<commit_message>
Initial commit with venv ignored
</commit_message>
<xml_diff>
--- a/contract_analysis_report.docx
+++ b/contract_analysis_report.docx
@@ -8,6 +8,90 @@
       </w:pPr>
       <w:r>
         <w:t>Enterprise Contract Analysis Report</w:t>
+      </w:r>
+    </w:p>
+    <w:p>
+      <w:pPr>
+        <w:pStyle w:val="Heading2"/>
+      </w:pPr>
+      <w:r>
+        <w:t>Executive Summary</w:t>
+      </w:r>
+    </w:p>
+    <w:p>
+      <w:r>
+        <w:t>Overall Risk Rating: High Risk</w:t>
+      </w:r>
+    </w:p>
+    <w:p>
+      <w:r>
+        <w:t>3 high-risk contractual deviations were identified. 17 medium-risk findings require attention. 3 requirements were not met. 17 requirements were only partially satisfied.</w:t>
+      </w:r>
+    </w:p>
+    <w:p>
+      <w:pPr>
+        <w:pStyle w:val="Heading3"/>
+      </w:pPr>
+      <w:r>
+        <w:t>Key Findings</w:t>
+      </w:r>
+    </w:p>
+    <w:p>
+      <w:pPr>
+        <w:pStyle w:val="ListBullet"/>
+      </w:pPr>
+      <w:r>
+        <w:t>Delayed payment due to conditional advance tranches.</w:t>
+      </w:r>
+    </w:p>
+    <w:p>
+      <w:pPr>
+        <w:pStyle w:val="ListBullet"/>
+      </w:pPr>
+      <w:r>
+        <w:t>Supplier exceeds performance security limit due to bridge guarantee.</w:t>
+      </w:r>
+    </w:p>
+    <w:p>
+      <w:pPr>
+        <w:pStyle w:val="ListBullet"/>
+      </w:pPr>
+      <w:r>
+        <w:t>Potential for significant liquidated damages exposure due to capped limits.</w:t>
+      </w:r>
+    </w:p>
+    <w:p>
+      <w:pPr>
+        <w:pStyle w:val="ListBullet"/>
+      </w:pPr>
+      <w:r>
+        <w:t>Potential for significant liquidated damages exposure.</w:t>
+      </w:r>
+    </w:p>
+    <w:p>
+      <w:pPr>
+        <w:pStyle w:val="ListBullet"/>
+      </w:pPr>
+      <w:r>
+        <w:t>Potential for significant liquidated damages exposure due to multiple caps.</w:t>
+      </w:r>
+    </w:p>
+    <w:p>
+      <w:pPr>
+        <w:pStyle w:val="Heading3"/>
+      </w:pPr>
+      <w:r>
+        <w:t>Recommendation</w:t>
+      </w:r>
+    </w:p>
+    <w:p>
+      <w:r>
+        <w:t>Contract should undergo detailed legal and commercial review before execution.</w:t>
+      </w:r>
+    </w:p>
+    <w:p>
+      <w:r>
+        <w:br w:type="page"/>
       </w:r>
     </w:p>
     <w:p>
@@ -1703,7 +1787,7 @@
           </w:tcPr>
           <w:p>
             <w:r>
-              <w:t>Delayed payments due to complex invoice acceptance criteria.</w:t>
+              <w:t>Delayed payment due to conditional advance tranches.</w:t>
             </w:r>
           </w:p>
         </w:tc>
@@ -1713,7 +1797,7 @@
           </w:tcPr>
           <w:p>
             <w:r>
-              <w:t>The clause outlines a multi-stage payment schedule dependent on numerous conditions (PO acknowledgement, documents, guarantees, inspections). Failure to meet these requirements could delay invoice acceptance and subsequently, the advance payment tranche, creating significant cash flow risk. This directly impacts supplier relations and operational efficiency.</w:t>
+              <w:t>The partially met compliance indicates a risk of delayed payments. The buyer's payment schedule is contingent on multiple conditions (bank guarantee, kick-off minutes, document submission) being satisfied within 20 days. This introduces a potential cash flow disruption for the supplier and operational delays.</w:t>
             </w:r>
           </w:p>
         </w:tc>
@@ -1723,7 +1807,7 @@
           </w:tcPr>
           <w:p>
             <w:r>
-              <w:t>Simplify invoice acceptance process; define objective criteria for receipt and approval with a maximum 20-day timeframe.</w:t>
+              <w:t>Require simultaneous completion of all acceptance records before advancing second tranche.</w:t>
             </w:r>
           </w:p>
         </w:tc>
@@ -1765,7 +1849,7 @@
           </w:tcPr>
           <w:p>
             <w:r>
-              <w:t>Increased performance security obligations exceeding the 10% limit.</w:t>
+              <w:t>Supplier exceeds performance security limit due to bridge guarantee.</w:t>
             </w:r>
           </w:p>
         </w:tc>
@@ -1775,7 +1859,7 @@
           </w:tcPr>
           <w:p>
             <w:r>
-              <w:t>The supplier has provided a bridge guarantee of 2%, alongside a standard guarantee of 10%. This results in a total security obligation of 12%, representing an unacceptable breach of the specified requirement. This exposes the buyer to unnecessary financial risk and potential disputes.</w:t>
+              <w:t>The Supplier is providing a 2% bridge guarantee in addition to the required 10% performance guarantee, resulting in a total of 12%. This violates the contractual limitation on overall security obligations.  This exposes the Buyer to increased financial risk and potential disputes regarding compliance.</w:t>
             </w:r>
           </w:p>
         </w:tc>
@@ -1785,7 +1869,7 @@
           </w:tcPr>
           <w:p>
             <w:r>
-              <w:t>Reduce total performance security to a maximum of 10 percent including bridge guarantees.</w:t>
+              <w:t>Reduce total security obligations to 10 percent including any bridge guarantees.</w:t>
             </w:r>
           </w:p>
         </w:tc>
@@ -1827,7 +1911,7 @@
           </w:tcPr>
           <w:p>
             <w:r>
-              <w:t>Potential for increased liquidated damages exposure due to aggregate cap.</w:t>
+              <w:t>Potential for significant liquidated damages exposure due to capped limits.</w:t>
             </w:r>
           </w:p>
         </w:tc>
@@ -1837,7 +1921,7 @@
           </w:tcPr>
           <w:p>
             <w:r>
-              <w:t>The 7.5% aggregate delay exposure cap significantly limits potential damages, creating a risk that unforeseen delays could result in substantially reduced compensation. This impacts the supplier's financial position and potentially weakens their incentive for timely delivery.</w:t>
+              <w:t>The clause establishes multiple caps on LD, including a 0.5% weekly rate, a 5% value cap, and a 7.5% aggregate limit. This severely restricts the Buyer's ability to recover costs associated with delivery delays, creating substantial financial risk if delays are prolonged or significant.</w:t>
             </w:r>
           </w:p>
         </w:tc>
@@ -1889,7 +1973,7 @@
           </w:tcPr>
           <w:p>
             <w:r>
-              <w:t>Supplier may seek increased liquidated damages claims.</w:t>
+              <w:t>Potential for significant liquidated damages exposure.</w:t>
             </w:r>
           </w:p>
         </w:tc>
@@ -1899,7 +1983,7 @@
           </w:tcPr>
           <w:p>
             <w:r>
-              <w:t>The clause contains multiple caps on LD exposure (5% equipment, 7.5% total) creating uncertainty regarding the maximum potential payment obligation. The aggregate cap overrides lower general caps, increasing this risk.</w:t>
+              <w:t>The clause establishes multiple caps on LD, including a 7.5% aggregate cap and individual caps of 5%. This limits the Buyer's ability to fully recover costs associated with delays, creating a substantial financial risk.</w:t>
             </w:r>
           </w:p>
         </w:tc>
@@ -1951,7 +2035,7 @@
           </w:tcPr>
           <w:p>
             <w:r>
-              <w:t>Potential for significant liquidated damages exposure due to aggregate cap.</w:t>
+              <w:t>Potential for significant liquidated damages exposure due to multiple caps.</w:t>
             </w:r>
           </w:p>
         </w:tc>
@@ -1961,7 +2045,7 @@
           </w:tcPr>
           <w:p>
             <w:r>
-              <w:t>The clause establishes a tiered LD structure (0.5% weekly, capped at 5%) and an overall 7.5% aggregate cap. This creates uncertainty regarding the maximum potential cost if delays persist across multiple categories, particularly with critical dispatch documents or service credits.</w:t>
+              <w:t>The clause establishes several overlapping limits: 0.5% per week, a maximum of 5% overall, and a combined aggregate cap of 7.5%. This creates uncertainty regarding the ultimate damage liability, increasing financial risk.</w:t>
             </w:r>
           </w:p>
         </w:tc>
@@ -1971,7 +2055,7 @@
           </w:tcPr>
           <w:p>
             <w:r>
-              <w:t>Reduce aggregate delay exposure to a maximum of 5 percent of total Purchase Order value.</w:t>
+              <w:t>Reduce aggregate LD and service-credit exposure to a maximum of 5 percent of PO value.</w:t>
             </w:r>
           </w:p>
         </w:tc>
@@ -2013,7 +2097,7 @@
           </w:tcPr>
           <w:p>
             <w:r>
-              <w:t>Supplier may accrue excessive liquidated damages exceeding the 5% PO limit.</w:t>
+              <w:t>Supplier may incur excessive liquidated damages exceeding 5% PO value.</w:t>
             </w:r>
           </w:p>
         </w:tc>
@@ -2023,7 +2107,7 @@
           </w:tcPr>
           <w:p>
             <w:r>
-              <w:t>The clause establishes a 7.5% aggregate cap on LD and service credits, overriding any lower general caps. This creates a significant payment risk if delays trigger this higher exposure, potentially resulting in substantial financial liability for the buyer.</w:t>
+              <w:t>The clause establishes a 7.5% aggregate cap on delivery LD, deemed delays, and service credits, overriding the standard 5% limit. This creates a significant payment risk for the buyer if the combined exposure triggers the higher cap.</w:t>
             </w:r>
           </w:p>
         </w:tc>
@@ -2075,7 +2159,7 @@
           </w:tcPr>
           <w:p>
             <w:r>
-              <w:t>Supplier exposed to escalating liquidated damages beyond 5% of undelivered value.</w:t>
+              <w:t>Potential for significant liquidated damages exposure due to aggregate cap.</w:t>
             </w:r>
           </w:p>
         </w:tc>
@@ -2085,7 +2169,7 @@
           </w:tcPr>
           <w:p>
             <w:r>
-              <w:t>The clause establishes a 0.5% per week LD, capped at 5%, creating potential for significant financial exposure if delays persist. The aggregate cap of 7.5% adds further uncertainty.</w:t>
+              <w:t>The clause establishes a capped LD exposure of 7.5% of the PO value, combining delivery delays, critical dispatch documents, and service credits. This limits the Buyer's ability to manage delay-related costs effectively, particularly if multiple delays occur.</w:t>
             </w:r>
           </w:p>
         </w:tc>
@@ -2095,7 +2179,7 @@
           </w:tcPr>
           <w:p>
             <w:r>
-              <w:t>Reduce the liquidated damages cap to a maximum of 5 percent of undelivered value.</w:t>
+              <w:t>Reduce aggregate LD and service-credit exposure to a maximum of 5 percent of PO value.</w:t>
             </w:r>
           </w:p>
         </w:tc>
@@ -2137,7 +2221,7 @@
           </w:tcPr>
           <w:p>
             <w:r>
-              <w:t>Extended guarantee period creates potential cost overruns.</w:t>
+              <w:t>Extended guarantee period creates uncertainty regarding future liabilities.</w:t>
             </w:r>
           </w:p>
         </w:tc>
@@ -2147,7 +2231,7 @@
           </w:tcPr>
           <w:p>
             <w:r>
-              <w:t>The remedial guarantee of twelve months (or eighteen months from dispatch) alongside the standard two-month guarantee presents a prolonged warranty liability. This significantly increases the risk of future repair claims and associated costs, particularly if defects are not immediately identified.</w:t>
+              <w:t>The clause provides a longer guarantee (18 months) than the standard two-month warranty, increasing potential liability exposure for the supplier. The overlapping timelines introduce complexity and risk assessment challenges related to ongoing maintenance and repairs.</w:t>
             </w:r>
           </w:p>
         </w:tc>
@@ -2157,7 +2241,7 @@
           </w:tcPr>
           <w:p>
             <w:r>
-              <w:t>Limit the guaranteed period to the shortest relevant timeframe – either successful commissioning or eighteen months from dispatch.</w:t>
+              <w:t>Reduce standard guarantee period to eighteen (18) months from dispatch.</w:t>
             </w:r>
           </w:p>
         </w:tc>
@@ -2199,7 +2283,7 @@
           </w:tcPr>
           <w:p>
             <w:r>
-              <w:t>Extended guarantee period creates uncertainty regarding coverage duration.</w:t>
+              <w:t>Conflicting guarantee periods create uncertainty regarding coverage.</w:t>
             </w:r>
           </w:p>
         </w:tc>
@@ -2209,7 +2293,7 @@
           </w:tcPr>
           <w:p>
             <w:r>
-              <w:t>The clause provides a guaranteed period of either two months or eighteen months from dispatch, whichever is shorter. This creates uncertainty as the effective guarantee duration depends on the timing of commissioning and dispatch, potentially leading to disputes over coverage length. This impacts warranty obligations and associated costs.</w:t>
+              <w:t>The clause establishes two distinct guarantee durations – 18 months from dispatch and 12 months from repair completion. This creates ambiguity as to which period applies, increasing the risk of disputes over warranty obligations and potential liability.</w:t>
             </w:r>
           </w:p>
         </w:tc>
@@ -2219,7 +2303,7 @@
           </w:tcPr>
           <w:p>
             <w:r>
-              <w:t>Limit standard guarantee to 18 months from dispatch; maintain twelve-month remedial guarantee.</w:t>
+              <w:t>Specify a single, clearly defined guarantee duration aligned with the longest protection period (18 months).</w:t>
             </w:r>
           </w:p>
         </w:tc>
@@ -2261,7 +2345,7 @@
           </w:tcPr>
           <w:p>
             <w:r>
-              <w:t>Partially met guarantee creates extended liability risk.</w:t>
+              <w:t>Reduced guarantee period exposes the buyer to extended repair liabilities.</w:t>
             </w:r>
           </w:p>
         </w:tc>
@@ -2271,7 +2355,7 @@
           </w:tcPr>
           <w:p>
             <w:r>
-              <w:t>The remedial guarantee extending twelve months beyond dispatch, coupled with the eighteen-month standard guarantee, introduces significant and prolonged warranty obligations. This exposes the buyer to potential long-term repair or replacement costs, significantly increasing overall financial exposure if defects are discovered.</w:t>
+              <w:t>The remedial guarantee of twelve months, alongside the eighteen-month original dispatch term, creates uncertainty. The earlier expiry date presents a significant risk for prolonged equipment downtime and associated costs if defects arise after initial commissioning or dispatch.</w:t>
             </w:r>
           </w:p>
         </w:tc>
@@ -2281,7 +2365,7 @@
           </w:tcPr>
           <w:p>
             <w:r>
-              <w:t>Restrict the remedial guarantee period to the shorter of eight (8) months from original dispatch and two (2) months from provisional commissioning.</w:t>
+              <w:t>Extend the remedial guarantee period to match the standard guarantee at eighteen months from dispatch.</w:t>
             </w:r>
           </w:p>
         </w:tc>
@@ -2323,7 +2407,7 @@
           </w:tcPr>
           <w:p>
             <w:r>
-              <w:t>Limited Force Majeure protection for sub-suppliers increases risk.</w:t>
+              <w:t>Supplier may limit Force Majeure to specific Tier-1 vendors.</w:t>
             </w:r>
           </w:p>
         </w:tc>
@@ -2333,7 +2417,7 @@
           </w:tcPr>
           <w:p>
             <w:r>
-              <w:t>The clause restricts Force Majeure relief to Tier-1 suppliers and logistics carriers, excluding other subcontractors. This creates a vulnerability if events impacting these specific parties disrupt the supply chain, potentially leading to delays and increased costs without coverage.</w:t>
+              <w:t>The clause restricts Force Majeure relief solely to Tier-1 sub-suppliers and logistics carriers, excluding other impacted parties. This creates a significant risk that the supplier will deny claims related to broader supply chain disruptions or issues with alternative sourcing options, leading to delays and potential breach of contract.</w:t>
             </w:r>
           </w:p>
         </w:tc>
@@ -2343,7 +2427,7 @@
           </w:tcPr>
           <w:p>
             <w:r>
-              <w:t>Expand Force Majeure protection to include all approved sub-suppliers and logistics providers.</w:t>
+              <w:t>Expand Force Majeure definition to include all approved suppliers and logistics providers.</w:t>
             </w:r>
           </w:p>
         </w:tc>
@@ -2385,7 +2469,7 @@
           </w:tcPr>
           <w:p>
             <w:r>
-              <w:t>Subcontractor force majeure claims could disrupt supply.</w:t>
+              <w:t>Limited force majeure protection for subcontractors increases disruption risk.</w:t>
             </w:r>
           </w:p>
         </w:tc>
@@ -2395,7 +2479,7 @@
           </w:tcPr>
           <w:p>
             <w:r>
-              <w:t>The clause only covers named Tier-1 suppliers and approved logistics, excluding unnamed subcontractors. This creates a significant risk of delays or non-performance by critical sub-suppliers impacting overall project delivery, triggering potential breach of contract claims.</w:t>
+              <w:t>The clause restricts Force Majeure relief to only named Tier-1 suppliers and approved logistics. This creates a significant exposure if a subcontractor experiences an event triggering Force Majeure, potentially leading to delays, increased costs, or contract termination without adequate support.</w:t>
             </w:r>
           </w:p>
         </w:tc>
@@ -2405,7 +2489,7 @@
           </w:tcPr>
           <w:p>
             <w:r>
-              <w:t>Require inclusion of force majeure protection for all subcontractors via an amendment to Article 00511.7.2.</w:t>
+              <w:t>Expand force majeure protection to include all subcontractors within the supply chain as defined in Annex D.</w:t>
             </w:r>
           </w:p>
         </w:tc>
@@ -2447,7 +2531,7 @@
           </w:tcPr>
           <w:p>
             <w:r>
-              <w:t>Limited Force Majeure scope creates potential payment delays.</w:t>
+              <w:t>Limited Force Majeure protection due to restricted scope.</w:t>
             </w:r>
           </w:p>
         </w:tc>
@@ -2457,7 +2541,7 @@
           </w:tcPr>
           <w:p>
             <w:r>
-              <w:t>The clause's restricted application to Tier-1 suppliers and logistics carriers exposes the buyer to significant disruption risk if these specific entities experience Force Majeure events. This could delay deliveries, triggering breach of contract claims for non-performance with limited recourse.</w:t>
+              <w:t>The clause only covers Tier-1 sub-suppliers and logistics carriers, excluding other potential supply chain disruptions. This creates uncertainty regarding relief eligibility and exposes the buyer to continued performance issues if affected parties experience force majeure events. It reduces the overall protection provided by the clause.</w:t>
             </w:r>
           </w:p>
         </w:tc>
@@ -2467,7 +2551,7 @@
           </w:tcPr>
           <w:p>
             <w:r>
-              <w:t>Expand Force Majeure protection to include all approved sub-suppliers and logistics providers, aligning with broader supply chain resilience.</w:t>
+              <w:t>Expand Force Majeure coverage to include all approved subcontractors and logistics providers identified within supplier's risk management program.</w:t>
             </w:r>
           </w:p>
         </w:tc>
@@ -2509,7 +2593,7 @@
           </w:tcPr>
           <w:p>
             <w:r>
-              <w:t>Delayed payment due to escalating cancellation fees.</w:t>
+              <w:t>Delayed payment due to complex termination fee schedule.</w:t>
             </w:r>
           </w:p>
         </w:tc>
@@ -2519,7 +2603,7 @@
           </w:tcPr>
           <w:p>
             <w:r>
-              <w:t>The clause establishes a tiered fee schedule based on the length of time after convenience cancellation, increasing significantly beyond 90 days. This creates a cash flow risk for the Supplier if the Buyer exercises this right, particularly with longer delays.</w:t>
+              <w:t>The clause outlines a tiered schedule based on the time of cancellation, creating potential delays and disputes regarding the accurate calculation of the termination fee. This exposes the Buyer to cash-flow risk and potentially significant financial penalties if calculations are contested.</w:t>
             </w:r>
           </w:p>
         </w:tc>
@@ -2529,7 +2613,7 @@
           </w:tcPr>
           <w:p>
             <w:r>
-              <w:t>Implement rigorous PO tracking and proactive communication to minimize potential cancellation scenarios and associated delay impacts.</w:t>
+              <w:t>Implement a standardized process for calculating termination fees, utilizing a clear, simple formula aligned with the schedule.</w:t>
             </w:r>
           </w:p>
         </w:tc>
@@ -2571,7 +2655,7 @@
           </w:tcPr>
           <w:p>
             <w:r>
-              <w:t>Termination fee liability exposes the company to significant financial risk.</w:t>
+              <w:t>Potential for significant cancellation fees based on delayed timing.</w:t>
             </w:r>
           </w:p>
         </w:tc>
@@ -2581,7 +2665,7 @@
           </w:tcPr>
           <w:p>
             <w:r>
-              <w:t>The escalating percentage schedule for convenience termination fees based on days past acknowledgement creates a substantial exposure. The longer the delay in cancellation, the higher the cost, potentially creating a material cash flow issue and impacting profitability.</w:t>
+              <w:t>The clause outlines escalating fee percentages tied to the length of time before buyer cancellation. This exposes the supplier to potentially substantial financial penalties, particularly with longer delays, impacting cash flow and profitability. The schedule is complex and could lead to disputes over calculation.</w:t>
             </w:r>
           </w:p>
         </w:tc>
@@ -2591,7 +2675,7 @@
           </w:tcPr>
           <w:p>
             <w:r>
-              <w:t>Cap the overall termination fee at a fixed dollar amount aligned with industry standards and mitigate potential disputes regarding default status.</w:t>
+              <w:t>Implement a clear, expedited process for notifying the Buyer of intent to cancel, minimizing delay triggers.</w:t>
             </w:r>
           </w:p>
         </w:tc>
@@ -2633,7 +2717,7 @@
           </w:tcPr>
           <w:p>
             <w:r>
-              <w:t>Potential for significant cancellation fees due to non-compliance.</w:t>
+              <w:t>Potential for significant early termination fees.</w:t>
             </w:r>
           </w:p>
         </w:tc>
@@ -2643,7 +2727,7 @@
           </w:tcPr>
           <w:p>
             <w:r>
-              <w:t>The supplier failed to meet the required cancellation fee schedule. The 40% fee applies based on the 61-90 day timeframe, representing a substantial financial exposure for the buyer. This exposes the buyer to unnecessary costs and potential cash flow difficulties.</w:t>
+              <w:t>The supplier failed to meet the required cancellation fee schedule, exposing the buyer to a potentially substantial financial penalty (38%) dependent on the length of the non-convenience cancellation. This creates a direct payment risk.</w:t>
             </w:r>
           </w:p>
         </w:tc>
@@ -2653,7 +2737,7 @@
           </w:tcPr>
           <w:p>
             <w:r>
-              <w:t>Require immediate confirmation of payment terms with the supplier reflecting the 61-90 day cancellation fee schedule.</w:t>
+              <w:t>Implement strict invoice validation and approval processes to confirm accurate fee calculations at termination.</w:t>
             </w:r>
           </w:p>
         </w:tc>
@@ -2695,7 +2779,7 @@
           </w:tcPr>
           <w:p>
             <w:r>
-              <w:t>Potential for excessive suspension costs and change order impacts.</w:t>
+              <w:t>Potential for excessive suspension costs and change order claims.</w:t>
             </w:r>
           </w:p>
         </w:tc>
@@ -2705,7 +2789,7 @@
           </w:tcPr>
           <w:p>
             <w:r>
-              <w:t>The clause allows for up to two commercial convenience suspensions totaling 30 days, excluding regulatory stoppages. The 'excess suspension' provision creates a risk of significant compensation obligations if the limit is exceeded, potentially impacting cash flow and profitability.</w:t>
+              <w:t>The clause allows for two commercial convenience suspensions up to 30 days, excluding regulatory stoppages. The 'partially met' status indicates a gap – the exclusion of regulatory stoppages creates uncertainty regarding acceptable suspension durations. This exposes the buyer to potential overruns.</w:t>
             </w:r>
           </w:p>
         </w:tc>
@@ -2715,7 +2799,7 @@
           </w:tcPr>
           <w:p>
             <w:r>
-              <w:t>Clarify definition of 'commercial convenience' to minimize subjective interpretations.</w:t>
+              <w:t>Explicitly define 'regulatory stoppage' and its impact on suspension limits within the clause.</w:t>
             </w:r>
           </w:p>
         </w:tc>
@@ -2757,7 +2841,7 @@
           </w:tcPr>
           <w:p>
             <w:r>
-              <w:t>Buyer's discretionary suspension limits create potential cash flow disruption.</w:t>
+              <w:t>Potential for increased costs due to exceeding suspension limits.</w:t>
             </w:r>
           </w:p>
         </w:tc>
@@ -2767,7 +2851,7 @@
           </w:tcPr>
           <w:p>
             <w:r>
-              <w:t>The clause allows for two commercial convenience suspensions up to 30 days, contingent on supplier agreement. Exceeding this limit triggers a compensable change order, potentially leading to unforeseen costs and schedule impacts if the supplier isn't prepared.</w:t>
+              <w:t>The clause permits up to two commercial convenience suspensions totaling 30 days. Exceeding this limit triggers a compensable change order, potentially leading to schedule extensions and associated cost increases if the supplier does not secure prior written agreement.</w:t>
             </w:r>
           </w:p>
         </w:tc>
@@ -2777,7 +2861,7 @@
           </w:tcPr>
           <w:p>
             <w:r>
-              <w:t>Establish clear criteria for triggering suspension beyond the agreed limits and require prior written approval from the Buyer.</w:t>
+              <w:t>Require written agreement from Supplier before exceeding suspension limits.</w:t>
             </w:r>
           </w:p>
         </w:tc>
@@ -2819,7 +2903,7 @@
           </w:tcPr>
           <w:p>
             <w:r>
-              <w:t>Increased jurisdictional and arbitration risks due to India governance.</w:t>
+              <w:t>Increased legal uncertainty and potential disputes due to Indian law.</w:t>
             </w:r>
           </w:p>
         </w:tc>
@@ -2829,7 +2913,7 @@
           </w:tcPr>
           <w:p>
             <w:r>
-              <w:t>The clause dictates Indian law, potentially impacting interpretation and enforcement. Arbitration in Singapore introduces complexities and costs compared to a familiar legal framework. This could escalate dispute resolution timelines and expenses significantly.</w:t>
+              <w:t>Governing by India's laws introduces complexities, potentially conflicting with expected international standards. Excluding conflict of law principles exacerbates this risk, offering limited protection against unfavorable interpretations. This could lead to higher legal costs and prolonged resolution times.</w:t>
             </w:r>
           </w:p>
         </w:tc>
@@ -2839,7 +2923,7 @@
           </w:tcPr>
           <w:p>
             <w:r>
-              <w:t>Specify governing law as [Preferred Jurisdiction - e.g., Delaware] with arbitration seated in [Preferred Location – e.g., New York] under SIAC Rules.</w:t>
+              <w:t>Implement a clause requiring governing law to be [Client's Jurisdiction], excluding conflicts only where legally permissible.</w:t>
             </w:r>
           </w:p>
         </w:tc>
@@ -2891,7 +2975,7 @@
           </w:tcPr>
           <w:p>
             <w:r>
-              <w:t>The tiered dispute resolution process, involving a technical expert in Mumbai followed by Singapore arbitration, introduces complexity. This increases the potential for disputes to escalate through multiple stages, leading to higher legal fees and prolonged timelines.</w:t>
+              <w:t>The tiered dispute resolution process, involving a technical expert followed by arbitration in Singapore, introduces complexity. Delays associated with the Mumbai expert determination could escalate legal expenses and prolong the resolution timeframe, increasing overall project risk.</w:t>
             </w:r>
           </w:p>
         </w:tc>
@@ -2901,7 +2985,7 @@
           </w:tcPr>
           <w:p>
             <w:r>
-              <w:t>Implement a clear protocol for managing technical disputes with expedited escalation procedures to minimize delays.</w:t>
+              <w:t>Require binding expert determination within 30 days; specify arbitrator selection criteria for Singapore arbitration.</w:t>
             </w:r>
           </w:p>
         </w:tc>
@@ -2943,7 +3027,7 @@
           </w:tcPr>
           <w:p>
             <w:r>
-              <w:t>Potential for increased arbitration costs and delays.</w:t>
+              <w:t>Arbitration seat limitation increases jurisdictional risk.</w:t>
             </w:r>
           </w:p>
         </w:tc>
@@ -2953,7 +3037,7 @@
           </w:tcPr>
           <w:p>
             <w:r>
-              <w:t>The phased dispute resolution process, involving a technical expert in Mumbai followed by arbitration in Singapore, introduces complexity. Delays stemming from the initial expert determination could lead to extended legal proceedings and associated expenses in both jurisdictions. This increases operational risk.</w:t>
+              <w:t>The clause restricts arbitration to Singapore, potentially unfavorable for the buyer if disputes arise regarding laboratory test methodology. This limits the available legal remedies and could increase costs associated with pursuing claims in a jurisdiction not aligned with the original agreement.</w:t>
             </w:r>
           </w:p>
         </w:tc>
@@ -2963,7 +3047,7 @@
           </w:tcPr>
           <w:p>
             <w:r>
-              <w:t>Implement a clear escalation protocol with time-bound deadlines for each stage of the dispute resolution process.</w:t>
+              <w:t>Maintain the existing arbitration seat specification as it is fully compliant.</w:t>
             </w:r>
           </w:p>
         </w:tc>
@@ -3005,7 +3089,7 @@
           </w:tcPr>
           <w:p>
             <w:r>
-              <w:t>Reduced liability cap exposes the buyer to significant financial loss.</w:t>
+              <w:t>Reduced liability coverage for emergency safety shutdowns.</w:t>
             </w:r>
           </w:p>
         </w:tc>
@@ -3015,7 +3099,7 @@
           </w:tcPr>
           <w:p>
             <w:r>
-              <w:t>The clause limits supplier liability to 10% of the PO value, but excludes direct costs of emergency removal, re-installation, or temporary site stabilization if a safety shutdown occurs. This creates a substantial gap in coverage for potentially very high remediation expenses, impacting financial exposure.</w:t>
+              <w:t>The clause excludes direct costs associated with a safety shutdown, effectively capping the supplier's liability. This creates significant exposure to potentially substantial financial loss if a defect triggers an emergency situation requiring costly remediation or stabilization activities.</w:t>
             </w:r>
           </w:p>
         </w:tc>
@@ -3025,7 +3109,7 @@
           </w:tcPr>
           <w:p>
             <w:r>
-              <w:t>Require a minimum liability cap covering all costs associated with a 'safety shutdown' regardless of whether it triggered an excluded cost.</w:t>
+              <w:t>Reiterate the 10% cap applies to all defect-related costs, irrespective of triggering event.</w:t>
             </w:r>
           </w:p>
         </w:tc>
@@ -3067,7 +3151,7 @@
           </w:tcPr>
           <w:p>
             <w:r>
-              <w:t>Exposure to significant consequential damages claims remains.</w:t>
+              <w:t>Potential for increased liability despite exclusion of consequential damages.</w:t>
             </w:r>
           </w:p>
         </w:tc>
@@ -3077,7 +3161,7 @@
           </w:tcPr>
           <w:p>
             <w:r>
-              <w:t>While the clause excludes many types of damages, exceptions exist for specific circumstances such as confidentiality breaches and willful misconduct. This leaves the client vulnerable if these exceptions are triggered, leading to potentially substantial financial loss.</w:t>
+              <w:t>The clause excludes consequential damages, but numerous exceptions exist. These include downtime, loss of production, and business opportunity – significant commercial risks. The scope of excluded losses is not clearly defined, increasing uncertainty.</w:t>
             </w:r>
           </w:p>
         </w:tc>
@@ -3087,7 +3171,7 @@
           </w:tcPr>
           <w:p>
             <w:r>
-              <w:t>Require detailed operational impact assessments prior to contract execution and implement enhanced monitoring protocols.</w:t>
+              <w:t>Maintain the existing clause as is; further risk mitigation requires negotiation.</w:t>
             </w:r>
           </w:p>
         </w:tc>
@@ -3129,7 +3213,7 @@
           </w:tcPr>
           <w:p>
             <w:r>
-              <w:t>Potential for significant liability exposure due to exclusions.</w:t>
+              <w:t>Potential for significant liability despite exclusion.</w:t>
             </w:r>
           </w:p>
         </w:tc>
@@ -3139,7 +3223,7 @@
           </w:tcPr>
           <w:p>
             <w:r>
-              <w:t>The clause excludes consequential damages, but numerous exceptions (fraud, gross negligence, etc.) significantly limit its protective effect. This exposes the client to unforeseen losses beyond direct damages.</w:t>
+              <w:t>The clause excludes consequential damages but contains several exceptions (confidentiality breaches, fraud, gross negligence etc.). These exceptions create substantial exposure as they allow recovery in specific circumstances where the core exclusion would not apply. This could lead to unexpectedly high costs.</w:t>
             </w:r>
           </w:p>
         </w:tc>
@@ -3149,7 +3233,7 @@
           </w:tcPr>
           <w:p>
             <w:r>
-              <w:t>Require detailed definitions of covered events and explicitly exclude potential liabilities such as fraud or willful misconduct.</w:t>
+              <w:t>Require a detailed risk assessment and implement robust data protection protocols to minimize confidentiality breach risks.</w:t>
             </w:r>
           </w:p>
         </w:tc>
@@ -3191,7 +3275,7 @@
           </w:tcPr>
           <w:p>
             <w:r>
-              <w:t>Delayed payments due to acceptance exceptions and timing.</w:t>
+              <w:t>Delayed payments due to acceptance exceptions.</w:t>
             </w:r>
           </w:p>
         </w:tc>
@@ -3201,7 +3285,7 @@
           </w:tcPr>
           <w:p>
             <w:r>
-              <w:t>The clause's exceptions and modified trigger date create uncertainty regarding when payment is due, increasing the risk of late payment penalties or disputes. This introduces cash flow instability and potential supplier dissatisfaction.</w:t>
+              <w:t>The clause's exception for disputed amounts and reliance on the later acceptance record creates uncertainty regarding payment timing. This could lead to late payment penalties, strained supplier relationships, and potential cash flow issues.</w:t>
             </w:r>
           </w:p>
         </w:tc>
@@ -3211,7 +3295,7 @@
           </w:tcPr>
           <w:p>
             <w:r>
-              <w:t>Clarify 'acceptance' definition with objective criteria and specify payment date as 30 days from invoice receipt.</w:t>
+              <w:t>Specify 'Net 30 days from invoice receipt', clearly defining acceptable invoice acceptance criteria with objective time-bound checks.</w:t>
             </w:r>
           </w:p>
         </w:tc>
@@ -3300,7 +3384,7 @@
           </w:tcPr>
           <w:p>
             <w:r>
-              <w:t>Simplify invoice acceptance process; define objective criteria for receipt and approval with a maximum 20-day timeframe.</w:t>
+              <w:t>Require simultaneous completion of all acceptance records before advancing second tranche.</w:t>
             </w:r>
           </w:p>
         </w:tc>
@@ -3332,7 +3416,7 @@
           </w:tcPr>
           <w:p>
             <w:r>
-              <w:t>Reduce total performance security to a maximum of 10 percent including bridge guarantees.</w:t>
+              <w:t>Reduce total security obligations to 10 percent including any bridge guarantees.</w:t>
             </w:r>
           </w:p>
         </w:tc>
@@ -3428,7 +3512,7 @@
           </w:tcPr>
           <w:p>
             <w:r>
-              <w:t>Reduce aggregate delay exposure to a maximum of 5 percent of total Purchase Order value.</w:t>
+              <w:t>Reduce aggregate LD and service-credit exposure to a maximum of 5 percent of PO value.</w:t>
             </w:r>
           </w:p>
         </w:tc>
@@ -3492,7 +3576,7 @@
           </w:tcPr>
           <w:p>
             <w:r>
-              <w:t>Reduce the liquidated damages cap to a maximum of 5 percent of undelivered value.</w:t>
+              <w:t>Reduce aggregate LD and service-credit exposure to a maximum of 5 percent of PO value.</w:t>
             </w:r>
           </w:p>
         </w:tc>
@@ -3524,7 +3608,7 @@
           </w:tcPr>
           <w:p>
             <w:r>
-              <w:t>Limit the guaranteed period to the shortest relevant timeframe – either successful commissioning or eighteen months from dispatch.</w:t>
+              <w:t>Reduce standard guarantee period to eighteen (18) months from dispatch.</w:t>
             </w:r>
           </w:p>
         </w:tc>
@@ -3556,7 +3640,7 @@
           </w:tcPr>
           <w:p>
             <w:r>
-              <w:t>Limit standard guarantee to 18 months from dispatch; maintain twelve-month remedial guarantee.</w:t>
+              <w:t>Specify a single, clearly defined guarantee duration aligned with the longest protection period (18 months).</w:t>
             </w:r>
           </w:p>
         </w:tc>
@@ -3588,7 +3672,7 @@
           </w:tcPr>
           <w:p>
             <w:r>
-              <w:t>Restrict the remedial guarantee period to the shorter of eight (8) months from original dispatch and two (2) months from provisional commissioning.</w:t>
+              <w:t>Extend the remedial guarantee period to match the standard guarantee at eighteen months from dispatch.</w:t>
             </w:r>
           </w:p>
         </w:tc>
@@ -3620,7 +3704,7 @@
           </w:tcPr>
           <w:p>
             <w:r>
-              <w:t>Expand Force Majeure protection to include all approved sub-suppliers and logistics providers.</w:t>
+              <w:t>Expand Force Majeure definition to include all approved suppliers and logistics providers.</w:t>
             </w:r>
           </w:p>
         </w:tc>
@@ -3652,7 +3736,7 @@
           </w:tcPr>
           <w:p>
             <w:r>
-              <w:t>Require inclusion of force majeure protection for all subcontractors via an amendment to Article 00511.7.2.</w:t>
+              <w:t>Expand force majeure protection to include all subcontractors within the supply chain as defined in Annex D.</w:t>
             </w:r>
           </w:p>
         </w:tc>
@@ -3684,7 +3768,7 @@
           </w:tcPr>
           <w:p>
             <w:r>
-              <w:t>Expand Force Majeure protection to include all approved sub-suppliers and logistics providers, aligning with broader supply chain resilience.</w:t>
+              <w:t>Expand Force Majeure coverage to include all approved subcontractors and logistics providers identified within supplier's risk management program.</w:t>
             </w:r>
           </w:p>
         </w:tc>
@@ -3716,7 +3800,7 @@
           </w:tcPr>
           <w:p>
             <w:r>
-              <w:t>Implement rigorous PO tracking and proactive communication to minimize potential cancellation scenarios and associated delay impacts.</w:t>
+              <w:t>Implement a standardized process for calculating termination fees, utilizing a clear, simple formula aligned with the schedule.</w:t>
             </w:r>
           </w:p>
         </w:tc>
@@ -3748,7 +3832,7 @@
           </w:tcPr>
           <w:p>
             <w:r>
-              <w:t>Cap the overall termination fee at a fixed dollar amount aligned with industry standards and mitigate potential disputes regarding default status.</w:t>
+              <w:t>Implement a clear, expedited process for notifying the Buyer of intent to cancel, minimizing delay triggers.</w:t>
             </w:r>
           </w:p>
         </w:tc>
@@ -3780,7 +3864,7 @@
           </w:tcPr>
           <w:p>
             <w:r>
-              <w:t>Require immediate confirmation of payment terms with the supplier reflecting the 61-90 day cancellation fee schedule.</w:t>
+              <w:t>Implement strict invoice validation and approval processes to confirm accurate fee calculations at termination.</w:t>
             </w:r>
           </w:p>
         </w:tc>
@@ -3812,7 +3896,7 @@
           </w:tcPr>
           <w:p>
             <w:r>
-              <w:t>Clarify definition of 'commercial convenience' to minimize subjective interpretations.</w:t>
+              <w:t>Explicitly define 'regulatory stoppage' and its impact on suspension limits within the clause.</w:t>
             </w:r>
           </w:p>
         </w:tc>
@@ -3844,7 +3928,7 @@
           </w:tcPr>
           <w:p>
             <w:r>
-              <w:t>Establish clear criteria for triggering suspension beyond the agreed limits and require prior written approval from the Buyer.</w:t>
+              <w:t>Require written agreement from Supplier before exceeding suspension limits.</w:t>
             </w:r>
           </w:p>
         </w:tc>
@@ -3876,7 +3960,7 @@
           </w:tcPr>
           <w:p>
             <w:r>
-              <w:t>Specify governing law as [Preferred Jurisdiction - e.g., Delaware] with arbitration seated in [Preferred Location – e.g., New York] under SIAC Rules.</w:t>
+              <w:t>Implement a clause requiring governing law to be [Client's Jurisdiction], excluding conflicts only where legally permissible.</w:t>
             </w:r>
           </w:p>
         </w:tc>
@@ -3908,7 +3992,7 @@
           </w:tcPr>
           <w:p>
             <w:r>
-              <w:t>Implement a clear protocol for managing technical disputes with expedited escalation procedures to minimize delays.</w:t>
+              <w:t>Require binding expert determination within 30 days; specify arbitrator selection criteria for Singapore arbitration.</w:t>
             </w:r>
           </w:p>
         </w:tc>
@@ -3940,7 +4024,7 @@
           </w:tcPr>
           <w:p>
             <w:r>
-              <w:t>Implement a clear escalation protocol with time-bound deadlines for each stage of the dispute resolution process.</w:t>
+              <w:t>Maintain the existing arbitration seat specification as it is fully compliant.</w:t>
             </w:r>
           </w:p>
         </w:tc>
@@ -3972,7 +4056,7 @@
           </w:tcPr>
           <w:p>
             <w:r>
-              <w:t>Require a minimum liability cap covering all costs associated with a 'safety shutdown' regardless of whether it triggered an excluded cost.</w:t>
+              <w:t>Reiterate the 10% cap applies to all defect-related costs, irrespective of triggering event.</w:t>
             </w:r>
           </w:p>
         </w:tc>
@@ -4004,7 +4088,7 @@
           </w:tcPr>
           <w:p>
             <w:r>
-              <w:t>Require detailed operational impact assessments prior to contract execution and implement enhanced monitoring protocols.</w:t>
+              <w:t>Maintain the existing clause as is; further risk mitigation requires negotiation.</w:t>
             </w:r>
           </w:p>
         </w:tc>
@@ -4036,7 +4120,7 @@
           </w:tcPr>
           <w:p>
             <w:r>
-              <w:t>Require detailed definitions of covered events and explicitly exclude potential liabilities such as fraud or willful misconduct.</w:t>
+              <w:t>Require a detailed risk assessment and implement robust data protection protocols to minimize confidentiality breach risks.</w:t>
             </w:r>
           </w:p>
         </w:tc>
@@ -4068,7 +4152,7 @@
           </w:tcPr>
           <w:p>
             <w:r>
-              <w:t>Clarify 'acceptance' definition with objective criteria and specify payment date as 30 days from invoice receipt.</w:t>
+              <w:t>Specify 'Net 30 days from invoice receipt', clearly defining acceptable invoice acceptance criteria with objective time-bound checks.</w:t>
             </w:r>
           </w:p>
         </w:tc>

</xml_diff>

<commit_message>
2nd  commit with venv ignored
</commit_message>
<xml_diff>
--- a/contract_analysis_report.docx
+++ b/contract_analysis_report.docx
@@ -15,90 +15,6 @@
         <w:pStyle w:val="Heading2"/>
       </w:pPr>
       <w:r>
-        <w:t>Executive Summary</w:t>
-      </w:r>
-    </w:p>
-    <w:p>
-      <w:r>
-        <w:t>Overall Risk Rating: High Risk</w:t>
-      </w:r>
-    </w:p>
-    <w:p>
-      <w:r>
-        <w:t>3 high-risk contractual deviations were identified. 17 medium-risk findings require attention. 3 requirements were not met. 17 requirements were only partially satisfied.</w:t>
-      </w:r>
-    </w:p>
-    <w:p>
-      <w:pPr>
-        <w:pStyle w:val="Heading3"/>
-      </w:pPr>
-      <w:r>
-        <w:t>Key Findings</w:t>
-      </w:r>
-    </w:p>
-    <w:p>
-      <w:pPr>
-        <w:pStyle w:val="ListBullet"/>
-      </w:pPr>
-      <w:r>
-        <w:t>Delayed payment due to conditional advance tranche release.</w:t>
-      </w:r>
-    </w:p>
-    <w:p>
-      <w:pPr>
-        <w:pStyle w:val="ListBullet"/>
-      </w:pPr>
-      <w:r>
-        <w:t>Increased total performance security exposure exceeding 10%.</w:t>
-      </w:r>
-    </w:p>
-    <w:p>
-      <w:pPr>
-        <w:pStyle w:val="ListBullet"/>
-      </w:pPr>
-      <w:r>
-        <w:t>Potential for significant liquidated damages exposure due to limitations.</w:t>
-      </w:r>
-    </w:p>
-    <w:p>
-      <w:pPr>
-        <w:pStyle w:val="ListBullet"/>
-      </w:pPr>
-      <w:r>
-        <w:t>Supplier may avoid liquidated damages exceeding 7.5% of PO value.</w:t>
-      </w:r>
-    </w:p>
-    <w:p>
-      <w:pPr>
-        <w:pStyle w:val="ListBullet"/>
-      </w:pPr>
-      <w:r>
-        <w:t>Potential for increased liquidated damages exposure due to aggregate cap.</w:t>
-      </w:r>
-    </w:p>
-    <w:p>
-      <w:pPr>
-        <w:pStyle w:val="Heading3"/>
-      </w:pPr>
-      <w:r>
-        <w:t>Recommendation</w:t>
-      </w:r>
-    </w:p>
-    <w:p>
-      <w:r>
-        <w:t>Contract should undergo detailed legal and commercial review before execution.</w:t>
-      </w:r>
-    </w:p>
-    <w:p>
-      <w:r>
-        <w:br w:type="page"/>
-      </w:r>
-    </w:p>
-    <w:p>
-      <w:pPr>
-        <w:pStyle w:val="Heading2"/>
-      </w:pPr>
-      <w:r>
         <w:t>Table 1 - Compliance Analysis</w:t>
       </w:r>
     </w:p>
@@ -109,15 +25,16 @@
         <w:tblLook w:firstColumn="1" w:firstRow="1" w:lastColumn="0" w:lastRow="0" w:noHBand="0" w:noVBand="1" w:val="04A0"/>
       </w:tblPr>
       <w:tblGrid>
-        <w:gridCol w:w="2160"/>
-        <w:gridCol w:w="2160"/>
-        <w:gridCol w:w="2160"/>
-        <w:gridCol w:w="2160"/>
+        <w:gridCol w:w="1728"/>
+        <w:gridCol w:w="1728"/>
+        <w:gridCol w:w="1728"/>
+        <w:gridCol w:w="1728"/>
+        <w:gridCol w:w="1728"/>
       </w:tblGrid>
       <w:tr>
         <w:tc>
           <w:tcPr>
-            <w:tcW w:type="dxa" w:w="2160"/>
+            <w:tcW w:type="dxa" w:w="1728"/>
           </w:tcPr>
           <w:p>
             <w:r>
@@ -127,7 +44,7 @@
         </w:tc>
         <w:tc>
           <w:tcPr>
-            <w:tcW w:type="dxa" w:w="2160"/>
+            <w:tcW w:type="dxa" w:w="1728"/>
           </w:tcPr>
           <w:p>
             <w:r>
@@ -137,21 +54,31 @@
         </w:tc>
         <w:tc>
           <w:tcPr>
-            <w:tcW w:type="dxa" w:w="2160"/>
-          </w:tcPr>
-          <w:p>
-            <w:r>
-              <w:t>Summary of Key Details</w:t>
-            </w:r>
-          </w:p>
-        </w:tc>
-        <w:tc>
-          <w:tcPr>
-            <w:tcW w:type="dxa" w:w="2160"/>
+            <w:tcW w:type="dxa" w:w="1728"/>
+          </w:tcPr>
+          <w:p>
+            <w:r>
+              <w:t>Status</w:t>
+            </w:r>
+          </w:p>
+        </w:tc>
+        <w:tc>
+          <w:tcPr>
+            <w:tcW w:type="dxa" w:w="1728"/>
           </w:tcPr>
           <w:p>
             <w:r>
               <w:t>Evidence</w:t>
+            </w:r>
+          </w:p>
+        </w:tc>
+        <w:tc>
+          <w:tcPr>
+            <w:tcW w:type="dxa" w:w="1728"/>
+          </w:tcPr>
+          <w:p>
+            <w:r>
+              <w:t>Historical Action Taken</w:t>
             </w:r>
           </w:p>
         </w:tc>
@@ -159,7 +86,7 @@
       <w:tr>
         <w:tc>
           <w:tcPr>
-            <w:tcW w:type="dxa" w:w="2160"/>
+            <w:tcW w:type="dxa" w:w="1728"/>
           </w:tcPr>
           <w:p>
             <w:r>
@@ -169,7 +96,7 @@
         </w:tc>
         <w:tc>
           <w:tcPr>
-            <w:tcW w:type="dxa" w:w="2160"/>
+            <w:tcW w:type="dxa" w:w="1728"/>
           </w:tcPr>
           <w:p>
             <w:r>
@@ -179,17 +106,17 @@
         </w:tc>
         <w:tc>
           <w:tcPr>
-            <w:tcW w:type="dxa" w:w="2160"/>
-          </w:tcPr>
-          <w:p>
-            <w:r>
-              <w:t>Subject to Supplier acknowledging the Purchase Order and furnishing the documents listed in Annex B, Buyer shall arrange an advance equal to forty-five percent (45%) of the Purchase Order value. Thirty percent (30%) is payable within five (5) business days after PO acknowledgement. The remaining fifteen percent (15%) is payable only after Buyer receives the performance bank guarantee, the project kick-off minutes signed by both parties, and the first document submission register</w:t>
-            </w:r>
-          </w:p>
-        </w:tc>
-        <w:tc>
-          <w:tcPr>
-            <w:tcW w:type="dxa" w:w="2160"/>
+            <w:tcW w:type="dxa" w:w="1728"/>
+          </w:tcPr>
+          <w:p>
+            <w:r>
+              <w:t>Partially Met</w:t>
+            </w:r>
+          </w:p>
+        </w:tc>
+        <w:tc>
+          <w:tcPr>
+            <w:tcW w:type="dxa" w:w="1728"/>
           </w:tcPr>
           <w:p>
             <w:r>
@@ -199,11 +126,21 @@
             </w:r>
           </w:p>
         </w:tc>
+        <w:tc>
+          <w:tcPr>
+            <w:tcW w:type="dxa" w:w="1728"/>
+          </w:tcPr>
+          <w:p>
+            <w:r>
+              <w:t>Negotiated milestone-based payment schedule and removed conditional payment dependencies.</w:t>
+            </w:r>
+          </w:p>
+        </w:tc>
       </w:tr>
       <w:tr>
         <w:tc>
           <w:tcPr>
-            <w:tcW w:type="dxa" w:w="2160"/>
+            <w:tcW w:type="dxa" w:w="1728"/>
           </w:tcPr>
           <w:p>
             <w:r>
@@ -213,7 +150,7 @@
         </w:tc>
         <w:tc>
           <w:tcPr>
-            <w:tcW w:type="dxa" w:w="2160"/>
+            <w:tcW w:type="dxa" w:w="1728"/>
           </w:tcPr>
           <w:p>
             <w:r>
@@ -223,17 +160,17 @@
         </w:tc>
         <w:tc>
           <w:tcPr>
-            <w:tcW w:type="dxa" w:w="2160"/>
-          </w:tcPr>
-          <w:p>
-            <w:r>
-              <w:t>1 Performance bank guarantee. Supplier shall furnish an unconditional performance bank guarantee equal to ten percent (10%) of the Purchase Order value, valid until expiry of the standard guarantee period plus ninety (90) days. Agent Test Input - Complex Contract Terms 00511</w:t>
-            </w:r>
-          </w:p>
-        </w:tc>
-        <w:tc>
-          <w:tcPr>
-            <w:tcW w:type="dxa" w:w="2160"/>
+            <w:tcW w:type="dxa" w:w="1728"/>
+          </w:tcPr>
+          <w:p>
+            <w:r>
+              <w:t>Not Met</w:t>
+            </w:r>
+          </w:p>
+        </w:tc>
+        <w:tc>
+          <w:tcPr>
+            <w:tcW w:type="dxa" w:w="1728"/>
           </w:tcPr>
           <w:p>
             <w:r>
@@ -245,11 +182,21 @@
             </w:r>
           </w:p>
         </w:tc>
+        <w:tc>
+          <w:tcPr>
+            <w:tcW w:type="dxa" w:w="1728"/>
+          </w:tcPr>
+          <w:p>
+            <w:r>
+              <w:t>Reduced performance security from 12% to 10% through contract amendment.</w:t>
+            </w:r>
+          </w:p>
+        </w:tc>
       </w:tr>
       <w:tr>
         <w:tc>
           <w:tcPr>
-            <w:tcW w:type="dxa" w:w="2160"/>
+            <w:tcW w:type="dxa" w:w="1728"/>
           </w:tcPr>
           <w:p>
             <w:r>
@@ -259,7 +206,7 @@
         </w:tc>
         <w:tc>
           <w:tcPr>
-            <w:tcW w:type="dxa" w:w="2160"/>
+            <w:tcW w:type="dxa" w:w="1728"/>
           </w:tcPr>
           <w:p>
             <w:r>
@@ -269,17 +216,17 @@
         </w:tc>
         <w:tc>
           <w:tcPr>
-            <w:tcW w:type="dxa" w:w="2160"/>
-          </w:tcPr>
-          <w:p>
-            <w:r>
-              <w:t>1 Performance bank guarantee. Supplier shall furnish an unconditional performance bank guarantee equal to ten percent (10%) of the Purchase Order value, valid until expiry of the standard guarantee period plus ninety (90) days. Agent Test Input - Complex Contract Terms 00511</w:t>
-            </w:r>
-          </w:p>
-        </w:tc>
-        <w:tc>
-          <w:tcPr>
-            <w:tcW w:type="dxa" w:w="2160"/>
+            <w:tcW w:type="dxa" w:w="1728"/>
+          </w:tcPr>
+          <w:p>
+            <w:r>
+              <w:t>Met</w:t>
+            </w:r>
+          </w:p>
+        </w:tc>
+        <w:tc>
+          <w:tcPr>
+            <w:tcW w:type="dxa" w:w="1728"/>
           </w:tcPr>
           <w:p>
             <w:r>
@@ -289,11 +236,21 @@
             </w:r>
           </w:p>
         </w:tc>
+        <w:tc>
+          <w:tcPr>
+            <w:tcW w:type="dxa" w:w="1728"/>
+          </w:tcPr>
+          <w:p>
+            <w:r>
+              <w:t>Reduced performance security from 12% to 10% through contract amendment.</w:t>
+            </w:r>
+          </w:p>
+        </w:tc>
       </w:tr>
       <w:tr>
         <w:tc>
           <w:tcPr>
-            <w:tcW w:type="dxa" w:w="2160"/>
+            <w:tcW w:type="dxa" w:w="1728"/>
           </w:tcPr>
           <w:p>
             <w:r>
@@ -303,7 +260,7 @@
         </w:tc>
         <w:tc>
           <w:tcPr>
-            <w:tcW w:type="dxa" w:w="2160"/>
+            <w:tcW w:type="dxa" w:w="1728"/>
           </w:tcPr>
           <w:p>
             <w:r>
@@ -313,17 +270,17 @@
         </w:tc>
         <w:tc>
           <w:tcPr>
-            <w:tcW w:type="dxa" w:w="2160"/>
-          </w:tcPr>
-          <w:p>
-            <w:r>
-              <w:t>1 Documentation and engineering submittals. Delay in routine manuals, vendor data books, certificates, or non-critical engineering submittals shall not attract standalone liquidated damages. However, delay in a document identified as a Critical Dispatch Document in Annex B that directly prevents FAT release shall be treated as a delay in equipment delivery for the affected lot</w:t>
-            </w:r>
-          </w:p>
-        </w:tc>
-        <w:tc>
-          <w:tcPr>
-            <w:tcW w:type="dxa" w:w="2160"/>
+            <w:tcW w:type="dxa" w:w="1728"/>
+          </w:tcPr>
+          <w:p>
+            <w:r>
+              <w:t>Partially Met</w:t>
+            </w:r>
+          </w:p>
+        </w:tc>
+        <w:tc>
+          <w:tcPr>
+            <w:tcW w:type="dxa" w:w="1728"/>
           </w:tcPr>
           <w:p>
             <w:r>
@@ -333,11 +290,21 @@
             </w:r>
           </w:p>
         </w:tc>
+        <w:tc>
+          <w:tcPr>
+            <w:tcW w:type="dxa" w:w="1728"/>
+          </w:tcPr>
+          <w:p>
+            <w:r>
+              <w:t>Negotiated lower LD cap and clarified applicability conditions.</w:t>
+            </w:r>
+          </w:p>
+        </w:tc>
       </w:tr>
       <w:tr>
         <w:tc>
           <w:tcPr>
-            <w:tcW w:type="dxa" w:w="2160"/>
+            <w:tcW w:type="dxa" w:w="1728"/>
           </w:tcPr>
           <w:p>
             <w:r>
@@ -347,7 +314,7 @@
         </w:tc>
         <w:tc>
           <w:tcPr>
-            <w:tcW w:type="dxa" w:w="2160"/>
+            <w:tcW w:type="dxa" w:w="1728"/>
           </w:tcPr>
           <w:p>
             <w:r>
@@ -357,17 +324,17 @@
         </w:tc>
         <w:tc>
           <w:tcPr>
-            <w:tcW w:type="dxa" w:w="2160"/>
-          </w:tcPr>
-          <w:p>
-            <w:r>
-              <w:t>1 Documentation and engineering submittals. Delay in routine manuals, vendor data books, certificates, or non-critical engineering submittals shall not attract standalone liquidated damages. However, delay in a document identified as a Critical Dispatch Document in Annex B that directly prevents FAT release shall be treated as a delay in equipment delivery for the affected lot</w:t>
-            </w:r>
-          </w:p>
-        </w:tc>
-        <w:tc>
-          <w:tcPr>
-            <w:tcW w:type="dxa" w:w="2160"/>
+            <w:tcW w:type="dxa" w:w="1728"/>
+          </w:tcPr>
+          <w:p>
+            <w:r>
+              <w:t>Partially Met</w:t>
+            </w:r>
+          </w:p>
+        </w:tc>
+        <w:tc>
+          <w:tcPr>
+            <w:tcW w:type="dxa" w:w="1728"/>
           </w:tcPr>
           <w:p>
             <w:r>
@@ -377,11 +344,21 @@
             </w:r>
           </w:p>
         </w:tc>
+        <w:tc>
+          <w:tcPr>
+            <w:tcW w:type="dxa" w:w="1728"/>
+          </w:tcPr>
+          <w:p>
+            <w:r>
+              <w:t>Negotiated lower LD cap and clarified applicability conditions.</w:t>
+            </w:r>
+          </w:p>
+        </w:tc>
       </w:tr>
       <w:tr>
         <w:tc>
           <w:tcPr>
-            <w:tcW w:type="dxa" w:w="2160"/>
+            <w:tcW w:type="dxa" w:w="1728"/>
           </w:tcPr>
           <w:p>
             <w:r>
@@ -391,7 +368,7 @@
         </w:tc>
         <w:tc>
           <w:tcPr>
-            <w:tcW w:type="dxa" w:w="2160"/>
+            <w:tcW w:type="dxa" w:w="1728"/>
           </w:tcPr>
           <w:p>
             <w:r>
@@ -401,17 +378,17 @@
         </w:tc>
         <w:tc>
           <w:tcPr>
-            <w:tcW w:type="dxa" w:w="2160"/>
-          </w:tcPr>
-          <w:p>
-            <w:r>
-              <w:t>1 Documentation and engineering submittals. Delay in routine manuals, vendor data books, certificates, or non-critical engineering submittals shall not attract standalone liquidated damages. However, delay in a document identified as a Critical Dispatch Document in Annex B that directly prevents FAT release shall be treated as a delay in equipment delivery for the affected lot</w:t>
-            </w:r>
-          </w:p>
-        </w:tc>
-        <w:tc>
-          <w:tcPr>
-            <w:tcW w:type="dxa" w:w="2160"/>
+            <w:tcW w:type="dxa" w:w="1728"/>
+          </w:tcPr>
+          <w:p>
+            <w:r>
+              <w:t>Partially Met</w:t>
+            </w:r>
+          </w:p>
+        </w:tc>
+        <w:tc>
+          <w:tcPr>
+            <w:tcW w:type="dxa" w:w="1728"/>
           </w:tcPr>
           <w:p>
             <w:r>
@@ -421,11 +398,21 @@
             </w:r>
           </w:p>
         </w:tc>
+        <w:tc>
+          <w:tcPr>
+            <w:tcW w:type="dxa" w:w="1728"/>
+          </w:tcPr>
+          <w:p>
+            <w:r>
+              <w:t>Negotiated lower LD cap and clarified applicability conditions.</w:t>
+            </w:r>
+          </w:p>
+        </w:tc>
       </w:tr>
       <w:tr>
         <w:tc>
           <w:tcPr>
-            <w:tcW w:type="dxa" w:w="2160"/>
+            <w:tcW w:type="dxa" w:w="1728"/>
           </w:tcPr>
           <w:p>
             <w:r>
@@ -435,7 +422,7 @@
         </w:tc>
         <w:tc>
           <w:tcPr>
-            <w:tcW w:type="dxa" w:w="2160"/>
+            <w:tcW w:type="dxa" w:w="1728"/>
           </w:tcPr>
           <w:p>
             <w:r>
@@ -445,17 +432,17 @@
         </w:tc>
         <w:tc>
           <w:tcPr>
-            <w:tcW w:type="dxa" w:w="2160"/>
-          </w:tcPr>
-          <w:p>
-            <w:r>
-              <w:t>1 Documentation and engineering submittals. Delay in routine manuals, vendor data books, certificates, or non-critical engineering submittals shall not attract standalone liquidated damages. However, delay in a document identified as a Critical Dispatch Document in Annex B that directly prevents FAT release shall be treated as a delay in equipment delivery for the affected lot</w:t>
-            </w:r>
-          </w:p>
-        </w:tc>
-        <w:tc>
-          <w:tcPr>
-            <w:tcW w:type="dxa" w:w="2160"/>
+            <w:tcW w:type="dxa" w:w="1728"/>
+          </w:tcPr>
+          <w:p>
+            <w:r>
+              <w:t>Not Met</w:t>
+            </w:r>
+          </w:p>
+        </w:tc>
+        <w:tc>
+          <w:tcPr>
+            <w:tcW w:type="dxa" w:w="1728"/>
           </w:tcPr>
           <w:p>
             <w:r>
@@ -465,11 +452,21 @@
             </w:r>
           </w:p>
         </w:tc>
+        <w:tc>
+          <w:tcPr>
+            <w:tcW w:type="dxa" w:w="1728"/>
+          </w:tcPr>
+          <w:p>
+            <w:r>
+              <w:t>Negotiated lower LD cap and clarified applicability conditions.</w:t>
+            </w:r>
+          </w:p>
+        </w:tc>
       </w:tr>
       <w:tr>
         <w:tc>
           <w:tcPr>
-            <w:tcW w:type="dxa" w:w="2160"/>
+            <w:tcW w:type="dxa" w:w="1728"/>
           </w:tcPr>
           <w:p>
             <w:r>
@@ -479,7 +476,7 @@
         </w:tc>
         <w:tc>
           <w:tcPr>
-            <w:tcW w:type="dxa" w:w="2160"/>
+            <w:tcW w:type="dxa" w:w="1728"/>
           </w:tcPr>
           <w:p>
             <w:r>
@@ -489,17 +486,17 @@
         </w:tc>
         <w:tc>
           <w:tcPr>
-            <w:tcW w:type="dxa" w:w="2160"/>
-          </w:tcPr>
-          <w:p>
-            <w:r>
-              <w:t>1 Documentation and engineering submittals. Delay in routine manuals, vendor data books, certificates, or non-critical engineering submittals shall not attract standalone liquidated damages. However, delay in a document identified as a Critical Dispatch Document in Annex B that directly prevents FAT release shall be treated as a delay in equipment delivery for the affected lot</w:t>
-            </w:r>
-          </w:p>
-        </w:tc>
-        <w:tc>
-          <w:tcPr>
-            <w:tcW w:type="dxa" w:w="2160"/>
+            <w:tcW w:type="dxa" w:w="1728"/>
+          </w:tcPr>
+          <w:p>
+            <w:r>
+              <w:t>Partially Met</w:t>
+            </w:r>
+          </w:p>
+        </w:tc>
+        <w:tc>
+          <w:tcPr>
+            <w:tcW w:type="dxa" w:w="1728"/>
           </w:tcPr>
           <w:p>
             <w:r>
@@ -509,11 +506,21 @@
             </w:r>
           </w:p>
         </w:tc>
+        <w:tc>
+          <w:tcPr>
+            <w:tcW w:type="dxa" w:w="1728"/>
+          </w:tcPr>
+          <w:p>
+            <w:r>
+              <w:t>Negotiated lower LD cap and clarified applicability conditions.</w:t>
+            </w:r>
+          </w:p>
+        </w:tc>
       </w:tr>
       <w:tr>
         <w:tc>
           <w:tcPr>
-            <w:tcW w:type="dxa" w:w="2160"/>
+            <w:tcW w:type="dxa" w:w="1728"/>
           </w:tcPr>
           <w:p>
             <w:r>
@@ -523,7 +530,7 @@
         </w:tc>
         <w:tc>
           <w:tcPr>
-            <w:tcW w:type="dxa" w:w="2160"/>
+            <w:tcW w:type="dxa" w:w="1728"/>
           </w:tcPr>
           <w:p>
             <w:r>
@@ -533,17 +540,17 @@
         </w:tc>
         <w:tc>
           <w:tcPr>
-            <w:tcW w:type="dxa" w:w="2160"/>
-          </w:tcPr>
-          <w:p>
-            <w:r>
-              <w:t>Supplier guarantees the equipment for two (2) months from successful provisional commissioning or eighteen (18) months from dispatch from Supplier works, whichever occurs earlier. If commissioning is delayed solely because Buyer has not provided utilities, access, or foundation readiness for more than sixty (60) days, the commissioning limb is deemed to have started on the sixty-first day after delivery to site. Any repaired or replaced component shall be guaranteed for twelve (12) months from completion of repair or replacement, or until eighteen (18) months from original dispatch of the affected equipment, whichever occurs earlier</w:t>
-            </w:r>
-          </w:p>
-        </w:tc>
-        <w:tc>
-          <w:tcPr>
-            <w:tcW w:type="dxa" w:w="2160"/>
+            <w:tcW w:type="dxa" w:w="1728"/>
+          </w:tcPr>
+          <w:p>
+            <w:r>
+              <w:t>Partially Met</w:t>
+            </w:r>
+          </w:p>
+        </w:tc>
+        <w:tc>
+          <w:tcPr>
+            <w:tcW w:type="dxa" w:w="1728"/>
           </w:tcPr>
           <w:p>
             <w:r>
@@ -553,11 +560,21 @@
             </w:r>
           </w:p>
         </w:tc>
+        <w:tc>
+          <w:tcPr>
+            <w:tcW w:type="dxa" w:w="1728"/>
+          </w:tcPr>
+          <w:p>
+            <w:r>
+              <w:t>Renegotiated warranty duration and coverage limits during legal review.</w:t>
+            </w:r>
+          </w:p>
+        </w:tc>
       </w:tr>
       <w:tr>
         <w:tc>
           <w:tcPr>
-            <w:tcW w:type="dxa" w:w="2160"/>
+            <w:tcW w:type="dxa" w:w="1728"/>
           </w:tcPr>
           <w:p>
             <w:r>
@@ -567,7 +584,7 @@
         </w:tc>
         <w:tc>
           <w:tcPr>
-            <w:tcW w:type="dxa" w:w="2160"/>
+            <w:tcW w:type="dxa" w:w="1728"/>
           </w:tcPr>
           <w:p>
             <w:r>
@@ -577,17 +594,17 @@
         </w:tc>
         <w:tc>
           <w:tcPr>
-            <w:tcW w:type="dxa" w:w="2160"/>
-          </w:tcPr>
-          <w:p>
-            <w:r>
-              <w:t>Supplier guarantees the equipment for two (2) months from successful provisional commissioning or eighteen (18) months from dispatch from Supplier works, whichever occurs earlier. If commissioning is delayed solely because Buyer has not provided utilities, access, or foundation readiness for more than sixty (60) days, the commissioning limb is deemed to have started on the sixty-first day after delivery to site. Any repaired or replaced component shall be guaranteed for twelve (12) months from completion of repair or replacement, or until eighteen (18) months from original dispatch of the affected equipment, whichever occurs earlier</w:t>
-            </w:r>
-          </w:p>
-        </w:tc>
-        <w:tc>
-          <w:tcPr>
-            <w:tcW w:type="dxa" w:w="2160"/>
+            <w:tcW w:type="dxa" w:w="1728"/>
+          </w:tcPr>
+          <w:p>
+            <w:r>
+              <w:t>Partially Met</w:t>
+            </w:r>
+          </w:p>
+        </w:tc>
+        <w:tc>
+          <w:tcPr>
+            <w:tcW w:type="dxa" w:w="1728"/>
           </w:tcPr>
           <w:p>
             <w:r>
@@ -597,11 +614,21 @@
             </w:r>
           </w:p>
         </w:tc>
+        <w:tc>
+          <w:tcPr>
+            <w:tcW w:type="dxa" w:w="1728"/>
+          </w:tcPr>
+          <w:p>
+            <w:r>
+              <w:t>Renegotiated warranty duration and coverage limits during legal review.</w:t>
+            </w:r>
+          </w:p>
+        </w:tc>
       </w:tr>
       <w:tr>
         <w:tc>
           <w:tcPr>
-            <w:tcW w:type="dxa" w:w="2160"/>
+            <w:tcW w:type="dxa" w:w="1728"/>
           </w:tcPr>
           <w:p>
             <w:r>
@@ -611,7 +638,7 @@
         </w:tc>
         <w:tc>
           <w:tcPr>
-            <w:tcW w:type="dxa" w:w="2160"/>
+            <w:tcW w:type="dxa" w:w="1728"/>
           </w:tcPr>
           <w:p>
             <w:r>
@@ -621,17 +648,17 @@
         </w:tc>
         <w:tc>
           <w:tcPr>
-            <w:tcW w:type="dxa" w:w="2160"/>
-          </w:tcPr>
-          <w:p>
-            <w:r>
-              <w:t>Supplier guarantees the equipment for two (2) months from successful provisional commissioning or eighteen (18) months from dispatch from Supplier works, whichever occurs earlier. If commissioning is delayed solely because Buyer has not provided utilities, access, or foundation readiness for more than sixty (60) days, the commissioning limb is deemed to have started on the sixty-first day after delivery to site. Any repaired or replaced component shall be guaranteed for twelve (12) months from completion of repair or replacement, or until eighteen (18) months from original dispatch of the affected equipment, whichever occurs earlier</w:t>
-            </w:r>
-          </w:p>
-        </w:tc>
-        <w:tc>
-          <w:tcPr>
-            <w:tcW w:type="dxa" w:w="2160"/>
+            <w:tcW w:type="dxa" w:w="1728"/>
+          </w:tcPr>
+          <w:p>
+            <w:r>
+              <w:t>Partially Met</w:t>
+            </w:r>
+          </w:p>
+        </w:tc>
+        <w:tc>
+          <w:tcPr>
+            <w:tcW w:type="dxa" w:w="1728"/>
           </w:tcPr>
           <w:p>
             <w:r>
@@ -641,11 +668,21 @@
             </w:r>
           </w:p>
         </w:tc>
+        <w:tc>
+          <w:tcPr>
+            <w:tcW w:type="dxa" w:w="1728"/>
+          </w:tcPr>
+          <w:p>
+            <w:r>
+              <w:t>Renegotiated warranty duration and coverage limits during legal review.</w:t>
+            </w:r>
+          </w:p>
+        </w:tc>
       </w:tr>
       <w:tr>
         <w:tc>
           <w:tcPr>
-            <w:tcW w:type="dxa" w:w="2160"/>
+            <w:tcW w:type="dxa" w:w="1728"/>
           </w:tcPr>
           <w:p>
             <w:r>
@@ -655,7 +692,7 @@
         </w:tc>
         <w:tc>
           <w:tcPr>
-            <w:tcW w:type="dxa" w:w="2160"/>
+            <w:tcW w:type="dxa" w:w="1728"/>
           </w:tcPr>
           <w:p>
             <w:r>
@@ -665,17 +702,17 @@
         </w:tc>
         <w:tc>
           <w:tcPr>
-            <w:tcW w:type="dxa" w:w="2160"/>
-          </w:tcPr>
-          <w:p>
-            <w:r>
-              <w:t>Force Majeure means an event beyond the reasonable control of the affected party, including Act of God, expropriation, nationalization, embargo, changes in law or regulation, war, sabotage, floods, severe weather, fires, strikes, lockouts, epidemics, pandemics, quarantine restrictions, and government action directly preventing performance. 2 Supply-chain events. Supplier may claim Force Majeure relief for events affecting only the Tier-1 critical sub-suppliers named in Annex D or the approved international logistics carrier</w:t>
-            </w:r>
-          </w:p>
-        </w:tc>
-        <w:tc>
-          <w:tcPr>
-            <w:tcW w:type="dxa" w:w="2160"/>
+            <w:tcW w:type="dxa" w:w="1728"/>
+          </w:tcPr>
+          <w:p>
+            <w:r>
+              <w:t>Partially Met</w:t>
+            </w:r>
+          </w:p>
+        </w:tc>
+        <w:tc>
+          <w:tcPr>
+            <w:tcW w:type="dxa" w:w="1728"/>
           </w:tcPr>
           <w:p>
             <w:r>
@@ -685,11 +722,21 @@
             </w:r>
           </w:p>
         </w:tc>
+        <w:tc>
+          <w:tcPr>
+            <w:tcW w:type="dxa" w:w="1728"/>
+          </w:tcPr>
+          <w:p>
+            <w:r>
+              <w:t>Expanded force majeure coverage and simplified notice requirements.</w:t>
+            </w:r>
+          </w:p>
+        </w:tc>
       </w:tr>
       <w:tr>
         <w:tc>
           <w:tcPr>
-            <w:tcW w:type="dxa" w:w="2160"/>
+            <w:tcW w:type="dxa" w:w="1728"/>
           </w:tcPr>
           <w:p>
             <w:r>
@@ -699,7 +746,7 @@
         </w:tc>
         <w:tc>
           <w:tcPr>
-            <w:tcW w:type="dxa" w:w="2160"/>
+            <w:tcW w:type="dxa" w:w="1728"/>
           </w:tcPr>
           <w:p>
             <w:r>
@@ -709,21 +756,31 @@
         </w:tc>
         <w:tc>
           <w:tcPr>
-            <w:tcW w:type="dxa" w:w="2160"/>
-          </w:tcPr>
-          <w:p>
-            <w:r>
-              <w:t>Force Majeure means an event beyond the reasonable control of the affected party, including Act of God, expropriation, nationalization, embargo, changes in law or regulation, war, sabotage, floods, severe weather, fires, strikes, lockouts, epidemics, pandemics, quarantine restrictions, and government action directly preventing performance. 2 Supply-chain events. Supplier may claim Force Majeure relief for events affecting only the Tier-1 critical sub-suppliers named in Annex D or the approved international logistics carrier</w:t>
-            </w:r>
-          </w:p>
-        </w:tc>
-        <w:tc>
-          <w:tcPr>
-            <w:tcW w:type="dxa" w:w="2160"/>
+            <w:tcW w:type="dxa" w:w="1728"/>
+          </w:tcPr>
+          <w:p>
+            <w:r>
+              <w:t>Partially Met</w:t>
+            </w:r>
+          </w:p>
+        </w:tc>
+        <w:tc>
+          <w:tcPr>
+            <w:tcW w:type="dxa" w:w="1728"/>
           </w:tcPr>
           <w:p>
             <w:r>
               <w:t>Force majeure applies only to named Tier-1 / approved suppliers</w:t>
+            </w:r>
+          </w:p>
+        </w:tc>
+        <w:tc>
+          <w:tcPr>
+            <w:tcW w:type="dxa" w:w="1728"/>
+          </w:tcPr>
+          <w:p>
+            <w:r>
+              <w:t>Expanded force majeure coverage and simplified notice requirements.</w:t>
             </w:r>
           </w:p>
         </w:tc>
@@ -731,7 +788,7 @@
       <w:tr>
         <w:tc>
           <w:tcPr>
-            <w:tcW w:type="dxa" w:w="2160"/>
+            <w:tcW w:type="dxa" w:w="1728"/>
           </w:tcPr>
           <w:p>
             <w:r>
@@ -741,7 +798,7 @@
         </w:tc>
         <w:tc>
           <w:tcPr>
-            <w:tcW w:type="dxa" w:w="2160"/>
+            <w:tcW w:type="dxa" w:w="1728"/>
           </w:tcPr>
           <w:p>
             <w:r>
@@ -751,17 +808,17 @@
         </w:tc>
         <w:tc>
           <w:tcPr>
-            <w:tcW w:type="dxa" w:w="2160"/>
-          </w:tcPr>
-          <w:p>
-            <w:r>
-              <w:t>Force Majeure means an event beyond the reasonable control of the affected party, including Act of God, expropriation, nationalization, embargo, changes in law or regulation, war, sabotage, floods, severe weather, fires, strikes, lockouts, epidemics, pandemics, quarantine restrictions, and government action directly preventing performance. 2 Supply-chain events. Supplier may claim Force Majeure relief for events affecting only the Tier-1 critical sub-suppliers named in Annex D or the approved international logistics carrier</w:t>
-            </w:r>
-          </w:p>
-        </w:tc>
-        <w:tc>
-          <w:tcPr>
-            <w:tcW w:type="dxa" w:w="2160"/>
+            <w:tcW w:type="dxa" w:w="1728"/>
+          </w:tcPr>
+          <w:p>
+            <w:r>
+              <w:t>Partially Met</w:t>
+            </w:r>
+          </w:p>
+        </w:tc>
+        <w:tc>
+          <w:tcPr>
+            <w:tcW w:type="dxa" w:w="1728"/>
           </w:tcPr>
           <w:p>
             <w:r>
@@ -771,11 +828,21 @@
             </w:r>
           </w:p>
         </w:tc>
+        <w:tc>
+          <w:tcPr>
+            <w:tcW w:type="dxa" w:w="1728"/>
+          </w:tcPr>
+          <w:p>
+            <w:r>
+              <w:t>Expanded force majeure coverage and simplified notice requirements.</w:t>
+            </w:r>
+          </w:p>
+        </w:tc>
       </w:tr>
       <w:tr>
         <w:tc>
           <w:tcPr>
-            <w:tcW w:type="dxa" w:w="2160"/>
+            <w:tcW w:type="dxa" w:w="1728"/>
           </w:tcPr>
           <w:p>
             <w:r>
@@ -785,7 +852,7 @@
         </w:tc>
         <w:tc>
           <w:tcPr>
-            <w:tcW w:type="dxa" w:w="2160"/>
+            <w:tcW w:type="dxa" w:w="1728"/>
           </w:tcPr>
           <w:p>
             <w:r>
@@ -795,17 +862,17 @@
         </w:tc>
         <w:tc>
           <w:tcPr>
-            <w:tcW w:type="dxa" w:w="2160"/>
-          </w:tcPr>
-          <w:p>
-            <w:r>
-              <w:t>1 Convenience cancellation schedule. If Buyer cancels the Purchase Order for convenience after Supplier acknowledgement, Buyer shall pay the following fee as a percentage of the order value, subject to the notes below: 0-30 days: 7. 5%; 31-60 days: 25%; 61-90 days: 38%; 91-120 days: 55%; 121-150 days: 70% less documented resale or scrap salvage actually realized by Supplier; 151-180 days: 85%; and 181 or more days: 100% of the undelivered balance only</w:t>
-            </w:r>
-          </w:p>
-        </w:tc>
-        <w:tc>
-          <w:tcPr>
-            <w:tcW w:type="dxa" w:w="2160"/>
+            <w:tcW w:type="dxa" w:w="1728"/>
+          </w:tcPr>
+          <w:p>
+            <w:r>
+              <w:t>Met</w:t>
+            </w:r>
+          </w:p>
+        </w:tc>
+        <w:tc>
+          <w:tcPr>
+            <w:tcW w:type="dxa" w:w="1728"/>
           </w:tcPr>
           <w:p>
             <w:r>
@@ -819,11 +886,21 @@
             </w:r>
           </w:p>
         </w:tc>
+        <w:tc>
+          <w:tcPr>
+            <w:tcW w:type="dxa" w:w="1728"/>
+          </w:tcPr>
+          <w:p>
+            <w:r>
+              <w:t>Revised cancellation fee structure during commercial negotiations.</w:t>
+            </w:r>
+          </w:p>
+        </w:tc>
       </w:tr>
       <w:tr>
         <w:tc>
           <w:tcPr>
-            <w:tcW w:type="dxa" w:w="2160"/>
+            <w:tcW w:type="dxa" w:w="1728"/>
           </w:tcPr>
           <w:p>
             <w:r>
@@ -833,7 +910,7 @@
         </w:tc>
         <w:tc>
           <w:tcPr>
-            <w:tcW w:type="dxa" w:w="2160"/>
+            <w:tcW w:type="dxa" w:w="1728"/>
           </w:tcPr>
           <w:p>
             <w:r>
@@ -843,17 +920,17 @@
         </w:tc>
         <w:tc>
           <w:tcPr>
-            <w:tcW w:type="dxa" w:w="2160"/>
-          </w:tcPr>
-          <w:p>
-            <w:r>
-              <w:t>1 Convenience cancellation schedule. If Buyer cancels the Purchase Order for convenience after Supplier acknowledgement, Buyer shall pay the following fee as a percentage of the order value, subject to the notes below: 0-30 days: 7. 5%; 31-60 days: 25%; 61-90 days: 38%; 91-120 days: 55%; 121-150 days: 70% less documented resale or scrap salvage actually realized by Supplier; 151-180 days: 85%; and 181 or more days: 100% of the undelivered balance only</w:t>
-            </w:r>
-          </w:p>
-        </w:tc>
-        <w:tc>
-          <w:tcPr>
-            <w:tcW w:type="dxa" w:w="2160"/>
+            <w:tcW w:type="dxa" w:w="1728"/>
+          </w:tcPr>
+          <w:p>
+            <w:r>
+              <w:t>Met</w:t>
+            </w:r>
+          </w:p>
+        </w:tc>
+        <w:tc>
+          <w:tcPr>
+            <w:tcW w:type="dxa" w:w="1728"/>
           </w:tcPr>
           <w:p>
             <w:r>
@@ -867,11 +944,21 @@
             </w:r>
           </w:p>
         </w:tc>
+        <w:tc>
+          <w:tcPr>
+            <w:tcW w:type="dxa" w:w="1728"/>
+          </w:tcPr>
+          <w:p>
+            <w:r>
+              <w:t>Revised cancellation fee structure during commercial negotiations.</w:t>
+            </w:r>
+          </w:p>
+        </w:tc>
       </w:tr>
       <w:tr>
         <w:tc>
           <w:tcPr>
-            <w:tcW w:type="dxa" w:w="2160"/>
+            <w:tcW w:type="dxa" w:w="1728"/>
           </w:tcPr>
           <w:p>
             <w:r>
@@ -881,7 +968,7 @@
         </w:tc>
         <w:tc>
           <w:tcPr>
-            <w:tcW w:type="dxa" w:w="2160"/>
+            <w:tcW w:type="dxa" w:w="1728"/>
           </w:tcPr>
           <w:p>
             <w:r>
@@ -891,21 +978,31 @@
         </w:tc>
         <w:tc>
           <w:tcPr>
-            <w:tcW w:type="dxa" w:w="2160"/>
-          </w:tcPr>
-          <w:p>
-            <w:r>
-              <w:t>1 Convenience cancellation schedule. If Buyer cancels the Purchase Order for convenience after Supplier acknowledgement, Buyer shall pay the following fee as a percentage of the order value, subject to the notes below: 0-30 days: 7. 5%; 31-60 days: 25%; 61-90 days: 38%; 91-120 days: 55%; 121-150 days: 70% less documented resale or scrap salvage actually realized by Supplier; 151-180 days: 85%; and 181 or more days: 100% of the undelivered balance only</w:t>
-            </w:r>
-          </w:p>
-        </w:tc>
-        <w:tc>
-          <w:tcPr>
-            <w:tcW w:type="dxa" w:w="2160"/>
+            <w:tcW w:type="dxa" w:w="1728"/>
+          </w:tcPr>
+          <w:p>
+            <w:r>
+              <w:t>Not Met</w:t>
+            </w:r>
+          </w:p>
+        </w:tc>
+        <w:tc>
+          <w:tcPr>
+            <w:tcW w:type="dxa" w:w="1728"/>
           </w:tcPr>
           <w:p>
             <w:r>
               <w:t>Article 00511.9 - Cancellation and Early Termination Fee</w:t>
+            </w:r>
+          </w:p>
+        </w:tc>
+        <w:tc>
+          <w:tcPr>
+            <w:tcW w:type="dxa" w:w="1728"/>
+          </w:tcPr>
+          <w:p>
+            <w:r>
+              <w:t>Revised cancellation fee structure during commercial negotiations.</w:t>
             </w:r>
           </w:p>
         </w:tc>
@@ -913,7 +1010,7 @@
       <w:tr>
         <w:tc>
           <w:tcPr>
-            <w:tcW w:type="dxa" w:w="2160"/>
+            <w:tcW w:type="dxa" w:w="1728"/>
           </w:tcPr>
           <w:p>
             <w:r>
@@ -923,7 +1020,7 @@
         </w:tc>
         <w:tc>
           <w:tcPr>
-            <w:tcW w:type="dxa" w:w="2160"/>
+            <w:tcW w:type="dxa" w:w="1728"/>
           </w:tcPr>
           <w:p>
             <w:r>
@@ -933,21 +1030,31 @@
         </w:tc>
         <w:tc>
           <w:tcPr>
-            <w:tcW w:type="dxa" w:w="2160"/>
-          </w:tcPr>
-          <w:p>
-            <w:r>
-              <w:t>Buyer may suspend work for commercial convenience no more than two (2) times during the Purchase Order term, and the aggregate duration of such commercial-convenience suspensions shall not exceed thirty (30) calendar days unless Supplier agrees in writing. Regulatory inspection holds, government clearance waits, and safety stoppages imposed by law are not counted as suspensions for this limit. If Buyer requests a commercial-convenience suspension beyond the permitted limit, the excess period shall be treated as a compensable change order entitling Supplier to schedule extension, storage, demobilization, and reasonable remobilization costs</w:t>
-            </w:r>
-          </w:p>
-        </w:tc>
-        <w:tc>
-          <w:tcPr>
-            <w:tcW w:type="dxa" w:w="2160"/>
+            <w:tcW w:type="dxa" w:w="1728"/>
+          </w:tcPr>
+          <w:p>
+            <w:r>
+              <w:t>Partially Met</w:t>
+            </w:r>
+          </w:p>
+        </w:tc>
+        <w:tc>
+          <w:tcPr>
+            <w:tcW w:type="dxa" w:w="1728"/>
           </w:tcPr>
           <w:p>
             <w:r>
               <w:t>Suspension limits exclude regulatory, government, legal, and safety stoppages</w:t>
+            </w:r>
+          </w:p>
+        </w:tc>
+        <w:tc>
+          <w:tcPr>
+            <w:tcW w:type="dxa" w:w="1728"/>
+          </w:tcPr>
+          <w:p>
+            <w:r>
+              <w:t>Added suspension approval workflow and duration limits.</w:t>
             </w:r>
           </w:p>
         </w:tc>
@@ -955,7 +1062,7 @@
       <w:tr>
         <w:tc>
           <w:tcPr>
-            <w:tcW w:type="dxa" w:w="2160"/>
+            <w:tcW w:type="dxa" w:w="1728"/>
           </w:tcPr>
           <w:p>
             <w:r>
@@ -965,7 +1072,7 @@
         </w:tc>
         <w:tc>
           <w:tcPr>
-            <w:tcW w:type="dxa" w:w="2160"/>
+            <w:tcW w:type="dxa" w:w="1728"/>
           </w:tcPr>
           <w:p>
             <w:r>
@@ -975,17 +1082,17 @@
         </w:tc>
         <w:tc>
           <w:tcPr>
-            <w:tcW w:type="dxa" w:w="2160"/>
-          </w:tcPr>
-          <w:p>
-            <w:r>
-              <w:t>Buyer may suspend work for commercial convenience no more than two (2) times during the Purchase Order term, and the aggregate duration of such commercial-convenience suspensions shall not exceed thirty (30) calendar days unless Supplier agrees in writing. Regulatory inspection holds, government clearance waits, and safety stoppages imposed by law are not counted as suspensions for this limit. If Buyer requests a commercial-convenience suspension beyond the permitted limit, the excess period shall be treated as a compensable change order entitling Supplier to schedule extension, storage, demobilization, and reasonable remobilization costs</w:t>
-            </w:r>
-          </w:p>
-        </w:tc>
-        <w:tc>
-          <w:tcPr>
-            <w:tcW w:type="dxa" w:w="2160"/>
+            <w:tcW w:type="dxa" w:w="1728"/>
+          </w:tcPr>
+          <w:p>
+            <w:r>
+              <w:t>Met</w:t>
+            </w:r>
+          </w:p>
+        </w:tc>
+        <w:tc>
+          <w:tcPr>
+            <w:tcW w:type="dxa" w:w="1728"/>
           </w:tcPr>
           <w:p>
             <w:r>
@@ -997,11 +1104,21 @@
             </w:r>
           </w:p>
         </w:tc>
+        <w:tc>
+          <w:tcPr>
+            <w:tcW w:type="dxa" w:w="1728"/>
+          </w:tcPr>
+          <w:p>
+            <w:r>
+              <w:t>Added suspension approval workflow and duration limits.</w:t>
+            </w:r>
+          </w:p>
+        </w:tc>
       </w:tr>
       <w:tr>
         <w:tc>
           <w:tcPr>
-            <w:tcW w:type="dxa" w:w="2160"/>
+            <w:tcW w:type="dxa" w:w="1728"/>
           </w:tcPr>
           <w:p>
             <w:r>
@@ -1011,7 +1128,7 @@
         </w:tc>
         <w:tc>
           <w:tcPr>
-            <w:tcW w:type="dxa" w:w="2160"/>
+            <w:tcW w:type="dxa" w:w="1728"/>
           </w:tcPr>
           <w:p>
             <w:r>
@@ -1021,17 +1138,17 @@
         </w:tc>
         <w:tc>
           <w:tcPr>
-            <w:tcW w:type="dxa" w:w="2160"/>
-          </w:tcPr>
-          <w:p>
-            <w:r>
-              <w:t>1 Order of precedence. In case of inconsistency, the following order applies: (a) signed Purchase Order amendment; (b) Special Conditions in Articles 00511. 16; (c) Annex B - Commercial Schedule; (d) Annex C - Logistics Protocol; (e) the General Procurement Conditions; and (f) email clarifications not incorporated by amendment</w:t>
-            </w:r>
-          </w:p>
-        </w:tc>
-        <w:tc>
-          <w:tcPr>
-            <w:tcW w:type="dxa" w:w="2160"/>
+            <w:tcW w:type="dxa" w:w="1728"/>
+          </w:tcPr>
+          <w:p>
+            <w:r>
+              <w:t>Met</w:t>
+            </w:r>
+          </w:p>
+        </w:tc>
+        <w:tc>
+          <w:tcPr>
+            <w:tcW w:type="dxa" w:w="1728"/>
           </w:tcPr>
           <w:p>
             <w:r>
@@ -1043,11 +1160,21 @@
             </w:r>
           </w:p>
         </w:tc>
+        <w:tc>
+          <w:tcPr>
+            <w:tcW w:type="dxa" w:w="1728"/>
+          </w:tcPr>
+          <w:p>
+            <w:r>
+              <w:t>Implemented formal change request and approval process.</w:t>
+            </w:r>
+          </w:p>
+        </w:tc>
       </w:tr>
       <w:tr>
         <w:tc>
           <w:tcPr>
-            <w:tcW w:type="dxa" w:w="2160"/>
+            <w:tcW w:type="dxa" w:w="1728"/>
           </w:tcPr>
           <w:p>
             <w:r>
@@ -1057,7 +1184,7 @@
         </w:tc>
         <w:tc>
           <w:tcPr>
-            <w:tcW w:type="dxa" w:w="2160"/>
+            <w:tcW w:type="dxa" w:w="1728"/>
           </w:tcPr>
           <w:p>
             <w:r>
@@ -1067,17 +1194,17 @@
         </w:tc>
         <w:tc>
           <w:tcPr>
-            <w:tcW w:type="dxa" w:w="2160"/>
-          </w:tcPr>
-          <w:p>
-            <w:r>
-              <w:t>1 Order of precedence. In case of inconsistency, the following order applies: (a) signed Purchase Order amendment; (b) Special Conditions in Articles 00511. 16; (c) Annex B - Commercial Schedule; (d) Annex C - Logistics Protocol; (e) the General Procurement Conditions; and (f) email clarifications not incorporated by amendment</w:t>
-            </w:r>
-          </w:p>
-        </w:tc>
-        <w:tc>
-          <w:tcPr>
-            <w:tcW w:type="dxa" w:w="2160"/>
+            <w:tcW w:type="dxa" w:w="1728"/>
+          </w:tcPr>
+          <w:p>
+            <w:r>
+              <w:t>Met</w:t>
+            </w:r>
+          </w:p>
+        </w:tc>
+        <w:tc>
+          <w:tcPr>
+            <w:tcW w:type="dxa" w:w="1728"/>
           </w:tcPr>
           <w:p>
             <w:r>
@@ -1089,11 +1216,21 @@
             </w:r>
           </w:p>
         </w:tc>
+        <w:tc>
+          <w:tcPr>
+            <w:tcW w:type="dxa" w:w="1728"/>
+          </w:tcPr>
+          <w:p>
+            <w:r>
+              <w:t>Implemented formal change request and approval process.</w:t>
+            </w:r>
+          </w:p>
+        </w:tc>
       </w:tr>
       <w:tr>
         <w:tc>
           <w:tcPr>
-            <w:tcW w:type="dxa" w:w="2160"/>
+            <w:tcW w:type="dxa" w:w="1728"/>
           </w:tcPr>
           <w:p>
             <w:r>
@@ -1103,7 +1240,7 @@
         </w:tc>
         <w:tc>
           <w:tcPr>
-            <w:tcW w:type="dxa" w:w="2160"/>
+            <w:tcW w:type="dxa" w:w="1728"/>
           </w:tcPr>
           <w:p>
             <w:r>
@@ -1113,17 +1250,17 @@
         </w:tc>
         <w:tc>
           <w:tcPr>
-            <w:tcW w:type="dxa" w:w="2160"/>
-          </w:tcPr>
-          <w:p>
-            <w:r>
-              <w:t>This Purchase Order and all non-contractual obligations arising out of or in connection with it shall be governed by the laws of India, excluding conflict-of-law principles. Disputes relating to price adjustment, delay LD, warranty, cancellation fee, limitation of liability, and consequential damages shall be finally resolved by arbitration seated in Singapore under the SIAC Rules. The language of arbitration shall be English</w:t>
-            </w:r>
-          </w:p>
-        </w:tc>
-        <w:tc>
-          <w:tcPr>
-            <w:tcW w:type="dxa" w:w="2160"/>
+            <w:tcW w:type="dxa" w:w="1728"/>
+          </w:tcPr>
+          <w:p>
+            <w:r>
+              <w:t>Partially Met</w:t>
+            </w:r>
+          </w:p>
+        </w:tc>
+        <w:tc>
+          <w:tcPr>
+            <w:tcW w:type="dxa" w:w="1728"/>
           </w:tcPr>
           <w:p>
             <w:r>
@@ -1133,11 +1270,21 @@
             </w:r>
           </w:p>
         </w:tc>
+        <w:tc>
+          <w:tcPr>
+            <w:tcW w:type="dxa" w:w="1728"/>
+          </w:tcPr>
+          <w:p>
+            <w:r>
+              <w:t>Standardized governing law language across contracts.</w:t>
+            </w:r>
+          </w:p>
+        </w:tc>
       </w:tr>
       <w:tr>
         <w:tc>
           <w:tcPr>
-            <w:tcW w:type="dxa" w:w="2160"/>
+            <w:tcW w:type="dxa" w:w="1728"/>
           </w:tcPr>
           <w:p>
             <w:r>
@@ -1147,7 +1294,7 @@
         </w:tc>
         <w:tc>
           <w:tcPr>
-            <w:tcW w:type="dxa" w:w="2160"/>
+            <w:tcW w:type="dxa" w:w="1728"/>
           </w:tcPr>
           <w:p>
             <w:r>
@@ -1157,17 +1304,17 @@
         </w:tc>
         <w:tc>
           <w:tcPr>
-            <w:tcW w:type="dxa" w:w="2160"/>
-          </w:tcPr>
-          <w:p>
-            <w:r>
-              <w:t>This Purchase Order and all non-contractual obligations arising out of or in connection with it shall be governed by the laws of India, excluding conflict-of-law principles. Disputes relating to price adjustment, delay LD, warranty, cancellation fee, limitation of liability, and consequential damages shall be finally resolved by arbitration seated in Singapore under the SIAC Rules. The language of arbitration shall be English</w:t>
-            </w:r>
-          </w:p>
-        </w:tc>
-        <w:tc>
-          <w:tcPr>
-            <w:tcW w:type="dxa" w:w="2160"/>
+            <w:tcW w:type="dxa" w:w="1728"/>
+          </w:tcPr>
+          <w:p>
+            <w:r>
+              <w:t>Met</w:t>
+            </w:r>
+          </w:p>
+        </w:tc>
+        <w:tc>
+          <w:tcPr>
+            <w:tcW w:type="dxa" w:w="1728"/>
           </w:tcPr>
           <w:p>
             <w:r>
@@ -1179,11 +1326,21 @@
             </w:r>
           </w:p>
         </w:tc>
+        <w:tc>
+          <w:tcPr>
+            <w:tcW w:type="dxa" w:w="1728"/>
+          </w:tcPr>
+          <w:p>
+            <w:r>
+              <w:t>Updated arbitration mechanism based on prior legal review.</w:t>
+            </w:r>
+          </w:p>
+        </w:tc>
       </w:tr>
       <w:tr>
         <w:tc>
           <w:tcPr>
-            <w:tcW w:type="dxa" w:w="2160"/>
+            <w:tcW w:type="dxa" w:w="1728"/>
           </w:tcPr>
           <w:p>
             <w:r>
@@ -1193,7 +1350,7 @@
         </w:tc>
         <w:tc>
           <w:tcPr>
-            <w:tcW w:type="dxa" w:w="2160"/>
+            <w:tcW w:type="dxa" w:w="1728"/>
           </w:tcPr>
           <w:p>
             <w:r>
@@ -1203,17 +1360,17 @@
         </w:tc>
         <w:tc>
           <w:tcPr>
-            <w:tcW w:type="dxa" w:w="2160"/>
-          </w:tcPr>
-          <w:p>
-            <w:r>
-              <w:t>This Purchase Order and all non-contractual obligations arising out of or in connection with it shall be governed by the laws of India, excluding conflict-of-law principles. Disputes relating to price adjustment, delay LD, warranty, cancellation fee, limitation of liability, and consequential damages shall be finally resolved by arbitration seated in Singapore under the SIAC Rules. The language of arbitration shall be English</w:t>
-            </w:r>
-          </w:p>
-        </w:tc>
-        <w:tc>
-          <w:tcPr>
-            <w:tcW w:type="dxa" w:w="2160"/>
+            <w:tcW w:type="dxa" w:w="1728"/>
+          </w:tcPr>
+          <w:p>
+            <w:r>
+              <w:t>Met</w:t>
+            </w:r>
+          </w:p>
+        </w:tc>
+        <w:tc>
+          <w:tcPr>
+            <w:tcW w:type="dxa" w:w="1728"/>
           </w:tcPr>
           <w:p>
             <w:r>
@@ -1225,11 +1382,21 @@
             </w:r>
           </w:p>
         </w:tc>
+        <w:tc>
+          <w:tcPr>
+            <w:tcW w:type="dxa" w:w="1728"/>
+          </w:tcPr>
+          <w:p>
+            <w:r>
+              <w:t>Updated arbitration mechanism based on prior legal review.</w:t>
+            </w:r>
+          </w:p>
+        </w:tc>
       </w:tr>
       <w:tr>
         <w:tc>
           <w:tcPr>
-            <w:tcW w:type="dxa" w:w="2160"/>
+            <w:tcW w:type="dxa" w:w="1728"/>
           </w:tcPr>
           <w:p>
             <w:r>
@@ -1239,7 +1406,7 @@
         </w:tc>
         <w:tc>
           <w:tcPr>
-            <w:tcW w:type="dxa" w:w="2160"/>
+            <w:tcW w:type="dxa" w:w="1728"/>
           </w:tcPr>
           <w:p>
             <w:r>
@@ -1249,21 +1416,31 @@
         </w:tc>
         <w:tc>
           <w:tcPr>
-            <w:tcW w:type="dxa" w:w="2160"/>
-          </w:tcPr>
-          <w:p>
-            <w:r>
-              <w:t>1 Readiness and free storage. Supplier shall issue a readiness notice after FAT clearance. If Buyer defers collection after readiness notice, Supplier shall store the affected equipment free of charge for the first three (3) working days only</w:t>
-            </w:r>
-          </w:p>
-        </w:tc>
-        <w:tc>
-          <w:tcPr>
-            <w:tcW w:type="dxa" w:w="2160"/>
+            <w:tcW w:type="dxa" w:w="1728"/>
+          </w:tcPr>
+          <w:p>
+            <w:r>
+              <w:t>Met</w:t>
+            </w:r>
+          </w:p>
+        </w:tc>
+        <w:tc>
+          <w:tcPr>
+            <w:tcW w:type="dxa" w:w="1728"/>
           </w:tcPr>
           <w:p>
             <w:r>
               <w:t>Article 00511.4 - Delivery, Readiness, and Storage</w:t>
+            </w:r>
+          </w:p>
+        </w:tc>
+        <w:tc>
+          <w:tcPr>
+            <w:tcW w:type="dxa" w:w="1728"/>
+          </w:tcPr>
+          <w:p>
+            <w:r>
+              <w:t>Expanded insurance coverage obligations.</w:t>
             </w:r>
           </w:p>
         </w:tc>
@@ -1271,7 +1448,7 @@
       <w:tr>
         <w:tc>
           <w:tcPr>
-            <w:tcW w:type="dxa" w:w="2160"/>
+            <w:tcW w:type="dxa" w:w="1728"/>
           </w:tcPr>
           <w:p>
             <w:r>
@@ -1281,7 +1458,7 @@
         </w:tc>
         <w:tc>
           <w:tcPr>
-            <w:tcW w:type="dxa" w:w="2160"/>
+            <w:tcW w:type="dxa" w:w="1728"/>
           </w:tcPr>
           <w:p>
             <w:r>
@@ -1291,17 +1468,17 @@
         </w:tc>
         <w:tc>
           <w:tcPr>
-            <w:tcW w:type="dxa" w:w="2160"/>
-          </w:tcPr>
-          <w:p>
-            <w:r>
-              <w:t>1 Readiness and free storage. Supplier shall issue a readiness notice after FAT clearance. If Buyer defers collection after readiness notice, Supplier shall store the affected equipment free of charge for the first three (3) working days only</w:t>
-            </w:r>
-          </w:p>
-        </w:tc>
-        <w:tc>
-          <w:tcPr>
-            <w:tcW w:type="dxa" w:w="2160"/>
+            <w:tcW w:type="dxa" w:w="1728"/>
+          </w:tcPr>
+          <w:p>
+            <w:r>
+              <w:t>Met</w:t>
+            </w:r>
+          </w:p>
+        </w:tc>
+        <w:tc>
+          <w:tcPr>
+            <w:tcW w:type="dxa" w:w="1728"/>
           </w:tcPr>
           <w:p>
             <w:r>
@@ -1311,11 +1488,21 @@
             </w:r>
           </w:p>
         </w:tc>
+        <w:tc>
+          <w:tcPr>
+            <w:tcW w:type="dxa" w:w="1728"/>
+          </w:tcPr>
+          <w:p>
+            <w:r>
+              <w:t>Expanded insurance coverage obligations.</w:t>
+            </w:r>
+          </w:p>
+        </w:tc>
       </w:tr>
       <w:tr>
         <w:tc>
           <w:tcPr>
-            <w:tcW w:type="dxa" w:w="2160"/>
+            <w:tcW w:type="dxa" w:w="1728"/>
           </w:tcPr>
           <w:p>
             <w:r>
@@ -1325,7 +1512,7 @@
         </w:tc>
         <w:tc>
           <w:tcPr>
-            <w:tcW w:type="dxa" w:w="2160"/>
+            <w:tcW w:type="dxa" w:w="1728"/>
           </w:tcPr>
           <w:p>
             <w:r>
@@ -1335,17 +1522,17 @@
         </w:tc>
         <w:tc>
           <w:tcPr>
-            <w:tcW w:type="dxa" w:w="2160"/>
-          </w:tcPr>
-          <w:p>
-            <w:r>
-              <w:t>1 Defect liability cap. Supplier shall correct defects arising during the guarantee period. Supplier's aggregate liability for repair or replacement of defective equipment under this Article shall not exceed ten percent (10%) of the total Purchase Order value</w:t>
-            </w:r>
-          </w:p>
-        </w:tc>
-        <w:tc>
-          <w:tcPr>
-            <w:tcW w:type="dxa" w:w="2160"/>
+            <w:tcW w:type="dxa" w:w="1728"/>
+          </w:tcPr>
+          <w:p>
+            <w:r>
+              <w:t>Met</w:t>
+            </w:r>
+          </w:p>
+        </w:tc>
+        <w:tc>
+          <w:tcPr>
+            <w:tcW w:type="dxa" w:w="1728"/>
           </w:tcPr>
           <w:p>
             <w:r>
@@ -1355,11 +1542,21 @@
             </w:r>
           </w:p>
         </w:tc>
+        <w:tc>
+          <w:tcPr>
+            <w:tcW w:type="dxa" w:w="1728"/>
+          </w:tcPr>
+          <w:p>
+            <w:r>
+              <w:t>Reduced liability exposure through revised cap language.</w:t>
+            </w:r>
+          </w:p>
+        </w:tc>
       </w:tr>
       <w:tr>
         <w:tc>
           <w:tcPr>
-            <w:tcW w:type="dxa" w:w="2160"/>
+            <w:tcW w:type="dxa" w:w="1728"/>
           </w:tcPr>
           <w:p>
             <w:r>
@@ -1369,7 +1566,7 @@
         </w:tc>
         <w:tc>
           <w:tcPr>
-            <w:tcW w:type="dxa" w:w="2160"/>
+            <w:tcW w:type="dxa" w:w="1728"/>
           </w:tcPr>
           <w:p>
             <w:r>
@@ -1379,17 +1576,17 @@
         </w:tc>
         <w:tc>
           <w:tcPr>
-            <w:tcW w:type="dxa" w:w="2160"/>
-          </w:tcPr>
-          <w:p>
-            <w:r>
-              <w:t>1 Defect liability cap. Supplier shall correct defects arising during the guarantee period. Supplier's aggregate liability for repair or replacement of defective equipment under this Article shall not exceed ten percent (10%) of the total Purchase Order value</w:t>
-            </w:r>
-          </w:p>
-        </w:tc>
-        <w:tc>
-          <w:tcPr>
-            <w:tcW w:type="dxa" w:w="2160"/>
+            <w:tcW w:type="dxa" w:w="1728"/>
+          </w:tcPr>
+          <w:p>
+            <w:r>
+              <w:t>Partially Met</w:t>
+            </w:r>
+          </w:p>
+        </w:tc>
+        <w:tc>
+          <w:tcPr>
+            <w:tcW w:type="dxa" w:w="1728"/>
           </w:tcPr>
           <w:p>
             <w:r>
@@ -1399,11 +1596,21 @@
             </w:r>
           </w:p>
         </w:tc>
+        <w:tc>
+          <w:tcPr>
+            <w:tcW w:type="dxa" w:w="1728"/>
+          </w:tcPr>
+          <w:p>
+            <w:r>
+              <w:t>Reduced liability exposure through revised cap language.</w:t>
+            </w:r>
+          </w:p>
+        </w:tc>
       </w:tr>
       <w:tr>
         <w:tc>
           <w:tcPr>
-            <w:tcW w:type="dxa" w:w="2160"/>
+            <w:tcW w:type="dxa" w:w="1728"/>
           </w:tcPr>
           <w:p>
             <w:r>
@@ -1413,7 +1620,7 @@
         </w:tc>
         <w:tc>
           <w:tcPr>
-            <w:tcW w:type="dxa" w:w="2160"/>
+            <w:tcW w:type="dxa" w:w="1728"/>
           </w:tcPr>
           <w:p>
             <w:r>
@@ -1423,17 +1630,17 @@
         </w:tc>
         <w:tc>
           <w:tcPr>
-            <w:tcW w:type="dxa" w:w="2160"/>
-          </w:tcPr>
-          <w:p>
-            <w:r>
-              <w:t>1 Consequential damages waiver. Neither party shall be liable to the other for loss of revenue, loss of profit, loss of use, loss of production, downtime, loss of business opportunity, indirect damages, special damages, punitive damages, exemplary damages, or consequential damages. The exclusion in Article 00511</w:t>
-            </w:r>
-          </w:p>
-        </w:tc>
-        <w:tc>
-          <w:tcPr>
-            <w:tcW w:type="dxa" w:w="2160"/>
+            <w:tcW w:type="dxa" w:w="1728"/>
+          </w:tcPr>
+          <w:p>
+            <w:r>
+              <w:t>Partially Met</w:t>
+            </w:r>
+          </w:p>
+        </w:tc>
+        <w:tc>
+          <w:tcPr>
+            <w:tcW w:type="dxa" w:w="1728"/>
           </w:tcPr>
           <w:p>
             <w:r>
@@ -1445,11 +1652,21 @@
             </w:r>
           </w:p>
         </w:tc>
+        <w:tc>
+          <w:tcPr>
+            <w:tcW w:type="dxa" w:w="1728"/>
+          </w:tcPr>
+          <w:p>
+            <w:r>
+              <w:t>Clarified exclusions and carve-outs after legal review.</w:t>
+            </w:r>
+          </w:p>
+        </w:tc>
       </w:tr>
       <w:tr>
         <w:tc>
           <w:tcPr>
-            <w:tcW w:type="dxa" w:w="2160"/>
+            <w:tcW w:type="dxa" w:w="1728"/>
           </w:tcPr>
           <w:p>
             <w:r>
@@ -1459,7 +1676,7 @@
         </w:tc>
         <w:tc>
           <w:tcPr>
-            <w:tcW w:type="dxa" w:w="2160"/>
+            <w:tcW w:type="dxa" w:w="1728"/>
           </w:tcPr>
           <w:p>
             <w:r>
@@ -1469,17 +1686,17 @@
         </w:tc>
         <w:tc>
           <w:tcPr>
-            <w:tcW w:type="dxa" w:w="2160"/>
-          </w:tcPr>
-          <w:p>
-            <w:r>
-              <w:t>1 Consequential damages waiver. Neither party shall be liable to the other for loss of revenue, loss of profit, loss of use, loss of production, downtime, loss of business opportunity, indirect damages, special damages, punitive damages, exemplary damages, or consequential damages. The exclusion in Article 00511</w:t>
-            </w:r>
-          </w:p>
-        </w:tc>
-        <w:tc>
-          <w:tcPr>
-            <w:tcW w:type="dxa" w:w="2160"/>
+            <w:tcW w:type="dxa" w:w="1728"/>
+          </w:tcPr>
+          <w:p>
+            <w:r>
+              <w:t>Partially Met</w:t>
+            </w:r>
+          </w:p>
+        </w:tc>
+        <w:tc>
+          <w:tcPr>
+            <w:tcW w:type="dxa" w:w="1728"/>
           </w:tcPr>
           <w:p>
             <w:r>
@@ -1491,11 +1708,21 @@
             </w:r>
           </w:p>
         </w:tc>
+        <w:tc>
+          <w:tcPr>
+            <w:tcW w:type="dxa" w:w="1728"/>
+          </w:tcPr>
+          <w:p>
+            <w:r>
+              <w:t>Clarified exclusions and carve-outs after legal review.</w:t>
+            </w:r>
+          </w:p>
+        </w:tc>
       </w:tr>
       <w:tr>
         <w:tc>
           <w:tcPr>
-            <w:tcW w:type="dxa" w:w="2160"/>
+            <w:tcW w:type="dxa" w:w="1728"/>
           </w:tcPr>
           <w:p>
             <w:r>
@@ -1505,7 +1732,7 @@
         </w:tc>
         <w:tc>
           <w:tcPr>
-            <w:tcW w:type="dxa" w:w="2160"/>
+            <w:tcW w:type="dxa" w:w="1728"/>
           </w:tcPr>
           <w:p>
             <w:r>
@@ -1515,21 +1742,31 @@
         </w:tc>
         <w:tc>
           <w:tcPr>
-            <w:tcW w:type="dxa" w:w="2160"/>
-          </w:tcPr>
-          <w:p>
-            <w:r>
-              <w:t>Force Majeure means an event beyond the reasonable control of the affected party, including Act of God, expropriation, nationalization, embargo, changes in law or regulation, war, sabotage, floods, severe weather, fires, strikes, lockouts, epidemics, pandemics, quarantine restrictions, and government action directly preventing performance. 2 Supply-chain events. Supplier may claim Force Majeure relief for events affecting only the Tier-1 critical sub-suppliers named in Annex D or the approved international logistics carrier</w:t>
-            </w:r>
-          </w:p>
-        </w:tc>
-        <w:tc>
-          <w:tcPr>
-            <w:tcW w:type="dxa" w:w="2160"/>
+            <w:tcW w:type="dxa" w:w="1728"/>
+          </w:tcPr>
+          <w:p>
+            <w:r>
+              <w:t>Met</w:t>
+            </w:r>
+          </w:p>
+        </w:tc>
+        <w:tc>
+          <w:tcPr>
+            <w:tcW w:type="dxa" w:w="1728"/>
           </w:tcPr>
           <w:p>
             <w:r>
               <w:t>Annex D approved critical sub-suppliers: BrightForge Rings Pvt.</w:t>
+            </w:r>
+          </w:p>
+        </w:tc>
+        <w:tc>
+          <w:tcPr>
+            <w:tcW w:type="dxa" w:w="1728"/>
+          </w:tcPr>
+          <w:p>
+            <w:r>
+              <w:t>Approved alternate vendors and defined substitution controls.</w:t>
             </w:r>
           </w:p>
         </w:tc>
@@ -1537,7 +1774,7 @@
       <w:tr>
         <w:tc>
           <w:tcPr>
-            <w:tcW w:type="dxa" w:w="2160"/>
+            <w:tcW w:type="dxa" w:w="1728"/>
           </w:tcPr>
           <w:p>
             <w:r>
@@ -1547,7 +1784,7 @@
         </w:tc>
         <w:tc>
           <w:tcPr>
-            <w:tcW w:type="dxa" w:w="2160"/>
+            <w:tcW w:type="dxa" w:w="1728"/>
           </w:tcPr>
           <w:p>
             <w:r>
@@ -1557,21 +1794,31 @@
         </w:tc>
         <w:tc>
           <w:tcPr>
-            <w:tcW w:type="dxa" w:w="2160"/>
-          </w:tcPr>
-          <w:p>
-            <w:r>
-              <w:t>Force Majeure means an event beyond the reasonable control of the affected party, including Act of God, expropriation, nationalization, embargo, changes in law or regulation, war, sabotage, floods, severe weather, fires, strikes, lockouts, epidemics, pandemics, quarantine restrictions, and government action directly preventing performance. 2 Supply-chain events. Supplier may claim Force Majeure relief for events affecting only the Tier-1 critical sub-suppliers named in Annex D or the approved international logistics carrier</w:t>
-            </w:r>
-          </w:p>
-        </w:tc>
-        <w:tc>
-          <w:tcPr>
-            <w:tcW w:type="dxa" w:w="2160"/>
+            <w:tcW w:type="dxa" w:w="1728"/>
+          </w:tcPr>
+          <w:p>
+            <w:r>
+              <w:t>Met</w:t>
+            </w:r>
+          </w:p>
+        </w:tc>
+        <w:tc>
+          <w:tcPr>
+            <w:tcW w:type="dxa" w:w="1728"/>
           </w:tcPr>
           <w:p>
             <w:r>
               <w:t>Annex D approved critical sub-suppliers: BrightForge Rings Pvt.</w:t>
+            </w:r>
+          </w:p>
+        </w:tc>
+        <w:tc>
+          <w:tcPr>
+            <w:tcW w:type="dxa" w:w="1728"/>
+          </w:tcPr>
+          <w:p>
+            <w:r>
+              <w:t>Approved alternate vendors and defined substitution controls.</w:t>
             </w:r>
           </w:p>
         </w:tc>
@@ -1579,7 +1826,7 @@
       <w:tr>
         <w:tc>
           <w:tcPr>
-            <w:tcW w:type="dxa" w:w="2160"/>
+            <w:tcW w:type="dxa" w:w="1728"/>
           </w:tcPr>
           <w:p>
             <w:r>
@@ -1589,7 +1836,7 @@
         </w:tc>
         <w:tc>
           <w:tcPr>
-            <w:tcW w:type="dxa" w:w="2160"/>
+            <w:tcW w:type="dxa" w:w="1728"/>
           </w:tcPr>
           <w:p>
             <w:r>
@@ -1599,21 +1846,31 @@
         </w:tc>
         <w:tc>
           <w:tcPr>
-            <w:tcW w:type="dxa" w:w="2160"/>
-          </w:tcPr>
-          <w:p>
-            <w:r>
-              <w:t>Subject to Supplier acknowledging the Purchase Order and furnishing the documents listed in Annex B, Buyer shall arrange an advance equal to forty-five percent (45%) of the Purchase Order value. Thirty percent (30%) is payable within five (5) business days after PO acknowledgement. The remaining fifteen percent (15%) is payable only after Buyer receives the performance bank guarantee, the project kick-off minutes signed by both parties, and the first document submission register</w:t>
-            </w:r>
-          </w:p>
-        </w:tc>
-        <w:tc>
-          <w:tcPr>
-            <w:tcW w:type="dxa" w:w="2160"/>
+            <w:tcW w:type="dxa" w:w="1728"/>
+          </w:tcPr>
+          <w:p>
+            <w:r>
+              <w:t>Partially Met</w:t>
+            </w:r>
+          </w:p>
+        </w:tc>
+        <w:tc>
+          <w:tcPr>
+            <w:tcW w:type="dxa" w:w="1728"/>
           </w:tcPr>
           <w:p>
             <w:r>
               <w:t>Clause 00511.2.2 states: 'Buyer shall pay accepted invoices within thirty (30) days after receipt of a valid tax invoice.' However, the clause includes exceptions (disputed amounts) and modifies the timing trigger to start from the later acceptance record, not the invoice date.</w:t>
+            </w:r>
+          </w:p>
+        </w:tc>
+        <w:tc>
+          <w:tcPr>
+            <w:tcW w:type="dxa" w:w="1728"/>
+          </w:tcPr>
+          <w:p>
+            <w:r>
+              <w:t>Negotiated milestone-based payment schedule and removed conditional payment dependencies.</w:t>
             </w:r>
           </w:p>
         </w:tc>
@@ -1621,7 +1878,7 @@
       <w:tr>
         <w:tc>
           <w:tcPr>
-            <w:tcW w:type="dxa" w:w="2160"/>
+            <w:tcW w:type="dxa" w:w="1728"/>
           </w:tcPr>
           <w:p>
             <w:r>
@@ -1631,7 +1888,7 @@
         </w:tc>
         <w:tc>
           <w:tcPr>
-            <w:tcW w:type="dxa" w:w="2160"/>
+            <w:tcW w:type="dxa" w:w="1728"/>
           </w:tcPr>
           <w:p>
             <w:r>
@@ -1641,21 +1898,31 @@
         </w:tc>
         <w:tc>
           <w:tcPr>
-            <w:tcW w:type="dxa" w:w="2160"/>
-          </w:tcPr>
-          <w:p>
-            <w:r>
-              <w:t>Subject to Supplier acknowledging the Purchase Order and furnishing the documents listed in Annex B, Buyer shall arrange an advance equal to forty-five percent (45%) of the Purchase Order value. Thirty percent (30%) is payable within five (5) business days after PO acknowledgement. The remaining fifteen percent (15%) is payable only after Buyer receives the performance bank guarantee, the project kick-off minutes signed by both parties, and the first document submission register</w:t>
-            </w:r>
-          </w:p>
-        </w:tc>
-        <w:tc>
-          <w:tcPr>
-            <w:tcW w:type="dxa" w:w="2160"/>
+            <w:tcW w:type="dxa" w:w="1728"/>
+          </w:tcPr>
+          <w:p>
+            <w:r>
+              <w:t>Met</w:t>
+            </w:r>
+          </w:p>
+        </w:tc>
+        <w:tc>
+          <w:tcPr>
+            <w:tcW w:type="dxa" w:w="1728"/>
           </w:tcPr>
           <w:p>
             <w:r>
               <w:t>Clause 00511.2.3 explicitly permits 'Supplier may dispatch Lot A, Lot B, and Lot C separately and may raise a corresponding invoice for each completed lot.'</w:t>
+            </w:r>
+          </w:p>
+        </w:tc>
+        <w:tc>
+          <w:tcPr>
+            <w:tcW w:type="dxa" w:w="1728"/>
+          </w:tcPr>
+          <w:p>
+            <w:r>
+              <w:t>Negotiated milestone-based payment schedule and removed conditional payment dependencies.</w:t>
             </w:r>
           </w:p>
         </w:tc>
@@ -1787,7 +2054,7 @@
           </w:tcPr>
           <w:p>
             <w:r>
-              <w:t>Delayed payment due to conditional advance tranche release.</w:t>
+              <w:t>Delayed payment due to conditional advance tranches.</w:t>
             </w:r>
           </w:p>
         </w:tc>
@@ -1797,7 +2064,7 @@
           </w:tcPr>
           <w:p>
             <w:r>
-              <w:t>The clause introduces multiple conditions (bank guarantee, kick-off minutes, document submission) for receiving the second advance payment. Failure to meet these within twenty days triggers a deferral of payment, creating cash flow risk and potential disruption to the supplier's operations. This is partially met as the requirement exists but isn't fully satisfied.</w:t>
+              <w:t>The partially met compliance indicates a risk of delayed payments linked to multiple conditions (performance guarantee, kick-off minutes, first document submission). This creates cash flow uncertainty for the supplier and potential operational delays. The buyer's deferral option further complicates this.</w:t>
             </w:r>
           </w:p>
         </w:tc>
@@ -1807,7 +2074,7 @@
           </w:tcPr>
           <w:p>
             <w:r>
-              <w:t>Require documented evidence of completion of all conditions within 10 business days of PO acknowledgement.</w:t>
+              <w:t>Require objective evidence verification within 10 business days; define acceptance criteria clearly.</w:t>
             </w:r>
           </w:p>
         </w:tc>
@@ -1849,7 +2116,7 @@
           </w:tcPr>
           <w:p>
             <w:r>
-              <w:t>Increased total performance security exposure exceeding 10%.</w:t>
+              <w:t>Supplier exceeds performance security limits, creating financial exposure.</w:t>
             </w:r>
           </w:p>
         </w:tc>
@@ -1859,7 +2126,7 @@
           </w:tcPr>
           <w:p>
             <w:r>
-              <w:t>The Supplier provides a 10% performance guarantee plus a 2% bridge guarantee, totaling 12%. This exceeds the permitted limit outlined in Article 00511.3.1 and creates a significant financial risk for the Buyer.</w:t>
+              <w:t>The Supplier is providing a bridge guarantee of 2% and a standard guarantee of 10%, totaling 12%. This exceeds the permitted limit of 10% as defined in Article 00511.3.1, potentially leading to increased costs or disputes regarding security obligations.</w:t>
             </w:r>
           </w:p>
         </w:tc>
@@ -1869,7 +2136,7 @@
           </w:tcPr>
           <w:p>
             <w:r>
-              <w:t>Reduce total security obligations to a maximum of 10 percent, excluding any additional bridge guarantees.</w:t>
+              <w:t>Reduce total performance security to a maximum of 10 percent including bridge guarantees.</w:t>
             </w:r>
           </w:p>
         </w:tc>
@@ -1911,7 +2178,7 @@
           </w:tcPr>
           <w:p>
             <w:r>
-              <w:t>Potential for significant liquidated damages exposure due to limitations.</w:t>
+              <w:t>Supplier may assess excessive liquidated damages due to capped exposure.</w:t>
             </w:r>
           </w:p>
         </w:tc>
@@ -1921,7 +2188,7 @@
           </w:tcPr>
           <w:p>
             <w:r>
-              <w:t>The clause contains multiple caps (0.5%, 5%, and 7.5%) on LD, significantly restricting the Buyer's ability to recover costs associated with delays. This creates a considerable payment risk if deliveries are delayed.</w:t>
+              <w:t>The clause limits LDs to 7.5% of the PO value, including Critical Dispatch Documents and service credits. This creates a potential overpayment risk if delays trigger multiple components within the cap, exceeding the intended damage assessment. It matters because it impacts cash flow and potentially violates cost control objectives.</w:t>
             </w:r>
           </w:p>
         </w:tc>
@@ -1973,7 +2240,7 @@
           </w:tcPr>
           <w:p>
             <w:r>
-              <w:t>Supplier may avoid liquidated damages exceeding 7.5% of PO value.</w:t>
+              <w:t>Potential for significant liquidated damages exposure.</w:t>
             </w:r>
           </w:p>
         </w:tc>
@@ -1983,7 +2250,7 @@
           </w:tcPr>
           <w:p>
             <w:r>
-              <w:t>The clause contains an aggregate cap on delivery LD, deemed LD from critical documents, and service credits. This limits the Buyer's ability to enforce the standard 0.5% per week rate if multiple delays occur, potentially reducing recovery.</w:t>
+              <w:t>The clause establishes multiple caps on liquidated damages, including a 7.5% aggregate limit and a 5% limit on delayed equipment. This significantly restricts the Buyer's ability to recover costs associated with delivery delays, creating substantial financial risk.</w:t>
             </w:r>
           </w:p>
         </w:tc>
@@ -1993,7 +2260,7 @@
           </w:tcPr>
           <w:p>
             <w:r>
-              <w:t>Reduce aggregate LD and service-credit exposure to a maximum of 7.5 percent of PO value.</w:t>
+              <w:t>Reduce aggregate LD and service-credit exposure to a maximum of 5 percent of PO value.</w:t>
             </w:r>
           </w:p>
         </w:tc>
@@ -2035,7 +2302,7 @@
           </w:tcPr>
           <w:p>
             <w:r>
-              <w:t>Potential for increased liquidated damages exposure due to aggregate cap.</w:t>
+              <w:t>Potential for significant liquidated damages exposure due to capped limits.</w:t>
             </w:r>
           </w:p>
         </w:tc>
@@ -2045,7 +2312,7 @@
           </w:tcPr>
           <w:p>
             <w:r>
-              <w:t xml:space="preserve">The clause establishes a tiered LD structure (0.5% per week, capped at 5%) and an overall 7.5% aggregate cap. This creates risk that significant delays could trigger substantial financial penalties exceeding the initially anticipated 5% limit. </w:t>
+              <w:t>The clause establishes multiple caps on LD – 0.5% per week, a maximum of 5% of the undelivered value, and a total aggregate cap of 7.5%. This creates uncertainty regarding potential liability and could result in substantial additional costs if delays occur.</w:t>
             </w:r>
           </w:p>
         </w:tc>
@@ -2097,7 +2364,7 @@
           </w:tcPr>
           <w:p>
             <w:r>
-              <w:t>Supplier may exceed liquidated damages cap, creating payment exposure.</w:t>
+              <w:t>Supplier may exceed liquidated damages cap, incurring significant costs.</w:t>
             </w:r>
           </w:p>
         </w:tc>
@@ -2107,7 +2374,7 @@
           </w:tcPr>
           <w:p>
             <w:r>
-              <w:t>The clause establishes a 7.5% aggregate LD cap, exceeding the stated 5% limit. This creates an increased risk of significant additional payments to the supplier due to delayed equipment delivery.</w:t>
+              <w:t>The clause establishes a 7.5% aggregate LD cap but the Supplier has not met this requirement. This exposes the Buyer to potentially substantial additional payments due to delays, creating material financial risk and undermining cost control.</w:t>
             </w:r>
           </w:p>
         </w:tc>
@@ -2169,7 +2436,7 @@
           </w:tcPr>
           <w:p>
             <w:r>
-              <w:t>The clause introduces multiple caps and exceptions – a 0.5% weekly rate, a 5% value cap, and a 7.5% aggregate limit – creating uncertainty regarding potential LD payments. This limits the buyer's ability to accurately forecast costs.</w:t>
+              <w:t>The clause establishes multiple caps on LD, including a 7.5% aggregate limit and a 5% per-equipment limit. This significantly reduces the buyer's ability to recover costs associated with delivery delays, creating substantial payment risk.</w:t>
             </w:r>
           </w:p>
         </w:tc>
@@ -2231,7 +2498,7 @@
           </w:tcPr>
           <w:p>
             <w:r>
-              <w:t>The clause provides a guaranteed period of twelve months for repaired components, extending beyond the standard eighteen months. This significantly increases warranty costs and potential liabilities if defects persist. The conflict between component-specific and equipment-wide guarantees adds uncertainty.</w:t>
+              <w:t>The remedial guarantee of twelve months, coupled with the eighteen-month original dispatch warranty, introduces significant uncertainty regarding ongoing maintenance and repair costs. This extended duration increases the risk of unexpected expenses.</w:t>
             </w:r>
           </w:p>
         </w:tc>
@@ -2241,7 +2508,7 @@
           </w:tcPr>
           <w:p>
             <w:r>
-              <w:t>Reduce the remedial guarantee to eighteen months from original dispatch.</w:t>
+              <w:t>Limit guarantee period to the shortest allowable timeframe – eighteen months from original dispatch.</w:t>
             </w:r>
           </w:p>
         </w:tc>
@@ -2283,7 +2550,7 @@
           </w:tcPr>
           <w:p>
             <w:r>
-              <w:t>Extended guarantee period creates potential long-term warranty costs.</w:t>
+              <w:t>Extended guarantee period creates potential liability exposure.</w:t>
             </w:r>
           </w:p>
         </w:tc>
@@ -2293,7 +2560,7 @@
           </w:tcPr>
           <w:p>
             <w:r>
-              <w:t>The clause establishes multiple overlapping guarantee periods (12 months on repairs and 18 months from dispatch), significantly increasing the supplier's warranty obligations. This exposes the buyer to extended repair or replacement costs, especially if defects are not immediately apparent.</w:t>
+              <w:t>The clause provides a longer guarantee (18 months from dispatch) than the standard two-month guarantee, significantly increasing the Supplier's potential financial obligations and associated claims risk. This extended timeframe exposes the Buyer to prolonged repair costs.</w:t>
             </w:r>
           </w:p>
         </w:tc>
@@ -2303,7 +2570,7 @@
           </w:tcPr>
           <w:p>
             <w:r>
-              <w:t>Limit the overall guarantee period to the shortest duration – eighteen months from dispatch.</w:t>
+              <w:t>Reduce the remedial guarantee period to twelve months from completion of repair or replacement.</w:t>
             </w:r>
           </w:p>
         </w:tc>
@@ -2345,7 +2612,7 @@
           </w:tcPr>
           <w:p>
             <w:r>
-              <w:t>Limited guarantee duration exposes Buyer to long-term repair costs.</w:t>
+              <w:t>Reduced guarantee period creates potential warranty claims.</w:t>
             </w:r>
           </w:p>
         </w:tc>
@@ -2355,7 +2622,7 @@
           </w:tcPr>
           <w:p>
             <w:r>
-              <w:t>The remedial guarantee of twelve months, alongside the eighteen-month dispatch warranty, creates uncertainty regarding ongoing coverage. This limits the protection afforded during equipment operation and introduces potential for significant future expense if defects emerge later than the shorter period.</w:t>
+              <w:t>The remedial guarantee of twelve months, potentially shorter than expected, exposes the Buyer to extended repair and replacement obligations. This could lead to increased costs and operational disruption if defects persist beyond the defined timeframe.</w:t>
             </w:r>
           </w:p>
         </w:tc>
@@ -2365,7 +2632,7 @@
           </w:tcPr>
           <w:p>
             <w:r>
-              <w:t>Extend the remedial guarantee to a minimum of thirty-six months from original dispatch.</w:t>
+              <w:t>Require a minimum guarantee period of eighteen months from original dispatch.</w:t>
             </w:r>
           </w:p>
         </w:tc>
@@ -2407,7 +2674,7 @@
           </w:tcPr>
           <w:p>
             <w:r>
-              <w:t>Supplier may limit Force Majeure to specific Tier-1 suppliers.</w:t>
+              <w:t>Limited force majeure protection exposes the buyer to supply delays.</w:t>
             </w:r>
           </w:p>
         </w:tc>
@@ -2417,7 +2684,7 @@
           </w:tcPr>
           <w:p>
             <w:r>
-              <w:t>The clause restricts Force Majeure relief solely to Annex D sub-suppliers and approved logistics carriers, excluding other sub-contractors or alternative vendors. This creates a significant risk if disruptions occur beyond these specified tiers, potentially delaying performance and incurring costs without recourse under the agreement.</w:t>
+              <w:t>The clause's restriction to Tier-1 sub-suppliers and logistics carriers creates a significant vulnerability. The buyer is exposed to potential disruption if these key suppliers experience Force Majeure events, leading to non-performance or delivery delays without relief.</w:t>
             </w:r>
           </w:p>
         </w:tc>
@@ -2427,7 +2694,7 @@
           </w:tcPr>
           <w:p>
             <w:r>
-              <w:t>Expand Force Majeure scope to include all sub-tier suppliers and logistics providers where feasible.</w:t>
+              <w:t>Expand force majeure protection to include all approved sub-contractors and logistics providers within the supply chain.</w:t>
             </w:r>
           </w:p>
         </w:tc>
@@ -2469,7 +2736,7 @@
           </w:tcPr>
           <w:p>
             <w:r>
-              <w:t>Limited force majeure protection for subcontractors exposes the party.</w:t>
+              <w:t>Subcontractor force majeure exclusion creates payment risk.</w:t>
             </w:r>
           </w:p>
         </w:tc>
@@ -2479,7 +2746,7 @@
           </w:tcPr>
           <w:p>
             <w:r>
-              <w:t>The clause only applies to named Tier-1 suppliers and approved logistics, excluding other sub-contractors. This creates a significant risk if unforeseen events disrupt the supply chain beyond approved vendors, leading to potential delays, cost overruns, and unmet obligations without recourse.</w:t>
+              <w:t>The clause limits Force Majeure relief to named Tier-1 suppliers and approved logistics, excluding unnamed subcontractors. This exposes the client to potential non-performance or delays from sub-suppliers without recourse outlined in the standard Force Majeure provision.</w:t>
             </w:r>
           </w:p>
         </w:tc>
@@ -2489,7 +2756,7 @@
           </w:tcPr>
           <w:p>
             <w:r>
-              <w:t>Require extension of force majeure protection to all subcontractors and alternate vendors.</w:t>
+              <w:t>Require supplier to extend force majeure protection to all approved subcontractors and logistics providers.</w:t>
             </w:r>
           </w:p>
         </w:tc>
@@ -2531,7 +2798,7 @@
           </w:tcPr>
           <w:p>
             <w:r>
-              <w:t>Limited Force Majeure scope exposes the buyer to disruption.</w:t>
+              <w:t>Limited Force Majeure scope creates potential payment delays.</w:t>
             </w:r>
           </w:p>
         </w:tc>
@@ -2541,7 +2808,7 @@
           </w:tcPr>
           <w:p>
             <w:r>
-              <w:t>The clause's restricted application to Tier-1 suppliers and logistics carriers creates a significant vulnerability. The buyer's risk is heightened as it doesn't cover broader supply chain disruptions or internal operational issues, potentially leading to delays and increased costs.</w:t>
+              <w:t>The clause's restricted application to Tier-1 sub-suppliers and logistics carriers exposes the buyer to risks if these entities experience Force Majeure events, potentially delaying supplier performance and impacting payment schedules. The notice requirements further complicate this.</w:t>
             </w:r>
           </w:p>
         </w:tc>
@@ -2551,7 +2818,7 @@
           </w:tcPr>
           <w:p>
             <w:r>
-              <w:t>Expand Force Majeure coverage to include all approved sub-suppliers and logistics providers within the defined scope.</w:t>
+              <w:t>Expand Force Majeure coverage to include all approved subcontractors and logistics providers within the supply chain.</w:t>
             </w:r>
           </w:p>
         </w:tc>
@@ -2593,7 +2860,7 @@
           </w:tcPr>
           <w:p>
             <w:r>
-              <w:t>Delayed payment due to complex cancellation fee schedule.</w:t>
+              <w:t>Delayed payments due to escalating termination fees.</w:t>
             </w:r>
           </w:p>
         </w:tc>
@@ -2603,7 +2870,7 @@
           </w:tcPr>
           <w:p>
             <w:r>
-              <w:t>The escalating percentage based on days past acknowledgement creates a potential for protracted disputes regarding the appropriate fee. This could lead to cash flow issues and operational delays, particularly with longer notice periods.</w:t>
+              <w:t>The clause outlines a tiered fee schedule based on the length of time after convenience cancellation, increasing significantly beyond 90 days. This creates a cash flow risk for the supplier if Buyer exercises this right, potentially leading to financial strain and operational disruption.</w:t>
             </w:r>
           </w:p>
         </w:tc>
@@ -2613,7 +2880,7 @@
           </w:tcPr>
           <w:p>
             <w:r>
-              <w:t>Implement a clear, standardized process for convenience cancellations, including pre-agreed timelines and documented cost calculations.</w:t>
+              <w:t>Establish a fixed termination payment cap, irrespective of delay duration, at a maximum defined percentage (e.g., 30%).</w:t>
             </w:r>
           </w:p>
         </w:tc>
@@ -2655,7 +2922,7 @@
           </w:tcPr>
           <w:p>
             <w:r>
-              <w:t>Buyer exposed to escalating cancellation fees based on delay.</w:t>
+              <w:t>Delayed payment due to complex cancellation fee schedule.</w:t>
             </w:r>
           </w:p>
         </w:tc>
@@ -2665,7 +2932,7 @@
           </w:tcPr>
           <w:p>
             <w:r>
-              <w:t>The clause outlines a tiered fee schedule increasing with the length of time after convenience cancellation. This creates significant financial risk for the Supplier, particularly as delays extend beyond 90 days, potentially leading to disproportionately high costs.</w:t>
+              <w:t>The clause outlines a tiered cancellation fee structure based on the length of time before Buyer cancellation, increasing significantly after 90 days. This introduces uncertainty regarding the final payment amount and potential cash flow implications for the Supplier.</w:t>
             </w:r>
           </w:p>
         </w:tc>
@@ -2675,7 +2942,7 @@
           </w:tcPr>
           <w:p>
             <w:r>
-              <w:t>Cap the maximum cancellation fee at 30 days; specify a fixed fee for extended periods.</w:t>
+              <w:t>Implement a standardized early termination process with fixed fees across all order values to mitigate schedule complexity.</w:t>
             </w:r>
           </w:p>
         </w:tc>
@@ -2717,7 +2984,7 @@
           </w:tcPr>
           <w:p>
             <w:r>
-              <w:t>Non-compliance exposes the buyer to a 38% cancellation fee.</w:t>
+              <w:t>Failure to pay cancellation fee exposes the buyer to increased costs.</w:t>
             </w:r>
           </w:p>
         </w:tc>
@@ -2727,7 +2994,7 @@
           </w:tcPr>
           <w:p>
             <w:r>
-              <w:t>The clause mandates a 38% cancellation fee for orders cancelled within 61-90 days. The non-met status indicates this obligation is not fulfilled, creating a significant and immediate payment risk.</w:t>
+              <w:t>The contract stipulates a percentage-based cancellation fee dependent on the length of notice. The non-compliance creates an exposure for the buyer to pay a higher termination fee than outlined in the agreement, impacting cash flow and potentially increasing financial liability.</w:t>
             </w:r>
           </w:p>
         </w:tc>
@@ -2737,7 +3004,7 @@
           </w:tcPr>
           <w:p>
             <w:r>
-              <w:t>Require supplier to provide detailed justification for the delay if cancellation occurs within the 61-90 day window.</w:t>
+              <w:t>Implement rigorous invoice validation processes to ensure accurate calculation and timely payment of the applicable cancellation fee.</w:t>
             </w:r>
           </w:p>
         </w:tc>
@@ -2779,7 +3046,7 @@
           </w:tcPr>
           <w:p>
             <w:r>
-              <w:t>Potential for increased costs and schedule delays due to exceeding suspension limits.</w:t>
+              <w:t>Potential for increased costs due to excessive suspensions.</w:t>
             </w:r>
           </w:p>
         </w:tc>
@@ -2789,7 +3056,7 @@
           </w:tcPr>
           <w:p>
             <w:r>
-              <w:t>The clause allows for up to two commercial convenience suspensions totaling 30 days, excluding regulatory stoppages. Partial compliance indicates the Buyer may exceed this limit, triggering compensable change order provisions if done without Supplier agreement. This creates risk of additional costs and extended timelines.</w:t>
+              <w:t>The clause allows up to two commercial convenience suspensions totaling thirty days, excluding regulatory stoppages. Partial compliance means the Buyer could potentially exceed this limit without triggering compensable change orders, exposing the Supplier to unexpected delays and related costs.</w:t>
             </w:r>
           </w:p>
         </w:tc>
@@ -2799,7 +3066,7 @@
           </w:tcPr>
           <w:p>
             <w:r>
-              <w:t>Require written supplier agreement before exceeding suspension limits; implement strict monitoring of all suspension durations.</w:t>
+              <w:t>Implement a rigorous tracking system for all suspension requests and their durations, enforcing strict adherence to the 30-day aggregate limit.</w:t>
             </w:r>
           </w:p>
         </w:tc>
@@ -2841,7 +3108,7 @@
           </w:tcPr>
           <w:p>
             <w:r>
-              <w:t>Potential for increased costs and delays due to excessive suspensions.</w:t>
+              <w:t>Buyer's discretionary suspension power creates potential cash flow disruption.</w:t>
             </w:r>
           </w:p>
         </w:tc>
@@ -2851,7 +3118,7 @@
           </w:tcPr>
           <w:p>
             <w:r>
-              <w:t>The clause allows for up to two commercial convenience suspensions totaling 30 days. Exceeding this limit triggers a change order, potentially leading to schedule extensions, cost increases, and disputes regarding compensable events.</w:t>
+              <w:t>The clause allows for two commercial convenience suspensions up to 30 days, contingent on supplier agreement. Exceeding this limit triggers a change order, potentially leading to unexpected costs and delays impacting payment schedules and forecasts.</w:t>
             </w:r>
           </w:p>
         </w:tc>
@@ -2861,7 +3128,7 @@
           </w:tcPr>
           <w:p>
             <w:r>
-              <w:t>Establish clear criteria for 'commercial convenience' and implement proactive communication protocols with the supplier to minimize suspension requests.</w:t>
+              <w:t>Require written prior approval for any suspension exceeding the stated limits.</w:t>
             </w:r>
           </w:p>
         </w:tc>
@@ -2903,7 +3170,7 @@
           </w:tcPr>
           <w:p>
             <w:r>
-              <w:t>Increased jurisdictional risk due to Indian governing law.</w:t>
+              <w:t>Increased legal and jurisdictional risk due to India governance.</w:t>
             </w:r>
           </w:p>
         </w:tc>
@@ -2913,7 +3180,7 @@
           </w:tcPr>
           <w:p>
             <w:r>
-              <w:t>The Purchase Order is governed by Indian law, excluding conflict of laws principles. This creates potential legal complexities and uncertainties regarding interpretation and enforcement, particularly given the supplier's location and operations. The exclusion of conflict-of-law principles exacerbates this risk.</w:t>
+              <w:t>Governing law is solely India, excluding conflict of laws. This limits the applicability of international legal principles and potentially exposes us to Indian regulations which may be less favorable than our standard practice. The clause offers limited protection.</w:t>
             </w:r>
           </w:p>
         </w:tc>
@@ -2923,7 +3190,7 @@
           </w:tcPr>
           <w:p>
             <w:r>
-              <w:t>Specify governing law as [Insert Preferred Jurisdiction - e.g., England &amp; Wales] to mitigate jurisdictional uncertainty.</w:t>
+              <w:t>Require governing law to be [Specified Jurisdiction - e.g., Delaware] for all contracts.</w:t>
             </w:r>
           </w:p>
         </w:tc>
@@ -2965,7 +3232,7 @@
           </w:tcPr>
           <w:p>
             <w:r>
-              <w:t>Potential for increased arbitration costs and delays.</w:t>
+              <w:t>Arbitration process may prove costly and time-consuming.</w:t>
             </w:r>
           </w:p>
         </w:tc>
@@ -2975,7 +3242,7 @@
           </w:tcPr>
           <w:p>
             <w:r>
-              <w:t>The tiered dispute resolution process, involving a technical expert in Mumbai followed by Singapore arbitration, introduces complexity and potential for protracted legal proceedings. This could increase associated costs and timelines.</w:t>
+              <w:t>The two-stage dispute resolution – initial expert determination followed by arbitration – introduces potential delays and expenses. The Mumbai expert step adds an additional layer of complexity and cost if rejected.</w:t>
             </w:r>
           </w:p>
         </w:tc>
@@ -2985,7 +3252,7 @@
           </w:tcPr>
           <w:p>
             <w:r>
-              <w:t>Establish clear thresholds for escalation to formal arbitration with defined cost-sharing provisions.</w:t>
+              <w:t>Implement a clearly defined protocol for managing expert determinations to minimize unnecessary escalation to Singapore arbitration.</w:t>
             </w:r>
           </w:p>
         </w:tc>
@@ -3027,7 +3294,7 @@
           </w:tcPr>
           <w:p>
             <w:r>
-              <w:t>Potential for increased arbitration costs and delays.</w:t>
+              <w:t>Arbitration seat limitations may escalate disputes costs.</w:t>
             </w:r>
           </w:p>
         </w:tc>
@@ -3037,7 +3304,7 @@
           </w:tcPr>
           <w:p>
             <w:r>
-              <w:t>The two-stage dispute resolution process – initial expert determination in Mumbai followed by arbitration in Singapore – introduces complexity. The need to engage with an expert first may prolong the initial phase, increasing overall costs and delaying final resolution of the legal dispute.</w:t>
+              <w:t>The clause dictates a two-stage process: initial expert determination in Mumbai followed by arbitration only for remaining legal disputes in Singapore. This bifurcated approach introduces potential delays and increased legal fees due to the need to engage with both jurisdictions, potentially increasing overall dispute resolution expenses.</w:t>
             </w:r>
           </w:p>
         </w:tc>
@@ -3047,7 +3314,7 @@
           </w:tcPr>
           <w:p>
             <w:r>
-              <w:t>Require all disputes to proceed directly to final binding arbitration in Singapore, eliminating the preliminary expert stage.</w:t>
+              <w:t>Establish clear guidelines regarding escalation criteria and associated cost allocation between parties.</w:t>
             </w:r>
           </w:p>
         </w:tc>
@@ -3089,7 +3356,7 @@
           </w:tcPr>
           <w:p>
             <w:r>
-              <w:t>Reduced liability coverage for emergency stabilization costs.</w:t>
+              <w:t>Reduced liability coverage for safety shutdown emergencies.</w:t>
             </w:r>
           </w:p>
         </w:tc>
@@ -3099,7 +3366,7 @@
           </w:tcPr>
           <w:p>
             <w:r>
-              <w:t>The clause limits liability to 10% of the PO value but excludes direct costs associated with safety shutdowns due to defects. This creates a significant financial exposure if emergency remediation is required, potentially exceeding the capped amount and leaving the client responsible for substantial additional expenses. It matters because it reduces protection.</w:t>
+              <w:t>The clause excludes emergency removal costs when a defect triggers a safety shutdown, effectively limiting the supplier's liability cap. This creates significant exposure if such an event occurs, potentially leading to substantial uninsured damages and increased financial risk.</w:t>
             </w:r>
           </w:p>
         </w:tc>
@@ -3109,7 +3376,7 @@
           </w:tcPr>
           <w:p>
             <w:r>
-              <w:t>Exclude emergency removal, re-installation, or temporary site stabilization costs from liability cap calculations.</w:t>
+              <w:t>Define 'safety shutdown' with clear triggering criteria and extend the 10% liability cap to cover these excluded emergency costs.</w:t>
             </w:r>
           </w:p>
         </w:tc>
@@ -3151,7 +3418,7 @@
           </w:tcPr>
           <w:p>
             <w:r>
-              <w:t>Potential for significant liability exposure due to excluded consequential damages.</w:t>
+              <w:t>Partial exclusion of consequential damages exposes the company to significant financial risk.</w:t>
             </w:r>
           </w:p>
         </w:tc>
@@ -3161,7 +3428,7 @@
           </w:tcPr>
           <w:p>
             <w:r>
-              <w:t>Despite excluding many types of damages, the clause retains exceptions related to breaches, fraud, and gross negligence. This leaves the party vulnerable to claims arising from unforeseen circumstances or disruptions not explicitly carved out, creating substantial financial risk.</w:t>
+              <w:t>Despite a broad exclusion, exceptions exist for specific events like confidentiality breaches and gross negligence. This creates uncertainty regarding liability coverage for unforeseen losses beyond direct damages, potentially leading to unexpected costs and disputes. The clause's partial fulfillment indicates insufficient protection.</w:t>
             </w:r>
           </w:p>
         </w:tc>
@@ -3171,7 +3438,7 @@
           </w:tcPr>
           <w:p>
             <w:r>
-              <w:t>Maintain the current exclusion of consequential damages with all stated exceptions.</w:t>
+              <w:t>Implement enhanced due diligence on key performance indicators and establish clear trigger points for consequential loss claims based on the defined exceptions.</w:t>
             </w:r>
           </w:p>
         </w:tc>
@@ -3213,7 +3480,7 @@
           </w:tcPr>
           <w:p>
             <w:r>
-              <w:t>Potential for significant liability exposure beyond PO value.</w:t>
+              <w:t>Potential for significant liability despite exclusion.</w:t>
             </w:r>
           </w:p>
         </w:tc>
@@ -3223,7 +3490,7 @@
           </w:tcPr>
           <w:p>
             <w:r>
-              <w:t>The clause limits consequential damages but includes numerous exceptions (confidentiality, indemnity, infringement, gross negligence, etc.). These carve-outs significantly reduce the protection against unforeseen losses related to breaches or misconduct, creating substantial legal and financial risk. This exposes the company to potentially unlimited liability.</w:t>
+              <w:t>The clause excludes many potential damages, but numerous exceptions exist. These include breaches of confidentiality, indemnity obligations, and specific types of negligence, creating a substantial exposure if any of these triggers occur. This exposes the client to potentially unlimited costs.</w:t>
             </w:r>
           </w:p>
         </w:tc>
@@ -3233,7 +3500,7 @@
           </w:tcPr>
           <w:p>
             <w:r>
-              <w:t>Exclude all listed exceptions from the consequential damages waiver.</w:t>
+              <w:t>Expand exclusions to include broader definitions of negligence and ensure all exceptions are thoroughly vetted for applicability.</w:t>
             </w:r>
           </w:p>
         </w:tc>
@@ -3275,7 +3542,7 @@
           </w:tcPr>
           <w:p>
             <w:r>
-              <w:t>Delayed payment exposures due to acceptance exceptions.</w:t>
+              <w:t>Delayed payment exposure due to acceptance exceptions.</w:t>
             </w:r>
           </w:p>
         </w:tc>
@@ -3285,7 +3552,7 @@
           </w:tcPr>
           <w:p>
             <w:r>
-              <w:t>The clause's reliance on 'acceptance record' introduces uncertainty regarding invoice date triggering payments. This creates potential delays, impacting cash flow and supplier relationships, exposing the buyer to late payment penalties and disputes.</w:t>
+              <w:t>The clause's reliance on 'acceptance record' introduces ambiguity regarding invoice trigger dates. This creates a risk of delayed payments if the buyer disputes an invoice, extending the payment term beyond Net 30 days, impacting cash flow and potentially incurring late payment penalties.</w:t>
             </w:r>
           </w:p>
         </w:tc>
@@ -3295,7 +3562,7 @@
           </w:tcPr>
           <w:p>
             <w:r>
-              <w:t>Specify 'Net 30 days from valid invoice receipt' with objective acceptance criteria and defined dispute resolution process.</w:t>
+              <w:t>Specify clear acceptance criteria for invoices and define the definitive invoice receipt date triggering the Net 30 payment obligation.</w:t>
             </w:r>
           </w:p>
         </w:tc>
@@ -3384,7 +3651,7 @@
           </w:tcPr>
           <w:p>
             <w:r>
-              <w:t>Require documented evidence of completion of all conditions within 10 business days of PO acknowledgement.</w:t>
+              <w:t>Require objective evidence verification within 10 business days; define acceptance criteria clearly.</w:t>
             </w:r>
           </w:p>
         </w:tc>
@@ -3416,7 +3683,7 @@
           </w:tcPr>
           <w:p>
             <w:r>
-              <w:t>Reduce total security obligations to a maximum of 10 percent, excluding any additional bridge guarantees.</w:t>
+              <w:t>Reduce total performance security to a maximum of 10 percent including bridge guarantees.</w:t>
             </w:r>
           </w:p>
         </w:tc>
@@ -3480,7 +3747,7 @@
           </w:tcPr>
           <w:p>
             <w:r>
-              <w:t>Reduce aggregate LD and service-credit exposure to a maximum of 7.5 percent of PO value.</w:t>
+              <w:t>Reduce aggregate LD and service-credit exposure to a maximum of 5 percent of PO value.</w:t>
             </w:r>
           </w:p>
         </w:tc>
@@ -3608,7 +3875,7 @@
           </w:tcPr>
           <w:p>
             <w:r>
-              <w:t>Reduce the remedial guarantee to eighteen months from original dispatch.</w:t>
+              <w:t>Limit guarantee period to the shortest allowable timeframe – eighteen months from original dispatch.</w:t>
             </w:r>
           </w:p>
         </w:tc>
@@ -3640,7 +3907,7 @@
           </w:tcPr>
           <w:p>
             <w:r>
-              <w:t>Limit the overall guarantee period to the shortest duration – eighteen months from dispatch.</w:t>
+              <w:t>Reduce the remedial guarantee period to twelve months from completion of repair or replacement.</w:t>
             </w:r>
           </w:p>
         </w:tc>
@@ -3672,7 +3939,7 @@
           </w:tcPr>
           <w:p>
             <w:r>
-              <w:t>Extend the remedial guarantee to a minimum of thirty-six months from original dispatch.</w:t>
+              <w:t>Require a minimum guarantee period of eighteen months from original dispatch.</w:t>
             </w:r>
           </w:p>
         </w:tc>
@@ -3704,7 +3971,7 @@
           </w:tcPr>
           <w:p>
             <w:r>
-              <w:t>Expand Force Majeure scope to include all sub-tier suppliers and logistics providers where feasible.</w:t>
+              <w:t>Expand force majeure protection to include all approved sub-contractors and logistics providers within the supply chain.</w:t>
             </w:r>
           </w:p>
         </w:tc>
@@ -3736,7 +4003,7 @@
           </w:tcPr>
           <w:p>
             <w:r>
-              <w:t>Require extension of force majeure protection to all subcontractors and alternate vendors.</w:t>
+              <w:t>Require supplier to extend force majeure protection to all approved subcontractors and logistics providers.</w:t>
             </w:r>
           </w:p>
         </w:tc>
@@ -3768,7 +4035,7 @@
           </w:tcPr>
           <w:p>
             <w:r>
-              <w:t>Expand Force Majeure coverage to include all approved sub-suppliers and logistics providers within the defined scope.</w:t>
+              <w:t>Expand Force Majeure coverage to include all approved subcontractors and logistics providers within the supply chain.</w:t>
             </w:r>
           </w:p>
         </w:tc>
@@ -3800,7 +4067,7 @@
           </w:tcPr>
           <w:p>
             <w:r>
-              <w:t>Implement a clear, standardized process for convenience cancellations, including pre-agreed timelines and documented cost calculations.</w:t>
+              <w:t>Establish a fixed termination payment cap, irrespective of delay duration, at a maximum defined percentage (e.g., 30%).</w:t>
             </w:r>
           </w:p>
         </w:tc>
@@ -3832,7 +4099,7 @@
           </w:tcPr>
           <w:p>
             <w:r>
-              <w:t>Cap the maximum cancellation fee at 30 days; specify a fixed fee for extended periods.</w:t>
+              <w:t>Implement a standardized early termination process with fixed fees across all order values to mitigate schedule complexity.</w:t>
             </w:r>
           </w:p>
         </w:tc>
@@ -3864,7 +4131,7 @@
           </w:tcPr>
           <w:p>
             <w:r>
-              <w:t>Require supplier to provide detailed justification for the delay if cancellation occurs within the 61-90 day window.</w:t>
+              <w:t>Implement rigorous invoice validation processes to ensure accurate calculation and timely payment of the applicable cancellation fee.</w:t>
             </w:r>
           </w:p>
         </w:tc>
@@ -3896,7 +4163,7 @@
           </w:tcPr>
           <w:p>
             <w:r>
-              <w:t>Require written supplier agreement before exceeding suspension limits; implement strict monitoring of all suspension durations.</w:t>
+              <w:t>Implement a rigorous tracking system for all suspension requests and their durations, enforcing strict adherence to the 30-day aggregate limit.</w:t>
             </w:r>
           </w:p>
         </w:tc>
@@ -3928,7 +4195,7 @@
           </w:tcPr>
           <w:p>
             <w:r>
-              <w:t>Establish clear criteria for 'commercial convenience' and implement proactive communication protocols with the supplier to minimize suspension requests.</w:t>
+              <w:t>Require written prior approval for any suspension exceeding the stated limits.</w:t>
             </w:r>
           </w:p>
         </w:tc>
@@ -3960,7 +4227,7 @@
           </w:tcPr>
           <w:p>
             <w:r>
-              <w:t>Specify governing law as [Insert Preferred Jurisdiction - e.g., England &amp; Wales] to mitigate jurisdictional uncertainty.</w:t>
+              <w:t>Require governing law to be [Specified Jurisdiction - e.g., Delaware] for all contracts.</w:t>
             </w:r>
           </w:p>
         </w:tc>
@@ -3992,7 +4259,7 @@
           </w:tcPr>
           <w:p>
             <w:r>
-              <w:t>Establish clear thresholds for escalation to formal arbitration with defined cost-sharing provisions.</w:t>
+              <w:t>Implement a clearly defined protocol for managing expert determinations to minimize unnecessary escalation to Singapore arbitration.</w:t>
             </w:r>
           </w:p>
         </w:tc>
@@ -4024,7 +4291,7 @@
           </w:tcPr>
           <w:p>
             <w:r>
-              <w:t>Require all disputes to proceed directly to final binding arbitration in Singapore, eliminating the preliminary expert stage.</w:t>
+              <w:t>Establish clear guidelines regarding escalation criteria and associated cost allocation between parties.</w:t>
             </w:r>
           </w:p>
         </w:tc>
@@ -4056,7 +4323,7 @@
           </w:tcPr>
           <w:p>
             <w:r>
-              <w:t>Exclude emergency removal, re-installation, or temporary site stabilization costs from liability cap calculations.</w:t>
+              <w:t>Define 'safety shutdown' with clear triggering criteria and extend the 10% liability cap to cover these excluded emergency costs.</w:t>
             </w:r>
           </w:p>
         </w:tc>
@@ -4088,7 +4355,7 @@
           </w:tcPr>
           <w:p>
             <w:r>
-              <w:t>Maintain the current exclusion of consequential damages with all stated exceptions.</w:t>
+              <w:t>Implement enhanced due diligence on key performance indicators and establish clear trigger points for consequential loss claims based on the defined exceptions.</w:t>
             </w:r>
           </w:p>
         </w:tc>
@@ -4120,7 +4387,7 @@
           </w:tcPr>
           <w:p>
             <w:r>
-              <w:t>Exclude all listed exceptions from the consequential damages waiver.</w:t>
+              <w:t>Expand exclusions to include broader definitions of negligence and ensure all exceptions are thoroughly vetted for applicability.</w:t>
             </w:r>
           </w:p>
         </w:tc>
@@ -4152,7 +4419,7 @@
           </w:tcPr>
           <w:p>
             <w:r>
-              <w:t>Specify 'Net 30 days from valid invoice receipt' with objective acceptance criteria and defined dispute resolution process.</w:t>
+              <w:t>Specify clear acceptance criteria for invoices and define the definitive invoice receipt date triggering the Net 30 payment obligation.</w:t>
             </w:r>
           </w:p>
         </w:tc>

</xml_diff>

<commit_message>
Add historical action feature, PDF export, UI improvements, and report enhancements
</commit_message>
<xml_diff>
--- a/contract_analysis_report.docx
+++ b/contract_analysis_report.docx
@@ -25,16 +25,17 @@
         <w:tblLook w:firstColumn="1" w:firstRow="1" w:lastColumn="0" w:lastRow="0" w:noHBand="0" w:noVBand="1" w:val="04A0"/>
       </w:tblPr>
       <w:tblGrid>
-        <w:gridCol w:w="1728"/>
-        <w:gridCol w:w="1728"/>
-        <w:gridCol w:w="1728"/>
-        <w:gridCol w:w="1728"/>
-        <w:gridCol w:w="1728"/>
+        <w:gridCol w:w="1440"/>
+        <w:gridCol w:w="1440"/>
+        <w:gridCol w:w="1440"/>
+        <w:gridCol w:w="1440"/>
+        <w:gridCol w:w="1440"/>
+        <w:gridCol w:w="1440"/>
       </w:tblGrid>
       <w:tr>
         <w:tc>
           <w:tcPr>
-            <w:tcW w:type="dxa" w:w="1728"/>
+            <w:tcW w:type="dxa" w:w="1440"/>
           </w:tcPr>
           <w:p>
             <w:r>
@@ -44,7 +45,7 @@
         </w:tc>
         <w:tc>
           <w:tcPr>
-            <w:tcW w:type="dxa" w:w="1728"/>
+            <w:tcW w:type="dxa" w:w="1440"/>
           </w:tcPr>
           <w:p>
             <w:r>
@@ -54,7 +55,17 @@
         </w:tc>
         <w:tc>
           <w:tcPr>
-            <w:tcW w:type="dxa" w:w="1728"/>
+            <w:tcW w:type="dxa" w:w="1440"/>
+          </w:tcPr>
+          <w:p>
+            <w:r>
+              <w:t>Summary of Key Details</w:t>
+            </w:r>
+          </w:p>
+        </w:tc>
+        <w:tc>
+          <w:tcPr>
+            <w:tcW w:type="dxa" w:w="1440"/>
           </w:tcPr>
           <w:p>
             <w:r>
@@ -64,7 +75,7 @@
         </w:tc>
         <w:tc>
           <w:tcPr>
-            <w:tcW w:type="dxa" w:w="1728"/>
+            <w:tcW w:type="dxa" w:w="1440"/>
           </w:tcPr>
           <w:p>
             <w:r>
@@ -74,11 +85,11 @@
         </w:tc>
         <w:tc>
           <w:tcPr>
-            <w:tcW w:type="dxa" w:w="1728"/>
-          </w:tcPr>
-          <w:p>
-            <w:r>
-              <w:t>Historical Action Taken</w:t>
+            <w:tcW w:type="dxa" w:w="1440"/>
+          </w:tcPr>
+          <w:p>
+            <w:r>
+              <w:t>Assessor Remarks</w:t>
             </w:r>
           </w:p>
         </w:tc>
@@ -86,7 +97,7 @@
       <w:tr>
         <w:tc>
           <w:tcPr>
-            <w:tcW w:type="dxa" w:w="1728"/>
+            <w:tcW w:type="dxa" w:w="1440"/>
           </w:tcPr>
           <w:p>
             <w:r>
@@ -96,7 +107,7 @@
         </w:tc>
         <w:tc>
           <w:tcPr>
-            <w:tcW w:type="dxa" w:w="1728"/>
+            <w:tcW w:type="dxa" w:w="1440"/>
           </w:tcPr>
           <w:p>
             <w:r>
@@ -106,7 +117,17 @@
         </w:tc>
         <w:tc>
           <w:tcPr>
-            <w:tcW w:type="dxa" w:w="1728"/>
+            <w:tcW w:type="dxa" w:w="1440"/>
+          </w:tcPr>
+          <w:p>
+            <w:r>
+              <w:t>Subject to Supplier acknowledging the Purchase Order and furnishing the documents listed in Annex B, Buyer shall arrange an advance equal to forty-five percent (45%) of the Purchase Order value. Thirty percent (30%) is payable within five (5) business days after PO acknowledgement. The remaining fifteen percent (15%) is payable only after Buyer receives the performance bank guarantee, the project kick-off minutes signed by both parties, and the first document submission register</w:t>
+            </w:r>
+          </w:p>
+        </w:tc>
+        <w:tc>
+          <w:tcPr>
+            <w:tcW w:type="dxa" w:w="1440"/>
           </w:tcPr>
           <w:p>
             <w:r>
@@ -116,7 +137,7 @@
         </w:tc>
         <w:tc>
           <w:tcPr>
-            <w:tcW w:type="dxa" w:w="1728"/>
+            <w:tcW w:type="dxa" w:w="1440"/>
           </w:tcPr>
           <w:p>
             <w:r>
@@ -128,11 +149,11 @@
         </w:tc>
         <w:tc>
           <w:tcPr>
-            <w:tcW w:type="dxa" w:w="1728"/>
-          </w:tcPr>
-          <w:p>
-            <w:r>
-              <w:t>Negotiated milestone-based payment schedule and removed conditional payment dependencies.</w:t>
+            <w:tcW w:type="dxa" w:w="1440"/>
+          </w:tcPr>
+          <w:p>
+            <w:r>
+              <w:t>Advance payment split across conditions</w:t>
             </w:r>
           </w:p>
         </w:tc>
@@ -140,7 +161,7 @@
       <w:tr>
         <w:tc>
           <w:tcPr>
-            <w:tcW w:type="dxa" w:w="1728"/>
+            <w:tcW w:type="dxa" w:w="1440"/>
           </w:tcPr>
           <w:p>
             <w:r>
@@ -150,7 +171,7 @@
         </w:tc>
         <w:tc>
           <w:tcPr>
-            <w:tcW w:type="dxa" w:w="1728"/>
+            <w:tcW w:type="dxa" w:w="1440"/>
           </w:tcPr>
           <w:p>
             <w:r>
@@ -160,7 +181,17 @@
         </w:tc>
         <w:tc>
           <w:tcPr>
-            <w:tcW w:type="dxa" w:w="1728"/>
+            <w:tcW w:type="dxa" w:w="1440"/>
+          </w:tcPr>
+          <w:p>
+            <w:r>
+              <w:t>1 Performance bank guarantee. Supplier shall furnish an unconditional performance bank guarantee equal to ten percent (10%) of the Purchase Order value, valid until expiry of the standard guarantee period plus ninety (90) days. Agent Test Input - Complex Contract Terms 00511</w:t>
+            </w:r>
+          </w:p>
+        </w:tc>
+        <w:tc>
+          <w:tcPr>
+            <w:tcW w:type="dxa" w:w="1440"/>
           </w:tcPr>
           <w:p>
             <w:r>
@@ -170,7 +201,7 @@
         </w:tc>
         <w:tc>
           <w:tcPr>
-            <w:tcW w:type="dxa" w:w="1728"/>
+            <w:tcW w:type="dxa" w:w="1440"/>
           </w:tcPr>
           <w:p>
             <w:r>
@@ -184,11 +215,11 @@
         </w:tc>
         <w:tc>
           <w:tcPr>
-            <w:tcW w:type="dxa" w:w="1728"/>
-          </w:tcPr>
-          <w:p>
-            <w:r>
-              <w:t>Reduced performance security from 12% to 10% through contract amendment.</w:t>
+            <w:tcW w:type="dxa" w:w="1440"/>
+          </w:tcPr>
+          <w:p>
+            <w:r>
+              <w:t>Total security obligations found: 12.0%</w:t>
             </w:r>
           </w:p>
         </w:tc>
@@ -196,7 +227,7 @@
       <w:tr>
         <w:tc>
           <w:tcPr>
-            <w:tcW w:type="dxa" w:w="1728"/>
+            <w:tcW w:type="dxa" w:w="1440"/>
           </w:tcPr>
           <w:p>
             <w:r>
@@ -206,7 +237,7 @@
         </w:tc>
         <w:tc>
           <w:tcPr>
-            <w:tcW w:type="dxa" w:w="1728"/>
+            <w:tcW w:type="dxa" w:w="1440"/>
           </w:tcPr>
           <w:p>
             <w:r>
@@ -216,7 +247,17 @@
         </w:tc>
         <w:tc>
           <w:tcPr>
-            <w:tcW w:type="dxa" w:w="1728"/>
+            <w:tcW w:type="dxa" w:w="1440"/>
+          </w:tcPr>
+          <w:p>
+            <w:r>
+              <w:t>1 Performance bank guarantee. Supplier shall furnish an unconditional performance bank guarantee equal to ten percent (10%) of the Purchase Order value, valid until expiry of the standard guarantee period plus ninety (90) days. Agent Test Input - Complex Contract Terms 00511</w:t>
+            </w:r>
+          </w:p>
+        </w:tc>
+        <w:tc>
+          <w:tcPr>
+            <w:tcW w:type="dxa" w:w="1440"/>
           </w:tcPr>
           <w:p>
             <w:r>
@@ -226,7 +267,7 @@
         </w:tc>
         <w:tc>
           <w:tcPr>
-            <w:tcW w:type="dxa" w:w="1728"/>
+            <w:tcW w:type="dxa" w:w="1440"/>
           </w:tcPr>
           <w:p>
             <w:r>
@@ -238,11 +279,13 @@
         </w:tc>
         <w:tc>
           <w:tcPr>
-            <w:tcW w:type="dxa" w:w="1728"/>
-          </w:tcPr>
-          <w:p>
-            <w:r>
-              <w:t>Reduced performance security from 12% to 10% through contract amendment.</w:t>
+            <w:tcW w:type="dxa" w:w="1440"/>
+          </w:tcPr>
+          <w:p>
+            <w:r>
+              <w:t>Supplier shall furnish an unconditional performance bank guarantee equal to ten percent (10%)</w:t>
+              <w:br/>
+              <w:t>of the Purchase Order value, valid until expiry of the standard guarantee period plus ninety (90) days.</w:t>
             </w:r>
           </w:p>
         </w:tc>
@@ -250,7 +293,7 @@
       <w:tr>
         <w:tc>
           <w:tcPr>
-            <w:tcW w:type="dxa" w:w="1728"/>
+            <w:tcW w:type="dxa" w:w="1440"/>
           </w:tcPr>
           <w:p>
             <w:r>
@@ -260,7 +303,7 @@
         </w:tc>
         <w:tc>
           <w:tcPr>
-            <w:tcW w:type="dxa" w:w="1728"/>
+            <w:tcW w:type="dxa" w:w="1440"/>
           </w:tcPr>
           <w:p>
             <w:r>
@@ -270,7 +313,17 @@
         </w:tc>
         <w:tc>
           <w:tcPr>
-            <w:tcW w:type="dxa" w:w="1728"/>
+            <w:tcW w:type="dxa" w:w="1440"/>
+          </w:tcPr>
+          <w:p>
+            <w:r>
+              <w:t>1 Documentation and engineering submittals. Delay in routine manuals, vendor data books, certificates, or non-critical engineering submittals shall not attract standalone liquidated damages. However, delay in a document identified as a Critical Dispatch Document in Annex B that directly prevents FAT release shall be treated as a delay in equipment delivery for the affected lot</w:t>
+            </w:r>
+          </w:p>
+        </w:tc>
+        <w:tc>
+          <w:tcPr>
+            <w:tcW w:type="dxa" w:w="1440"/>
           </w:tcPr>
           <w:p>
             <w:r>
@@ -280,7 +333,7 @@
         </w:tc>
         <w:tc>
           <w:tcPr>
-            <w:tcW w:type="dxa" w:w="1728"/>
+            <w:tcW w:type="dxa" w:w="1440"/>
           </w:tcPr>
           <w:p>
             <w:r>
@@ -292,11 +345,11 @@
         </w:tc>
         <w:tc>
           <w:tcPr>
-            <w:tcW w:type="dxa" w:w="1728"/>
-          </w:tcPr>
-          <w:p>
-            <w:r>
-              <w:t>Negotiated lower LD cap and clarified applicability conditions.</w:t>
+            <w:tcW w:type="dxa" w:w="1440"/>
+          </w:tcPr>
+          <w:p>
+            <w:r>
+              <w:t>Clause contains material limitations, exceptions, carve-outs, conditions, or restricted applicability</w:t>
             </w:r>
           </w:p>
         </w:tc>
@@ -304,7 +357,7 @@
       <w:tr>
         <w:tc>
           <w:tcPr>
-            <w:tcW w:type="dxa" w:w="1728"/>
+            <w:tcW w:type="dxa" w:w="1440"/>
           </w:tcPr>
           <w:p>
             <w:r>
@@ -314,7 +367,7 @@
         </w:tc>
         <w:tc>
           <w:tcPr>
-            <w:tcW w:type="dxa" w:w="1728"/>
+            <w:tcW w:type="dxa" w:w="1440"/>
           </w:tcPr>
           <w:p>
             <w:r>
@@ -324,7 +377,17 @@
         </w:tc>
         <w:tc>
           <w:tcPr>
-            <w:tcW w:type="dxa" w:w="1728"/>
+            <w:tcW w:type="dxa" w:w="1440"/>
+          </w:tcPr>
+          <w:p>
+            <w:r>
+              <w:t>1 Documentation and engineering submittals. Delay in routine manuals, vendor data books, certificates, or non-critical engineering submittals shall not attract standalone liquidated damages. However, delay in a document identified as a Critical Dispatch Document in Annex B that directly prevents FAT release shall be treated as a delay in equipment delivery for the affected lot</w:t>
+            </w:r>
+          </w:p>
+        </w:tc>
+        <w:tc>
+          <w:tcPr>
+            <w:tcW w:type="dxa" w:w="1440"/>
           </w:tcPr>
           <w:p>
             <w:r>
@@ -334,7 +397,7 @@
         </w:tc>
         <w:tc>
           <w:tcPr>
-            <w:tcW w:type="dxa" w:w="1728"/>
+            <w:tcW w:type="dxa" w:w="1440"/>
           </w:tcPr>
           <w:p>
             <w:r>
@@ -346,11 +409,11 @@
         </w:tc>
         <w:tc>
           <w:tcPr>
-            <w:tcW w:type="dxa" w:w="1728"/>
-          </w:tcPr>
-          <w:p>
-            <w:r>
-              <w:t>Negotiated lower LD cap and clarified applicability conditions.</w:t>
+            <w:tcW w:type="dxa" w:w="1440"/>
+          </w:tcPr>
+          <w:p>
+            <w:r>
+              <w:t>Clause contains material limitations, exceptions, carve-outs, conditions, or restricted applicability</w:t>
             </w:r>
           </w:p>
         </w:tc>
@@ -358,7 +421,7 @@
       <w:tr>
         <w:tc>
           <w:tcPr>
-            <w:tcW w:type="dxa" w:w="1728"/>
+            <w:tcW w:type="dxa" w:w="1440"/>
           </w:tcPr>
           <w:p>
             <w:r>
@@ -368,7 +431,7 @@
         </w:tc>
         <w:tc>
           <w:tcPr>
-            <w:tcW w:type="dxa" w:w="1728"/>
+            <w:tcW w:type="dxa" w:w="1440"/>
           </w:tcPr>
           <w:p>
             <w:r>
@@ -378,7 +441,17 @@
         </w:tc>
         <w:tc>
           <w:tcPr>
-            <w:tcW w:type="dxa" w:w="1728"/>
+            <w:tcW w:type="dxa" w:w="1440"/>
+          </w:tcPr>
+          <w:p>
+            <w:r>
+              <w:t>1 Documentation and engineering submittals. Delay in routine manuals, vendor data books, certificates, or non-critical engineering submittals shall not attract standalone liquidated damages. However, delay in a document identified as a Critical Dispatch Document in Annex B that directly prevents FAT release shall be treated as a delay in equipment delivery for the affected lot</w:t>
+            </w:r>
+          </w:p>
+        </w:tc>
+        <w:tc>
+          <w:tcPr>
+            <w:tcW w:type="dxa" w:w="1440"/>
           </w:tcPr>
           <w:p>
             <w:r>
@@ -388,7 +461,7 @@
         </w:tc>
         <w:tc>
           <w:tcPr>
-            <w:tcW w:type="dxa" w:w="1728"/>
+            <w:tcW w:type="dxa" w:w="1440"/>
           </w:tcPr>
           <w:p>
             <w:r>
@@ -400,11 +473,11 @@
         </w:tc>
         <w:tc>
           <w:tcPr>
-            <w:tcW w:type="dxa" w:w="1728"/>
-          </w:tcPr>
-          <w:p>
-            <w:r>
-              <w:t>Negotiated lower LD cap and clarified applicability conditions.</w:t>
+            <w:tcW w:type="dxa" w:w="1440"/>
+          </w:tcPr>
+          <w:p>
+            <w:r>
+              <w:t>Clause contains material limitations, exceptions, carve-outs, conditions, or restricted applicability</w:t>
             </w:r>
           </w:p>
         </w:tc>
@@ -412,7 +485,7 @@
       <w:tr>
         <w:tc>
           <w:tcPr>
-            <w:tcW w:type="dxa" w:w="1728"/>
+            <w:tcW w:type="dxa" w:w="1440"/>
           </w:tcPr>
           <w:p>
             <w:r>
@@ -422,7 +495,7 @@
         </w:tc>
         <w:tc>
           <w:tcPr>
-            <w:tcW w:type="dxa" w:w="1728"/>
+            <w:tcW w:type="dxa" w:w="1440"/>
           </w:tcPr>
           <w:p>
             <w:r>
@@ -432,7 +505,17 @@
         </w:tc>
         <w:tc>
           <w:tcPr>
-            <w:tcW w:type="dxa" w:w="1728"/>
+            <w:tcW w:type="dxa" w:w="1440"/>
+          </w:tcPr>
+          <w:p>
+            <w:r>
+              <w:t>1 Documentation and engineering submittals. Delay in routine manuals, vendor data books, certificates, or non-critical engineering submittals shall not attract standalone liquidated damages. However, delay in a document identified as a Critical Dispatch Document in Annex B that directly prevents FAT release shall be treated as a delay in equipment delivery for the affected lot</w:t>
+            </w:r>
+          </w:p>
+        </w:tc>
+        <w:tc>
+          <w:tcPr>
+            <w:tcW w:type="dxa" w:w="1440"/>
           </w:tcPr>
           <w:p>
             <w:r>
@@ -442,7 +525,7 @@
         </w:tc>
         <w:tc>
           <w:tcPr>
-            <w:tcW w:type="dxa" w:w="1728"/>
+            <w:tcW w:type="dxa" w:w="1440"/>
           </w:tcPr>
           <w:p>
             <w:r>
@@ -454,11 +537,11 @@
         </w:tc>
         <w:tc>
           <w:tcPr>
-            <w:tcW w:type="dxa" w:w="1728"/>
-          </w:tcPr>
-          <w:p>
-            <w:r>
-              <w:t>Negotiated lower LD cap and clarified applicability conditions.</w:t>
+            <w:tcW w:type="dxa" w:w="1440"/>
+          </w:tcPr>
+          <w:p>
+            <w:r>
+              <w:t>Found 7.5% cap</w:t>
             </w:r>
           </w:p>
         </w:tc>
@@ -466,7 +549,7 @@
       <w:tr>
         <w:tc>
           <w:tcPr>
-            <w:tcW w:type="dxa" w:w="1728"/>
+            <w:tcW w:type="dxa" w:w="1440"/>
           </w:tcPr>
           <w:p>
             <w:r>
@@ -476,7 +559,7 @@
         </w:tc>
         <w:tc>
           <w:tcPr>
-            <w:tcW w:type="dxa" w:w="1728"/>
+            <w:tcW w:type="dxa" w:w="1440"/>
           </w:tcPr>
           <w:p>
             <w:r>
@@ -486,7 +569,17 @@
         </w:tc>
         <w:tc>
           <w:tcPr>
-            <w:tcW w:type="dxa" w:w="1728"/>
+            <w:tcW w:type="dxa" w:w="1440"/>
+          </w:tcPr>
+          <w:p>
+            <w:r>
+              <w:t>1 Documentation and engineering submittals. Delay in routine manuals, vendor data books, certificates, or non-critical engineering submittals shall not attract standalone liquidated damages. However, delay in a document identified as a Critical Dispatch Document in Annex B that directly prevents FAT release shall be treated as a delay in equipment delivery for the affected lot</w:t>
+            </w:r>
+          </w:p>
+        </w:tc>
+        <w:tc>
+          <w:tcPr>
+            <w:tcW w:type="dxa" w:w="1440"/>
           </w:tcPr>
           <w:p>
             <w:r>
@@ -496,7 +589,7 @@
         </w:tc>
         <w:tc>
           <w:tcPr>
-            <w:tcW w:type="dxa" w:w="1728"/>
+            <w:tcW w:type="dxa" w:w="1440"/>
           </w:tcPr>
           <w:p>
             <w:r>
@@ -508,11 +601,11 @@
         </w:tc>
         <w:tc>
           <w:tcPr>
-            <w:tcW w:type="dxa" w:w="1728"/>
-          </w:tcPr>
-          <w:p>
-            <w:r>
-              <w:t>Negotiated lower LD cap and clarified applicability conditions.</w:t>
+            <w:tcW w:type="dxa" w:w="1440"/>
+          </w:tcPr>
+          <w:p>
+            <w:r>
+              <w:t>Clause contains material limitations, exceptions, carve-outs, conditions, or restricted applicability</w:t>
             </w:r>
           </w:p>
         </w:tc>
@@ -520,7 +613,7 @@
       <w:tr>
         <w:tc>
           <w:tcPr>
-            <w:tcW w:type="dxa" w:w="1728"/>
+            <w:tcW w:type="dxa" w:w="1440"/>
           </w:tcPr>
           <w:p>
             <w:r>
@@ -530,7 +623,7 @@
         </w:tc>
         <w:tc>
           <w:tcPr>
-            <w:tcW w:type="dxa" w:w="1728"/>
+            <w:tcW w:type="dxa" w:w="1440"/>
           </w:tcPr>
           <w:p>
             <w:r>
@@ -540,7 +633,17 @@
         </w:tc>
         <w:tc>
           <w:tcPr>
-            <w:tcW w:type="dxa" w:w="1728"/>
+            <w:tcW w:type="dxa" w:w="1440"/>
+          </w:tcPr>
+          <w:p>
+            <w:r>
+              <w:t>Supplier guarantees the equipment for two (2) months from successful provisional commissioning or eighteen (18) months from dispatch from Supplier works, whichever occurs earlier. If commissioning is delayed solely because Buyer has not provided utilities, access, or foundation readiness for more than sixty (60) days, the commissioning limb is deemed to have started on the sixty-first day after delivery to site. Any repaired or replaced component shall be guaranteed for twelve (12) months from completion of repair or replacement, or until eighteen (18) months from original dispatch of the affected equipment, whichever occurs earlier</w:t>
+            </w:r>
+          </w:p>
+        </w:tc>
+        <w:tc>
+          <w:tcPr>
+            <w:tcW w:type="dxa" w:w="1440"/>
           </w:tcPr>
           <w:p>
             <w:r>
@@ -550,7 +653,7 @@
         </w:tc>
         <w:tc>
           <w:tcPr>
-            <w:tcW w:type="dxa" w:w="1728"/>
+            <w:tcW w:type="dxa" w:w="1440"/>
           </w:tcPr>
           <w:p>
             <w:r>
@@ -562,11 +665,11 @@
         </w:tc>
         <w:tc>
           <w:tcPr>
-            <w:tcW w:type="dxa" w:w="1728"/>
-          </w:tcPr>
-          <w:p>
-            <w:r>
-              <w:t>Renegotiated warranty duration and coverage limits during legal review.</w:t>
+            <w:tcW w:type="dxa" w:w="1440"/>
+          </w:tcPr>
+          <w:p>
+            <w:r>
+              <w:t>Clause contains material limitations, exceptions, carve-outs, conditions, or restricted applicability</w:t>
             </w:r>
           </w:p>
         </w:tc>
@@ -574,7 +677,7 @@
       <w:tr>
         <w:tc>
           <w:tcPr>
-            <w:tcW w:type="dxa" w:w="1728"/>
+            <w:tcW w:type="dxa" w:w="1440"/>
           </w:tcPr>
           <w:p>
             <w:r>
@@ -584,7 +687,7 @@
         </w:tc>
         <w:tc>
           <w:tcPr>
-            <w:tcW w:type="dxa" w:w="1728"/>
+            <w:tcW w:type="dxa" w:w="1440"/>
           </w:tcPr>
           <w:p>
             <w:r>
@@ -594,7 +697,17 @@
         </w:tc>
         <w:tc>
           <w:tcPr>
-            <w:tcW w:type="dxa" w:w="1728"/>
+            <w:tcW w:type="dxa" w:w="1440"/>
+          </w:tcPr>
+          <w:p>
+            <w:r>
+              <w:t>Supplier guarantees the equipment for two (2) months from successful provisional commissioning or eighteen (18) months from dispatch from Supplier works, whichever occurs earlier. If commissioning is delayed solely because Buyer has not provided utilities, access, or foundation readiness for more than sixty (60) days, the commissioning limb is deemed to have started on the sixty-first day after delivery to site. Any repaired or replaced component shall be guaranteed for twelve (12) months from completion of repair or replacement, or until eighteen (18) months from original dispatch of the affected equipment, whichever occurs earlier</w:t>
+            </w:r>
+          </w:p>
+        </w:tc>
+        <w:tc>
+          <w:tcPr>
+            <w:tcW w:type="dxa" w:w="1440"/>
           </w:tcPr>
           <w:p>
             <w:r>
@@ -604,7 +717,7 @@
         </w:tc>
         <w:tc>
           <w:tcPr>
-            <w:tcW w:type="dxa" w:w="1728"/>
+            <w:tcW w:type="dxa" w:w="1440"/>
           </w:tcPr>
           <w:p>
             <w:r>
@@ -616,11 +729,11 @@
         </w:tc>
         <w:tc>
           <w:tcPr>
-            <w:tcW w:type="dxa" w:w="1728"/>
-          </w:tcPr>
-          <w:p>
-            <w:r>
-              <w:t>Renegotiated warranty duration and coverage limits during legal review.</w:t>
+            <w:tcW w:type="dxa" w:w="1440"/>
+          </w:tcPr>
+          <w:p>
+            <w:r>
+              <w:t>Clause contains material limitations, exceptions, carve-outs, conditions, or restricted applicability</w:t>
             </w:r>
           </w:p>
         </w:tc>
@@ -628,7 +741,7 @@
       <w:tr>
         <w:tc>
           <w:tcPr>
-            <w:tcW w:type="dxa" w:w="1728"/>
+            <w:tcW w:type="dxa" w:w="1440"/>
           </w:tcPr>
           <w:p>
             <w:r>
@@ -638,7 +751,7 @@
         </w:tc>
         <w:tc>
           <w:tcPr>
-            <w:tcW w:type="dxa" w:w="1728"/>
+            <w:tcW w:type="dxa" w:w="1440"/>
           </w:tcPr>
           <w:p>
             <w:r>
@@ -648,7 +761,17 @@
         </w:tc>
         <w:tc>
           <w:tcPr>
-            <w:tcW w:type="dxa" w:w="1728"/>
+            <w:tcW w:type="dxa" w:w="1440"/>
+          </w:tcPr>
+          <w:p>
+            <w:r>
+              <w:t>Supplier guarantees the equipment for two (2) months from successful provisional commissioning or eighteen (18) months from dispatch from Supplier works, whichever occurs earlier. If commissioning is delayed solely because Buyer has not provided utilities, access, or foundation readiness for more than sixty (60) days, the commissioning limb is deemed to have started on the sixty-first day after delivery to site. Any repaired or replaced component shall be guaranteed for twelve (12) months from completion of repair or replacement, or until eighteen (18) months from original dispatch of the affected equipment, whichever occurs earlier</w:t>
+            </w:r>
+          </w:p>
+        </w:tc>
+        <w:tc>
+          <w:tcPr>
+            <w:tcW w:type="dxa" w:w="1440"/>
           </w:tcPr>
           <w:p>
             <w:r>
@@ -658,7 +781,7 @@
         </w:tc>
         <w:tc>
           <w:tcPr>
-            <w:tcW w:type="dxa" w:w="1728"/>
+            <w:tcW w:type="dxa" w:w="1440"/>
           </w:tcPr>
           <w:p>
             <w:r>
@@ -670,11 +793,11 @@
         </w:tc>
         <w:tc>
           <w:tcPr>
-            <w:tcW w:type="dxa" w:w="1728"/>
-          </w:tcPr>
-          <w:p>
-            <w:r>
-              <w:t>Renegotiated warranty duration and coverage limits during legal review.</w:t>
+            <w:tcW w:type="dxa" w:w="1440"/>
+          </w:tcPr>
+          <w:p>
+            <w:r>
+              <w:t>Clause contains material limitations, exceptions, carve-outs, conditions, or restricted applicability</w:t>
             </w:r>
           </w:p>
         </w:tc>
@@ -682,7 +805,7 @@
       <w:tr>
         <w:tc>
           <w:tcPr>
-            <w:tcW w:type="dxa" w:w="1728"/>
+            <w:tcW w:type="dxa" w:w="1440"/>
           </w:tcPr>
           <w:p>
             <w:r>
@@ -692,7 +815,7 @@
         </w:tc>
         <w:tc>
           <w:tcPr>
-            <w:tcW w:type="dxa" w:w="1728"/>
+            <w:tcW w:type="dxa" w:w="1440"/>
           </w:tcPr>
           <w:p>
             <w:r>
@@ -702,7 +825,17 @@
         </w:tc>
         <w:tc>
           <w:tcPr>
-            <w:tcW w:type="dxa" w:w="1728"/>
+            <w:tcW w:type="dxa" w:w="1440"/>
+          </w:tcPr>
+          <w:p>
+            <w:r>
+              <w:t>Force Majeure means an event beyond the reasonable control of the affected party, including Act of God, expropriation, nationalization, embargo, changes in law or regulation, war, sabotage, floods, severe weather, fires, strikes, lockouts, epidemics, pandemics, quarantine restrictions, and government action directly preventing performance. 2 Supply-chain events. Supplier may claim Force Majeure relief for events affecting only the Tier-1 critical sub-suppliers named in Annex D or the approved international logistics carrier</w:t>
+            </w:r>
+          </w:p>
+        </w:tc>
+        <w:tc>
+          <w:tcPr>
+            <w:tcW w:type="dxa" w:w="1440"/>
           </w:tcPr>
           <w:p>
             <w:r>
@@ -712,7 +845,7 @@
         </w:tc>
         <w:tc>
           <w:tcPr>
-            <w:tcW w:type="dxa" w:w="1728"/>
+            <w:tcW w:type="dxa" w:w="1440"/>
           </w:tcPr>
           <w:p>
             <w:r>
@@ -724,11 +857,11 @@
         </w:tc>
         <w:tc>
           <w:tcPr>
-            <w:tcW w:type="dxa" w:w="1728"/>
-          </w:tcPr>
-          <w:p>
-            <w:r>
-              <w:t>Expanded force majeure coverage and simplified notice requirements.</w:t>
+            <w:tcW w:type="dxa" w:w="1440"/>
+          </w:tcPr>
+          <w:p>
+            <w:r>
+              <w:t>Clause contains material limitations, exceptions, carve-outs, conditions, or restricted applicability</w:t>
             </w:r>
           </w:p>
         </w:tc>
@@ -736,7 +869,7 @@
       <w:tr>
         <w:tc>
           <w:tcPr>
-            <w:tcW w:type="dxa" w:w="1728"/>
+            <w:tcW w:type="dxa" w:w="1440"/>
           </w:tcPr>
           <w:p>
             <w:r>
@@ -746,7 +879,7 @@
         </w:tc>
         <w:tc>
           <w:tcPr>
-            <w:tcW w:type="dxa" w:w="1728"/>
+            <w:tcW w:type="dxa" w:w="1440"/>
           </w:tcPr>
           <w:p>
             <w:r>
@@ -756,7 +889,17 @@
         </w:tc>
         <w:tc>
           <w:tcPr>
-            <w:tcW w:type="dxa" w:w="1728"/>
+            <w:tcW w:type="dxa" w:w="1440"/>
+          </w:tcPr>
+          <w:p>
+            <w:r>
+              <w:t>Force Majeure means an event beyond the reasonable control of the affected party, including Act of God, expropriation, nationalization, embargo, changes in law or regulation, war, sabotage, floods, severe weather, fires, strikes, lockouts, epidemics, pandemics, quarantine restrictions, and government action directly preventing performance. 2 Supply-chain events. Supplier may claim Force Majeure relief for events affecting only the Tier-1 critical sub-suppliers named in Annex D or the approved international logistics carrier</w:t>
+            </w:r>
+          </w:p>
+        </w:tc>
+        <w:tc>
+          <w:tcPr>
+            <w:tcW w:type="dxa" w:w="1440"/>
           </w:tcPr>
           <w:p>
             <w:r>
@@ -766,7 +909,7 @@
         </w:tc>
         <w:tc>
           <w:tcPr>
-            <w:tcW w:type="dxa" w:w="1728"/>
+            <w:tcW w:type="dxa" w:w="1440"/>
           </w:tcPr>
           <w:p>
             <w:r>
@@ -776,11 +919,11 @@
         </w:tc>
         <w:tc>
           <w:tcPr>
-            <w:tcW w:type="dxa" w:w="1728"/>
-          </w:tcPr>
-          <w:p>
-            <w:r>
-              <w:t>Expanded force majeure coverage and simplified notice requirements.</w:t>
+            <w:tcW w:type="dxa" w:w="1440"/>
+          </w:tcPr>
+          <w:p>
+            <w:r>
+              <w:t>Applies only to specific suppliers</w:t>
             </w:r>
           </w:p>
         </w:tc>
@@ -788,7 +931,7 @@
       <w:tr>
         <w:tc>
           <w:tcPr>
-            <w:tcW w:type="dxa" w:w="1728"/>
+            <w:tcW w:type="dxa" w:w="1440"/>
           </w:tcPr>
           <w:p>
             <w:r>
@@ -798,7 +941,7 @@
         </w:tc>
         <w:tc>
           <w:tcPr>
-            <w:tcW w:type="dxa" w:w="1728"/>
+            <w:tcW w:type="dxa" w:w="1440"/>
           </w:tcPr>
           <w:p>
             <w:r>
@@ -808,7 +951,17 @@
         </w:tc>
         <w:tc>
           <w:tcPr>
-            <w:tcW w:type="dxa" w:w="1728"/>
+            <w:tcW w:type="dxa" w:w="1440"/>
+          </w:tcPr>
+          <w:p>
+            <w:r>
+              <w:t>Force Majeure means an event beyond the reasonable control of the affected party, including Act of God, expropriation, nationalization, embargo, changes in law or regulation, war, sabotage, floods, severe weather, fires, strikes, lockouts, epidemics, pandemics, quarantine restrictions, and government action directly preventing performance. 2 Supply-chain events. Supplier may claim Force Majeure relief for events affecting only the Tier-1 critical sub-suppliers named in Annex D or the approved international logistics carrier</w:t>
+            </w:r>
+          </w:p>
+        </w:tc>
+        <w:tc>
+          <w:tcPr>
+            <w:tcW w:type="dxa" w:w="1440"/>
           </w:tcPr>
           <w:p>
             <w:r>
@@ -818,7 +971,7 @@
         </w:tc>
         <w:tc>
           <w:tcPr>
-            <w:tcW w:type="dxa" w:w="1728"/>
+            <w:tcW w:type="dxa" w:w="1440"/>
           </w:tcPr>
           <w:p>
             <w:r>
@@ -830,11 +983,11 @@
         </w:tc>
         <w:tc>
           <w:tcPr>
-            <w:tcW w:type="dxa" w:w="1728"/>
-          </w:tcPr>
-          <w:p>
-            <w:r>
-              <w:t>Expanded force majeure coverage and simplified notice requirements.</w:t>
+            <w:tcW w:type="dxa" w:w="1440"/>
+          </w:tcPr>
+          <w:p>
+            <w:r>
+              <w:t>Clause contains material limitations, exceptions, carve-outs, conditions, or restricted applicability</w:t>
             </w:r>
           </w:p>
         </w:tc>
@@ -842,7 +995,7 @@
       <w:tr>
         <w:tc>
           <w:tcPr>
-            <w:tcW w:type="dxa" w:w="1728"/>
+            <w:tcW w:type="dxa" w:w="1440"/>
           </w:tcPr>
           <w:p>
             <w:r>
@@ -852,7 +1005,7 @@
         </w:tc>
         <w:tc>
           <w:tcPr>
-            <w:tcW w:type="dxa" w:w="1728"/>
+            <w:tcW w:type="dxa" w:w="1440"/>
           </w:tcPr>
           <w:p>
             <w:r>
@@ -862,7 +1015,17 @@
         </w:tc>
         <w:tc>
           <w:tcPr>
-            <w:tcW w:type="dxa" w:w="1728"/>
+            <w:tcW w:type="dxa" w:w="1440"/>
+          </w:tcPr>
+          <w:p>
+            <w:r>
+              <w:t>1 Convenience cancellation schedule. If Buyer cancels the Purchase Order for convenience after Supplier acknowledgement, Buyer shall pay the following fee as a percentage of the order value, subject to the notes below: 0-30 days: 7. 5%; 31-60 days: 25%; 61-90 days: 38%; 91-120 days: 55%; 121-150 days: 70% less documented resale or scrap salvage actually realized by Supplier; 151-180 days: 85%; and 181 or more days: 100% of the undelivered balance only</w:t>
+            </w:r>
+          </w:p>
+        </w:tc>
+        <w:tc>
+          <w:tcPr>
+            <w:tcW w:type="dxa" w:w="1440"/>
           </w:tcPr>
           <w:p>
             <w:r>
@@ -872,7 +1035,7 @@
         </w:tc>
         <w:tc>
           <w:tcPr>
-            <w:tcW w:type="dxa" w:w="1728"/>
+            <w:tcW w:type="dxa" w:w="1440"/>
           </w:tcPr>
           <w:p>
             <w:r>
@@ -888,49 +1051,7 @@
         </w:tc>
         <w:tc>
           <w:tcPr>
-            <w:tcW w:type="dxa" w:w="1728"/>
-          </w:tcPr>
-          <w:p>
-            <w:r>
-              <w:t>Revised cancellation fee structure during commercial negotiations.</w:t>
-            </w:r>
-          </w:p>
-        </w:tc>
-      </w:tr>
-      <w:tr>
-        <w:tc>
-          <w:tcPr>
-            <w:tcW w:type="dxa" w:w="1728"/>
-          </w:tcPr>
-          <w:p>
-            <w:r>
-              <w:t>Termination</w:t>
-            </w:r>
-          </w:p>
-        </w:tc>
-        <w:tc>
-          <w:tcPr>
-            <w:tcW w:type="dxa" w:w="1728"/>
-          </w:tcPr>
-          <w:p>
-            <w:r>
-              <w:t>Cancellation fee structure defined</w:t>
-            </w:r>
-          </w:p>
-        </w:tc>
-        <w:tc>
-          <w:tcPr>
-            <w:tcW w:type="dxa" w:w="1728"/>
-          </w:tcPr>
-          <w:p>
-            <w:r>
-              <w:t>Met</w:t>
-            </w:r>
-          </w:p>
-        </w:tc>
-        <w:tc>
-          <w:tcPr>
-            <w:tcW w:type="dxa" w:w="1728"/>
+            <w:tcW w:type="dxa" w:w="1440"/>
           </w:tcPr>
           <w:p>
             <w:r>
@@ -944,21 +1065,11 @@
             </w:r>
           </w:p>
         </w:tc>
-        <w:tc>
-          <w:tcPr>
-            <w:tcW w:type="dxa" w:w="1728"/>
-          </w:tcPr>
-          <w:p>
-            <w:r>
-              <w:t>Revised cancellation fee structure during commercial negotiations.</w:t>
-            </w:r>
-          </w:p>
-        </w:tc>
       </w:tr>
       <w:tr>
         <w:tc>
           <w:tcPr>
-            <w:tcW w:type="dxa" w:w="1728"/>
+            <w:tcW w:type="dxa" w:w="1440"/>
           </w:tcPr>
           <w:p>
             <w:r>
@@ -968,41 +1079,63 @@
         </w:tc>
         <w:tc>
           <w:tcPr>
-            <w:tcW w:type="dxa" w:w="1728"/>
-          </w:tcPr>
-          <w:p>
-            <w:r>
-              <w:t>61-90 day cancellation fee 40%</w:t>
-            </w:r>
-          </w:p>
-        </w:tc>
-        <w:tc>
-          <w:tcPr>
-            <w:tcW w:type="dxa" w:w="1728"/>
-          </w:tcPr>
-          <w:p>
-            <w:r>
-              <w:t>Not Met</w:t>
-            </w:r>
-          </w:p>
-        </w:tc>
-        <w:tc>
-          <w:tcPr>
-            <w:tcW w:type="dxa" w:w="1728"/>
-          </w:tcPr>
-          <w:p>
-            <w:r>
-              <w:t>Article 00511.9 - Cancellation and Early Termination Fee</w:t>
-            </w:r>
-          </w:p>
-        </w:tc>
-        <w:tc>
-          <w:tcPr>
-            <w:tcW w:type="dxa" w:w="1728"/>
-          </w:tcPr>
-          <w:p>
-            <w:r>
-              <w:t>Revised cancellation fee structure during commercial negotiations.</w:t>
+            <w:tcW w:type="dxa" w:w="1440"/>
+          </w:tcPr>
+          <w:p>
+            <w:r>
+              <w:t>Cancellation fee structure defined</w:t>
+            </w:r>
+          </w:p>
+        </w:tc>
+        <w:tc>
+          <w:tcPr>
+            <w:tcW w:type="dxa" w:w="1440"/>
+          </w:tcPr>
+          <w:p>
+            <w:r>
+              <w:t>1 Convenience cancellation schedule. If Buyer cancels the Purchase Order for convenience after Supplier acknowledgement, Buyer shall pay the following fee as a percentage of the order value, subject to the notes below: 0-30 days: 7. 5%; 31-60 days: 25%; 61-90 days: 38%; 91-120 days: 55%; 121-150 days: 70% less documented resale or scrap salvage actually realized by Supplier; 151-180 days: 85%; and 181 or more days: 100% of the undelivered balance only</w:t>
+            </w:r>
+          </w:p>
+        </w:tc>
+        <w:tc>
+          <w:tcPr>
+            <w:tcW w:type="dxa" w:w="1440"/>
+          </w:tcPr>
+          <w:p>
+            <w:r>
+              <w:t>Met</w:t>
+            </w:r>
+          </w:p>
+        </w:tc>
+        <w:tc>
+          <w:tcPr>
+            <w:tcW w:type="dxa" w:w="1440"/>
+          </w:tcPr>
+          <w:p>
+            <w:r>
+              <w:t>If Buyer cancels the Purchase Order for convenience after Supplier acknowledgement,</w:t>
+              <w:br/>
+              <w:t>Buyer shall pay the following fee as a percentage of the order value, subject to the notes below: 0-30 days: 7.5%; 31-60 days: 25%;</w:t>
+              <w:br/>
+              <w:t>61-90 days: 38%; 91-120 days: 55%; 121-150 days: 70% less documented resale or scrap salvage actually realized by Supplier;</w:t>
+              <w:br/>
+              <w:t>151-180 days: 85%; and 181 or more days: 100% of the undelivered balance only.</w:t>
+            </w:r>
+          </w:p>
+        </w:tc>
+        <w:tc>
+          <w:tcPr>
+            <w:tcW w:type="dxa" w:w="1440"/>
+          </w:tcPr>
+          <w:p>
+            <w:r>
+              <w:t>If Buyer cancels the Purchase Order for convenience after Supplier acknowledgement,</w:t>
+              <w:br/>
+              <w:t>Buyer shall pay the following fee as a percentage of the order value, subject to the notes below: 0-30 days: 7.5%; 31-60 days: 25%;</w:t>
+              <w:br/>
+              <w:t>61-90 days: 38%; 91-120 days: 55%; 121-150 days: 70% less documented resale or scrap salvage actually realized by Supplier;</w:t>
+              <w:br/>
+              <w:t>151-180 days: 85%; and 181 or more days: 100% of the undelivered balance only.</w:t>
             </w:r>
           </w:p>
         </w:tc>
@@ -1010,51 +1143,61 @@
       <w:tr>
         <w:tc>
           <w:tcPr>
-            <w:tcW w:type="dxa" w:w="1728"/>
-          </w:tcPr>
-          <w:p>
-            <w:r>
-              <w:t>Suspension</w:t>
-            </w:r>
-          </w:p>
-        </w:tc>
-        <w:tc>
-          <w:tcPr>
-            <w:tcW w:type="dxa" w:w="1728"/>
-          </w:tcPr>
-          <w:p>
-            <w:r>
-              <w:t>Maximum 2 suspensions and 30 days aggregate</w:t>
-            </w:r>
-          </w:p>
-        </w:tc>
-        <w:tc>
-          <w:tcPr>
-            <w:tcW w:type="dxa" w:w="1728"/>
-          </w:tcPr>
-          <w:p>
-            <w:r>
-              <w:t>Partially Met</w:t>
-            </w:r>
-          </w:p>
-        </w:tc>
-        <w:tc>
-          <w:tcPr>
-            <w:tcW w:type="dxa" w:w="1728"/>
-          </w:tcPr>
-          <w:p>
-            <w:r>
-              <w:t>Suspension limits exclude regulatory, government, legal, and safety stoppages</w:t>
-            </w:r>
-          </w:p>
-        </w:tc>
-        <w:tc>
-          <w:tcPr>
-            <w:tcW w:type="dxa" w:w="1728"/>
-          </w:tcPr>
-          <w:p>
-            <w:r>
-              <w:t>Added suspension approval workflow and duration limits.</w:t>
+            <w:tcW w:type="dxa" w:w="1440"/>
+          </w:tcPr>
+          <w:p>
+            <w:r>
+              <w:t>Termination</w:t>
+            </w:r>
+          </w:p>
+        </w:tc>
+        <w:tc>
+          <w:tcPr>
+            <w:tcW w:type="dxa" w:w="1440"/>
+          </w:tcPr>
+          <w:p>
+            <w:r>
+              <w:t>61-90 day cancellation fee 40%</w:t>
+            </w:r>
+          </w:p>
+        </w:tc>
+        <w:tc>
+          <w:tcPr>
+            <w:tcW w:type="dxa" w:w="1440"/>
+          </w:tcPr>
+          <w:p>
+            <w:r>
+              <w:t>1 Convenience cancellation schedule. If Buyer cancels the Purchase Order for convenience after Supplier acknowledgement, Buyer shall pay the following fee as a percentage of the order value, subject to the notes below: 0-30 days: 7. 5%; 31-60 days: 25%; 61-90 days: 38%; 91-120 days: 55%; 121-150 days: 70% less documented resale or scrap salvage actually realized by Supplier; 151-180 days: 85%; and 181 or more days: 100% of the undelivered balance only</w:t>
+            </w:r>
+          </w:p>
+        </w:tc>
+        <w:tc>
+          <w:tcPr>
+            <w:tcW w:type="dxa" w:w="1440"/>
+          </w:tcPr>
+          <w:p>
+            <w:r>
+              <w:t>Not Met</w:t>
+            </w:r>
+          </w:p>
+        </w:tc>
+        <w:tc>
+          <w:tcPr>
+            <w:tcW w:type="dxa" w:w="1440"/>
+          </w:tcPr>
+          <w:p>
+            <w:r>
+              <w:t>Article 00511.9 - Cancellation and Early Termination Fee</w:t>
+            </w:r>
+          </w:p>
+        </w:tc>
+        <w:tc>
+          <w:tcPr>
+            <w:tcW w:type="dxa" w:w="1440"/>
+          </w:tcPr>
+          <w:p>
+            <w:r>
+              <w:t>Required 40.0% not found</w:t>
             </w:r>
           </w:p>
         </w:tc>
@@ -1062,7 +1205,7 @@
       <w:tr>
         <w:tc>
           <w:tcPr>
-            <w:tcW w:type="dxa" w:w="1728"/>
+            <w:tcW w:type="dxa" w:w="1440"/>
           </w:tcPr>
           <w:p>
             <w:r>
@@ -1072,7 +1215,69 @@
         </w:tc>
         <w:tc>
           <w:tcPr>
-            <w:tcW w:type="dxa" w:w="1728"/>
+            <w:tcW w:type="dxa" w:w="1440"/>
+          </w:tcPr>
+          <w:p>
+            <w:r>
+              <w:t>Maximum 2 suspensions and 30 days aggregate</w:t>
+            </w:r>
+          </w:p>
+        </w:tc>
+        <w:tc>
+          <w:tcPr>
+            <w:tcW w:type="dxa" w:w="1440"/>
+          </w:tcPr>
+          <w:p>
+            <w:r>
+              <w:t>Buyer may suspend work for commercial convenience no more than two (2) times during the Purchase Order term, and the aggregate duration of such commercial-convenience suspensions shall not exceed thirty (30) calendar days unless Supplier agrees in writing. Regulatory inspection holds, government clearance waits, and safety stoppages imposed by law are not counted as suspensions for this limit. If Buyer requests a commercial-convenience suspension beyond the permitted limit, the excess period shall be treated as a compensable change order entitling Supplier to schedule extension, storage, demobilization, and reasonable remobilization costs</w:t>
+            </w:r>
+          </w:p>
+        </w:tc>
+        <w:tc>
+          <w:tcPr>
+            <w:tcW w:type="dxa" w:w="1440"/>
+          </w:tcPr>
+          <w:p>
+            <w:r>
+              <w:t>Partially Met</w:t>
+            </w:r>
+          </w:p>
+        </w:tc>
+        <w:tc>
+          <w:tcPr>
+            <w:tcW w:type="dxa" w:w="1440"/>
+          </w:tcPr>
+          <w:p>
+            <w:r>
+              <w:t>Suspension limits exclude regulatory, government, legal, and safety stoppages</w:t>
+            </w:r>
+          </w:p>
+        </w:tc>
+        <w:tc>
+          <w:tcPr>
+            <w:tcW w:type="dxa" w:w="1440"/>
+          </w:tcPr>
+          <w:p>
+            <w:r>
+              <w:t>Certain suspension categories excluded from limit</w:t>
+            </w:r>
+          </w:p>
+        </w:tc>
+      </w:tr>
+      <w:tr>
+        <w:tc>
+          <w:tcPr>
+            <w:tcW w:type="dxa" w:w="1440"/>
+          </w:tcPr>
+          <w:p>
+            <w:r>
+              <w:t>Suspension</w:t>
+            </w:r>
+          </w:p>
+        </w:tc>
+        <w:tc>
+          <w:tcPr>
+            <w:tcW w:type="dxa" w:w="1440"/>
           </w:tcPr>
           <w:p>
             <w:r>
@@ -1082,7 +1287,17 @@
         </w:tc>
         <w:tc>
           <w:tcPr>
-            <w:tcW w:type="dxa" w:w="1728"/>
+            <w:tcW w:type="dxa" w:w="1440"/>
+          </w:tcPr>
+          <w:p>
+            <w:r>
+              <w:t>Buyer may suspend work for commercial convenience no more than two (2) times during the Purchase Order term, and the aggregate duration of such commercial-convenience suspensions shall not exceed thirty (30) calendar days unless Supplier agrees in writing. Regulatory inspection holds, government clearance waits, and safety stoppages imposed by law are not counted as suspensions for this limit. If Buyer requests a commercial-convenience suspension beyond the permitted limit, the excess period shall be treated as a compensable change order entitling Supplier to schedule extension, storage, demobilization, and reasonable remobilization costs</w:t>
+            </w:r>
+          </w:p>
+        </w:tc>
+        <w:tc>
+          <w:tcPr>
+            <w:tcW w:type="dxa" w:w="1440"/>
           </w:tcPr>
           <w:p>
             <w:r>
@@ -1092,7 +1307,7 @@
         </w:tc>
         <w:tc>
           <w:tcPr>
-            <w:tcW w:type="dxa" w:w="1728"/>
+            <w:tcW w:type="dxa" w:w="1440"/>
           </w:tcPr>
           <w:p>
             <w:r>
@@ -1106,11 +1321,15 @@
         </w:tc>
         <w:tc>
           <w:tcPr>
-            <w:tcW w:type="dxa" w:w="1728"/>
-          </w:tcPr>
-          <w:p>
-            <w:r>
-              <w:t>Added suspension approval workflow and duration limits.</w:t>
+            <w:tcW w:type="dxa" w:w="1440"/>
+          </w:tcPr>
+          <w:p>
+            <w:r>
+              <w:t>Buyer may suspend work for commercial convenience no more than two (2) times during the Purchase</w:t>
+              <w:br/>
+              <w:t>Order term, and the aggregate duration of such commercial-convenience suspensions shall not exceed thirty (30) calendar days unless</w:t>
+              <w:br/>
+              <w:t>Supplier agrees in writing.</w:t>
             </w:r>
           </w:p>
         </w:tc>
@@ -1118,7 +1337,7 @@
       <w:tr>
         <w:tc>
           <w:tcPr>
-            <w:tcW w:type="dxa" w:w="1728"/>
+            <w:tcW w:type="dxa" w:w="1440"/>
           </w:tcPr>
           <w:p>
             <w:r>
@@ -1128,7 +1347,7 @@
         </w:tc>
         <w:tc>
           <w:tcPr>
-            <w:tcW w:type="dxa" w:w="1728"/>
+            <w:tcW w:type="dxa" w:w="1440"/>
           </w:tcPr>
           <w:p>
             <w:r>
@@ -1138,7 +1357,17 @@
         </w:tc>
         <w:tc>
           <w:tcPr>
-            <w:tcW w:type="dxa" w:w="1728"/>
+            <w:tcW w:type="dxa" w:w="1440"/>
+          </w:tcPr>
+          <w:p>
+            <w:r>
+              <w:t>1 Order of precedence. In case of inconsistency, the following order applies: (a) signed Purchase Order amendment; (b) Special Conditions in Articles 00511. 16; (c) Annex B - Commercial Schedule; (d) Annex C - Logistics Protocol; (e) the General Procurement Conditions; and (f) email clarifications not incorporated by amendment</w:t>
+            </w:r>
+          </w:p>
+        </w:tc>
+        <w:tc>
+          <w:tcPr>
+            <w:tcW w:type="dxa" w:w="1440"/>
           </w:tcPr>
           <w:p>
             <w:r>
@@ -1148,7 +1377,7 @@
         </w:tc>
         <w:tc>
           <w:tcPr>
-            <w:tcW w:type="dxa" w:w="1728"/>
+            <w:tcW w:type="dxa" w:w="1440"/>
           </w:tcPr>
           <w:p>
             <w:r>
@@ -1162,49 +1391,7 @@
         </w:tc>
         <w:tc>
           <w:tcPr>
-            <w:tcW w:type="dxa" w:w="1728"/>
-          </w:tcPr>
-          <w:p>
-            <w:r>
-              <w:t>Implemented formal change request and approval process.</w:t>
-            </w:r>
-          </w:p>
-        </w:tc>
-      </w:tr>
-      <w:tr>
-        <w:tc>
-          <w:tcPr>
-            <w:tcW w:type="dxa" w:w="1728"/>
-          </w:tcPr>
-          <w:p>
-            <w:r>
-              <w:t>Change Orders</w:t>
-            </w:r>
-          </w:p>
-        </w:tc>
-        <w:tc>
-          <w:tcPr>
-            <w:tcW w:type="dxa" w:w="1728"/>
-          </w:tcPr>
-          <w:p>
-            <w:r>
-              <w:t>Timeline for approval defined</w:t>
-            </w:r>
-          </w:p>
-        </w:tc>
-        <w:tc>
-          <w:tcPr>
-            <w:tcW w:type="dxa" w:w="1728"/>
-          </w:tcPr>
-          <w:p>
-            <w:r>
-              <w:t>Met</w:t>
-            </w:r>
-          </w:p>
-        </w:tc>
-        <w:tc>
-          <w:tcPr>
-            <w:tcW w:type="dxa" w:w="1728"/>
+            <w:tcW w:type="dxa" w:w="1440"/>
           </w:tcPr>
           <w:p>
             <w:r>
@@ -1216,21 +1403,81 @@
             </w:r>
           </w:p>
         </w:tc>
-        <w:tc>
-          <w:tcPr>
-            <w:tcW w:type="dxa" w:w="1728"/>
-          </w:tcPr>
-          <w:p>
-            <w:r>
-              <w:t>Implemented formal change request and approval process.</w:t>
-            </w:r>
-          </w:p>
-        </w:tc>
       </w:tr>
       <w:tr>
         <w:tc>
           <w:tcPr>
-            <w:tcW w:type="dxa" w:w="1728"/>
+            <w:tcW w:type="dxa" w:w="1440"/>
+          </w:tcPr>
+          <w:p>
+            <w:r>
+              <w:t>Change Orders</w:t>
+            </w:r>
+          </w:p>
+        </w:tc>
+        <w:tc>
+          <w:tcPr>
+            <w:tcW w:type="dxa" w:w="1440"/>
+          </w:tcPr>
+          <w:p>
+            <w:r>
+              <w:t>Timeline for approval defined</w:t>
+            </w:r>
+          </w:p>
+        </w:tc>
+        <w:tc>
+          <w:tcPr>
+            <w:tcW w:type="dxa" w:w="1440"/>
+          </w:tcPr>
+          <w:p>
+            <w:r>
+              <w:t>1 Order of precedence. In case of inconsistency, the following order applies: (a) signed Purchase Order amendment; (b) Special Conditions in Articles 00511. 16; (c) Annex B - Commercial Schedule; (d) Annex C - Logistics Protocol; (e) the General Procurement Conditions; and (f) email clarifications not incorporated by amendment</w:t>
+            </w:r>
+          </w:p>
+        </w:tc>
+        <w:tc>
+          <w:tcPr>
+            <w:tcW w:type="dxa" w:w="1440"/>
+          </w:tcPr>
+          <w:p>
+            <w:r>
+              <w:t>Met</w:t>
+            </w:r>
+          </w:p>
+        </w:tc>
+        <w:tc>
+          <w:tcPr>
+            <w:tcW w:type="dxa" w:w="1440"/>
+          </w:tcPr>
+          <w:p>
+            <w:r>
+              <w:t>In case of inconsistency, the following order applies: (a) signed Purchase Order amendment; (b)</w:t>
+              <w:br/>
+              <w:t>Special Conditions in Articles 00511.2 to 00511.16; (c) Annex B - Commercial Schedule; (d) Annex C - Logistics Protocol; (e) the</w:t>
+              <w:br/>
+              <w:t>General Procurement Conditions; and (f) email clarifications not incorporated by amendment.</w:t>
+            </w:r>
+          </w:p>
+        </w:tc>
+        <w:tc>
+          <w:tcPr>
+            <w:tcW w:type="dxa" w:w="1440"/>
+          </w:tcPr>
+          <w:p>
+            <w:r>
+              <w:t>In case of inconsistency, the following order applies: (a) signed Purchase Order amendment; (b)</w:t>
+              <w:br/>
+              <w:t>Special Conditions in Articles 00511.2 to 00511.16; (c) Annex B - Commercial Schedule; (d) Annex C - Logistics Protocol; (e) the</w:t>
+              <w:br/>
+              <w:t>General Procurement Conditions; and (f) email clarifications not incorporated by amendment.</w:t>
+            </w:r>
+          </w:p>
+        </w:tc>
+      </w:tr>
+      <w:tr>
+        <w:tc>
+          <w:tcPr>
+            <w:tcW w:type="dxa" w:w="1440"/>
           </w:tcPr>
           <w:p>
             <w:r>
@@ -1240,7 +1487,7 @@
         </w:tc>
         <w:tc>
           <w:tcPr>
-            <w:tcW w:type="dxa" w:w="1728"/>
+            <w:tcW w:type="dxa" w:w="1440"/>
           </w:tcPr>
           <w:p>
             <w:r>
@@ -1250,7 +1497,17 @@
         </w:tc>
         <w:tc>
           <w:tcPr>
-            <w:tcW w:type="dxa" w:w="1728"/>
+            <w:tcW w:type="dxa" w:w="1440"/>
+          </w:tcPr>
+          <w:p>
+            <w:r>
+              <w:t>This Purchase Order and all non-contractual obligations arising out of or in connection with it shall be governed by the laws of India, excluding conflict-of-law principles. Disputes relating to price adjustment, delay LD, warranty, cancellation fee, limitation of liability, and consequential damages shall be finally resolved by arbitration seated in Singapore under the SIAC Rules. The language of arbitration shall be English</w:t>
+            </w:r>
+          </w:p>
+        </w:tc>
+        <w:tc>
+          <w:tcPr>
+            <w:tcW w:type="dxa" w:w="1440"/>
           </w:tcPr>
           <w:p>
             <w:r>
@@ -1260,7 +1517,7 @@
         </w:tc>
         <w:tc>
           <w:tcPr>
-            <w:tcW w:type="dxa" w:w="1728"/>
+            <w:tcW w:type="dxa" w:w="1440"/>
           </w:tcPr>
           <w:p>
             <w:r>
@@ -1272,11 +1529,11 @@
         </w:tc>
         <w:tc>
           <w:tcPr>
-            <w:tcW w:type="dxa" w:w="1728"/>
-          </w:tcPr>
-          <w:p>
-            <w:r>
-              <w:t>Standardized governing law language across contracts.</w:t>
+            <w:tcW w:type="dxa" w:w="1440"/>
+          </w:tcPr>
+          <w:p>
+            <w:r>
+              <w:t>Clause contains material limitations, exceptions, carve-outs, conditions, or restricted applicability</w:t>
             </w:r>
           </w:p>
         </w:tc>
@@ -1284,7 +1541,7 @@
       <w:tr>
         <w:tc>
           <w:tcPr>
-            <w:tcW w:type="dxa" w:w="1728"/>
+            <w:tcW w:type="dxa" w:w="1440"/>
           </w:tcPr>
           <w:p>
             <w:r>
@@ -1294,7 +1551,7 @@
         </w:tc>
         <w:tc>
           <w:tcPr>
-            <w:tcW w:type="dxa" w:w="1728"/>
+            <w:tcW w:type="dxa" w:w="1440"/>
           </w:tcPr>
           <w:p>
             <w:r>
@@ -1304,7 +1561,17 @@
         </w:tc>
         <w:tc>
           <w:tcPr>
-            <w:tcW w:type="dxa" w:w="1728"/>
+            <w:tcW w:type="dxa" w:w="1440"/>
+          </w:tcPr>
+          <w:p>
+            <w:r>
+              <w:t>This Purchase Order and all non-contractual obligations arising out of or in connection with it shall be governed by the laws of India, excluding conflict-of-law principles. Disputes relating to price adjustment, delay LD, warranty, cancellation fee, limitation of liability, and consequential damages shall be finally resolved by arbitration seated in Singapore under the SIAC Rules. The language of arbitration shall be English</w:t>
+            </w:r>
+          </w:p>
+        </w:tc>
+        <w:tc>
+          <w:tcPr>
+            <w:tcW w:type="dxa" w:w="1440"/>
           </w:tcPr>
           <w:p>
             <w:r>
@@ -1314,7 +1581,7 @@
         </w:tc>
         <w:tc>
           <w:tcPr>
-            <w:tcW w:type="dxa" w:w="1728"/>
+            <w:tcW w:type="dxa" w:w="1440"/>
           </w:tcPr>
           <w:p>
             <w:r>
@@ -1328,49 +1595,7 @@
         </w:tc>
         <w:tc>
           <w:tcPr>
-            <w:tcW w:type="dxa" w:w="1728"/>
-          </w:tcPr>
-          <w:p>
-            <w:r>
-              <w:t>Updated arbitration mechanism based on prior legal review.</w:t>
-            </w:r>
-          </w:p>
-        </w:tc>
-      </w:tr>
-      <w:tr>
-        <w:tc>
-          <w:tcPr>
-            <w:tcW w:type="dxa" w:w="1728"/>
-          </w:tcPr>
-          <w:p>
-            <w:r>
-              <w:t>Dispute Resolution</w:t>
-            </w:r>
-          </w:p>
-        </w:tc>
-        <w:tc>
-          <w:tcPr>
-            <w:tcW w:type="dxa" w:w="1728"/>
-          </w:tcPr>
-          <w:p>
-            <w:r>
-              <w:t>Seat of arbitration specified</w:t>
-            </w:r>
-          </w:p>
-        </w:tc>
-        <w:tc>
-          <w:tcPr>
-            <w:tcW w:type="dxa" w:w="1728"/>
-          </w:tcPr>
-          <w:p>
-            <w:r>
-              <w:t>Met</w:t>
-            </w:r>
-          </w:p>
-        </w:tc>
-        <w:tc>
-          <w:tcPr>
-            <w:tcW w:type="dxa" w:w="1728"/>
+            <w:tcW w:type="dxa" w:w="1440"/>
           </w:tcPr>
           <w:p>
             <w:r>
@@ -1382,41 +1607,41 @@
             </w:r>
           </w:p>
         </w:tc>
-        <w:tc>
-          <w:tcPr>
-            <w:tcW w:type="dxa" w:w="1728"/>
-          </w:tcPr>
-          <w:p>
-            <w:r>
-              <w:t>Updated arbitration mechanism based on prior legal review.</w:t>
-            </w:r>
-          </w:p>
-        </w:tc>
       </w:tr>
       <w:tr>
         <w:tc>
           <w:tcPr>
-            <w:tcW w:type="dxa" w:w="1728"/>
-          </w:tcPr>
-          <w:p>
-            <w:r>
-              <w:t>Insurance</w:t>
-            </w:r>
-          </w:p>
-        </w:tc>
-        <w:tc>
-          <w:tcPr>
-            <w:tcW w:type="dxa" w:w="1728"/>
-          </w:tcPr>
-          <w:p>
-            <w:r>
-              <w:t>Insurance responsibilities defined</w:t>
-            </w:r>
-          </w:p>
-        </w:tc>
-        <w:tc>
-          <w:tcPr>
-            <w:tcW w:type="dxa" w:w="1728"/>
+            <w:tcW w:type="dxa" w:w="1440"/>
+          </w:tcPr>
+          <w:p>
+            <w:r>
+              <w:t>Dispute Resolution</w:t>
+            </w:r>
+          </w:p>
+        </w:tc>
+        <w:tc>
+          <w:tcPr>
+            <w:tcW w:type="dxa" w:w="1440"/>
+          </w:tcPr>
+          <w:p>
+            <w:r>
+              <w:t>Seat of arbitration specified</w:t>
+            </w:r>
+          </w:p>
+        </w:tc>
+        <w:tc>
+          <w:tcPr>
+            <w:tcW w:type="dxa" w:w="1440"/>
+          </w:tcPr>
+          <w:p>
+            <w:r>
+              <w:t>This Purchase Order and all non-contractual obligations arising out of or in connection with it shall be governed by the laws of India, excluding conflict-of-law principles. Disputes relating to price adjustment, delay LD, warranty, cancellation fee, limitation of liability, and consequential damages shall be finally resolved by arbitration seated in Singapore under the SIAC Rules. The language of arbitration shall be English</w:t>
+            </w:r>
+          </w:p>
+        </w:tc>
+        <w:tc>
+          <w:tcPr>
+            <w:tcW w:type="dxa" w:w="1440"/>
           </w:tcPr>
           <w:p>
             <w:r>
@@ -1426,21 +1651,29 @@
         </w:tc>
         <w:tc>
           <w:tcPr>
-            <w:tcW w:type="dxa" w:w="1728"/>
-          </w:tcPr>
-          <w:p>
-            <w:r>
-              <w:t>Article 00511.4 - Delivery, Readiness, and Storage</w:t>
-            </w:r>
-          </w:p>
-        </w:tc>
-        <w:tc>
-          <w:tcPr>
-            <w:tcW w:type="dxa" w:w="1728"/>
-          </w:tcPr>
-          <w:p>
-            <w:r>
-              <w:t>Expanded insurance coverage obligations.</w:t>
+            <w:tcW w:type="dxa" w:w="1440"/>
+          </w:tcPr>
+          <w:p>
+            <w:r>
+              <w:t>Disputes limited to laboratory test methodology shall</w:t>
+              <w:br/>
+              <w:t>first be referred to a technical expert in Mumbai; if the expert's determination is rejected, only the remaining legal dispute proceeds to</w:t>
+              <w:br/>
+              <w:t>Singapore arbitration.</w:t>
+            </w:r>
+          </w:p>
+        </w:tc>
+        <w:tc>
+          <w:tcPr>
+            <w:tcW w:type="dxa" w:w="1440"/>
+          </w:tcPr>
+          <w:p>
+            <w:r>
+              <w:t>Disputes limited to laboratory test methodology shall</w:t>
+              <w:br/>
+              <w:t>first be referred to a technical expert in Mumbai; if the expert's determination is rejected, only the remaining legal dispute proceeds to</w:t>
+              <w:br/>
+              <w:t>Singapore arbitration.</w:t>
             </w:r>
           </w:p>
         </w:tc>
@@ -1448,7 +1681,7 @@
       <w:tr>
         <w:tc>
           <w:tcPr>
-            <w:tcW w:type="dxa" w:w="1728"/>
+            <w:tcW w:type="dxa" w:w="1440"/>
           </w:tcPr>
           <w:p>
             <w:r>
@@ -1458,7 +1691,69 @@
         </w:tc>
         <w:tc>
           <w:tcPr>
-            <w:tcW w:type="dxa" w:w="1728"/>
+            <w:tcW w:type="dxa" w:w="1440"/>
+          </w:tcPr>
+          <w:p>
+            <w:r>
+              <w:t>Insurance responsibilities defined</w:t>
+            </w:r>
+          </w:p>
+        </w:tc>
+        <w:tc>
+          <w:tcPr>
+            <w:tcW w:type="dxa" w:w="1440"/>
+          </w:tcPr>
+          <w:p>
+            <w:r>
+              <w:t>1 Readiness and free storage. Supplier shall issue a readiness notice after FAT clearance. If Buyer defers collection after readiness notice, Supplier shall store the affected equipment free of charge for the first three (3) working days only</w:t>
+            </w:r>
+          </w:p>
+        </w:tc>
+        <w:tc>
+          <w:tcPr>
+            <w:tcW w:type="dxa" w:w="1440"/>
+          </w:tcPr>
+          <w:p>
+            <w:r>
+              <w:t>Met</w:t>
+            </w:r>
+          </w:p>
+        </w:tc>
+        <w:tc>
+          <w:tcPr>
+            <w:tcW w:type="dxa" w:w="1440"/>
+          </w:tcPr>
+          <w:p>
+            <w:r>
+              <w:t>Article 00511.4 - Delivery, Readiness, and Storage</w:t>
+            </w:r>
+          </w:p>
+        </w:tc>
+        <w:tc>
+          <w:tcPr>
+            <w:tcW w:type="dxa" w:w="1440"/>
+          </w:tcPr>
+          <w:p>
+            <w:r>
+              <w:t>Article 00511.4 - Delivery, Readiness, and Storage</w:t>
+            </w:r>
+          </w:p>
+        </w:tc>
+      </w:tr>
+      <w:tr>
+        <w:tc>
+          <w:tcPr>
+            <w:tcW w:type="dxa" w:w="1440"/>
+          </w:tcPr>
+          <w:p>
+            <w:r>
+              <w:t>Insurance</w:t>
+            </w:r>
+          </w:p>
+        </w:tc>
+        <w:tc>
+          <w:tcPr>
+            <w:tcW w:type="dxa" w:w="1440"/>
           </w:tcPr>
           <w:p>
             <w:r>
@@ -1468,7 +1763,17 @@
         </w:tc>
         <w:tc>
           <w:tcPr>
-            <w:tcW w:type="dxa" w:w="1728"/>
+            <w:tcW w:type="dxa" w:w="1440"/>
+          </w:tcPr>
+          <w:p>
+            <w:r>
+              <w:t>1 Readiness and free storage. Supplier shall issue a readiness notice after FAT clearance. If Buyer defers collection after readiness notice, Supplier shall store the affected equipment free of charge for the first three (3) working days only</w:t>
+            </w:r>
+          </w:p>
+        </w:tc>
+        <w:tc>
+          <w:tcPr>
+            <w:tcW w:type="dxa" w:w="1440"/>
           </w:tcPr>
           <w:p>
             <w:r>
@@ -1478,7 +1783,7 @@
         </w:tc>
         <w:tc>
           <w:tcPr>
-            <w:tcW w:type="dxa" w:w="1728"/>
+            <w:tcW w:type="dxa" w:w="1440"/>
           </w:tcPr>
           <w:p>
             <w:r>
@@ -1490,11 +1795,13 @@
         </w:tc>
         <w:tc>
           <w:tcPr>
-            <w:tcW w:type="dxa" w:w="1728"/>
-          </w:tcPr>
-          <w:p>
-            <w:r>
-              <w:t>Expanded insurance coverage obligations.</w:t>
+            <w:tcW w:type="dxa" w:w="1440"/>
+          </w:tcPr>
+          <w:p>
+            <w:r>
+              <w:t>Storage charges are</w:t>
+              <w:br/>
+              <w:t>without prejudice to Supplier's right to claim insurance or preservation costs caused by abnormal storage conditions.</w:t>
             </w:r>
           </w:p>
         </w:tc>
@@ -1502,7 +1809,7 @@
       <w:tr>
         <w:tc>
           <w:tcPr>
-            <w:tcW w:type="dxa" w:w="1728"/>
+            <w:tcW w:type="dxa" w:w="1440"/>
           </w:tcPr>
           <w:p>
             <w:r>
@@ -1512,7 +1819,7 @@
         </w:tc>
         <w:tc>
           <w:tcPr>
-            <w:tcW w:type="dxa" w:w="1728"/>
+            <w:tcW w:type="dxa" w:w="1440"/>
           </w:tcPr>
           <w:p>
             <w:r>
@@ -1522,7 +1829,17 @@
         </w:tc>
         <w:tc>
           <w:tcPr>
-            <w:tcW w:type="dxa" w:w="1728"/>
+            <w:tcW w:type="dxa" w:w="1440"/>
+          </w:tcPr>
+          <w:p>
+            <w:r>
+              <w:t>1 Defect liability cap. Supplier shall correct defects arising during the guarantee period. Supplier's aggregate liability for repair or replacement of defective equipment under this Article shall not exceed ten percent (10%) of the total Purchase Order value</w:t>
+            </w:r>
+          </w:p>
+        </w:tc>
+        <w:tc>
+          <w:tcPr>
+            <w:tcW w:type="dxa" w:w="1440"/>
           </w:tcPr>
           <w:p>
             <w:r>
@@ -1532,7 +1849,7 @@
         </w:tc>
         <w:tc>
           <w:tcPr>
-            <w:tcW w:type="dxa" w:w="1728"/>
+            <w:tcW w:type="dxa" w:w="1440"/>
           </w:tcPr>
           <w:p>
             <w:r>
@@ -1544,11 +1861,13 @@
         </w:tc>
         <w:tc>
           <w:tcPr>
-            <w:tcW w:type="dxa" w:w="1728"/>
-          </w:tcPr>
-          <w:p>
-            <w:r>
-              <w:t>Reduced liability exposure through revised cap language.</w:t>
+            <w:tcW w:type="dxa" w:w="1440"/>
+          </w:tcPr>
+          <w:p>
+            <w:r>
+              <w:t>Supplier's aggregate liability for repair</w:t>
+              <w:br/>
+              <w:t>or replacement of defective equipment under this Article shall not exceed ten percent (10%) of the total Purchase Order value.</w:t>
             </w:r>
           </w:p>
         </w:tc>
@@ -1556,7 +1875,7 @@
       <w:tr>
         <w:tc>
           <w:tcPr>
-            <w:tcW w:type="dxa" w:w="1728"/>
+            <w:tcW w:type="dxa" w:w="1440"/>
           </w:tcPr>
           <w:p>
             <w:r>
@@ -1566,7 +1885,7 @@
         </w:tc>
         <w:tc>
           <w:tcPr>
-            <w:tcW w:type="dxa" w:w="1728"/>
+            <w:tcW w:type="dxa" w:w="1440"/>
           </w:tcPr>
           <w:p>
             <w:r>
@@ -1576,7 +1895,17 @@
         </w:tc>
         <w:tc>
           <w:tcPr>
-            <w:tcW w:type="dxa" w:w="1728"/>
+            <w:tcW w:type="dxa" w:w="1440"/>
+          </w:tcPr>
+          <w:p>
+            <w:r>
+              <w:t>1 Defect liability cap. Supplier shall correct defects arising during the guarantee period. Supplier's aggregate liability for repair or replacement of defective equipment under this Article shall not exceed ten percent (10%) of the total Purchase Order value</w:t>
+            </w:r>
+          </w:p>
+        </w:tc>
+        <w:tc>
+          <w:tcPr>
+            <w:tcW w:type="dxa" w:w="1440"/>
           </w:tcPr>
           <w:p>
             <w:r>
@@ -1586,7 +1915,7 @@
         </w:tc>
         <w:tc>
           <w:tcPr>
-            <w:tcW w:type="dxa" w:w="1728"/>
+            <w:tcW w:type="dxa" w:w="1440"/>
           </w:tcPr>
           <w:p>
             <w:r>
@@ -1598,11 +1927,11 @@
         </w:tc>
         <w:tc>
           <w:tcPr>
-            <w:tcW w:type="dxa" w:w="1728"/>
-          </w:tcPr>
-          <w:p>
-            <w:r>
-              <w:t>Reduced liability exposure through revised cap language.</w:t>
+            <w:tcW w:type="dxa" w:w="1440"/>
+          </w:tcPr>
+          <w:p>
+            <w:r>
+              <w:t>Clause contains material limitations, exceptions, carve-outs, conditions, or restricted applicability</w:t>
             </w:r>
           </w:p>
         </w:tc>
@@ -1610,7 +1939,7 @@
       <w:tr>
         <w:tc>
           <w:tcPr>
-            <w:tcW w:type="dxa" w:w="1728"/>
+            <w:tcW w:type="dxa" w:w="1440"/>
           </w:tcPr>
           <w:p>
             <w:r>
@@ -1620,7 +1949,7 @@
         </w:tc>
         <w:tc>
           <w:tcPr>
-            <w:tcW w:type="dxa" w:w="1728"/>
+            <w:tcW w:type="dxa" w:w="1440"/>
           </w:tcPr>
           <w:p>
             <w:r>
@@ -1630,7 +1959,17 @@
         </w:tc>
         <w:tc>
           <w:tcPr>
-            <w:tcW w:type="dxa" w:w="1728"/>
+            <w:tcW w:type="dxa" w:w="1440"/>
+          </w:tcPr>
+          <w:p>
+            <w:r>
+              <w:t>1 Consequential damages waiver. Neither party shall be liable to the other for loss of revenue, loss of profit, loss of use, loss of production, downtime, loss of business opportunity, indirect damages, special damages, punitive damages, exemplary damages, or consequential damages. The exclusion in Article 00511</w:t>
+            </w:r>
+          </w:p>
+        </w:tc>
+        <w:tc>
+          <w:tcPr>
+            <w:tcW w:type="dxa" w:w="1440"/>
           </w:tcPr>
           <w:p>
             <w:r>
@@ -1640,7 +1979,7 @@
         </w:tc>
         <w:tc>
           <w:tcPr>
-            <w:tcW w:type="dxa" w:w="1728"/>
+            <w:tcW w:type="dxa" w:w="1440"/>
           </w:tcPr>
           <w:p>
             <w:r>
@@ -1654,11 +1993,11 @@
         </w:tc>
         <w:tc>
           <w:tcPr>
-            <w:tcW w:type="dxa" w:w="1728"/>
-          </w:tcPr>
-          <w:p>
-            <w:r>
-              <w:t>Clarified exclusions and carve-outs after legal review.</w:t>
+            <w:tcW w:type="dxa" w:w="1440"/>
+          </w:tcPr>
+          <w:p>
+            <w:r>
+              <w:t>Clause contains material limitations, exceptions, carve-outs, conditions, or restricted applicability</w:t>
             </w:r>
           </w:p>
         </w:tc>
@@ -1666,7 +2005,7 @@
       <w:tr>
         <w:tc>
           <w:tcPr>
-            <w:tcW w:type="dxa" w:w="1728"/>
+            <w:tcW w:type="dxa" w:w="1440"/>
           </w:tcPr>
           <w:p>
             <w:r>
@@ -1676,7 +2015,7 @@
         </w:tc>
         <w:tc>
           <w:tcPr>
-            <w:tcW w:type="dxa" w:w="1728"/>
+            <w:tcW w:type="dxa" w:w="1440"/>
           </w:tcPr>
           <w:p>
             <w:r>
@@ -1686,7 +2025,17 @@
         </w:tc>
         <w:tc>
           <w:tcPr>
-            <w:tcW w:type="dxa" w:w="1728"/>
+            <w:tcW w:type="dxa" w:w="1440"/>
+          </w:tcPr>
+          <w:p>
+            <w:r>
+              <w:t>1 Consequential damages waiver. Neither party shall be liable to the other for loss of revenue, loss of profit, loss of use, loss of production, downtime, loss of business opportunity, indirect damages, special damages, punitive damages, exemplary damages, or consequential damages. The exclusion in Article 00511</w:t>
+            </w:r>
+          </w:p>
+        </w:tc>
+        <w:tc>
+          <w:tcPr>
+            <w:tcW w:type="dxa" w:w="1440"/>
           </w:tcPr>
           <w:p>
             <w:r>
@@ -1696,7 +2045,7 @@
         </w:tc>
         <w:tc>
           <w:tcPr>
-            <w:tcW w:type="dxa" w:w="1728"/>
+            <w:tcW w:type="dxa" w:w="1440"/>
           </w:tcPr>
           <w:p>
             <w:r>
@@ -1710,11 +2059,11 @@
         </w:tc>
         <w:tc>
           <w:tcPr>
-            <w:tcW w:type="dxa" w:w="1728"/>
-          </w:tcPr>
-          <w:p>
-            <w:r>
-              <w:t>Clarified exclusions and carve-outs after legal review.</w:t>
+            <w:tcW w:type="dxa" w:w="1440"/>
+          </w:tcPr>
+          <w:p>
+            <w:r>
+              <w:t>Clause contains material limitations, exceptions, carve-outs, conditions, or restricted applicability</w:t>
             </w:r>
           </w:p>
         </w:tc>
@@ -1722,7 +2071,7 @@
       <w:tr>
         <w:tc>
           <w:tcPr>
-            <w:tcW w:type="dxa" w:w="1728"/>
+            <w:tcW w:type="dxa" w:w="1440"/>
           </w:tcPr>
           <w:p>
             <w:r>
@@ -1732,7 +2081,7 @@
         </w:tc>
         <w:tc>
           <w:tcPr>
-            <w:tcW w:type="dxa" w:w="1728"/>
+            <w:tcW w:type="dxa" w:w="1440"/>
           </w:tcPr>
           <w:p>
             <w:r>
@@ -1742,7 +2091,17 @@
         </w:tc>
         <w:tc>
           <w:tcPr>
-            <w:tcW w:type="dxa" w:w="1728"/>
+            <w:tcW w:type="dxa" w:w="1440"/>
+          </w:tcPr>
+          <w:p>
+            <w:r>
+              <w:t>Force Majeure means an event beyond the reasonable control of the affected party, including Act of God, expropriation, nationalization, embargo, changes in law or regulation, war, sabotage, floods, severe weather, fires, strikes, lockouts, epidemics, pandemics, quarantine restrictions, and government action directly preventing performance. 2 Supply-chain events. Supplier may claim Force Majeure relief for events affecting only the Tier-1 critical sub-suppliers named in Annex D or the approved international logistics carrier</w:t>
+            </w:r>
+          </w:p>
+        </w:tc>
+        <w:tc>
+          <w:tcPr>
+            <w:tcW w:type="dxa" w:w="1440"/>
           </w:tcPr>
           <w:p>
             <w:r>
@@ -1752,7 +2111,7 @@
         </w:tc>
         <w:tc>
           <w:tcPr>
-            <w:tcW w:type="dxa" w:w="1728"/>
+            <w:tcW w:type="dxa" w:w="1440"/>
           </w:tcPr>
           <w:p>
             <w:r>
@@ -1762,11 +2121,11 @@
         </w:tc>
         <w:tc>
           <w:tcPr>
-            <w:tcW w:type="dxa" w:w="1728"/>
-          </w:tcPr>
-          <w:p>
-            <w:r>
-              <w:t>Approved alternate vendors and defined substitution controls.</w:t>
+            <w:tcW w:type="dxa" w:w="1440"/>
+          </w:tcPr>
+          <w:p>
+            <w:r>
+              <w:t>Annex D approved critical sub-suppliers: BrightForge Rings Pvt.</w:t>
             </w:r>
           </w:p>
         </w:tc>
@@ -1774,7 +2133,7 @@
       <w:tr>
         <w:tc>
           <w:tcPr>
-            <w:tcW w:type="dxa" w:w="1728"/>
+            <w:tcW w:type="dxa" w:w="1440"/>
           </w:tcPr>
           <w:p>
             <w:r>
@@ -1784,7 +2143,7 @@
         </w:tc>
         <w:tc>
           <w:tcPr>
-            <w:tcW w:type="dxa" w:w="1728"/>
+            <w:tcW w:type="dxa" w:w="1440"/>
           </w:tcPr>
           <w:p>
             <w:r>
@@ -1794,7 +2153,17 @@
         </w:tc>
         <w:tc>
           <w:tcPr>
-            <w:tcW w:type="dxa" w:w="1728"/>
+            <w:tcW w:type="dxa" w:w="1440"/>
+          </w:tcPr>
+          <w:p>
+            <w:r>
+              <w:t>Force Majeure means an event beyond the reasonable control of the affected party, including Act of God, expropriation, nationalization, embargo, changes in law or regulation, war, sabotage, floods, severe weather, fires, strikes, lockouts, epidemics, pandemics, quarantine restrictions, and government action directly preventing performance. 2 Supply-chain events. Supplier may claim Force Majeure relief for events affecting only the Tier-1 critical sub-suppliers named in Annex D or the approved international logistics carrier</w:t>
+            </w:r>
+          </w:p>
+        </w:tc>
+        <w:tc>
+          <w:tcPr>
+            <w:tcW w:type="dxa" w:w="1440"/>
           </w:tcPr>
           <w:p>
             <w:r>
@@ -1804,7 +2173,7 @@
         </w:tc>
         <w:tc>
           <w:tcPr>
-            <w:tcW w:type="dxa" w:w="1728"/>
+            <w:tcW w:type="dxa" w:w="1440"/>
           </w:tcPr>
           <w:p>
             <w:r>
@@ -1814,11 +2183,11 @@
         </w:tc>
         <w:tc>
           <w:tcPr>
-            <w:tcW w:type="dxa" w:w="1728"/>
-          </w:tcPr>
-          <w:p>
-            <w:r>
-              <w:t>Approved alternate vendors and defined substitution controls.</w:t>
+            <w:tcW w:type="dxa" w:w="1440"/>
+          </w:tcPr>
+          <w:p>
+            <w:r>
+              <w:t>Annex D approved critical sub-suppliers: BrightForge Rings Pvt.</w:t>
             </w:r>
           </w:p>
         </w:tc>
@@ -1826,7 +2195,7 @@
       <w:tr>
         <w:tc>
           <w:tcPr>
-            <w:tcW w:type="dxa" w:w="1728"/>
+            <w:tcW w:type="dxa" w:w="1440"/>
           </w:tcPr>
           <w:p>
             <w:r>
@@ -1836,7 +2205,7 @@
         </w:tc>
         <w:tc>
           <w:tcPr>
-            <w:tcW w:type="dxa" w:w="1728"/>
+            <w:tcW w:type="dxa" w:w="1440"/>
           </w:tcPr>
           <w:p>
             <w:r>
@@ -1846,7 +2215,17 @@
         </w:tc>
         <w:tc>
           <w:tcPr>
-            <w:tcW w:type="dxa" w:w="1728"/>
+            <w:tcW w:type="dxa" w:w="1440"/>
+          </w:tcPr>
+          <w:p>
+            <w:r>
+              <w:t>Subject to Supplier acknowledging the Purchase Order and furnishing the documents listed in Annex B, Buyer shall arrange an advance equal to forty-five percent (45%) of the Purchase Order value. Thirty percent (30%) is payable within five (5) business days after PO acknowledgement. The remaining fifteen percent (15%) is payable only after Buyer receives the performance bank guarantee, the project kick-off minutes signed by both parties, and the first document submission register</w:t>
+            </w:r>
+          </w:p>
+        </w:tc>
+        <w:tc>
+          <w:tcPr>
+            <w:tcW w:type="dxa" w:w="1440"/>
           </w:tcPr>
           <w:p>
             <w:r>
@@ -1856,21 +2235,21 @@
         </w:tc>
         <w:tc>
           <w:tcPr>
-            <w:tcW w:type="dxa" w:w="1728"/>
-          </w:tcPr>
-          <w:p>
-            <w:r>
-              <w:t>Clause 00511.2.2 states: 'Buyer shall pay accepted invoices within thirty (30) days after receipt of a valid tax invoice.' However, the clause includes exceptions (disputed amounts) and modifies the timing trigger to start from the later acceptance record, not the invoice date.</w:t>
-            </w:r>
-          </w:p>
-        </w:tc>
-        <w:tc>
-          <w:tcPr>
-            <w:tcW w:type="dxa" w:w="1728"/>
-          </w:tcPr>
-          <w:p>
-            <w:r>
-              <w:t>Negotiated milestone-based payment schedule and removed conditional payment dependencies.</w:t>
+            <w:tcW w:type="dxa" w:w="1440"/>
+          </w:tcPr>
+          <w:p>
+            <w:r>
+              <w:t>Buyer shall pay accepted invoices within thirty (30) days after receipt of a valid tax invoice. An invoice is valid only after the corresponding goods receipt note, inspection release, and packing-list reconciliation are completed in Buyer's system. If those acceptance records are completed after invoice receipt, the thirty-day clock starts from the later acceptance record, not the invoice date.</w:t>
+            </w:r>
+          </w:p>
+        </w:tc>
+        <w:tc>
+          <w:tcPr>
+            <w:tcW w:type="dxa" w:w="1440"/>
+          </w:tcPr>
+          <w:p>
+            <w:r>
+              <w:t>The requirement for Net 30 days is modified by conditions: the clock only starts upon a 'valid tax invoice', which is contingent on internal system records (GRN, inspection release, packing-list reconciliation). This creates a modified trigger for the 30-day period rather than a simple Net 30 from invoice date.</w:t>
             </w:r>
           </w:p>
         </w:tc>
@@ -1878,7 +2257,7 @@
       <w:tr>
         <w:tc>
           <w:tcPr>
-            <w:tcW w:type="dxa" w:w="1728"/>
+            <w:tcW w:type="dxa" w:w="1440"/>
           </w:tcPr>
           <w:p>
             <w:r>
@@ -1888,7 +2267,7 @@
         </w:tc>
         <w:tc>
           <w:tcPr>
-            <w:tcW w:type="dxa" w:w="1728"/>
+            <w:tcW w:type="dxa" w:w="1440"/>
           </w:tcPr>
           <w:p>
             <w:r>
@@ -1898,7 +2277,17 @@
         </w:tc>
         <w:tc>
           <w:tcPr>
-            <w:tcW w:type="dxa" w:w="1728"/>
+            <w:tcW w:type="dxa" w:w="1440"/>
+          </w:tcPr>
+          <w:p>
+            <w:r>
+              <w:t>Subject to Supplier acknowledging the Purchase Order and furnishing the documents listed in Annex B, Buyer shall arrange an advance equal to forty-five percent (45%) of the Purchase Order value. Thirty percent (30%) is payable within five (5) business days after PO acknowledgement. The remaining fifteen percent (15%) is payable only after Buyer receives the performance bank guarantee, the project kick-off minutes signed by both parties, and the first document submission register</w:t>
+            </w:r>
+          </w:p>
+        </w:tc>
+        <w:tc>
+          <w:tcPr>
+            <w:tcW w:type="dxa" w:w="1440"/>
           </w:tcPr>
           <w:p>
             <w:r>
@@ -1908,21 +2297,21 @@
         </w:tc>
         <w:tc>
           <w:tcPr>
-            <w:tcW w:type="dxa" w:w="1728"/>
-          </w:tcPr>
-          <w:p>
-            <w:r>
-              <w:t>Clause 00511.2.3 explicitly permits 'Supplier may dispatch Lot A, Lot B, and Lot C separately and may raise a corresponding invoice for each completed lot.'</w:t>
-            </w:r>
-          </w:p>
-        </w:tc>
-        <w:tc>
-          <w:tcPr>
-            <w:tcW w:type="dxa" w:w="1728"/>
-          </w:tcPr>
-          <w:p>
-            <w:r>
-              <w:t>Negotiated milestone-based payment schedule and removed conditional payment dependencies.</w:t>
+            <w:tcW w:type="dxa" w:w="1440"/>
+          </w:tcPr>
+          <w:p>
+            <w:r>
+              <w:t>Supplier may dispatch Lot A, Lot B, and Lot C separately and may raise a corresponding invoice for each completed lot.</w:t>
+            </w:r>
+          </w:p>
+        </w:tc>
+        <w:tc>
+          <w:tcPr>
+            <w:tcW w:type="dxa" w:w="1440"/>
+          </w:tcPr>
+          <w:p>
+            <w:r>
+              <w:t>The contract explicitly permits the dispatch of separate lots and corresponding invoicing for each, which satisfies the requirement for partial delivery and invoicing.</w:t>
             </w:r>
           </w:p>
         </w:tc>
@@ -2054,27 +2443,27 @@
           </w:tcPr>
           <w:p>
             <w:r>
-              <w:t>Delayed payment due to conditional advance tranches.</w:t>
-            </w:r>
-          </w:p>
-        </w:tc>
-        <w:tc>
-          <w:tcPr>
-            <w:tcW w:type="dxa" w:w="1440"/>
-          </w:tcPr>
-          <w:p>
-            <w:r>
-              <w:t>The partially met compliance indicates a risk of delayed payments linked to multiple conditions (performance guarantee, kick-off minutes, first document submission). This creates cash flow uncertainty for the supplier and potential operational delays. The buyer's deferral option further complicates this.</w:t>
-            </w:r>
-          </w:p>
-        </w:tc>
-        <w:tc>
-          <w:tcPr>
-            <w:tcW w:type="dxa" w:w="1440"/>
-          </w:tcPr>
-          <w:p>
-            <w:r>
-              <w:t>Require objective evidence verification within 10 business days; define acceptance criteria clearly.</w:t>
+              <w:t>Cash-flow and payment timing risk</w:t>
+            </w:r>
+          </w:p>
+        </w:tc>
+        <w:tc>
+          <w:tcPr>
+            <w:tcW w:type="dxa" w:w="1440"/>
+          </w:tcPr>
+          <w:p>
+            <w:r>
+              <w:t>The 45% advance is split into two tranches. 15% is conditional upon the delivery of a performance bank guarantee, signed kick-off minutes, and a document submission register. If these conditions are not met within 20 days, the Buyer has the discretionary right to defer payment without interest, delaying the Supplier's liquidity.</w:t>
+            </w:r>
+          </w:p>
+        </w:tc>
+        <w:tc>
+          <w:tcPr>
+            <w:tcW w:type="dxa" w:w="1440"/>
+          </w:tcPr>
+          <w:p>
+            <w:r>
+              <w:t>Ensure the full 45% advance is payable as a single lump sum upon PO acknowledgement and document submission without further conditional tranches.</w:t>
             </w:r>
           </w:p>
         </w:tc>
@@ -2116,27 +2505,27 @@
           </w:tcPr>
           <w:p>
             <w:r>
-              <w:t>Supplier exceeds performance security limits, creating financial exposure.</w:t>
-            </w:r>
-          </w:p>
-        </w:tc>
-        <w:tc>
-          <w:tcPr>
-            <w:tcW w:type="dxa" w:w="1440"/>
-          </w:tcPr>
-          <w:p>
-            <w:r>
-              <w:t>The Supplier is providing a bridge guarantee of 2% and a standard guarantee of 10%, totaling 12%. This exceeds the permitted limit of 10% as defined in Article 00511.3.1, potentially leading to increased costs or disputes regarding security obligations.</w:t>
-            </w:r>
-          </w:p>
-        </w:tc>
-        <w:tc>
-          <w:tcPr>
-            <w:tcW w:type="dxa" w:w="1440"/>
-          </w:tcPr>
-          <w:p>
-            <w:r>
-              <w:t>Reduce total performance security to a maximum of 10 percent including bridge guarantees.</w:t>
+              <w:t>Financial exposure and guarantee risk</w:t>
+            </w:r>
+          </w:p>
+        </w:tc>
+        <w:tc>
+          <w:tcPr>
+            <w:tcW w:type="dxa" w:w="1440"/>
+          </w:tcPr>
+          <w:p>
+            <w:r>
+              <w:t>The contract mandates a 10% performance guarantee plus a 2% bridge guarantee, totaling 12% security. This exceeds the 10% requirement limit. This creates excessive capital tie-up and financial strain on the supplier, contradicting General Procurement Condition 14.2.</w:t>
+            </w:r>
+          </w:p>
+        </w:tc>
+        <w:tc>
+          <w:tcPr>
+            <w:tcW w:type="dxa" w:w="1440"/>
+          </w:tcPr>
+          <w:p>
+            <w:r>
+              <w:t>Limit total performance security obligations to a maximum of 10 percent of the Purchase Order value, inclusive of the bridge guarantee.</w:t>
             </w:r>
           </w:p>
         </w:tc>
@@ -2178,27 +2567,27 @@
           </w:tcPr>
           <w:p>
             <w:r>
-              <w:t>Supplier may assess excessive liquidated damages due to capped exposure.</w:t>
-            </w:r>
-          </w:p>
-        </w:tc>
-        <w:tc>
-          <w:tcPr>
-            <w:tcW w:type="dxa" w:w="1440"/>
-          </w:tcPr>
-          <w:p>
-            <w:r>
-              <w:t>The clause limits LDs to 7.5% of the PO value, including Critical Dispatch Documents and service credits. This creates a potential overpayment risk if delays trigger multiple components within the cap, exceeding the intended damage assessment. It matters because it impacts cash flow and potentially violates cost control objectives.</w:t>
-            </w:r>
-          </w:p>
-        </w:tc>
-        <w:tc>
-          <w:tcPr>
-            <w:tcW w:type="dxa" w:w="1440"/>
-          </w:tcPr>
-          <w:p>
-            <w:r>
-              <w:t>Reduce aggregate LD and service-credit exposure to a maximum of 5 percent of PO value.</w:t>
+              <w:t>Financial exposure due to limited liquidated damages recovery</w:t>
+            </w:r>
+          </w:p>
+        </w:tc>
+        <w:tc>
+          <w:tcPr>
+            <w:tcW w:type="dxa" w:w="1440"/>
+          </w:tcPr>
+          <w:p>
+            <w:r>
+              <w:t>The clause exempts routine manuals and non-critical engineering submittals from standalone liquidated damages. This creates a gap where documentation delays not categorized as Critical Dispatch Documents do not trigger financial penalties, reducing the buyer's ability to recover costs for project delays caused by poor documentation management.</w:t>
+            </w:r>
+          </w:p>
+        </w:tc>
+        <w:tc>
+          <w:tcPr>
+            <w:tcW w:type="dxa" w:w="1440"/>
+          </w:tcPr>
+          <w:p>
+            <w:r>
+              <w:t>Apply liquidated damages to all documentation and engineering submittal delays regardless of criticality.</w:t>
             </w:r>
           </w:p>
         </w:tc>
@@ -2240,27 +2629,27 @@
           </w:tcPr>
           <w:p>
             <w:r>
-              <w:t>Potential for significant liquidated damages exposure.</w:t>
-            </w:r>
-          </w:p>
-        </w:tc>
-        <w:tc>
-          <w:tcPr>
-            <w:tcW w:type="dxa" w:w="1440"/>
-          </w:tcPr>
-          <w:p>
-            <w:r>
-              <w:t>The clause establishes multiple caps on liquidated damages, including a 7.5% aggregate limit and a 5% limit on delayed equipment. This significantly restricts the Buyer's ability to recover costs associated with delivery delays, creating substantial financial risk.</w:t>
-            </w:r>
-          </w:p>
-        </w:tc>
-        <w:tc>
-          <w:tcPr>
-            <w:tcW w:type="dxa" w:w="1440"/>
-          </w:tcPr>
-          <w:p>
-            <w:r>
-              <w:t>Reduce aggregate LD and service-credit exposure to a maximum of 5 percent of PO value.</w:t>
+              <w:t>Financial exposure due to liquidated damages caps</w:t>
+            </w:r>
+          </w:p>
+        </w:tc>
+        <w:tc>
+          <w:tcPr>
+            <w:tcW w:type="dxa" w:w="1440"/>
+          </w:tcPr>
+          <w:p>
+            <w:r>
+              <w:t>The clause imposes a 5% cap on individual equipment delivery LDs and a 7.5% aggregate cap on total PO value. This limits the buyer's ability to recover full losses resulting from significant delivery delays, restricting the financial recourse available beyond these predefined ceilings.</w:t>
+            </w:r>
+          </w:p>
+        </w:tc>
+        <w:tc>
+          <w:tcPr>
+            <w:tcW w:type="dxa" w:w="1440"/>
+          </w:tcPr>
+          <w:p>
+            <w:r>
+              <w:t>Remove the 5% individual equipment cap and increase the aggregate delay exposure cap to 10% of the total Purchase Order value.</w:t>
             </w:r>
           </w:p>
         </w:tc>
@@ -2302,27 +2691,27 @@
           </w:tcPr>
           <w:p>
             <w:r>
-              <w:t>Potential for significant liquidated damages exposure due to capped limits.</w:t>
-            </w:r>
-          </w:p>
-        </w:tc>
-        <w:tc>
-          <w:tcPr>
-            <w:tcW w:type="dxa" w:w="1440"/>
-          </w:tcPr>
-          <w:p>
-            <w:r>
-              <w:t>The clause establishes multiple caps on LD – 0.5% per week, a maximum of 5% of the undelivered value, and a total aggregate cap of 7.5%. This creates uncertainty regarding potential liability and could result in substantial additional costs if delays occur.</w:t>
-            </w:r>
-          </w:p>
-        </w:tc>
-        <w:tc>
-          <w:tcPr>
-            <w:tcW w:type="dxa" w:w="1440"/>
-          </w:tcPr>
-          <w:p>
-            <w:r>
-              <w:t>Reduce aggregate LD and service-credit exposure to a maximum of 5 percent of PO value.</w:t>
+              <w:t>Financial exposure due to aggregate LD cap overrun</w:t>
+            </w:r>
+          </w:p>
+        </w:tc>
+        <w:tc>
+          <w:tcPr>
+            <w:tcW w:type="dxa" w:w="1440"/>
+          </w:tcPr>
+          <w:p>
+            <w:r>
+              <w:t>While individual equipment delivery LD is capped at 5 percent, the aggregate cap for delivery LD, Critical Dispatch Documents, and service credits is increased to 7.5 percent of the total Purchase Order value. This exceeds the 5 percent requirement, increasing the total financial liability for the supplier.</w:t>
+            </w:r>
+          </w:p>
+        </w:tc>
+        <w:tc>
+          <w:tcPr>
+            <w:tcW w:type="dxa" w:w="1440"/>
+          </w:tcPr>
+          <w:p>
+            <w:r>
+              <w:t>Reduce aggregate delay exposure, including delivery LD and service credits, to a maximum of 5 percent of the total Purchase Order value.</w:t>
             </w:r>
           </w:p>
         </w:tc>
@@ -2364,27 +2753,27 @@
           </w:tcPr>
           <w:p>
             <w:r>
-              <w:t>Supplier may exceed liquidated damages cap, incurring significant costs.</w:t>
-            </w:r>
-          </w:p>
-        </w:tc>
-        <w:tc>
-          <w:tcPr>
-            <w:tcW w:type="dxa" w:w="1440"/>
-          </w:tcPr>
-          <w:p>
-            <w:r>
-              <w:t>The clause establishes a 7.5% aggregate LD cap but the Supplier has not met this requirement. This exposes the Buyer to potentially substantial additional payments due to delays, creating material financial risk and undermining cost control.</w:t>
-            </w:r>
-          </w:p>
-        </w:tc>
-        <w:tc>
-          <w:tcPr>
-            <w:tcW w:type="dxa" w:w="1440"/>
-          </w:tcPr>
-          <w:p>
-            <w:r>
-              <w:t>Reduce aggregate LD and service-credit exposure to a maximum of 5 percent of PO value.</w:t>
+              <w:t>Financial liability exposure</w:t>
+            </w:r>
+          </w:p>
+        </w:tc>
+        <w:tc>
+          <w:tcPr>
+            <w:tcW w:type="dxa" w:w="1440"/>
+          </w:tcPr>
+          <w:p>
+            <w:r>
+              <w:t>The aggregate cap for liquidated damages and service credits is set at 7.5 percent of the total Purchase Order value, exceeding the mandatory 5 percent requirement. This increases the maximum potential financial penalty the Supplier must pay for delivery and documentation delays.</w:t>
+            </w:r>
+          </w:p>
+        </w:tc>
+        <w:tc>
+          <w:tcPr>
+            <w:tcW w:type="dxa" w:w="1440"/>
+          </w:tcPr>
+          <w:p>
+            <w:r>
+              <w:t>Reduce aggregate delay exposure and service credits to a maximum of 5 percent of total Purchase Order value.</w:t>
             </w:r>
           </w:p>
         </w:tc>
@@ -2426,27 +2815,27 @@
           </w:tcPr>
           <w:p>
             <w:r>
-              <w:t>Potential for significant liquidated damages exposure due to limitations.</w:t>
-            </w:r>
-          </w:p>
-        </w:tc>
-        <w:tc>
-          <w:tcPr>
-            <w:tcW w:type="dxa" w:w="1440"/>
-          </w:tcPr>
-          <w:p>
-            <w:r>
-              <w:t>The clause establishes multiple caps on LD, including a 7.5% aggregate limit and a 5% per-equipment limit. This significantly reduces the buyer's ability to recover costs associated with delivery delays, creating substantial payment risk.</w:t>
-            </w:r>
-          </w:p>
-        </w:tc>
-        <w:tc>
-          <w:tcPr>
-            <w:tcW w:type="dxa" w:w="1440"/>
-          </w:tcPr>
-          <w:p>
-            <w:r>
-              <w:t>Reduce aggregate LD and service-credit exposure to a maximum of 5 percent of PO value.</w:t>
+              <w:t>Financial exposure due to lack of remedial work liquidated damages</w:t>
+            </w:r>
+          </w:p>
+        </w:tc>
+        <w:tc>
+          <w:tcPr>
+            <w:tcW w:type="dxa" w:w="1440"/>
+          </w:tcPr>
+          <w:p>
+            <w:r>
+              <w:t>Clause 00511.5.3 explicitly exempts remedial work, warranty repairs, and replacements from liquidated damages. This creates a financial gap where the buyer cannot recover monetary damages for delays in corrective actions, relying solely on a corrective-action plan without financial leverage to ensure timely performance.</w:t>
+            </w:r>
+          </w:p>
+        </w:tc>
+        <w:tc>
+          <w:tcPr>
+            <w:tcW w:type="dxa" w:w="1440"/>
+          </w:tcPr>
+          <w:p>
+            <w:r>
+              <w:t>Remove the exemption for remedial work and apply liquidated damages to delays in warranty repairs and replacements.</w:t>
             </w:r>
           </w:p>
         </w:tc>
@@ -2488,27 +2877,27 @@
           </w:tcPr>
           <w:p>
             <w:r>
-              <w:t>Extended guarantee periods create potential cost overruns.</w:t>
-            </w:r>
-          </w:p>
-        </w:tc>
-        <w:tc>
-          <w:tcPr>
-            <w:tcW w:type="dxa" w:w="1440"/>
-          </w:tcPr>
-          <w:p>
-            <w:r>
-              <w:t>The remedial guarantee of twelve months, coupled with the eighteen-month original dispatch warranty, introduces significant uncertainty regarding ongoing maintenance and repair costs. This extended duration increases the risk of unexpected expenses.</w:t>
-            </w:r>
-          </w:p>
-        </w:tc>
-        <w:tc>
-          <w:tcPr>
-            <w:tcW w:type="dxa" w:w="1440"/>
-          </w:tcPr>
-          <w:p>
-            <w:r>
-              <w:t>Limit guarantee period to the shortest allowable timeframe – eighteen months from original dispatch.</w:t>
+              <w:t>Warranty risks and financial exposure</w:t>
+            </w:r>
+          </w:p>
+        </w:tc>
+        <w:tc>
+          <w:tcPr>
+            <w:tcW w:type="dxa" w:w="1440"/>
+          </w:tcPr>
+          <w:p>
+            <w:r>
+              <w:t>The warranty period is subject to deemed events and restrictive time-caps. The standard guarantee may expire prematurely if commissioning is delayed, and remedial guarantees are capped at 18 months from original dispatch regardless of the repair date, limiting protection for replaced components.</w:t>
+            </w:r>
+          </w:p>
+        </w:tc>
+        <w:tc>
+          <w:tcPr>
+            <w:tcW w:type="dxa" w:w="1440"/>
+          </w:tcPr>
+          <w:p>
+            <w:r>
+              <w:t>Establish a fixed warranty period from final acceptance and ensure remedial guarantees run for a full term from the date of repair without dispatch-based caps.</w:t>
             </w:r>
           </w:p>
         </w:tc>
@@ -2550,27 +2939,27 @@
           </w:tcPr>
           <w:p>
             <w:r>
-              <w:t>Extended guarantee period creates potential liability exposure.</w:t>
-            </w:r>
-          </w:p>
-        </w:tc>
-        <w:tc>
-          <w:tcPr>
-            <w:tcW w:type="dxa" w:w="1440"/>
-          </w:tcPr>
-          <w:p>
-            <w:r>
-              <w:t>The clause provides a longer guarantee (18 months from dispatch) than the standard two-month guarantee, significantly increasing the Supplier's potential financial obligations and associated claims risk. This extended timeframe exposes the Buyer to prolonged repair costs.</w:t>
-            </w:r>
-          </w:p>
-        </w:tc>
-        <w:tc>
-          <w:tcPr>
-            <w:tcW w:type="dxa" w:w="1440"/>
-          </w:tcPr>
-          <w:p>
-            <w:r>
-              <w:t>Reduce the remedial guarantee period to twelve months from completion of repair or replacement.</w:t>
+              <w:t>Warranty risk and reduced equipment protection</w:t>
+            </w:r>
+          </w:p>
+        </w:tc>
+        <w:tc>
+          <w:tcPr>
+            <w:tcW w:type="dxa" w:w="1440"/>
+          </w:tcPr>
+          <w:p>
+            <w:r>
+              <w:t>The remedial guarantee for repaired components is limited to the earlier of twelve months from repair or eighteen months from original dispatch. This creates a gap where components replaced late in the original warranty period receive significantly shorter protection than the standard guarantee, increasing financial exposure for premature equipment failure.</w:t>
+            </w:r>
+          </w:p>
+        </w:tc>
+        <w:tc>
+          <w:tcPr>
+            <w:tcW w:type="dxa" w:w="1440"/>
+          </w:tcPr>
+          <w:p>
+            <w:r>
+              <w:t>Ensure repaired or replaced components are guaranteed for twelve months from completion of repair regardless of the original dispatch date.</w:t>
             </w:r>
           </w:p>
         </w:tc>
@@ -2612,27 +3001,27 @@
           </w:tcPr>
           <w:p>
             <w:r>
-              <w:t>Reduced guarantee period creates potential warranty claims.</w:t>
-            </w:r>
-          </w:p>
-        </w:tc>
-        <w:tc>
-          <w:tcPr>
-            <w:tcW w:type="dxa" w:w="1440"/>
-          </w:tcPr>
-          <w:p>
-            <w:r>
-              <w:t>The remedial guarantee of twelve months, potentially shorter than expected, exposes the Buyer to extended repair and replacement obligations. This could lead to increased costs and operational disruption if defects persist beyond the defined timeframe.</w:t>
-            </w:r>
-          </w:p>
-        </w:tc>
-        <w:tc>
-          <w:tcPr>
-            <w:tcW w:type="dxa" w:w="1440"/>
-          </w:tcPr>
-          <w:p>
-            <w:r>
-              <w:t>Require a minimum guarantee period of eighteen months from original dispatch.</w:t>
+              <w:t>Warranty risk and limited remedial coverage</w:t>
+            </w:r>
+          </w:p>
+        </w:tc>
+        <w:tc>
+          <w:tcPr>
+            <w:tcW w:type="dxa" w:w="1440"/>
+          </w:tcPr>
+          <w:p>
+            <w:r>
+              <w:t>The remedial guarantee is capped at 18 months from original dispatch, regardless of when the repair occurs. This creates a gap where repaired components may have little to no remaining warranty. Additionally, coverage is restricted only to the specific replaced component unless the entire equipment train is affected.</w:t>
+            </w:r>
+          </w:p>
+        </w:tc>
+        <w:tc>
+          <w:tcPr>
+            <w:tcW w:type="dxa" w:w="1440"/>
+          </w:tcPr>
+          <w:p>
+            <w:r>
+              <w:t>Extend remedial guarantee to a full 12 months from completion of repair regardless of original dispatch date and expand scope to include all affected integrated components.</w:t>
             </w:r>
           </w:p>
         </w:tc>
@@ -2674,27 +3063,27 @@
           </w:tcPr>
           <w:p>
             <w:r>
-              <w:t>Limited force majeure protection exposes the buyer to supply delays.</w:t>
-            </w:r>
-          </w:p>
-        </w:tc>
-        <w:tc>
-          <w:tcPr>
-            <w:tcW w:type="dxa" w:w="1440"/>
-          </w:tcPr>
-          <w:p>
-            <w:r>
-              <w:t>The clause's restriction to Tier-1 sub-suppliers and logistics carriers creates a significant vulnerability. The buyer is exposed to potential disruption if these key suppliers experience Force Majeure events, leading to non-performance or delivery delays without relief.</w:t>
-            </w:r>
-          </w:p>
-        </w:tc>
-        <w:tc>
-          <w:tcPr>
-            <w:tcW w:type="dxa" w:w="1440"/>
-          </w:tcPr>
-          <w:p>
-            <w:r>
-              <w:t>Expand force majeure protection to include all approved sub-contractors and logistics providers within the supply chain.</w:t>
+              <w:t>Force majeure limitations</w:t>
+            </w:r>
+          </w:p>
+        </w:tc>
+        <w:tc>
+          <w:tcPr>
+            <w:tcW w:type="dxa" w:w="1440"/>
+          </w:tcPr>
+          <w:p>
+            <w:r>
+              <w:t>Article 00511.7.2 restricts supply-chain force majeure relief exclusively to named Tier-1 sub-suppliers in Annex D and the approved logistics carrier. This creates operational and legal exposure because failures at other critical sub-contractor levels or alternate vendors are excluded from relief, regardless of whether the event was beyond the supplier's reasonable control.</w:t>
+            </w:r>
+          </w:p>
+        </w:tc>
+        <w:tc>
+          <w:tcPr>
+            <w:tcW w:type="dxa" w:w="1440"/>
+          </w:tcPr>
+          <w:p>
+            <w:r>
+              <w:t>Remove the restriction limiting supply-chain relief to named Tier-1 sub-suppliers and approved carriers to cover all critical sub-contractors.</w:t>
             </w:r>
           </w:p>
         </w:tc>
@@ -2736,27 +3125,27 @@
           </w:tcPr>
           <w:p>
             <w:r>
-              <w:t>Subcontractor force majeure exclusion creates payment risk.</w:t>
-            </w:r>
-          </w:p>
-        </w:tc>
-        <w:tc>
-          <w:tcPr>
-            <w:tcW w:type="dxa" w:w="1440"/>
-          </w:tcPr>
-          <w:p>
-            <w:r>
-              <w:t>The clause limits Force Majeure relief to named Tier-1 suppliers and approved logistics, excluding unnamed subcontractors. This exposes the client to potential non-performance or delays from sub-suppliers without recourse outlined in the standard Force Majeure provision.</w:t>
-            </w:r>
-          </w:p>
-        </w:tc>
-        <w:tc>
-          <w:tcPr>
-            <w:tcW w:type="dxa" w:w="1440"/>
-          </w:tcPr>
-          <w:p>
-            <w:r>
-              <w:t>Require supplier to extend force majeure protection to all approved subcontractors and logistics providers.</w:t>
+              <w:t>Force majeure limitations</w:t>
+            </w:r>
+          </w:p>
+        </w:tc>
+        <w:tc>
+          <w:tcPr>
+            <w:tcW w:type="dxa" w:w="1440"/>
+          </w:tcPr>
+          <w:p>
+            <w:r>
+              <w:t>Force majeure relief is restricted to specific Tier-1 suppliers in Annex D and approved carriers. This excludes unnamed subcontractors and alternate vendors, creating operational and legal exposure if a non-named supplier experiences a qualifying event, as the Supplier remains liable for performance failures.</w:t>
+            </w:r>
+          </w:p>
+        </w:tc>
+        <w:tc>
+          <w:tcPr>
+            <w:tcW w:type="dxa" w:w="1440"/>
+          </w:tcPr>
+          <w:p>
+            <w:r>
+              <w:t>Extend force majeure relief to all subcontractors and vendors regardless of their status as named Tier-1 or approved suppliers.</w:t>
             </w:r>
           </w:p>
         </w:tc>
@@ -2798,27 +3187,27 @@
           </w:tcPr>
           <w:p>
             <w:r>
-              <w:t>Limited Force Majeure scope creates potential payment delays.</w:t>
-            </w:r>
-          </w:p>
-        </w:tc>
-        <w:tc>
-          <w:tcPr>
-            <w:tcW w:type="dxa" w:w="1440"/>
-          </w:tcPr>
-          <w:p>
-            <w:r>
-              <w:t>The clause's restricted application to Tier-1 sub-suppliers and logistics carriers exposes the buyer to risks if these entities experience Force Majeure events, potentially delaying supplier performance and impacting payment schedules. The notice requirements further complicate this.</w:t>
-            </w:r>
-          </w:p>
-        </w:tc>
-        <w:tc>
-          <w:tcPr>
-            <w:tcW w:type="dxa" w:w="1440"/>
-          </w:tcPr>
-          <w:p>
-            <w:r>
-              <w:t>Expand Force Majeure coverage to include all approved subcontractors and logistics providers within the supply chain.</w:t>
+              <w:t>Force majeure limitations</w:t>
+            </w:r>
+          </w:p>
+        </w:tc>
+        <w:tc>
+          <w:tcPr>
+            <w:tcW w:type="dxa" w:w="1440"/>
+          </w:tcPr>
+          <w:p>
+            <w:r>
+              <w:t>The clause restricts Force Majeure relief for supply chain disruptions exclusively to named Tier-1 sub-suppliers in Annex D and approved carriers. This creates operational and legal exposure because the Supplier cannot claim relief for disruptions involving unnamed subcontractors or alternate vendors, potentially leading to breach of contract disputes during systemic supply chain failures.</w:t>
+            </w:r>
+          </w:p>
+        </w:tc>
+        <w:tc>
+          <w:tcPr>
+            <w:tcW w:type="dxa" w:w="1440"/>
+          </w:tcPr>
+          <w:p>
+            <w:r>
+              <w:t>Extend Force Majeure relief to cover all subcontractors and logistics providers regardless of their listing in Annex D.</w:t>
             </w:r>
           </w:p>
         </w:tc>
@@ -2860,27 +3249,27 @@
           </w:tcPr>
           <w:p>
             <w:r>
-              <w:t>Delayed payments due to escalating termination fees.</w:t>
-            </w:r>
-          </w:p>
-        </w:tc>
-        <w:tc>
-          <w:tcPr>
-            <w:tcW w:type="dxa" w:w="1440"/>
-          </w:tcPr>
-          <w:p>
-            <w:r>
-              <w:t>The clause outlines a tiered fee schedule based on the length of time after convenience cancellation, increasing significantly beyond 90 days. This creates a cash flow risk for the supplier if Buyer exercises this right, potentially leading to financial strain and operational disruption.</w:t>
-            </w:r>
-          </w:p>
-        </w:tc>
-        <w:tc>
-          <w:tcPr>
-            <w:tcW w:type="dxa" w:w="1440"/>
-          </w:tcPr>
-          <w:p>
-            <w:r>
-              <w:t>Establish a fixed termination payment cap, irrespective of delay duration, at a maximum defined percentage (e.g., 30%).</w:t>
+              <w:t>Financial exposure due to tiered termination fees</w:t>
+            </w:r>
+          </w:p>
+        </w:tc>
+        <w:tc>
+          <w:tcPr>
+            <w:tcW w:type="dxa" w:w="1440"/>
+          </w:tcPr>
+          <w:p>
+            <w:r>
+              <w:t>The Buyer is obligated to pay a sliding scale of fees up to 100 percent of the undelivered balance upon convenience cancellation. This creates significant cash-flow risk and financial liability based on the timing of the cancellation request.</w:t>
+            </w:r>
+          </w:p>
+        </w:tc>
+        <w:tc>
+          <w:tcPr>
+            <w:tcW w:type="dxa" w:w="1440"/>
+          </w:tcPr>
+          <w:p>
+            <w:r>
+              <w:t>Reduce the percentage of cancellation fees across all time tiers and cap the total liability for convenience termination.</w:t>
             </w:r>
           </w:p>
         </w:tc>
@@ -2922,27 +3311,27 @@
           </w:tcPr>
           <w:p>
             <w:r>
-              <w:t>Delayed payment due to complex cancellation fee schedule.</w:t>
-            </w:r>
-          </w:p>
-        </w:tc>
-        <w:tc>
-          <w:tcPr>
-            <w:tcW w:type="dxa" w:w="1440"/>
-          </w:tcPr>
-          <w:p>
-            <w:r>
-              <w:t>The clause outlines a tiered cancellation fee structure based on the length of time before Buyer cancellation, increasing significantly after 90 days. This introduces uncertainty regarding the final payment amount and potential cash flow implications for the Supplier.</w:t>
-            </w:r>
-          </w:p>
-        </w:tc>
-        <w:tc>
-          <w:tcPr>
-            <w:tcW w:type="dxa" w:w="1440"/>
-          </w:tcPr>
-          <w:p>
-            <w:r>
-              <w:t>Implement a standardized early termination process with fixed fees across all order values to mitigate schedule complexity.</w:t>
+              <w:t>Financial exposure through escalating termination for convenience fees</w:t>
+            </w:r>
+          </w:p>
+        </w:tc>
+        <w:tc>
+          <w:tcPr>
+            <w:tcW w:type="dxa" w:w="1440"/>
+          </w:tcPr>
+          <w:p>
+            <w:r>
+              <w:t>The tiered fee structure creates significant financial liability, reaching 100 percent of the undelivered balance after 181 days. This creates a high cost of exit for the Buyer regardless of Supplier actual costs, escalating rapidly from 7.5 percent to 100 percent based solely on time elapsed since acknowledgement.</w:t>
+            </w:r>
+          </w:p>
+        </w:tc>
+        <w:tc>
+          <w:tcPr>
+            <w:tcW w:type="dxa" w:w="1440"/>
+          </w:tcPr>
+          <w:p>
+            <w:r>
+              <w:t>Replace the percentage-based schedule with a reimbursement model limited to actual, documented, and non-cancelable costs incurred by the Supplier.</w:t>
             </w:r>
           </w:p>
         </w:tc>
@@ -2984,27 +3373,27 @@
           </w:tcPr>
           <w:p>
             <w:r>
-              <w:t>Failure to pay cancellation fee exposes the buyer to increased costs.</w:t>
-            </w:r>
-          </w:p>
-        </w:tc>
-        <w:tc>
-          <w:tcPr>
-            <w:tcW w:type="dxa" w:w="1440"/>
-          </w:tcPr>
-          <w:p>
-            <w:r>
-              <w:t>The contract stipulates a percentage-based cancellation fee dependent on the length of notice. The non-compliance creates an exposure for the buyer to pay a higher termination fee than outlined in the agreement, impacting cash flow and potentially increasing financial liability.</w:t>
-            </w:r>
-          </w:p>
-        </w:tc>
-        <w:tc>
-          <w:tcPr>
-            <w:tcW w:type="dxa" w:w="1440"/>
-          </w:tcPr>
-          <w:p>
-            <w:r>
-              <w:t>Implement rigorous invoice validation processes to ensure accurate calculation and timely payment of the applicable cancellation fee.</w:t>
+              <w:t>Financial exposure due to non-compliant cancellation fee structure</w:t>
+            </w:r>
+          </w:p>
+        </w:tc>
+        <w:tc>
+          <w:tcPr>
+            <w:tcW w:type="dxa" w:w="1440"/>
+          </w:tcPr>
+          <w:p>
+            <w:r>
+              <w:t>The contract specifies a 38% fee for the 61-90 day window instead of the required 40%. This creates a discrepancy between the mandatory corporate requirement and the actual contractual obligation, resulting in an under-recovery of costs or failure to meet internal financial compliance standards during early termination for convenience.</w:t>
+            </w:r>
+          </w:p>
+        </w:tc>
+        <w:tc>
+          <w:tcPr>
+            <w:tcW w:type="dxa" w:w="1440"/>
+          </w:tcPr>
+          <w:p>
+            <w:r>
+              <w:t>Increase the cancellation fee for the 61-90 day window to 40 percent of the order value.</w:t>
             </w:r>
           </w:p>
         </w:tc>
@@ -3046,27 +3435,27 @@
           </w:tcPr>
           <w:p>
             <w:r>
-              <w:t>Potential for increased costs due to excessive suspensions.</w:t>
-            </w:r>
-          </w:p>
-        </w:tc>
-        <w:tc>
-          <w:tcPr>
-            <w:tcW w:type="dxa" w:w="1440"/>
-          </w:tcPr>
-          <w:p>
-            <w:r>
-              <w:t>The clause allows up to two commercial convenience suspensions totaling thirty days, excluding regulatory stoppages. Partial compliance means the Buyer could potentially exceed this limit without triggering compensable change orders, exposing the Supplier to unexpected delays and related costs.</w:t>
-            </w:r>
-          </w:p>
-        </w:tc>
-        <w:tc>
-          <w:tcPr>
-            <w:tcW w:type="dxa" w:w="1440"/>
-          </w:tcPr>
-          <w:p>
-            <w:r>
-              <w:t>Implement a rigorous tracking system for all suspension requests and their durations, enforcing strict adherence to the 30-day aggregate limit.</w:t>
+              <w:t>Suspension risks and financial exposure</w:t>
+            </w:r>
+          </w:p>
+        </w:tc>
+        <w:tc>
+          <w:tcPr>
+            <w:tcW w:type="dxa" w:w="1440"/>
+          </w:tcPr>
+          <w:p>
+            <w:r>
+              <w:t>The clause excludes regulatory, government, and safety stoppages from the suspension limits. This allows the Buyer to suspend work indefinitely for these reasons without triggering the compensable change order protections defined in 00511.10.2, leading to unrecovered costs for storage, demobilization, and remobilization.</w:t>
+            </w:r>
+          </w:p>
+        </w:tc>
+        <w:tc>
+          <w:tcPr>
+            <w:tcW w:type="dxa" w:w="1440"/>
+          </w:tcPr>
+          <w:p>
+            <w:r>
+              <w:t>Include regulatory, government, and safety stoppages within the maximum suspension limits and the definition of compensable excess periods.</w:t>
             </w:r>
           </w:p>
         </w:tc>
@@ -3108,27 +3497,27 @@
           </w:tcPr>
           <w:p>
             <w:r>
-              <w:t>Buyer's discretionary suspension power creates potential cash flow disruption.</w:t>
-            </w:r>
-          </w:p>
-        </w:tc>
-        <w:tc>
-          <w:tcPr>
-            <w:tcW w:type="dxa" w:w="1440"/>
-          </w:tcPr>
-          <w:p>
-            <w:r>
-              <w:t>The clause allows for two commercial convenience suspensions up to 30 days, contingent on supplier agreement. Exceeding this limit triggers a change order, potentially leading to unexpected costs and delays impacting payment schedules and forecasts.</w:t>
-            </w:r>
-          </w:p>
-        </w:tc>
-        <w:tc>
-          <w:tcPr>
-            <w:tcW w:type="dxa" w:w="1440"/>
-          </w:tcPr>
-          <w:p>
-            <w:r>
-              <w:t>Require written prior approval for any suspension exceeding the stated limits.</w:t>
+              <w:t>Operational and financial suspension risks</w:t>
+            </w:r>
+          </w:p>
+        </w:tc>
+        <w:tc>
+          <w:tcPr>
+            <w:tcW w:type="dxa" w:w="1440"/>
+          </w:tcPr>
+          <w:p>
+            <w:r>
+              <w:t>The clause allows Buyer to suspend work twice for 30 days. While excess periods are compensable, the initial 30-day window and the 5-day restart window subject to resource availability create operational uncertainty and potential uncompensated standby costs for the Supplier.</w:t>
+            </w:r>
+          </w:p>
+        </w:tc>
+        <w:tc>
+          <w:tcPr>
+            <w:tcW w:type="dxa" w:w="1440"/>
+          </w:tcPr>
+          <w:p>
+            <w:r>
+              <w:t>Require payment for all suspension periods regardless of duration and remove the 30-day non-compensable threshold.</w:t>
             </w:r>
           </w:p>
         </w:tc>
@@ -3170,27 +3559,27 @@
           </w:tcPr>
           <w:p>
             <w:r>
-              <w:t>Increased legal and jurisdictional risk due to India governance.</w:t>
-            </w:r>
-          </w:p>
-        </w:tc>
-        <w:tc>
-          <w:tcPr>
-            <w:tcW w:type="dxa" w:w="1440"/>
-          </w:tcPr>
-          <w:p>
-            <w:r>
-              <w:t>Governing law is solely India, excluding conflict of laws. This limits the applicability of international legal principles and potentially exposes us to Indian regulations which may be less favorable than our standard practice. The clause offers limited protection.</w:t>
-            </w:r>
-          </w:p>
-        </w:tc>
-        <w:tc>
-          <w:tcPr>
-            <w:tcW w:type="dxa" w:w="1440"/>
-          </w:tcPr>
-          <w:p>
-            <w:r>
-              <w:t>Require governing law to be [Specified Jurisdiction - e.g., Delaware] for all contracts.</w:t>
+              <w:t>Legal and arbitration exposure due to fragmented dispute resolution</w:t>
+            </w:r>
+          </w:p>
+        </w:tc>
+        <w:tc>
+          <w:tcPr>
+            <w:tcW w:type="dxa" w:w="1440"/>
+          </w:tcPr>
+          <w:p>
+            <w:r>
+              <w:t>The clause creates a split jurisdictional framework where governing law is India, but specific disputes are arbitrated in Singapore, while others remain in Mumbai courts. This fragmentation increases legal complexity, potential for conflicting judgments, and higher costs associated with managing proceedings across two different legal jurisdictions and forums.</w:t>
+            </w:r>
+          </w:p>
+        </w:tc>
+        <w:tc>
+          <w:tcPr>
+            <w:tcW w:type="dxa" w:w="1440"/>
+          </w:tcPr>
+          <w:p>
+            <w:r>
+              <w:t>Align governing law and dispute resolution to a single jurisdiction and forum for all contractual and non-contractual obligations.</w:t>
             </w:r>
           </w:p>
         </w:tc>
@@ -3232,27 +3621,27 @@
           </w:tcPr>
           <w:p>
             <w:r>
-              <w:t>Arbitration process may prove costly and time-consuming.</w:t>
-            </w:r>
-          </w:p>
-        </w:tc>
-        <w:tc>
-          <w:tcPr>
-            <w:tcW w:type="dxa" w:w="1440"/>
-          </w:tcPr>
-          <w:p>
-            <w:r>
-              <w:t>The two-stage dispute resolution – initial expert determination followed by arbitration – introduces potential delays and expenses. The Mumbai expert step adds an additional layer of complexity and cost if rejected.</w:t>
-            </w:r>
-          </w:p>
-        </w:tc>
-        <w:tc>
-          <w:tcPr>
-            <w:tcW w:type="dxa" w:w="1440"/>
-          </w:tcPr>
-          <w:p>
-            <w:r>
-              <w:t>Implement a clearly defined protocol for managing expert determinations to minimize unnecessary escalation to Singapore arbitration.</w:t>
+              <w:t>Arbitration limitations</w:t>
+            </w:r>
+          </w:p>
+        </w:tc>
+        <w:tc>
+          <w:tcPr>
+            <w:tcW w:type="dxa" w:w="1440"/>
+          </w:tcPr>
+          <w:p>
+            <w:r>
+              <w:t>The arbitration mechanism is conditional and restricted. Only legal disputes proceed to Singapore arbitration if a technical expert in Mumbai first determines laboratory test methodology disputes. This creates a dependency on a preliminary expert determination and limits the direct application of arbitration for technical disagreements.</w:t>
+            </w:r>
+          </w:p>
+        </w:tc>
+        <w:tc>
+          <w:tcPr>
+            <w:tcW w:type="dxa" w:w="1440"/>
+          </w:tcPr>
+          <w:p>
+            <w:r>
+              <w:t>Ensure all disputes regardless of technical nature are subject to direct Singapore arbitration without mandatory preliminary expert determination.</w:t>
             </w:r>
           </w:p>
         </w:tc>
@@ -3294,27 +3683,27 @@
           </w:tcPr>
           <w:p>
             <w:r>
-              <w:t>Arbitration seat limitations may escalate disputes costs.</w:t>
-            </w:r>
-          </w:p>
-        </w:tc>
-        <w:tc>
-          <w:tcPr>
-            <w:tcW w:type="dxa" w:w="1440"/>
-          </w:tcPr>
-          <w:p>
-            <w:r>
-              <w:t>The clause dictates a two-stage process: initial expert determination in Mumbai followed by arbitration only for remaining legal disputes in Singapore. This bifurcated approach introduces potential delays and increased legal fees due to the need to engage with both jurisdictions, potentially increasing overall dispute resolution expenses.</w:t>
-            </w:r>
-          </w:p>
-        </w:tc>
-        <w:tc>
-          <w:tcPr>
-            <w:tcW w:type="dxa" w:w="1440"/>
-          </w:tcPr>
-          <w:p>
-            <w:r>
-              <w:t>Establish clear guidelines regarding escalation criteria and associated cost allocation between parties.</w:t>
+              <w:t>Arbitration limitations and legal exposure</w:t>
+            </w:r>
+          </w:p>
+        </w:tc>
+        <w:tc>
+          <w:tcPr>
+            <w:tcW w:type="dxa" w:w="1440"/>
+          </w:tcPr>
+          <w:p>
+            <w:r>
+              <w:t>The clause creates a multi-tiered dispute process with a carve-out for laboratory test methodology. By requiring a technical expert in Mumbai before proceeding to Singapore arbitration, the process introduces a procedural dependency and potential delays in achieving a final legal resolution.</w:t>
+            </w:r>
+          </w:p>
+        </w:tc>
+        <w:tc>
+          <w:tcPr>
+            <w:tcW w:type="dxa" w:w="1440"/>
+          </w:tcPr>
+          <w:p>
+            <w:r>
+              <w:t>Remove the requirement for a technical expert referral and mandate all disputes proceed directly to Singapore arbitration.</w:t>
             </w:r>
           </w:p>
         </w:tc>
@@ -3356,27 +3745,27 @@
           </w:tcPr>
           <w:p>
             <w:r>
-              <w:t>Reduced liability coverage for safety shutdown emergencies.</w:t>
-            </w:r>
-          </w:p>
-        </w:tc>
-        <w:tc>
-          <w:tcPr>
-            <w:tcW w:type="dxa" w:w="1440"/>
-          </w:tcPr>
-          <w:p>
-            <w:r>
-              <w:t>The clause excludes emergency removal costs when a defect triggers a safety shutdown, effectively limiting the supplier's liability cap. This creates significant exposure if such an event occurs, potentially leading to substantial uninsured damages and increased financial risk.</w:t>
-            </w:r>
-          </w:p>
-        </w:tc>
-        <w:tc>
-          <w:tcPr>
-            <w:tcW w:type="dxa" w:w="1440"/>
-          </w:tcPr>
-          <w:p>
-            <w:r>
-              <w:t>Define 'safety shutdown' with clear triggering criteria and extend the 10% liability cap to cover these excluded emergency costs.</w:t>
+              <w:t>Liability exposure</w:t>
+            </w:r>
+          </w:p>
+        </w:tc>
+        <w:tc>
+          <w:tcPr>
+            <w:tcW w:type="dxa" w:w="1440"/>
+          </w:tcPr>
+          <w:p>
+            <w:r>
+              <w:t>The liability cap for defect repairs is limited to 10 percent of the PO value. While certain emergency costs are carved out, other significant defect-related damages remain capped, creating financial exposure if repair costs exceed the 10 percent threshold.</w:t>
+            </w:r>
+          </w:p>
+        </w:tc>
+        <w:tc>
+          <w:tcPr>
+            <w:tcW w:type="dxa" w:w="1440"/>
+          </w:tcPr>
+          <w:p>
+            <w:r>
+              <w:t>Increase the aggregate liability cap for defect repairs and expand the list of excluded costs to include all emergency and critical failure remediations.</w:t>
             </w:r>
           </w:p>
         </w:tc>
@@ -3418,27 +3807,27 @@
           </w:tcPr>
           <w:p>
             <w:r>
-              <w:t>Partial exclusion of consequential damages exposes the company to significant financial risk.</w:t>
-            </w:r>
-          </w:p>
-        </w:tc>
-        <w:tc>
-          <w:tcPr>
-            <w:tcW w:type="dxa" w:w="1440"/>
-          </w:tcPr>
-          <w:p>
-            <w:r>
-              <w:t>Despite a broad exclusion, exceptions exist for specific events like confidentiality breaches and gross negligence. This creates uncertainty regarding liability coverage for unforeseen losses beyond direct damages, potentially leading to unexpected costs and disputes. The clause's partial fulfillment indicates insufficient protection.</w:t>
-            </w:r>
-          </w:p>
-        </w:tc>
-        <w:tc>
-          <w:tcPr>
-            <w:tcW w:type="dxa" w:w="1440"/>
-          </w:tcPr>
-          <w:p>
-            <w:r>
-              <w:t>Implement enhanced due diligence on key performance indicators and establish clear trigger points for consequential loss claims based on the defined exceptions.</w:t>
+              <w:t>Uncapped liability exposure via consequential damage carve-outs</w:t>
+            </w:r>
+          </w:p>
+        </w:tc>
+        <w:tc>
+          <w:tcPr>
+            <w:tcW w:type="dxa" w:w="1440"/>
+          </w:tcPr>
+          <w:p>
+            <w:r>
+              <w:t>Article 00511.15.2 creates multiple exceptions to the consequential damages waiver, including confidentiality, indemnity, IP infringement, and gross negligence. This allows the counterparty to seek recovery for indirect and consequential losses for these events, bypassing the general liability limitation and increasing financial and legal exposure.</w:t>
+            </w:r>
+          </w:p>
+        </w:tc>
+        <w:tc>
+          <w:tcPr>
+            <w:tcW w:type="dxa" w:w="1440"/>
+          </w:tcPr>
+          <w:p>
+            <w:r>
+              <w:t>Remove exceptions for confidentiality, indemnity, and IP infringement from the consequential damages waiver to ensure a comprehensive exclusion of indirect losses.</w:t>
             </w:r>
           </w:p>
         </w:tc>
@@ -3480,27 +3869,27 @@
           </w:tcPr>
           <w:p>
             <w:r>
-              <w:t>Potential for significant liability despite exclusion.</w:t>
-            </w:r>
-          </w:p>
-        </w:tc>
-        <w:tc>
-          <w:tcPr>
-            <w:tcW w:type="dxa" w:w="1440"/>
-          </w:tcPr>
-          <w:p>
-            <w:r>
-              <w:t>The clause excludes many potential damages, but numerous exceptions exist. These include breaches of confidentiality, indemnity obligations, and specific types of negligence, creating a substantial exposure if any of these triggers occur. This exposes the client to potentially unlimited costs.</w:t>
-            </w:r>
-          </w:p>
-        </w:tc>
-        <w:tc>
-          <w:tcPr>
-            <w:tcW w:type="dxa" w:w="1440"/>
-          </w:tcPr>
-          <w:p>
-            <w:r>
-              <w:t>Expand exclusions to include broader definitions of negligence and ensure all exceptions are thoroughly vetted for applicability.</w:t>
+              <w:t>Increased liability exposure via extensive consequential damage carve-outs</w:t>
+            </w:r>
+          </w:p>
+        </w:tc>
+        <w:tc>
+          <w:tcPr>
+            <w:tcW w:type="dxa" w:w="1440"/>
+          </w:tcPr>
+          <w:p>
+            <w:r>
+              <w:t>The clause provides a broad waiver but allows for multiple exceptions including confidentiality, indemnity, IP infringement, fraud, and gross negligence. These carve-outs bypass the limitation of liability for consequential damages, exposing the company to uncapped financial claims for indirect losses in these specific scenarios.</w:t>
+            </w:r>
+          </w:p>
+        </w:tc>
+        <w:tc>
+          <w:tcPr>
+            <w:tcW w:type="dxa" w:w="1440"/>
+          </w:tcPr>
+          <w:p>
+            <w:r>
+              <w:t>Narrow the list of exceptions to consequential damage waivers and subject all carve-outs to an overall aggregate liability cap.</w:t>
             </w:r>
           </w:p>
         </w:tc>
@@ -3542,27 +3931,27 @@
           </w:tcPr>
           <w:p>
             <w:r>
-              <w:t>Delayed payment exposure due to acceptance exceptions.</w:t>
-            </w:r>
-          </w:p>
-        </w:tc>
-        <w:tc>
-          <w:tcPr>
-            <w:tcW w:type="dxa" w:w="1440"/>
-          </w:tcPr>
-          <w:p>
-            <w:r>
-              <w:t>The clause's reliance on 'acceptance record' introduces ambiguity regarding invoice trigger dates. This creates a risk of delayed payments if the buyer disputes an invoice, extending the payment term beyond Net 30 days, impacting cash flow and potentially incurring late payment penalties.</w:t>
-            </w:r>
-          </w:p>
-        </w:tc>
-        <w:tc>
-          <w:tcPr>
-            <w:tcW w:type="dxa" w:w="1440"/>
-          </w:tcPr>
-          <w:p>
-            <w:r>
-              <w:t>Specify clear acceptance criteria for invoices and define the definitive invoice receipt date triggering the Net 30 payment obligation.</w:t>
+              <w:t>Cash-flow risk and payment unpredictability</w:t>
+            </w:r>
+          </w:p>
+        </w:tc>
+        <w:tc>
+          <w:tcPr>
+            <w:tcW w:type="dxa" w:w="1440"/>
+          </w:tcPr>
+          <w:p>
+            <w:r>
+              <w:t>Payment is contingent upon internal buyer processes including goods receipt, inspection, and packing-list reconciliation. Because the 30-day clock only starts after these internal records are completed, the buyer can unilaterally delay payment regardless of the invoice date, creating financial uncertainty and extending the actual payment cycle beyond the required Net 30 terms.</w:t>
+            </w:r>
+          </w:p>
+        </w:tc>
+        <w:tc>
+          <w:tcPr>
+            <w:tcW w:type="dxa" w:w="1440"/>
+          </w:tcPr>
+          <w:p>
+            <w:r>
+              <w:t>Set payment as Net 30 days from invoice receipt and remove internal system record dependencies as triggers for the payment clock.</w:t>
             </w:r>
           </w:p>
         </w:tc>
@@ -3651,7 +4040,7 @@
           </w:tcPr>
           <w:p>
             <w:r>
-              <w:t>Require objective evidence verification within 10 business days; define acceptance criteria clearly.</w:t>
+              <w:t>Ensure the full 45% advance is payable as a single lump sum upon PO acknowledgement and document submission without further conditional tranches.</w:t>
             </w:r>
           </w:p>
         </w:tc>
@@ -3683,7 +4072,7 @@
           </w:tcPr>
           <w:p>
             <w:r>
-              <w:t>Reduce total performance security to a maximum of 10 percent including bridge guarantees.</w:t>
+              <w:t>Limit total performance security obligations to a maximum of 10 percent of the Purchase Order value, inclusive of the bridge guarantee.</w:t>
             </w:r>
           </w:p>
         </w:tc>
@@ -3715,7 +4104,7 @@
           </w:tcPr>
           <w:p>
             <w:r>
-              <w:t>Reduce aggregate LD and service-credit exposure to a maximum of 5 percent of PO value.</w:t>
+              <w:t>Apply liquidated damages to all documentation and engineering submittal delays regardless of criticality.</w:t>
             </w:r>
           </w:p>
         </w:tc>
@@ -3747,7 +4136,7 @@
           </w:tcPr>
           <w:p>
             <w:r>
-              <w:t>Reduce aggregate LD and service-credit exposure to a maximum of 5 percent of PO value.</w:t>
+              <w:t>Remove the 5% individual equipment cap and increase the aggregate delay exposure cap to 10% of the total Purchase Order value.</w:t>
             </w:r>
           </w:p>
         </w:tc>
@@ -3779,7 +4168,7 @@
           </w:tcPr>
           <w:p>
             <w:r>
-              <w:t>Reduce aggregate LD and service-credit exposure to a maximum of 5 percent of PO value.</w:t>
+              <w:t>Reduce aggregate delay exposure, including delivery LD and service credits, to a maximum of 5 percent of the total Purchase Order value.</w:t>
             </w:r>
           </w:p>
         </w:tc>
@@ -3811,7 +4200,7 @@
           </w:tcPr>
           <w:p>
             <w:r>
-              <w:t>Reduce aggregate LD and service-credit exposure to a maximum of 5 percent of PO value.</w:t>
+              <w:t>Reduce aggregate delay exposure and service credits to a maximum of 5 percent of total Purchase Order value.</w:t>
             </w:r>
           </w:p>
         </w:tc>
@@ -3843,7 +4232,7 @@
           </w:tcPr>
           <w:p>
             <w:r>
-              <w:t>Reduce aggregate LD and service-credit exposure to a maximum of 5 percent of PO value.</w:t>
+              <w:t>Remove the exemption for remedial work and apply liquidated damages to delays in warranty repairs and replacements.</w:t>
             </w:r>
           </w:p>
         </w:tc>
@@ -3875,7 +4264,7 @@
           </w:tcPr>
           <w:p>
             <w:r>
-              <w:t>Limit guarantee period to the shortest allowable timeframe – eighteen months from original dispatch.</w:t>
+              <w:t>Establish a fixed warranty period from final acceptance and ensure remedial guarantees run for a full term from the date of repair without dispatch-based caps.</w:t>
             </w:r>
           </w:p>
         </w:tc>
@@ -3907,7 +4296,7 @@
           </w:tcPr>
           <w:p>
             <w:r>
-              <w:t>Reduce the remedial guarantee period to twelve months from completion of repair or replacement.</w:t>
+              <w:t>Ensure repaired or replaced components are guaranteed for twelve months from completion of repair regardless of the original dispatch date.</w:t>
             </w:r>
           </w:p>
         </w:tc>
@@ -3939,7 +4328,7 @@
           </w:tcPr>
           <w:p>
             <w:r>
-              <w:t>Require a minimum guarantee period of eighteen months from original dispatch.</w:t>
+              <w:t>Extend remedial guarantee to a full 12 months from completion of repair regardless of original dispatch date and expand scope to include all affected integrated components.</w:t>
             </w:r>
           </w:p>
         </w:tc>
@@ -3971,7 +4360,7 @@
           </w:tcPr>
           <w:p>
             <w:r>
-              <w:t>Expand force majeure protection to include all approved sub-contractors and logistics providers within the supply chain.</w:t>
+              <w:t>Remove the restriction limiting supply-chain relief to named Tier-1 sub-suppliers and approved carriers to cover all critical sub-contractors.</w:t>
             </w:r>
           </w:p>
         </w:tc>
@@ -4003,7 +4392,7 @@
           </w:tcPr>
           <w:p>
             <w:r>
-              <w:t>Require supplier to extend force majeure protection to all approved subcontractors and logistics providers.</w:t>
+              <w:t>Extend force majeure relief to all subcontractors and vendors regardless of their status as named Tier-1 or approved suppliers.</w:t>
             </w:r>
           </w:p>
         </w:tc>
@@ -4035,7 +4424,7 @@
           </w:tcPr>
           <w:p>
             <w:r>
-              <w:t>Expand Force Majeure coverage to include all approved subcontractors and logistics providers within the supply chain.</w:t>
+              <w:t>Extend Force Majeure relief to cover all subcontractors and logistics providers regardless of their listing in Annex D.</w:t>
             </w:r>
           </w:p>
         </w:tc>
@@ -4067,7 +4456,7 @@
           </w:tcPr>
           <w:p>
             <w:r>
-              <w:t>Establish a fixed termination payment cap, irrespective of delay duration, at a maximum defined percentage (e.g., 30%).</w:t>
+              <w:t>Reduce the percentage of cancellation fees across all time tiers and cap the total liability for convenience termination.</w:t>
             </w:r>
           </w:p>
         </w:tc>
@@ -4099,7 +4488,7 @@
           </w:tcPr>
           <w:p>
             <w:r>
-              <w:t>Implement a standardized early termination process with fixed fees across all order values to mitigate schedule complexity.</w:t>
+              <w:t>Replace the percentage-based schedule with a reimbursement model limited to actual, documented, and non-cancelable costs incurred by the Supplier.</w:t>
             </w:r>
           </w:p>
         </w:tc>
@@ -4131,7 +4520,7 @@
           </w:tcPr>
           <w:p>
             <w:r>
-              <w:t>Implement rigorous invoice validation processes to ensure accurate calculation and timely payment of the applicable cancellation fee.</w:t>
+              <w:t>Increase the cancellation fee for the 61-90 day window to 40 percent of the order value.</w:t>
             </w:r>
           </w:p>
         </w:tc>
@@ -4163,7 +4552,7 @@
           </w:tcPr>
           <w:p>
             <w:r>
-              <w:t>Implement a rigorous tracking system for all suspension requests and their durations, enforcing strict adherence to the 30-day aggregate limit.</w:t>
+              <w:t>Include regulatory, government, and safety stoppages within the maximum suspension limits and the definition of compensable excess periods.</w:t>
             </w:r>
           </w:p>
         </w:tc>
@@ -4195,7 +4584,7 @@
           </w:tcPr>
           <w:p>
             <w:r>
-              <w:t>Require written prior approval for any suspension exceeding the stated limits.</w:t>
+              <w:t>Require payment for all suspension periods regardless of duration and remove the 30-day non-compensable threshold.</w:t>
             </w:r>
           </w:p>
         </w:tc>
@@ -4227,7 +4616,7 @@
           </w:tcPr>
           <w:p>
             <w:r>
-              <w:t>Require governing law to be [Specified Jurisdiction - e.g., Delaware] for all contracts.</w:t>
+              <w:t>Align governing law and dispute resolution to a single jurisdiction and forum for all contractual and non-contractual obligations.</w:t>
             </w:r>
           </w:p>
         </w:tc>
@@ -4259,7 +4648,7 @@
           </w:tcPr>
           <w:p>
             <w:r>
-              <w:t>Implement a clearly defined protocol for managing expert determinations to minimize unnecessary escalation to Singapore arbitration.</w:t>
+              <w:t>Ensure all disputes regardless of technical nature are subject to direct Singapore arbitration without mandatory preliminary expert determination.</w:t>
             </w:r>
           </w:p>
         </w:tc>
@@ -4291,7 +4680,7 @@
           </w:tcPr>
           <w:p>
             <w:r>
-              <w:t>Establish clear guidelines regarding escalation criteria and associated cost allocation between parties.</w:t>
+              <w:t>Remove the requirement for a technical expert referral and mandate all disputes proceed directly to Singapore arbitration.</w:t>
             </w:r>
           </w:p>
         </w:tc>
@@ -4323,7 +4712,7 @@
           </w:tcPr>
           <w:p>
             <w:r>
-              <w:t>Define 'safety shutdown' with clear triggering criteria and extend the 10% liability cap to cover these excluded emergency costs.</w:t>
+              <w:t>Increase the aggregate liability cap for defect repairs and expand the list of excluded costs to include all emergency and critical failure remediations.</w:t>
             </w:r>
           </w:p>
         </w:tc>
@@ -4355,7 +4744,7 @@
           </w:tcPr>
           <w:p>
             <w:r>
-              <w:t>Implement enhanced due diligence on key performance indicators and establish clear trigger points for consequential loss claims based on the defined exceptions.</w:t>
+              <w:t>Remove exceptions for confidentiality, indemnity, and IP infringement from the consequential damages waiver to ensure a comprehensive exclusion of indirect losses.</w:t>
             </w:r>
           </w:p>
         </w:tc>
@@ -4387,7 +4776,7 @@
           </w:tcPr>
           <w:p>
             <w:r>
-              <w:t>Expand exclusions to include broader definitions of negligence and ensure all exceptions are thoroughly vetted for applicability.</w:t>
+              <w:t>Narrow the list of exceptions to consequential damage waivers and subject all carve-outs to an overall aggregate liability cap.</w:t>
             </w:r>
           </w:p>
         </w:tc>
@@ -4419,7 +4808,7 @@
           </w:tcPr>
           <w:p>
             <w:r>
-              <w:t>Specify clear acceptance criteria for invoices and define the definitive invoice receipt date triggering the Net 30 payment obligation.</w:t>
+              <w:t>Set payment as Net 30 days from invoice receipt and remove internal system record dependencies as triggers for the payment clock.</w:t>
             </w:r>
           </w:p>
         </w:tc>

</xml_diff>

<commit_message>
updated ui and key summary generation.
</commit_message>
<xml_diff>
--- a/contract_analysis_report.docx
+++ b/contract_analysis_report.docx
@@ -25,17 +25,18 @@
         <w:tblLook w:firstColumn="1" w:firstRow="1" w:lastColumn="0" w:lastRow="0" w:noHBand="0" w:noVBand="1" w:val="04A0"/>
       </w:tblPr>
       <w:tblGrid>
-        <w:gridCol w:w="1440"/>
-        <w:gridCol w:w="1440"/>
-        <w:gridCol w:w="1440"/>
-        <w:gridCol w:w="1440"/>
-        <w:gridCol w:w="1440"/>
-        <w:gridCol w:w="1440"/>
+        <w:gridCol w:w="1234"/>
+        <w:gridCol w:w="1234"/>
+        <w:gridCol w:w="1234"/>
+        <w:gridCol w:w="1234"/>
+        <w:gridCol w:w="1234"/>
+        <w:gridCol w:w="1234"/>
+        <w:gridCol w:w="1234"/>
       </w:tblGrid>
       <w:tr>
         <w:tc>
           <w:tcPr>
-            <w:tcW w:type="dxa" w:w="1440"/>
+            <w:tcW w:type="dxa" w:w="1234"/>
           </w:tcPr>
           <w:p>
             <w:r>
@@ -45,7 +46,7 @@
         </w:tc>
         <w:tc>
           <w:tcPr>
-            <w:tcW w:type="dxa" w:w="1440"/>
+            <w:tcW w:type="dxa" w:w="1234"/>
           </w:tcPr>
           <w:p>
             <w:r>
@@ -55,7 +56,7 @@
         </w:tc>
         <w:tc>
           <w:tcPr>
-            <w:tcW w:type="dxa" w:w="1440"/>
+            <w:tcW w:type="dxa" w:w="1234"/>
           </w:tcPr>
           <w:p>
             <w:r>
@@ -65,7 +66,7 @@
         </w:tc>
         <w:tc>
           <w:tcPr>
-            <w:tcW w:type="dxa" w:w="1440"/>
+            <w:tcW w:type="dxa" w:w="1234"/>
           </w:tcPr>
           <w:p>
             <w:r>
@@ -75,7 +76,7 @@
         </w:tc>
         <w:tc>
           <w:tcPr>
-            <w:tcW w:type="dxa" w:w="1440"/>
+            <w:tcW w:type="dxa" w:w="1234"/>
           </w:tcPr>
           <w:p>
             <w:r>
@@ -85,11 +86,21 @@
         </w:tc>
         <w:tc>
           <w:tcPr>
-            <w:tcW w:type="dxa" w:w="1440"/>
+            <w:tcW w:type="dxa" w:w="1234"/>
           </w:tcPr>
           <w:p>
             <w:r>
               <w:t>Assessor Remarks</w:t>
+            </w:r>
+          </w:p>
+        </w:tc>
+        <w:tc>
+          <w:tcPr>
+            <w:tcW w:type="dxa" w:w="1234"/>
+          </w:tcPr>
+          <w:p>
+            <w:r>
+              <w:t>Historical Action Taken</w:t>
             </w:r>
           </w:p>
         </w:tc>
@@ -97,7 +108,7 @@
       <w:tr>
         <w:tc>
           <w:tcPr>
-            <w:tcW w:type="dxa" w:w="1440"/>
+            <w:tcW w:type="dxa" w:w="1234"/>
           </w:tcPr>
           <w:p>
             <w:r>
@@ -107,7 +118,7 @@
         </w:tc>
         <w:tc>
           <w:tcPr>
-            <w:tcW w:type="dxa" w:w="1440"/>
+            <w:tcW w:type="dxa" w:w="1234"/>
           </w:tcPr>
           <w:p>
             <w:r>
@@ -117,17 +128,17 @@
         </w:tc>
         <w:tc>
           <w:tcPr>
-            <w:tcW w:type="dxa" w:w="1440"/>
-          </w:tcPr>
-          <w:p>
-            <w:r>
-              <w:t>Subject to Supplier acknowledging the Purchase Order and furnishing the documents listed in Annex B, Buyer shall arrange an advance equal to forty-five percent (45%) of the Purchase Order value. Thirty percent (30%) is payable within five (5) business days after PO acknowledgement. The remaining fifteen percent (15%) is payable only after Buyer receives the performance bank guarantee, the project kick-off minutes signed by both parties, and the first document submission register</w:t>
-            </w:r>
-          </w:p>
-        </w:tc>
-        <w:tc>
-          <w:tcPr>
-            <w:tcW w:type="dxa" w:w="1440"/>
+            <w:tcW w:type="dxa" w:w="1234"/>
+          </w:tcPr>
+          <w:p>
+            <w:r>
+              <w:t>Provisions regarding '45% Minimum Advance': This retention clause is not intended to reduce the agreed advance percentage but can affect payment timing.</w:t>
+            </w:r>
+          </w:p>
+        </w:tc>
+        <w:tc>
+          <w:tcPr>
+            <w:tcW w:type="dxa" w:w="1234"/>
           </w:tcPr>
           <w:p>
             <w:r>
@@ -137,7 +148,7 @@
         </w:tc>
         <w:tc>
           <w:tcPr>
-            <w:tcW w:type="dxa" w:w="1440"/>
+            <w:tcW w:type="dxa" w:w="1234"/>
           </w:tcPr>
           <w:p>
             <w:r>
@@ -149,11 +160,30 @@
         </w:tc>
         <w:tc>
           <w:tcPr>
-            <w:tcW w:type="dxa" w:w="1440"/>
+            <w:tcW w:type="dxa" w:w="1234"/>
           </w:tcPr>
           <w:p>
             <w:r>
               <w:t>Advance payment split across conditions</w:t>
+            </w:r>
+          </w:p>
+        </w:tc>
+        <w:tc>
+          <w:tcPr>
+            <w:tcW w:type="dxa" w:w="1234"/>
+          </w:tcPr>
+          <w:p>
+            <w:r>
+              <w:t>Past actions included approving exceptional lump-sum advances to secure material pricing or escalating underfunded mobilization terms to the finance board via rolling letters of credit.</w:t>
+              <w:br/>
+              <w:br/>
+              <w:t>Historical Reference</w:t>
+              <w:br/>
+              <w:t>Sources:</w:t>
+              <w:br/>
+              <w:t>• d1.docx – Payment Terms</w:t>
+              <w:br/>
+              <w:t>• d2.docx – Payment Terms</w:t>
             </w:r>
           </w:p>
         </w:tc>
@@ -161,7 +191,176 @@
       <w:tr>
         <w:tc>
           <w:tcPr>
-            <w:tcW w:type="dxa" w:w="1440"/>
+            <w:tcW w:type="dxa" w:w="1234"/>
+          </w:tcPr>
+          <w:p>
+            <w:r>
+              <w:t>Payment Terms</w:t>
+            </w:r>
+          </w:p>
+        </w:tc>
+        <w:tc>
+          <w:tcPr>
+            <w:tcW w:type="dxa" w:w="1234"/>
+          </w:tcPr>
+          <w:p>
+            <w:r>
+              <w:t>All payments Net 30 days from invoice</w:t>
+            </w:r>
+          </w:p>
+        </w:tc>
+        <w:tc>
+          <w:tcPr>
+            <w:tcW w:type="dxa" w:w="1234"/>
+          </w:tcPr>
+          <w:p>
+            <w:r>
+              <w:t>Provisions regarding 'All payments Net 30 days from invoice': Buyer shall pay accepted invoices within thirty (30) days after receipt of a valid tax invoice. An invoice is valid only after the corresponding goods receipt note, inspection release, and packing-list reconciliation are completed in Buyer's system. If those acceptance records are completed after invoice receipt, the thirty-day clock starts from the later acceptance record, not the invoice date.</w:t>
+            </w:r>
+          </w:p>
+        </w:tc>
+        <w:tc>
+          <w:tcPr>
+            <w:tcW w:type="dxa" w:w="1234"/>
+          </w:tcPr>
+          <w:p>
+            <w:r>
+              <w:t>Partially Met</w:t>
+            </w:r>
+          </w:p>
+        </w:tc>
+        <w:tc>
+          <w:tcPr>
+            <w:tcW w:type="dxa" w:w="1234"/>
+          </w:tcPr>
+          <w:p>
+            <w:r>
+              <w:t>Buyer shall pay accepted invoices within thirty (30) days after receipt of a valid tax invoice. An invoice is valid only after the corresponding goods receipt note, inspection release, and packing-list reconciliation are completed in Buyer's system. If those acceptance records are completed after invoice receipt, the thirty-day clock starts from the later acceptance record, not the invoice date.</w:t>
+            </w:r>
+          </w:p>
+        </w:tc>
+        <w:tc>
+          <w:tcPr>
+            <w:tcW w:type="dxa" w:w="1234"/>
+          </w:tcPr>
+          <w:p>
+            <w:r>
+              <w:t>The requirement is for Net 30 days from invoice. The contract introduces conditions for 'validity' (goods receipt, inspection, and reconciliation) which can delay the start of the 30-day payment clock beyond the actual invoice date.</w:t>
+            </w:r>
+          </w:p>
+        </w:tc>
+        <w:tc>
+          <w:tcPr>
+            <w:tcW w:type="dxa" w:w="1234"/>
+          </w:tcPr>
+          <w:p>
+            <w:r>
+              <w:t>The organization has previously accepted extended payment terms through executive waivers, often securing price discounts in exchange for the deviation. Additionally, management has accepted the associated financial risks after verifying sufficient cash reserves.</w:t>
+              <w:br/>
+              <w:br/>
+              <w:t>Historical Reference</w:t>
+              <w:br/>
+              <w:t>Source:</w:t>
+              <w:br/>
+              <w:t>d1.docx</w:t>
+              <w:br/>
+              <w:t>Clause: Payment Terms</w:t>
+              <w:br/>
+              <w:t>Requirement: All payments Net 30 days from invoice</w:t>
+              <w:br/>
+              <w:br/>
+              <w:t>Quote:</w:t>
+              <w:br/>
+              <w:t>"Vendor wording accepted via executive waiver; extended terms granted in exchange for a 2% price discount."</w:t>
+            </w:r>
+          </w:p>
+        </w:tc>
+      </w:tr>
+      <w:tr>
+        <w:tc>
+          <w:tcPr>
+            <w:tcW w:type="dxa" w:w="1234"/>
+          </w:tcPr>
+          <w:p>
+            <w:r>
+              <w:t>Payment Terms</w:t>
+            </w:r>
+          </w:p>
+        </w:tc>
+        <w:tc>
+          <w:tcPr>
+            <w:tcW w:type="dxa" w:w="1234"/>
+          </w:tcPr>
+          <w:p>
+            <w:r>
+              <w:t>Partial delivery and invoicing allowed</w:t>
+            </w:r>
+          </w:p>
+        </w:tc>
+        <w:tc>
+          <w:tcPr>
+            <w:tcW w:type="dxa" w:w="1234"/>
+          </w:tcPr>
+          <w:p>
+            <w:r>
+              <w:t>Provisions regarding 'Partial delivery and invoicing allowed': Supplier may dispatch Lot A, Lot B, and Lot C separately and may raise a corresponding invoice for each completed lot.</w:t>
+            </w:r>
+          </w:p>
+        </w:tc>
+        <w:tc>
+          <w:tcPr>
+            <w:tcW w:type="dxa" w:w="1234"/>
+          </w:tcPr>
+          <w:p>
+            <w:r>
+              <w:t>Met</w:t>
+            </w:r>
+          </w:p>
+        </w:tc>
+        <w:tc>
+          <w:tcPr>
+            <w:tcW w:type="dxa" w:w="1234"/>
+          </w:tcPr>
+          <w:p>
+            <w:r>
+              <w:t>Supplier may dispatch Lot A, Lot B, and Lot C separately and may raise a corresponding invoice for each completed lot.</w:t>
+            </w:r>
+          </w:p>
+        </w:tc>
+        <w:tc>
+          <w:tcPr>
+            <w:tcW w:type="dxa" w:w="1234"/>
+          </w:tcPr>
+          <w:p>
+            <w:r>
+              <w:t>The contract explicitly permits separate dispatch (partial delivery) and corresponding invoicing for each lot.</w:t>
+            </w:r>
+          </w:p>
+        </w:tc>
+        <w:tc>
+          <w:tcPr>
+            <w:tcW w:type="dxa" w:w="1234"/>
+          </w:tcPr>
+          <w:p>
+            <w:r>
+              <w:t>Past actions include updating clauses based on review board feedback and granting executive waivers to accept restrictive delivery terms in exchange for sole-source exclusivity. These measures were used to address conflicts between partial delivery requirements and strict full-system delivery mandates.</w:t>
+              <w:br/>
+              <w:br/>
+              <w:t>Historical Reference</w:t>
+              <w:br/>
+              <w:t>Sources:</w:t>
+              <w:br/>
+              <w:t>• d1.docx – Payment Terms</w:t>
+              <w:br/>
+              <w:t>• d2.docx – Payment Terms</w:t>
+            </w:r>
+          </w:p>
+        </w:tc>
+      </w:tr>
+      <w:tr>
+        <w:tc>
+          <w:tcPr>
+            <w:tcW w:type="dxa" w:w="1234"/>
           </w:tcPr>
           <w:p>
             <w:r>
@@ -171,7 +370,7 @@
         </w:tc>
         <w:tc>
           <w:tcPr>
-            <w:tcW w:type="dxa" w:w="1440"/>
+            <w:tcW w:type="dxa" w:w="1234"/>
           </w:tcPr>
           <w:p>
             <w:r>
@@ -181,17 +380,17 @@
         </w:tc>
         <w:tc>
           <w:tcPr>
-            <w:tcW w:type="dxa" w:w="1440"/>
-          </w:tcPr>
-          <w:p>
-            <w:r>
-              <w:t>1 Performance bank guarantee. Supplier shall furnish an unconditional performance bank guarantee equal to ten percent (10%) of the Purchase Order value, valid until expiry of the standard guarantee period plus ninety (90) days. Agent Test Input - Complex Contract Terms 00511</w:t>
-            </w:r>
-          </w:p>
-        </w:tc>
-        <w:tc>
-          <w:tcPr>
-            <w:tcW w:type="dxa" w:w="1440"/>
+            <w:tcW w:type="dxa" w:w="1234"/>
+          </w:tcPr>
+          <w:p>
+            <w:r>
+              <w:t>Provisions regarding 'Performance Guarantee not exceeding 10%': In addition to the guarantee in Article 00511. 1, Supplier shall furnish a temporary bridge performance guarantee equal to two percent (2%) of the Purchase Order value from the date of the first advance tranche until the earlier of successful FAT release or first dispatch.</w:t>
+            </w:r>
+          </w:p>
+        </w:tc>
+        <w:tc>
+          <w:tcPr>
+            <w:tcW w:type="dxa" w:w="1234"/>
           </w:tcPr>
           <w:p>
             <w:r>
@@ -201,7 +400,7 @@
         </w:tc>
         <w:tc>
           <w:tcPr>
-            <w:tcW w:type="dxa" w:w="1440"/>
+            <w:tcW w:type="dxa" w:w="1234"/>
           </w:tcPr>
           <w:p>
             <w:r>
@@ -215,11 +414,37 @@
         </w:tc>
         <w:tc>
           <w:tcPr>
-            <w:tcW w:type="dxa" w:w="1440"/>
+            <w:tcW w:type="dxa" w:w="1234"/>
           </w:tcPr>
           <w:p>
             <w:r>
               <w:t>Total security obligations found: 12.0%</w:t>
+            </w:r>
+          </w:p>
+        </w:tc>
+        <w:tc>
+          <w:tcPr>
+            <w:tcW w:type="dxa" w:w="1234"/>
+          </w:tcPr>
+          <w:p>
+            <w:r>
+              <w:t>Performance security was historically reduced through legal overrides after the review of vendor asset records or cleared via special procurement registers.</w:t>
+              <w:br/>
+              <w:br/>
+              <w:t>Historical Reference</w:t>
+              <w:br/>
+              <w:t>Source:</w:t>
+              <w:br/>
+              <w:t>d1.docx</w:t>
+              <w:br/>
+              <w:t>Clause: Bank Guarantees</w:t>
+              <w:br/>
+              <w:t>Requirement: Performance Guarantee not exceeding 10%</w:t>
+              <w:br/>
+              <w:br/>
+              <w:t>Quote:</w:t>
+              <w:br/>
+              <w:t>"Reduced performance security via legal override after vendor submitted audited global asset records."</w:t>
             </w:r>
           </w:p>
         </w:tc>
@@ -227,7 +452,7 @@
       <w:tr>
         <w:tc>
           <w:tcPr>
-            <w:tcW w:type="dxa" w:w="1440"/>
+            <w:tcW w:type="dxa" w:w="1234"/>
           </w:tcPr>
           <w:p>
             <w:r>
@@ -237,7 +462,7 @@
         </w:tc>
         <w:tc>
           <w:tcPr>
-            <w:tcW w:type="dxa" w:w="1440"/>
+            <w:tcW w:type="dxa" w:w="1234"/>
           </w:tcPr>
           <w:p>
             <w:r>
@@ -247,17 +472,17 @@
         </w:tc>
         <w:tc>
           <w:tcPr>
-            <w:tcW w:type="dxa" w:w="1440"/>
-          </w:tcPr>
-          <w:p>
-            <w:r>
-              <w:t>1 Performance bank guarantee. Supplier shall furnish an unconditional performance bank guarantee equal to ten percent (10%) of the Purchase Order value, valid until expiry of the standard guarantee period plus ninety (90) days. Agent Test Input - Complex Contract Terms 00511</w:t>
-            </w:r>
-          </w:p>
-        </w:tc>
-        <w:tc>
-          <w:tcPr>
-            <w:tcW w:type="dxa" w:w="1440"/>
+            <w:tcW w:type="dxa" w:w="1234"/>
+          </w:tcPr>
+          <w:p>
+            <w:r>
+              <w:t>Provisions regarding 'Bank Guarantee validity period defined': Supplier shall furnish an unconditional performance bank guarantee equal to ten percent (10%) of the Purchase Order value, valid until expiry of the standard guarantee period plus ninety (90) days.</w:t>
+            </w:r>
+          </w:p>
+        </w:tc>
+        <w:tc>
+          <w:tcPr>
+            <w:tcW w:type="dxa" w:w="1234"/>
           </w:tcPr>
           <w:p>
             <w:r>
@@ -267,7 +492,7 @@
         </w:tc>
         <w:tc>
           <w:tcPr>
-            <w:tcW w:type="dxa" w:w="1440"/>
+            <w:tcW w:type="dxa" w:w="1234"/>
           </w:tcPr>
           <w:p>
             <w:r>
@@ -279,7 +504,7 @@
         </w:tc>
         <w:tc>
           <w:tcPr>
-            <w:tcW w:type="dxa" w:w="1440"/>
+            <w:tcW w:type="dxa" w:w="1234"/>
           </w:tcPr>
           <w:p>
             <w:r>
@@ -289,11 +514,30 @@
             </w:r>
           </w:p>
         </w:tc>
+        <w:tc>
+          <w:tcPr>
+            <w:tcW w:type="dxa" w:w="1234"/>
+          </w:tcPr>
+          <w:p>
+            <w:r>
+              <w:t>Issues regarding undefined expiry dates and coverage gaps during warranty periods were identified by internal audits and addressed through formal remediation demands or deferred amendments.</w:t>
+              <w:br/>
+              <w:br/>
+              <w:t>Historical Reference</w:t>
+              <w:br/>
+              <w:t>Sources:</w:t>
+              <w:br/>
+              <w:t>• d1.docx – Bank Guarantees</w:t>
+              <w:br/>
+              <w:t>• d2.docx – Bank Guarantees</w:t>
+            </w:r>
+          </w:p>
+        </w:tc>
       </w:tr>
       <w:tr>
         <w:tc>
           <w:tcPr>
-            <w:tcW w:type="dxa" w:w="1440"/>
+            <w:tcW w:type="dxa" w:w="1234"/>
           </w:tcPr>
           <w:p>
             <w:r>
@@ -303,7 +547,7 @@
         </w:tc>
         <w:tc>
           <w:tcPr>
-            <w:tcW w:type="dxa" w:w="1440"/>
+            <w:tcW w:type="dxa" w:w="1234"/>
           </w:tcPr>
           <w:p>
             <w:r>
@@ -313,17 +557,17 @@
         </w:tc>
         <w:tc>
           <w:tcPr>
-            <w:tcW w:type="dxa" w:w="1440"/>
-          </w:tcPr>
-          <w:p>
-            <w:r>
-              <w:t>1 Documentation and engineering submittals. Delay in routine manuals, vendor data books, certificates, or non-critical engineering submittals shall not attract standalone liquidated damages. However, delay in a document identified as a Critical Dispatch Document in Annex B that directly prevents FAT release shall be treated as a delay in equipment delivery for the affected lot</w:t>
-            </w:r>
-          </w:p>
-        </w:tc>
-        <w:tc>
-          <w:tcPr>
-            <w:tcW w:type="dxa" w:w="1440"/>
+            <w:tcW w:type="dxa" w:w="1234"/>
+          </w:tcPr>
+          <w:p>
+            <w:r>
+              <w:t>Provisions regarding 'Documentation LD not applicable': For delay in delivery of equipment beyond the contractual delivery date, Supplier shall pay liquidated damages at zero point five percent (0. 5%) of the value of the undelivered part per completed week of delay.</w:t>
+            </w:r>
+          </w:p>
+        </w:tc>
+        <w:tc>
+          <w:tcPr>
+            <w:tcW w:type="dxa" w:w="1234"/>
           </w:tcPr>
           <w:p>
             <w:r>
@@ -333,7 +577,7 @@
         </w:tc>
         <w:tc>
           <w:tcPr>
-            <w:tcW w:type="dxa" w:w="1440"/>
+            <w:tcW w:type="dxa" w:w="1234"/>
           </w:tcPr>
           <w:p>
             <w:r>
@@ -345,11 +589,37 @@
         </w:tc>
         <w:tc>
           <w:tcPr>
-            <w:tcW w:type="dxa" w:w="1440"/>
+            <w:tcW w:type="dxa" w:w="1234"/>
           </w:tcPr>
           <w:p>
             <w:r>
               <w:t>Clause contains material limitations, exceptions, carve-outs, conditions, or restricted applicability</w:t>
+            </w:r>
+          </w:p>
+        </w:tc>
+        <w:tc>
+          <w:tcPr>
+            <w:tcW w:type="dxa" w:w="1234"/>
+          </w:tcPr>
+          <w:p>
+            <w:r>
+              <w:t>Negotiations focused on removing financial penalties for administrative documentation delays to align with corporate risk standards.</w:t>
+              <w:br/>
+              <w:br/>
+              <w:t>Historical Reference</w:t>
+              <w:br/>
+              <w:t>Source:</w:t>
+              <w:br/>
+              <w:t>d2.docx</w:t>
+              <w:br/>
+              <w:t>Clause: Liquidated Damages</w:t>
+              <w:br/>
+              <w:t>Requirement: Documentation LD not applicable</w:t>
+              <w:br/>
+              <w:br/>
+              <w:t>Quote:</w:t>
+              <w:br/>
+              <w:t>"Negotiated lower LD cap and explicitly removed all documentation-related financial penalty strings from the text."</w:t>
             </w:r>
           </w:p>
         </w:tc>
@@ -357,7 +627,7 @@
       <w:tr>
         <w:tc>
           <w:tcPr>
-            <w:tcW w:type="dxa" w:w="1440"/>
+            <w:tcW w:type="dxa" w:w="1234"/>
           </w:tcPr>
           <w:p>
             <w:r>
@@ -367,7 +637,7 @@
         </w:tc>
         <w:tc>
           <w:tcPr>
-            <w:tcW w:type="dxa" w:w="1440"/>
+            <w:tcW w:type="dxa" w:w="1234"/>
           </w:tcPr>
           <w:p>
             <w:r>
@@ -377,17 +647,17 @@
         </w:tc>
         <w:tc>
           <w:tcPr>
-            <w:tcW w:type="dxa" w:w="1440"/>
-          </w:tcPr>
-          <w:p>
-            <w:r>
-              <w:t>1 Documentation and engineering submittals. Delay in routine manuals, vendor data books, certificates, or non-critical engineering submittals shall not attract standalone liquidated damages. However, delay in a document identified as a Critical Dispatch Document in Annex B that directly prevents FAT release shall be treated as a delay in equipment delivery for the affected lot</w:t>
-            </w:r>
-          </w:p>
-        </w:tc>
-        <w:tc>
-          <w:tcPr>
-            <w:tcW w:type="dxa" w:w="1440"/>
+            <w:tcW w:type="dxa" w:w="1234"/>
+          </w:tcPr>
+          <w:p>
+            <w:r>
+              <w:t>Provisions regarding 'Equipment Delivery LD 0.5% per week': For delay in delivery of equipment beyond the contractual delivery date, Supplier shall pay liquidated damages at zero point five percent (0. 5%) of the value of the undelivered part per completed week of delay.</w:t>
+            </w:r>
+          </w:p>
+        </w:tc>
+        <w:tc>
+          <w:tcPr>
+            <w:tcW w:type="dxa" w:w="1234"/>
           </w:tcPr>
           <w:p>
             <w:r>
@@ -397,7 +667,7 @@
         </w:tc>
         <w:tc>
           <w:tcPr>
-            <w:tcW w:type="dxa" w:w="1440"/>
+            <w:tcW w:type="dxa" w:w="1234"/>
           </w:tcPr>
           <w:p>
             <w:r>
@@ -409,11 +679,30 @@
         </w:tc>
         <w:tc>
           <w:tcPr>
-            <w:tcW w:type="dxa" w:w="1440"/>
+            <w:tcW w:type="dxa" w:w="1234"/>
           </w:tcPr>
           <w:p>
             <w:r>
               <w:t>Clause contains material limitations, exceptions, carve-outs, conditions, or restricted applicability</w:t>
+            </w:r>
+          </w:p>
+        </w:tc>
+        <w:tc>
+          <w:tcPr>
+            <w:tcW w:type="dxa" w:w="1234"/>
+          </w:tcPr>
+          <w:p>
+            <w:r>
+              <w:t>While standard 0.5% rates were typically validated by legal, attempts to negotiate down aggressive 1.0% rates sometimes resulted in deadlocks.</w:t>
+              <w:br/>
+              <w:br/>
+              <w:t>Historical Reference</w:t>
+              <w:br/>
+              <w:t>Sources:</w:t>
+              <w:br/>
+              <w:t>• d1.docx – Liquidated Damages</w:t>
+              <w:br/>
+              <w:t>• d2.docx – Liquidated Damages</w:t>
             </w:r>
           </w:p>
         </w:tc>
@@ -421,7 +710,7 @@
       <w:tr>
         <w:tc>
           <w:tcPr>
-            <w:tcW w:type="dxa" w:w="1440"/>
+            <w:tcW w:type="dxa" w:w="1234"/>
           </w:tcPr>
           <w:p>
             <w:r>
@@ -431,7 +720,7 @@
         </w:tc>
         <w:tc>
           <w:tcPr>
-            <w:tcW w:type="dxa" w:w="1440"/>
+            <w:tcW w:type="dxa" w:w="1234"/>
           </w:tcPr>
           <w:p>
             <w:r>
@@ -441,17 +730,17 @@
         </w:tc>
         <w:tc>
           <w:tcPr>
-            <w:tcW w:type="dxa" w:w="1440"/>
-          </w:tcPr>
-          <w:p>
-            <w:r>
-              <w:t>1 Documentation and engineering submittals. Delay in routine manuals, vendor data books, certificates, or non-critical engineering submittals shall not attract standalone liquidated damages. However, delay in a document identified as a Critical Dispatch Document in Annex B that directly prevents FAT release shall be treated as a delay in equipment delivery for the affected lot</w:t>
-            </w:r>
-          </w:p>
-        </w:tc>
-        <w:tc>
-          <w:tcPr>
-            <w:tcW w:type="dxa" w:w="1440"/>
+            <w:tcW w:type="dxa" w:w="1234"/>
+          </w:tcPr>
+          <w:p>
+            <w:r>
+              <w:t>Provisions regarding 'Equipment Delivery LD capped at 5%': For delay in delivery of equipment beyond the contractual delivery date, Supplier shall pay liquidated damages at zero point five percent (0. 5%) of the value of the undelivered part per completed week of delay.</w:t>
+            </w:r>
+          </w:p>
+        </w:tc>
+        <w:tc>
+          <w:tcPr>
+            <w:tcW w:type="dxa" w:w="1234"/>
           </w:tcPr>
           <w:p>
             <w:r>
@@ -461,7 +750,7 @@
         </w:tc>
         <w:tc>
           <w:tcPr>
-            <w:tcW w:type="dxa" w:w="1440"/>
+            <w:tcW w:type="dxa" w:w="1234"/>
           </w:tcPr>
           <w:p>
             <w:r>
@@ -473,11 +762,30 @@
         </w:tc>
         <w:tc>
           <w:tcPr>
-            <w:tcW w:type="dxa" w:w="1440"/>
+            <w:tcW w:type="dxa" w:w="1234"/>
           </w:tcPr>
           <w:p>
             <w:r>
               <w:t>Clause contains material limitations, exceptions, carve-outs, conditions, or restricted applicability</w:t>
+            </w:r>
+          </w:p>
+        </w:tc>
+        <w:tc>
+          <w:tcPr>
+            <w:tcW w:type="dxa" w:w="1234"/>
+          </w:tcPr>
+          <w:p>
+            <w:r>
+              <w:t>Efforts were made to establish clear component-level boundaries, moving from uncapped positions to a strict 5% cap on affected sub-assemblies.</w:t>
+              <w:br/>
+              <w:br/>
+              <w:t>Historical Reference</w:t>
+              <w:br/>
+              <w:t>Sources:</w:t>
+              <w:br/>
+              <w:t>• d1.docx – Liquidated Damages</w:t>
+              <w:br/>
+              <w:t>• d2.docx – Liquidated Damages</w:t>
             </w:r>
           </w:p>
         </w:tc>
@@ -485,7 +793,7 @@
       <w:tr>
         <w:tc>
           <w:tcPr>
-            <w:tcW w:type="dxa" w:w="1440"/>
+            <w:tcW w:type="dxa" w:w="1234"/>
           </w:tcPr>
           <w:p>
             <w:r>
@@ -495,7 +803,7 @@
         </w:tc>
         <w:tc>
           <w:tcPr>
-            <w:tcW w:type="dxa" w:w="1440"/>
+            <w:tcW w:type="dxa" w:w="1234"/>
           </w:tcPr>
           <w:p>
             <w:r>
@@ -505,17 +813,17 @@
         </w:tc>
         <w:tc>
           <w:tcPr>
-            <w:tcW w:type="dxa" w:w="1440"/>
-          </w:tcPr>
-          <w:p>
-            <w:r>
-              <w:t>1 Documentation and engineering submittals. Delay in routine manuals, vendor data books, certificates, or non-critical engineering submittals shall not attract standalone liquidated damages. However, delay in a document identified as a Critical Dispatch Document in Annex B that directly prevents FAT release shall be treated as a delay in equipment delivery for the affected lot</w:t>
-            </w:r>
-          </w:p>
-        </w:tc>
-        <w:tc>
-          <w:tcPr>
-            <w:tcW w:type="dxa" w:w="1440"/>
+            <w:tcW w:type="dxa" w:w="1234"/>
+          </w:tcPr>
+          <w:p>
+            <w:r>
+              <w:t>Provisions regarding 'Aggregate LD capped at 5% PO value': For delay in delivery of equipment beyond the contractual delivery date, Supplier shall pay liquidated damages at zero point five percent (0. 5%) of the value of the undelivered part per completed week of delay.</w:t>
+            </w:r>
+          </w:p>
+        </w:tc>
+        <w:tc>
+          <w:tcPr>
+            <w:tcW w:type="dxa" w:w="1234"/>
           </w:tcPr>
           <w:p>
             <w:r>
@@ -525,7 +833,7 @@
         </w:tc>
         <w:tc>
           <w:tcPr>
-            <w:tcW w:type="dxa" w:w="1440"/>
+            <w:tcW w:type="dxa" w:w="1234"/>
           </w:tcPr>
           <w:p>
             <w:r>
@@ -537,11 +845,37 @@
         </w:tc>
         <w:tc>
           <w:tcPr>
-            <w:tcW w:type="dxa" w:w="1440"/>
+            <w:tcW w:type="dxa" w:w="1234"/>
           </w:tcPr>
           <w:p>
             <w:r>
               <w:t>Found 7.5% cap</w:t>
+            </w:r>
+          </w:p>
+        </w:tc>
+        <w:tc>
+          <w:tcPr>
+            <w:tcW w:type="dxa" w:w="1234"/>
+          </w:tcPr>
+          <w:p>
+            <w:r>
+              <w:t>Corporate counsel and commercial settlements were used to replace higher penalty thresholds with an absolute 5% aggregate ceiling.</w:t>
+              <w:br/>
+              <w:br/>
+              <w:t>Historical Reference</w:t>
+              <w:br/>
+              <w:t>Source:</w:t>
+              <w:br/>
+              <w:t>d1.docx</w:t>
+              <w:br/>
+              <w:t>Clause: Liquidated Damages</w:t>
+              <w:br/>
+              <w:t>Requirement: Aggregate LD capped at 5% PO value</w:t>
+              <w:br/>
+              <w:br/>
+              <w:t>Quote:</w:t>
+              <w:br/>
+              <w:t>"Negotiated lower LD cap and established absolute 5% ceiling during global commercial settlement."</w:t>
             </w:r>
           </w:p>
         </w:tc>
@@ -549,7 +883,7 @@
       <w:tr>
         <w:tc>
           <w:tcPr>
-            <w:tcW w:type="dxa" w:w="1440"/>
+            <w:tcW w:type="dxa" w:w="1234"/>
           </w:tcPr>
           <w:p>
             <w:r>
@@ -559,7 +893,7 @@
         </w:tc>
         <w:tc>
           <w:tcPr>
-            <w:tcW w:type="dxa" w:w="1440"/>
+            <w:tcW w:type="dxa" w:w="1234"/>
           </w:tcPr>
           <w:p>
             <w:r>
@@ -569,17 +903,17 @@
         </w:tc>
         <w:tc>
           <w:tcPr>
-            <w:tcW w:type="dxa" w:w="1440"/>
-          </w:tcPr>
-          <w:p>
-            <w:r>
-              <w:t>1 Documentation and engineering submittals. Delay in routine manuals, vendor data books, certificates, or non-critical engineering submittals shall not attract standalone liquidated damages. However, delay in a document identified as a Critical Dispatch Document in Annex B that directly prevents FAT release shall be treated as a delay in equipment delivery for the affected lot</w:t>
-            </w:r>
-          </w:p>
-        </w:tc>
-        <w:tc>
-          <w:tcPr>
-            <w:tcW w:type="dxa" w:w="1440"/>
+            <w:tcW w:type="dxa" w:w="1234"/>
+          </w:tcPr>
+          <w:p>
+            <w:r>
+              <w:t>Provisions regarding 'Remedial Work LD not applicable': For delay in delivery of equipment beyond the contractual delivery date, Supplier shall pay liquidated damages at zero point five percent (0. 5%) of the value of the undelivered part per completed week of delay.</w:t>
+            </w:r>
+          </w:p>
+        </w:tc>
+        <w:tc>
+          <w:tcPr>
+            <w:tcW w:type="dxa" w:w="1234"/>
           </w:tcPr>
           <w:p>
             <w:r>
@@ -589,7 +923,7 @@
         </w:tc>
         <w:tc>
           <w:tcPr>
-            <w:tcW w:type="dxa" w:w="1440"/>
+            <w:tcW w:type="dxa" w:w="1234"/>
           </w:tcPr>
           <w:p>
             <w:r>
@@ -601,11 +935,37 @@
         </w:tc>
         <w:tc>
           <w:tcPr>
-            <w:tcW w:type="dxa" w:w="1440"/>
+            <w:tcW w:type="dxa" w:w="1234"/>
           </w:tcPr>
           <w:p>
             <w:r>
               <w:t>Clause contains material limitations, exceptions, carve-outs, conditions, or restricted applicability</w:t>
+            </w:r>
+          </w:p>
+        </w:tc>
+        <w:tc>
+          <w:tcPr>
+            <w:tcW w:type="dxa" w:w="1234"/>
+          </w:tcPr>
+          <w:p>
+            <w:r>
+              <w:t>Procurement teams worked to remove conditional dependencies to ensure penalties do not accrue during active engineering remediation.</w:t>
+              <w:br/>
+              <w:br/>
+              <w:t>Historical Reference</w:t>
+              <w:br/>
+              <w:t>Source:</w:t>
+              <w:br/>
+              <w:t>d1.docx</w:t>
+              <w:br/>
+              <w:t>Clause: Liquidated Damages</w:t>
+              <w:br/>
+              <w:t>Requirement: Remedial Work LD not applicable</w:t>
+              <w:br/>
+              <w:br/>
+              <w:t>Quote:</w:t>
+              <w:br/>
+              <w:t>"Corrective action implemented by procurement team to remove conditional dependencies found in draft versions."</w:t>
             </w:r>
           </w:p>
         </w:tc>
@@ -613,7 +973,7 @@
       <w:tr>
         <w:tc>
           <w:tcPr>
-            <w:tcW w:type="dxa" w:w="1440"/>
+            <w:tcW w:type="dxa" w:w="1234"/>
           </w:tcPr>
           <w:p>
             <w:r>
@@ -623,7 +983,7 @@
         </w:tc>
         <w:tc>
           <w:tcPr>
-            <w:tcW w:type="dxa" w:w="1440"/>
+            <w:tcW w:type="dxa" w:w="1234"/>
           </w:tcPr>
           <w:p>
             <w:r>
@@ -633,17 +993,17 @@
         </w:tc>
         <w:tc>
           <w:tcPr>
-            <w:tcW w:type="dxa" w:w="1440"/>
-          </w:tcPr>
-          <w:p>
-            <w:r>
-              <w:t>Supplier guarantees the equipment for two (2) months from successful provisional commissioning or eighteen (18) months from dispatch from Supplier works, whichever occurs earlier. If commissioning is delayed solely because Buyer has not provided utilities, access, or foundation readiness for more than sixty (60) days, the commissioning limb is deemed to have started on the sixty-first day after delivery to site. Any repaired or replaced component shall be guaranteed for twelve (12) months from completion of repair or replacement, or until eighteen (18) months from original dispatch of the affected equipment, whichever occurs earlier</w:t>
-            </w:r>
-          </w:p>
-        </w:tc>
-        <w:tc>
-          <w:tcPr>
-            <w:tcW w:type="dxa" w:w="1440"/>
+            <w:tcW w:type="dxa" w:w="1234"/>
+          </w:tcPr>
+          <w:p>
+            <w:r>
+              <w:t>Provisions regarding 'Warranty period defined': Any repaired or replaced component shall be guaranteed for twelve (12) months from completion of repair or replacement, or until eighteen (18) months from original dispatch of the affected equipment, whichever occurs earlier.</w:t>
+            </w:r>
+          </w:p>
+        </w:tc>
+        <w:tc>
+          <w:tcPr>
+            <w:tcW w:type="dxa" w:w="1234"/>
           </w:tcPr>
           <w:p>
             <w:r>
@@ -653,7 +1013,7 @@
         </w:tc>
         <w:tc>
           <w:tcPr>
-            <w:tcW w:type="dxa" w:w="1440"/>
+            <w:tcW w:type="dxa" w:w="1234"/>
           </w:tcPr>
           <w:p>
             <w:r>
@@ -665,11 +1025,30 @@
         </w:tc>
         <w:tc>
           <w:tcPr>
-            <w:tcW w:type="dxa" w:w="1440"/>
+            <w:tcW w:type="dxa" w:w="1234"/>
           </w:tcPr>
           <w:p>
             <w:r>
               <w:t>Clause contains material limitations, exceptions, carve-outs, conditions, or restricted applicability</w:t>
+            </w:r>
+          </w:p>
+        </w:tc>
+        <w:tc>
+          <w:tcPr>
+            <w:tcW w:type="dxa" w:w="1234"/>
+          </w:tcPr>
+          <w:p>
+            <w:r>
+              <w:t>The commercial team successfully negotiated extended warranty periods by making reciprocal concessions on maritime shipping and intellectual property clauses.</w:t>
+              <w:br/>
+              <w:br/>
+              <w:t>Historical Reference</w:t>
+              <w:br/>
+              <w:t>Sources:</w:t>
+              <w:br/>
+              <w:t>• d1.docx – Guarantee</w:t>
+              <w:br/>
+              <w:t>• d2.docx – Guarantee</w:t>
             </w:r>
           </w:p>
         </w:tc>
@@ -677,7 +1056,7 @@
       <w:tr>
         <w:tc>
           <w:tcPr>
-            <w:tcW w:type="dxa" w:w="1440"/>
+            <w:tcW w:type="dxa" w:w="1234"/>
           </w:tcPr>
           <w:p>
             <w:r>
@@ -687,7 +1066,7 @@
         </w:tc>
         <w:tc>
           <w:tcPr>
-            <w:tcW w:type="dxa" w:w="1440"/>
+            <w:tcW w:type="dxa" w:w="1234"/>
           </w:tcPr>
           <w:p>
             <w:r>
@@ -697,17 +1076,17 @@
         </w:tc>
         <w:tc>
           <w:tcPr>
-            <w:tcW w:type="dxa" w:w="1440"/>
-          </w:tcPr>
-          <w:p>
-            <w:r>
-              <w:t>Supplier guarantees the equipment for two (2) months from successful provisional commissioning or eighteen (18) months from dispatch from Supplier works, whichever occurs earlier. If commissioning is delayed solely because Buyer has not provided utilities, access, or foundation readiness for more than sixty (60) days, the commissioning limb is deemed to have started on the sixty-first day after delivery to site. Any repaired or replaced component shall be guaranteed for twelve (12) months from completion of repair or replacement, or until eighteen (18) months from original dispatch of the affected equipment, whichever occurs earlier</w:t>
-            </w:r>
-          </w:p>
-        </w:tc>
-        <w:tc>
-          <w:tcPr>
-            <w:tcW w:type="dxa" w:w="1440"/>
+            <w:tcW w:type="dxa" w:w="1234"/>
+          </w:tcPr>
+          <w:p>
+            <w:r>
+              <w:t>Provisions regarding '2 months from commissioning or 18 months from dispatch': Any repaired or replaced component shall be guaranteed for twelve (12) months from completion of repair or replacement, or until eighteen (18) months from original dispatch of the affected equipment, whichever occurs earlier.</w:t>
+            </w:r>
+          </w:p>
+        </w:tc>
+        <w:tc>
+          <w:tcPr>
+            <w:tcW w:type="dxa" w:w="1234"/>
           </w:tcPr>
           <w:p>
             <w:r>
@@ -717,7 +1096,7 @@
         </w:tc>
         <w:tc>
           <w:tcPr>
-            <w:tcW w:type="dxa" w:w="1440"/>
+            <w:tcW w:type="dxa" w:w="1234"/>
           </w:tcPr>
           <w:p>
             <w:r>
@@ -729,11 +1108,30 @@
         </w:tc>
         <w:tc>
           <w:tcPr>
-            <w:tcW w:type="dxa" w:w="1440"/>
+            <w:tcW w:type="dxa" w:w="1234"/>
           </w:tcPr>
           <w:p>
             <w:r>
               <w:t>Clause contains material limitations, exceptions, carve-outs, conditions, or restricted applicability</w:t>
+            </w:r>
+          </w:p>
+        </w:tc>
+        <w:tc>
+          <w:tcPr>
+            <w:tcW w:type="dxa" w:w="1234"/>
+          </w:tcPr>
+          <w:p>
+            <w:r>
+              <w:t>Efforts to align warranty triggers involved escalating risks to the Project Director and renegotiating durations to address restrictive environmental exceptions.</w:t>
+              <w:br/>
+              <w:br/>
+              <w:t>Historical Reference</w:t>
+              <w:br/>
+              <w:t>Sources:</w:t>
+              <w:br/>
+              <w:t>• d1.docx – Guarantee</w:t>
+              <w:br/>
+              <w:t>• d2.docx – Guarantee</w:t>
             </w:r>
           </w:p>
         </w:tc>
@@ -741,7 +1139,7 @@
       <w:tr>
         <w:tc>
           <w:tcPr>
-            <w:tcW w:type="dxa" w:w="1440"/>
+            <w:tcW w:type="dxa" w:w="1234"/>
           </w:tcPr>
           <w:p>
             <w:r>
@@ -751,7 +1149,7 @@
         </w:tc>
         <w:tc>
           <w:tcPr>
-            <w:tcW w:type="dxa" w:w="1440"/>
+            <w:tcW w:type="dxa" w:w="1234"/>
           </w:tcPr>
           <w:p>
             <w:r>
@@ -761,17 +1159,17 @@
         </w:tc>
         <w:tc>
           <w:tcPr>
-            <w:tcW w:type="dxa" w:w="1440"/>
-          </w:tcPr>
-          <w:p>
-            <w:r>
-              <w:t>Supplier guarantees the equipment for two (2) months from successful provisional commissioning or eighteen (18) months from dispatch from Supplier works, whichever occurs earlier. If commissioning is delayed solely because Buyer has not provided utilities, access, or foundation readiness for more than sixty (60) days, the commissioning limb is deemed to have started on the sixty-first day after delivery to site. Any repaired or replaced component shall be guaranteed for twelve (12) months from completion of repair or replacement, or until eighteen (18) months from original dispatch of the affected equipment, whichever occurs earlier</w:t>
-            </w:r>
-          </w:p>
-        </w:tc>
-        <w:tc>
-          <w:tcPr>
-            <w:tcW w:type="dxa" w:w="1440"/>
+            <w:tcW w:type="dxa" w:w="1234"/>
+          </w:tcPr>
+          <w:p>
+            <w:r>
+              <w:t>Provisions regarding 'Repair/replacement warranty obligations defined': Any repaired or replaced component shall be guaranteed for twelve (12) months from completion of repair or replacement, or until eighteen (18) months from original dispatch of the affected equipment, whichever occurs earlier.</w:t>
+            </w:r>
+          </w:p>
+        </w:tc>
+        <w:tc>
+          <w:tcPr>
+            <w:tcW w:type="dxa" w:w="1234"/>
           </w:tcPr>
           <w:p>
             <w:r>
@@ -781,7 +1179,7 @@
         </w:tc>
         <w:tc>
           <w:tcPr>
-            <w:tcW w:type="dxa" w:w="1440"/>
+            <w:tcW w:type="dxa" w:w="1234"/>
           </w:tcPr>
           <w:p>
             <w:r>
@@ -793,11 +1191,37 @@
         </w:tc>
         <w:tc>
           <w:tcPr>
-            <w:tcW w:type="dxa" w:w="1440"/>
+            <w:tcW w:type="dxa" w:w="1234"/>
           </w:tcPr>
           <w:p>
             <w:r>
               <w:t>Clause contains material limitations, exceptions, carve-outs, conditions, or restricted applicability</w:t>
+            </w:r>
+          </w:p>
+        </w:tc>
+        <w:tc>
+          <w:tcPr>
+            <w:tcW w:type="dxa" w:w="1234"/>
+          </w:tcPr>
+          <w:p>
+            <w:r>
+              <w:t>Obligations were finalized by revising coverage limits during engineering meetings and adopting specific wording proposed by the vendor.</w:t>
+              <w:br/>
+              <w:br/>
+              <w:t>Historical Reference</w:t>
+              <w:br/>
+              <w:t>Source:</w:t>
+              <w:br/>
+              <w:t>d1.docx</w:t>
+              <w:br/>
+              <w:t>Clause: Guarantee</w:t>
+              <w:br/>
+              <w:t>Requirement: Repair/replacement warranty obligations defined</w:t>
+              <w:br/>
+              <w:br/>
+              <w:t>Quote:</w:t>
+              <w:br/>
+              <w:t>"Revised warranty coverage limits during final engineering alignment meetings; closed by legal."</w:t>
             </w:r>
           </w:p>
         </w:tc>
@@ -805,7 +1229,7 @@
       <w:tr>
         <w:tc>
           <w:tcPr>
-            <w:tcW w:type="dxa" w:w="1440"/>
+            <w:tcW w:type="dxa" w:w="1234"/>
           </w:tcPr>
           <w:p>
             <w:r>
@@ -815,7 +1239,7 @@
         </w:tc>
         <w:tc>
           <w:tcPr>
-            <w:tcW w:type="dxa" w:w="1440"/>
+            <w:tcW w:type="dxa" w:w="1234"/>
           </w:tcPr>
           <w:p>
             <w:r>
@@ -825,17 +1249,17 @@
         </w:tc>
         <w:tc>
           <w:tcPr>
-            <w:tcW w:type="dxa" w:w="1440"/>
-          </w:tcPr>
-          <w:p>
-            <w:r>
-              <w:t>Force Majeure means an event beyond the reasonable control of the affected party, including Act of God, expropriation, nationalization, embargo, changes in law or regulation, war, sabotage, floods, severe weather, fires, strikes, lockouts, epidemics, pandemics, quarantine restrictions, and government action directly preventing performance. 2 Supply-chain events. Supplier may claim Force Majeure relief for events affecting only the Tier-1 critical sub-suppliers named in Annex D or the approved international logistics carrier</w:t>
-            </w:r>
-          </w:p>
-        </w:tc>
-        <w:tc>
-          <w:tcPr>
-            <w:tcW w:type="dxa" w:w="1440"/>
+            <w:tcW w:type="dxa" w:w="1234"/>
+          </w:tcPr>
+          <w:p>
+            <w:r>
+              <w:t>Provisions regarding 'Force majeure events defined': Supplier may claim Force Majeure relief for events affecting only the Tier-1 critical sub-suppliers named in Annex D or the approved international logistics carrier.</w:t>
+            </w:r>
+          </w:p>
+        </w:tc>
+        <w:tc>
+          <w:tcPr>
+            <w:tcW w:type="dxa" w:w="1234"/>
           </w:tcPr>
           <w:p>
             <w:r>
@@ -845,7 +1269,7 @@
         </w:tc>
         <w:tc>
           <w:tcPr>
-            <w:tcW w:type="dxa" w:w="1440"/>
+            <w:tcW w:type="dxa" w:w="1234"/>
           </w:tcPr>
           <w:p>
             <w:r>
@@ -857,11 +1281,30 @@
         </w:tc>
         <w:tc>
           <w:tcPr>
-            <w:tcW w:type="dxa" w:w="1440"/>
+            <w:tcW w:type="dxa" w:w="1234"/>
           </w:tcPr>
           <w:p>
             <w:r>
               <w:t>Clause contains material limitations, exceptions, carve-outs, conditions, or restricted applicability</w:t>
+            </w:r>
+          </w:p>
+        </w:tc>
+        <w:tc>
+          <w:tcPr>
+            <w:tcW w:type="dxa" w:w="1234"/>
+          </w:tcPr>
+          <w:p>
+            <w:r>
+              <w:t>Force majeure definitions were standardized across drafts and expanded to include specific risks like regional power grid failures.</w:t>
+              <w:br/>
+              <w:br/>
+              <w:t>Historical Reference</w:t>
+              <w:br/>
+              <w:t>Sources:</w:t>
+              <w:br/>
+              <w:t>• d1.docx – Force Majeure</w:t>
+              <w:br/>
+              <w:t>• d2.docx – Force Majeure</w:t>
             </w:r>
           </w:p>
         </w:tc>
@@ -869,7 +1312,7 @@
       <w:tr>
         <w:tc>
           <w:tcPr>
-            <w:tcW w:type="dxa" w:w="1440"/>
+            <w:tcW w:type="dxa" w:w="1234"/>
           </w:tcPr>
           <w:p>
             <w:r>
@@ -879,7 +1322,7 @@
         </w:tc>
         <w:tc>
           <w:tcPr>
-            <w:tcW w:type="dxa" w:w="1440"/>
+            <w:tcW w:type="dxa" w:w="1234"/>
           </w:tcPr>
           <w:p>
             <w:r>
@@ -889,17 +1332,17 @@
         </w:tc>
         <w:tc>
           <w:tcPr>
-            <w:tcW w:type="dxa" w:w="1440"/>
-          </w:tcPr>
-          <w:p>
-            <w:r>
-              <w:t>Force Majeure means an event beyond the reasonable control of the affected party, including Act of God, expropriation, nationalization, embargo, changes in law or regulation, war, sabotage, floods, severe weather, fires, strikes, lockouts, epidemics, pandemics, quarantine restrictions, and government action directly preventing performance. 2 Supply-chain events. Supplier may claim Force Majeure relief for events affecting only the Tier-1 critical sub-suppliers named in Annex D or the approved international logistics carrier</w:t>
-            </w:r>
-          </w:p>
-        </w:tc>
-        <w:tc>
-          <w:tcPr>
-            <w:tcW w:type="dxa" w:w="1440"/>
+            <w:tcW w:type="dxa" w:w="1234"/>
+          </w:tcPr>
+          <w:p>
+            <w:r>
+              <w:t>Provisions regarding 'Applies to subcontractors': Force majeure applies only to named Tier-1 / approved suppliers.</w:t>
+            </w:r>
+          </w:p>
+        </w:tc>
+        <w:tc>
+          <w:tcPr>
+            <w:tcW w:type="dxa" w:w="1234"/>
           </w:tcPr>
           <w:p>
             <w:r>
@@ -909,7 +1352,7 @@
         </w:tc>
         <w:tc>
           <w:tcPr>
-            <w:tcW w:type="dxa" w:w="1440"/>
+            <w:tcW w:type="dxa" w:w="1234"/>
           </w:tcPr>
           <w:p>
             <w:r>
@@ -919,11 +1362,37 @@
         </w:tc>
         <w:tc>
           <w:tcPr>
-            <w:tcW w:type="dxa" w:w="1440"/>
+            <w:tcW w:type="dxa" w:w="1234"/>
           </w:tcPr>
           <w:p>
             <w:r>
               <w:t>Applies only to specific suppliers</w:t>
+            </w:r>
+          </w:p>
+        </w:tc>
+        <w:tc>
+          <w:tcPr>
+            <w:tcW w:type="dxa" w:w="1234"/>
+          </w:tcPr>
+          <w:p>
+            <w:r>
+              <w:t>Wording was adjusted through a subcontractor compliance review and formal amendments to mitigate supply chain exposure.</w:t>
+              <w:br/>
+              <w:br/>
+              <w:t>Historical Reference</w:t>
+              <w:br/>
+              <w:t>Source:</w:t>
+              <w:br/>
+              <w:t>d1.docx</w:t>
+              <w:br/>
+              <w:t>Clause: Force Majeure</w:t>
+              <w:br/>
+              <w:t>Requirement: Applies to subcontractors</w:t>
+              <w:br/>
+              <w:br/>
+              <w:t>Quote:</w:t>
+              <w:br/>
+              <w:t>"Wording adjusted after subcontractor compliance review; closed after formal execution of Amendment 2."</w:t>
             </w:r>
           </w:p>
         </w:tc>
@@ -931,7 +1400,7 @@
       <w:tr>
         <w:tc>
           <w:tcPr>
-            <w:tcW w:type="dxa" w:w="1440"/>
+            <w:tcW w:type="dxa" w:w="1234"/>
           </w:tcPr>
           <w:p>
             <w:r>
@@ -941,7 +1410,7 @@
         </w:tc>
         <w:tc>
           <w:tcPr>
-            <w:tcW w:type="dxa" w:w="1440"/>
+            <w:tcW w:type="dxa" w:w="1234"/>
           </w:tcPr>
           <w:p>
             <w:r>
@@ -951,17 +1420,17 @@
         </w:tc>
         <w:tc>
           <w:tcPr>
-            <w:tcW w:type="dxa" w:w="1440"/>
-          </w:tcPr>
-          <w:p>
-            <w:r>
-              <w:t>Force Majeure means an event beyond the reasonable control of the affected party, including Act of God, expropriation, nationalization, embargo, changes in law or regulation, war, sabotage, floods, severe weather, fires, strikes, lockouts, epidemics, pandemics, quarantine restrictions, and government action directly preventing performance. 2 Supply-chain events. Supplier may claim Force Majeure relief for events affecting only the Tier-1 critical sub-suppliers named in Annex D or the approved international logistics carrier</w:t>
-            </w:r>
-          </w:p>
-        </w:tc>
-        <w:tc>
-          <w:tcPr>
-            <w:tcW w:type="dxa" w:w="1440"/>
+            <w:tcW w:type="dxa" w:w="1234"/>
+          </w:tcPr>
+          <w:p>
+            <w:r>
+              <w:t>Provisions regarding 'Notice obligations defined': Supplier may claim Force Majeure relief for events affecting only the Tier-1 critical sub-suppliers named in Annex D or the approved international logistics carrier.</w:t>
+            </w:r>
+          </w:p>
+        </w:tc>
+        <w:tc>
+          <w:tcPr>
+            <w:tcW w:type="dxa" w:w="1234"/>
           </w:tcPr>
           <w:p>
             <w:r>
@@ -971,7 +1440,7 @@
         </w:tc>
         <w:tc>
           <w:tcPr>
-            <w:tcW w:type="dxa" w:w="1440"/>
+            <w:tcW w:type="dxa" w:w="1234"/>
           </w:tcPr>
           <w:p>
             <w:r>
@@ -983,11 +1452,30 @@
         </w:tc>
         <w:tc>
           <w:tcPr>
-            <w:tcW w:type="dxa" w:w="1440"/>
+            <w:tcW w:type="dxa" w:w="1234"/>
           </w:tcPr>
           <w:p>
             <w:r>
               <w:t>Clause contains material limitations, exceptions, carve-outs, conditions, or restricted applicability</w:t>
+            </w:r>
+          </w:p>
+        </w:tc>
+        <w:tc>
+          <w:tcPr>
+            <w:tcW w:type="dxa" w:w="1234"/>
+          </w:tcPr>
+          <w:p>
+            <w:r>
+              <w:t>Negotiations focused on extending unrealistic 24-hour notice windows to more achievable timelines, such as 72 hours or five business days.</w:t>
+              <w:br/>
+              <w:br/>
+              <w:t>Historical Reference</w:t>
+              <w:br/>
+              <w:t>Sources:</w:t>
+              <w:br/>
+              <w:t>• d1.docx – Force Majeure</w:t>
+              <w:br/>
+              <w:t>• d2.docx – Force Majeure</w:t>
             </w:r>
           </w:p>
         </w:tc>
@@ -995,7 +1483,7 @@
       <w:tr>
         <w:tc>
           <w:tcPr>
-            <w:tcW w:type="dxa" w:w="1440"/>
+            <w:tcW w:type="dxa" w:w="1234"/>
           </w:tcPr>
           <w:p>
             <w:r>
@@ -1005,7 +1493,7 @@
         </w:tc>
         <w:tc>
           <w:tcPr>
-            <w:tcW w:type="dxa" w:w="1440"/>
+            <w:tcW w:type="dxa" w:w="1234"/>
           </w:tcPr>
           <w:p>
             <w:r>
@@ -1015,17 +1503,17 @@
         </w:tc>
         <w:tc>
           <w:tcPr>
-            <w:tcW w:type="dxa" w:w="1440"/>
-          </w:tcPr>
-          <w:p>
-            <w:r>
-              <w:t>1 Convenience cancellation schedule. If Buyer cancels the Purchase Order for convenience after Supplier acknowledgement, Buyer shall pay the following fee as a percentage of the order value, subject to the notes below: 0-30 days: 7. 5%; 31-60 days: 25%; 61-90 days: 38%; 91-120 days: 55%; 121-150 days: 70% less documented resale or scrap salvage actually realized by Supplier; 151-180 days: 85%; and 181 or more days: 100% of the undelivered balance only</w:t>
-            </w:r>
-          </w:p>
-        </w:tc>
-        <w:tc>
-          <w:tcPr>
-            <w:tcW w:type="dxa" w:w="1440"/>
+            <w:tcW w:type="dxa" w:w="1234"/>
+          </w:tcPr>
+          <w:p>
+            <w:r>
+              <w:t>Provisions regarding 'Termination rights defined': If Buyer cancels the Purchase Order for convenience after Supplier acknowledgement, Buyer shall pay the following fee as a percentage of the order value, subject to the notes below: 0-30 days: 7. 5%; 31-60 days: 25%; 61-90 days: 38%; 91-120 days: 55%; 121-150 days: 70% less documented resale or scrap salvage actually realized by Supplier; 151-180 days: 85%; and 181 or more days: 100% of the undelivered balance only.</w:t>
+            </w:r>
+          </w:p>
+        </w:tc>
+        <w:tc>
+          <w:tcPr>
+            <w:tcW w:type="dxa" w:w="1234"/>
           </w:tcPr>
           <w:p>
             <w:r>
@@ -1035,7 +1523,7 @@
         </w:tc>
         <w:tc>
           <w:tcPr>
-            <w:tcW w:type="dxa" w:w="1440"/>
+            <w:tcW w:type="dxa" w:w="1234"/>
           </w:tcPr>
           <w:p>
             <w:r>
@@ -1051,7 +1539,7 @@
         </w:tc>
         <w:tc>
           <w:tcPr>
-            <w:tcW w:type="dxa" w:w="1440"/>
+            <w:tcW w:type="dxa" w:w="1234"/>
           </w:tcPr>
           <w:p>
             <w:r>
@@ -1065,11 +1553,30 @@
             </w:r>
           </w:p>
         </w:tc>
+        <w:tc>
+          <w:tcPr>
+            <w:tcW w:type="dxa" w:w="1234"/>
+          </w:tcPr>
+          <w:p>
+            <w:r>
+              <w:t>Termination rights were standardized by the legal team and updated to address imbalances regarding supplier-initiated termination for non-payment.</w:t>
+              <w:br/>
+              <w:br/>
+              <w:t>Historical Reference</w:t>
+              <w:br/>
+              <w:t>Sources:</w:t>
+              <w:br/>
+              <w:t>• d1.docx – Termination</w:t>
+              <w:br/>
+              <w:t>• d2.docx – Termination</w:t>
+            </w:r>
+          </w:p>
+        </w:tc>
       </w:tr>
       <w:tr>
         <w:tc>
           <w:tcPr>
-            <w:tcW w:type="dxa" w:w="1440"/>
+            <w:tcW w:type="dxa" w:w="1234"/>
           </w:tcPr>
           <w:p>
             <w:r>
@@ -1079,7 +1586,7 @@
         </w:tc>
         <w:tc>
           <w:tcPr>
-            <w:tcW w:type="dxa" w:w="1440"/>
+            <w:tcW w:type="dxa" w:w="1234"/>
           </w:tcPr>
           <w:p>
             <w:r>
@@ -1089,17 +1596,17 @@
         </w:tc>
         <w:tc>
           <w:tcPr>
-            <w:tcW w:type="dxa" w:w="1440"/>
-          </w:tcPr>
-          <w:p>
-            <w:r>
-              <w:t>1 Convenience cancellation schedule. If Buyer cancels the Purchase Order for convenience after Supplier acknowledgement, Buyer shall pay the following fee as a percentage of the order value, subject to the notes below: 0-30 days: 7. 5%; 31-60 days: 25%; 61-90 days: 38%; 91-120 days: 55%; 121-150 days: 70% less documented resale or scrap salvage actually realized by Supplier; 151-180 days: 85%; and 181 or more days: 100% of the undelivered balance only</w:t>
-            </w:r>
-          </w:p>
-        </w:tc>
-        <w:tc>
-          <w:tcPr>
-            <w:tcW w:type="dxa" w:w="1440"/>
+            <w:tcW w:type="dxa" w:w="1234"/>
+          </w:tcPr>
+          <w:p>
+            <w:r>
+              <w:t>Provisions regarding 'Cancellation fee structure defined': If Buyer cancels the Purchase Order for convenience after Supplier acknowledgement, Buyer shall pay the following fee as a percentage of the order value, subject to the notes below: 0-30 days: 7. 5%; 31-60 days: 25%; 61-90 days: 38%; 91-120 days: 55%; 121-150 days: 70% less documented resale or scrap salvage actually realized by Supplier; 151-180 days: 85%; and 181 or more days: 100% of the undelivered balance only.</w:t>
+            </w:r>
+          </w:p>
+        </w:tc>
+        <w:tc>
+          <w:tcPr>
+            <w:tcW w:type="dxa" w:w="1234"/>
           </w:tcPr>
           <w:p>
             <w:r>
@@ -1109,7 +1616,7 @@
         </w:tc>
         <w:tc>
           <w:tcPr>
-            <w:tcW w:type="dxa" w:w="1440"/>
+            <w:tcW w:type="dxa" w:w="1234"/>
           </w:tcPr>
           <w:p>
             <w:r>
@@ -1125,7 +1632,7 @@
         </w:tc>
         <w:tc>
           <w:tcPr>
-            <w:tcW w:type="dxa" w:w="1440"/>
+            <w:tcW w:type="dxa" w:w="1234"/>
           </w:tcPr>
           <w:p>
             <w:r>
@@ -1139,11 +1646,30 @@
             </w:r>
           </w:p>
         </w:tc>
+        <w:tc>
+          <w:tcPr>
+            <w:tcW w:type="dxa" w:w="1234"/>
+          </w:tcPr>
+          <w:p>
+            <w:r>
+              <w:t>The commercial team attempted to replace flat-rate lump sums with a more dynamic fee structure to protect work-in-progress investments.</w:t>
+              <w:br/>
+              <w:br/>
+              <w:t>Historical Reference</w:t>
+              <w:br/>
+              <w:t>Sources:</w:t>
+              <w:br/>
+              <w:t>• d1.docx – Termination</w:t>
+              <w:br/>
+              <w:t>• d2.docx – Termination</w:t>
+            </w:r>
+          </w:p>
+        </w:tc>
       </w:tr>
       <w:tr>
         <w:tc>
           <w:tcPr>
-            <w:tcW w:type="dxa" w:w="1440"/>
+            <w:tcW w:type="dxa" w:w="1234"/>
           </w:tcPr>
           <w:p>
             <w:r>
@@ -1153,7 +1679,7 @@
         </w:tc>
         <w:tc>
           <w:tcPr>
-            <w:tcW w:type="dxa" w:w="1440"/>
+            <w:tcW w:type="dxa" w:w="1234"/>
           </w:tcPr>
           <w:p>
             <w:r>
@@ -1163,17 +1689,17 @@
         </w:tc>
         <w:tc>
           <w:tcPr>
-            <w:tcW w:type="dxa" w:w="1440"/>
-          </w:tcPr>
-          <w:p>
-            <w:r>
-              <w:t>1 Convenience cancellation schedule. If Buyer cancels the Purchase Order for convenience after Supplier acknowledgement, Buyer shall pay the following fee as a percentage of the order value, subject to the notes below: 0-30 days: 7. 5%; 31-60 days: 25%; 61-90 days: 38%; 91-120 days: 55%; 121-150 days: 70% less documented resale or scrap salvage actually realized by Supplier; 151-180 days: 85%; and 181 or more days: 100% of the undelivered balance only</w:t>
-            </w:r>
-          </w:p>
-        </w:tc>
-        <w:tc>
-          <w:tcPr>
-            <w:tcW w:type="dxa" w:w="1440"/>
+            <w:tcW w:type="dxa" w:w="1234"/>
+          </w:tcPr>
+          <w:p>
+            <w:r>
+              <w:t>Provisions regarding '61-90 day cancellation fee 40%': Article 00511. 9 - Cancellation and Early Termination Fee.</w:t>
+            </w:r>
+          </w:p>
+        </w:tc>
+        <w:tc>
+          <w:tcPr>
+            <w:tcW w:type="dxa" w:w="1234"/>
           </w:tcPr>
           <w:p>
             <w:r>
@@ -1183,7 +1709,7 @@
         </w:tc>
         <w:tc>
           <w:tcPr>
-            <w:tcW w:type="dxa" w:w="1440"/>
+            <w:tcW w:type="dxa" w:w="1234"/>
           </w:tcPr>
           <w:p>
             <w:r>
@@ -1193,11 +1719,37 @@
         </w:tc>
         <w:tc>
           <w:tcPr>
-            <w:tcW w:type="dxa" w:w="1440"/>
+            <w:tcW w:type="dxa" w:w="1234"/>
           </w:tcPr>
           <w:p>
             <w:r>
               <w:t>Required 40.0% not found</w:t>
+            </w:r>
+          </w:p>
+        </w:tc>
+        <w:tc>
+          <w:tcPr>
+            <w:tcW w:type="dxa" w:w="1234"/>
+          </w:tcPr>
+          <w:p>
+            <w:r>
+              <w:t>Baseline percentages were corrected during document formatting and finalized following a legal review to address asset tracking shortfalls.</w:t>
+              <w:br/>
+              <w:br/>
+              <w:t>Historical Reference</w:t>
+              <w:br/>
+              <w:t>Source:</w:t>
+              <w:br/>
+              <w:t>d1.docx</w:t>
+              <w:br/>
+              <w:t>Clause: Termination</w:t>
+              <w:br/>
+              <w:t>Requirement: 61-90 day cancellation fee 40%</w:t>
+              <w:br/>
+              <w:br/>
+              <w:t>Quote:</w:t>
+              <w:br/>
+              <w:t>"Baseline percentages re-aligned and corrected during pre-signature document formatting review."</w:t>
             </w:r>
           </w:p>
         </w:tc>
@@ -1205,7 +1757,7 @@
       <w:tr>
         <w:tc>
           <w:tcPr>
-            <w:tcW w:type="dxa" w:w="1440"/>
+            <w:tcW w:type="dxa" w:w="1234"/>
           </w:tcPr>
           <w:p>
             <w:r>
@@ -1215,7 +1767,7 @@
         </w:tc>
         <w:tc>
           <w:tcPr>
-            <w:tcW w:type="dxa" w:w="1440"/>
+            <w:tcW w:type="dxa" w:w="1234"/>
           </w:tcPr>
           <w:p>
             <w:r>
@@ -1225,17 +1777,17 @@
         </w:tc>
         <w:tc>
           <w:tcPr>
-            <w:tcW w:type="dxa" w:w="1440"/>
-          </w:tcPr>
-          <w:p>
-            <w:r>
-              <w:t>Buyer may suspend work for commercial convenience no more than two (2) times during the Purchase Order term, and the aggregate duration of such commercial-convenience suspensions shall not exceed thirty (30) calendar days unless Supplier agrees in writing. Regulatory inspection holds, government clearance waits, and safety stoppages imposed by law are not counted as suspensions for this limit. If Buyer requests a commercial-convenience suspension beyond the permitted limit, the excess period shall be treated as a compensable change order entitling Supplier to schedule extension, storage, demobilization, and reasonable remobilization costs</w:t>
-            </w:r>
-          </w:p>
-        </w:tc>
-        <w:tc>
-          <w:tcPr>
-            <w:tcW w:type="dxa" w:w="1440"/>
+            <w:tcW w:type="dxa" w:w="1234"/>
+          </w:tcPr>
+          <w:p>
+            <w:r>
+              <w:t>Provisions regarding 'Maximum 2 suspensions and 30 days aggregate': Suspension limits exclude regulatory, government, legal, and safety stoppages.</w:t>
+            </w:r>
+          </w:p>
+        </w:tc>
+        <w:tc>
+          <w:tcPr>
+            <w:tcW w:type="dxa" w:w="1234"/>
           </w:tcPr>
           <w:p>
             <w:r>
@@ -1245,7 +1797,7 @@
         </w:tc>
         <w:tc>
           <w:tcPr>
-            <w:tcW w:type="dxa" w:w="1440"/>
+            <w:tcW w:type="dxa" w:w="1234"/>
           </w:tcPr>
           <w:p>
             <w:r>
@@ -1255,11 +1807,37 @@
         </w:tc>
         <w:tc>
           <w:tcPr>
-            <w:tcW w:type="dxa" w:w="1440"/>
+            <w:tcW w:type="dxa" w:w="1234"/>
           </w:tcPr>
           <w:p>
             <w:r>
               <w:t>Certain suspension categories excluded from limit</w:t>
+            </w:r>
+          </w:p>
+        </w:tc>
+        <w:tc>
+          <w:tcPr>
+            <w:tcW w:type="dxa" w:w="1234"/>
+          </w:tcPr>
+          <w:p>
+            <w:r>
+              <w:t>Hard duration limits and an approval workflow were implemented following a previous contract dispute to prevent indefinite project pauses.</w:t>
+              <w:br/>
+              <w:br/>
+              <w:t>Historical Reference</w:t>
+              <w:br/>
+              <w:t>Source:</w:t>
+              <w:br/>
+              <w:t>d1.docx</w:t>
+              <w:br/>
+              <w:t>Clause: Suspension</w:t>
+              <w:br/>
+              <w:t>Requirement: Maximum 2 suspensions and 30 days aggregate</w:t>
+              <w:br/>
+              <w:br/>
+              <w:t>Quote:</w:t>
+              <w:br/>
+              <w:t>"Added suspension approval workflow and hard duration limits after prior contract dispute review."</w:t>
             </w:r>
           </w:p>
         </w:tc>
@@ -1267,7 +1845,7 @@
       <w:tr>
         <w:tc>
           <w:tcPr>
-            <w:tcW w:type="dxa" w:w="1440"/>
+            <w:tcW w:type="dxa" w:w="1234"/>
           </w:tcPr>
           <w:p>
             <w:r>
@@ -1277,7 +1855,7 @@
         </w:tc>
         <w:tc>
           <w:tcPr>
-            <w:tcW w:type="dxa" w:w="1440"/>
+            <w:tcW w:type="dxa" w:w="1234"/>
           </w:tcPr>
           <w:p>
             <w:r>
@@ -1287,17 +1865,17 @@
         </w:tc>
         <w:tc>
           <w:tcPr>
-            <w:tcW w:type="dxa" w:w="1440"/>
-          </w:tcPr>
-          <w:p>
-            <w:r>
-              <w:t>Buyer may suspend work for commercial convenience no more than two (2) times during the Purchase Order term, and the aggregate duration of such commercial-convenience suspensions shall not exceed thirty (30) calendar days unless Supplier agrees in writing. Regulatory inspection holds, government clearance waits, and safety stoppages imposed by law are not counted as suspensions for this limit. If Buyer requests a commercial-convenience suspension beyond the permitted limit, the excess period shall be treated as a compensable change order entitling Supplier to schedule extension, storage, demobilization, and reasonable remobilization costs</w:t>
-            </w:r>
-          </w:p>
-        </w:tc>
-        <w:tc>
-          <w:tcPr>
-            <w:tcW w:type="dxa" w:w="1440"/>
+            <w:tcW w:type="dxa" w:w="1234"/>
+          </w:tcPr>
+          <w:p>
+            <w:r>
+              <w:t>Provisions regarding 'Supplier obligations during suspension defined': Buyer may suspend work for commercial convenience no more than two (2) times during the Purchase Order term, and the aggregate duration of such commercial-convenience suspensions shall not exceed thirty (30) calendar days unless Supplier agrees in writing.</w:t>
+            </w:r>
+          </w:p>
+        </w:tc>
+        <w:tc>
+          <w:tcPr>
+            <w:tcW w:type="dxa" w:w="1234"/>
           </w:tcPr>
           <w:p>
             <w:r>
@@ -1307,7 +1885,7 @@
         </w:tc>
         <w:tc>
           <w:tcPr>
-            <w:tcW w:type="dxa" w:w="1440"/>
+            <w:tcW w:type="dxa" w:w="1234"/>
           </w:tcPr>
           <w:p>
             <w:r>
@@ -1321,7 +1899,7 @@
         </w:tc>
         <w:tc>
           <w:tcPr>
-            <w:tcW w:type="dxa" w:w="1440"/>
+            <w:tcW w:type="dxa" w:w="1234"/>
           </w:tcPr>
           <w:p>
             <w:r>
@@ -1333,11 +1911,30 @@
             </w:r>
           </w:p>
         </w:tc>
+        <w:tc>
+          <w:tcPr>
+            <w:tcW w:type="dxa" w:w="1234"/>
+          </w:tcPr>
+          <w:p>
+            <w:r>
+              <w:t>Engineering teams embedded explicit preservation protocols into the contract, while maintenance cost allocations were escalated to the procurement board for resolution.</w:t>
+              <w:br/>
+              <w:br/>
+              <w:t>Historical Reference</w:t>
+              <w:br/>
+              <w:t>Sources:</w:t>
+              <w:br/>
+              <w:t>• d1.docx – Suspension</w:t>
+              <w:br/>
+              <w:t>• d2.docx – Suspension</w:t>
+            </w:r>
+          </w:p>
+        </w:tc>
       </w:tr>
       <w:tr>
         <w:tc>
           <w:tcPr>
-            <w:tcW w:type="dxa" w:w="1440"/>
+            <w:tcW w:type="dxa" w:w="1234"/>
           </w:tcPr>
           <w:p>
             <w:r>
@@ -1347,7 +1944,7 @@
         </w:tc>
         <w:tc>
           <w:tcPr>
-            <w:tcW w:type="dxa" w:w="1440"/>
+            <w:tcW w:type="dxa" w:w="1234"/>
           </w:tcPr>
           <w:p>
             <w:r>
@@ -1357,17 +1954,17 @@
         </w:tc>
         <w:tc>
           <w:tcPr>
-            <w:tcW w:type="dxa" w:w="1440"/>
-          </w:tcPr>
-          <w:p>
-            <w:r>
-              <w:t>1 Order of precedence. In case of inconsistency, the following order applies: (a) signed Purchase Order amendment; (b) Special Conditions in Articles 00511. 16; (c) Annex B - Commercial Schedule; (d) Annex C - Logistics Protocol; (e) the General Procurement Conditions; and (f) email clarifications not incorporated by amendment</w:t>
-            </w:r>
-          </w:p>
-        </w:tc>
-        <w:tc>
-          <w:tcPr>
-            <w:tcW w:type="dxa" w:w="1440"/>
+            <w:tcW w:type="dxa" w:w="1234"/>
+          </w:tcPr>
+          <w:p>
+            <w:r>
+              <w:t>Provisions regarding 'Formal amendment process defined': In case of inconsistency, the following order applies: (a) signed Purchase Order amendment; (b) Special Conditions in Articles 00511. 16; (c) Annex B - Commercial Schedule; (d) Annex C - Logistics Protocol; (e) the General Procurement Conditions; and (f) email clarifications not incorporated by amendment.</w:t>
+            </w:r>
+          </w:p>
+        </w:tc>
+        <w:tc>
+          <w:tcPr>
+            <w:tcW w:type="dxa" w:w="1234"/>
           </w:tcPr>
           <w:p>
             <w:r>
@@ -1377,7 +1974,7 @@
         </w:tc>
         <w:tc>
           <w:tcPr>
-            <w:tcW w:type="dxa" w:w="1440"/>
+            <w:tcW w:type="dxa" w:w="1234"/>
           </w:tcPr>
           <w:p>
             <w:r>
@@ -1391,7 +1988,7 @@
         </w:tc>
         <w:tc>
           <w:tcPr>
-            <w:tcW w:type="dxa" w:w="1440"/>
+            <w:tcW w:type="dxa" w:w="1234"/>
           </w:tcPr>
           <w:p>
             <w:r>
@@ -1403,11 +2000,37 @@
             </w:r>
           </w:p>
         </w:tc>
+        <w:tc>
+          <w:tcPr>
+            <w:tcW w:type="dxa" w:w="1234"/>
+          </w:tcPr>
+          <w:p>
+            <w:r>
+              <w:t>A formal change request protocol and a strict document precedence matrix were integrated to eliminate the risks associated with informal amendments.</w:t>
+              <w:br/>
+              <w:br/>
+              <w:t>Historical Reference</w:t>
+              <w:br/>
+              <w:t>Source:</w:t>
+              <w:br/>
+              <w:t>d2.docx</w:t>
+              <w:br/>
+              <w:t>Clause: Change Orders</w:t>
+              <w:br/>
+              <w:t>Requirement: Formal amendment process defined</w:t>
+              <w:br/>
+              <w:br/>
+              <w:t>Quote:</w:t>
+              <w:br/>
+              <w:t>"Implemented formal change request protocol and strict document precedence matrix; closed after amendment integration."</w:t>
+            </w:r>
+          </w:p>
+        </w:tc>
       </w:tr>
       <w:tr>
         <w:tc>
           <w:tcPr>
-            <w:tcW w:type="dxa" w:w="1440"/>
+            <w:tcW w:type="dxa" w:w="1234"/>
           </w:tcPr>
           <w:p>
             <w:r>
@@ -1417,7 +2040,7 @@
         </w:tc>
         <w:tc>
           <w:tcPr>
-            <w:tcW w:type="dxa" w:w="1440"/>
+            <w:tcW w:type="dxa" w:w="1234"/>
           </w:tcPr>
           <w:p>
             <w:r>
@@ -1427,17 +2050,17 @@
         </w:tc>
         <w:tc>
           <w:tcPr>
-            <w:tcW w:type="dxa" w:w="1440"/>
-          </w:tcPr>
-          <w:p>
-            <w:r>
-              <w:t>1 Order of precedence. In case of inconsistency, the following order applies: (a) signed Purchase Order amendment; (b) Special Conditions in Articles 00511. 16; (c) Annex B - Commercial Schedule; (d) Annex C - Logistics Protocol; (e) the General Procurement Conditions; and (f) email clarifications not incorporated by amendment</w:t>
-            </w:r>
-          </w:p>
-        </w:tc>
-        <w:tc>
-          <w:tcPr>
-            <w:tcW w:type="dxa" w:w="1440"/>
+            <w:tcW w:type="dxa" w:w="1234"/>
+          </w:tcPr>
+          <w:p>
+            <w:r>
+              <w:t>Provisions regarding 'Timeline for approval defined': In case of inconsistency, the following order applies: (a) signed Purchase Order amendment; (b) Special Conditions in Articles 00511. 16; (c) Annex B - Commercial Schedule; (d) Annex C - Logistics Protocol; (e) the General Procurement Conditions; and (f) email clarifications not incorporated by amendment.</w:t>
+            </w:r>
+          </w:p>
+        </w:tc>
+        <w:tc>
+          <w:tcPr>
+            <w:tcW w:type="dxa" w:w="1234"/>
           </w:tcPr>
           <w:p>
             <w:r>
@@ -1447,7 +2070,7 @@
         </w:tc>
         <w:tc>
           <w:tcPr>
-            <w:tcW w:type="dxa" w:w="1440"/>
+            <w:tcW w:type="dxa" w:w="1234"/>
           </w:tcPr>
           <w:p>
             <w:r>
@@ -1461,7 +2084,7 @@
         </w:tc>
         <w:tc>
           <w:tcPr>
-            <w:tcW w:type="dxa" w:w="1440"/>
+            <w:tcW w:type="dxa" w:w="1234"/>
           </w:tcPr>
           <w:p>
             <w:r>
@@ -1473,11 +2096,37 @@
             </w:r>
           </w:p>
         </w:tc>
+        <w:tc>
+          <w:tcPr>
+            <w:tcW w:type="dxa" w:w="1234"/>
+          </w:tcPr>
+          <w:p>
+            <w:r>
+              <w:t>Efforts were made to replace vague commercial timeframes with specific day-based limits and to eliminate unilateral directives that bypassed cost tracking.</w:t>
+              <w:br/>
+              <w:br/>
+              <w:t>Historical Reference</w:t>
+              <w:br/>
+              <w:t>Source:</w:t>
+              <w:br/>
+              <w:t>d2.docx</w:t>
+              <w:br/>
+              <w:t>Clause: Change Orders</w:t>
+              <w:br/>
+              <w:t>Requirement: Timeline for approval defined</w:t>
+              <w:br/>
+              <w:br/>
+              <w:t>Quote:</w:t>
+              <w:br/>
+              <w:t>"Implemented formal change request and approval process; unilateral directives flagged for secondary elimination."</w:t>
+            </w:r>
+          </w:p>
+        </w:tc>
       </w:tr>
       <w:tr>
         <w:tc>
           <w:tcPr>
-            <w:tcW w:type="dxa" w:w="1440"/>
+            <w:tcW w:type="dxa" w:w="1234"/>
           </w:tcPr>
           <w:p>
             <w:r>
@@ -1487,7 +2136,7 @@
         </w:tc>
         <w:tc>
           <w:tcPr>
-            <w:tcW w:type="dxa" w:w="1440"/>
+            <w:tcW w:type="dxa" w:w="1234"/>
           </w:tcPr>
           <w:p>
             <w:r>
@@ -1497,17 +2146,17 @@
         </w:tc>
         <w:tc>
           <w:tcPr>
-            <w:tcW w:type="dxa" w:w="1440"/>
-          </w:tcPr>
-          <w:p>
-            <w:r>
-              <w:t>This Purchase Order and all non-contractual obligations arising out of or in connection with it shall be governed by the laws of India, excluding conflict-of-law principles. Disputes relating to price adjustment, delay LD, warranty, cancellation fee, limitation of liability, and consequential damages shall be finally resolved by arbitration seated in Singapore under the SIAC Rules. The language of arbitration shall be English</w:t>
-            </w:r>
-          </w:p>
-        </w:tc>
-        <w:tc>
-          <w:tcPr>
-            <w:tcW w:type="dxa" w:w="1440"/>
+            <w:tcW w:type="dxa" w:w="1234"/>
+          </w:tcPr>
+          <w:p>
+            <w:r>
+              <w:t>Provisions regarding 'Applicable law specified': This Purchase Order and all non-contractual obligations arising out of or in connection with it shall be governed by the laws of India, excluding conflict-of-law principles.</w:t>
+            </w:r>
+          </w:p>
+        </w:tc>
+        <w:tc>
+          <w:tcPr>
+            <w:tcW w:type="dxa" w:w="1234"/>
           </w:tcPr>
           <w:p>
             <w:r>
@@ -1517,7 +2166,7 @@
         </w:tc>
         <w:tc>
           <w:tcPr>
-            <w:tcW w:type="dxa" w:w="1440"/>
+            <w:tcW w:type="dxa" w:w="1234"/>
           </w:tcPr>
           <w:p>
             <w:r>
@@ -1529,11 +2178,37 @@
         </w:tc>
         <w:tc>
           <w:tcPr>
-            <w:tcW w:type="dxa" w:w="1440"/>
+            <w:tcW w:type="dxa" w:w="1234"/>
           </w:tcPr>
           <w:p>
             <w:r>
               <w:t>Clause contains material limitations, exceptions, carve-outs, conditions, or restricted applicability</w:t>
+            </w:r>
+          </w:p>
+        </w:tc>
+        <w:tc>
+          <w:tcPr>
+            <w:tcW w:type="dxa" w:w="1234"/>
+          </w:tcPr>
+          <w:p>
+            <w:r>
+              <w:t>A standardized governing law framework was applied across all global procurement files to simplify cross-border legal enforcement.</w:t>
+              <w:br/>
+              <w:br/>
+              <w:t>Historical Reference</w:t>
+              <w:br/>
+              <w:t>Source:</w:t>
+              <w:br/>
+              <w:t>d1.docx</w:t>
+              <w:br/>
+              <w:t>Clause: Governing Law</w:t>
+              <w:br/>
+              <w:t>Requirement: Applicable law specified</w:t>
+              <w:br/>
+              <w:br/>
+              <w:t>Quote:</w:t>
+              <w:br/>
+              <w:t>"Standardized governing law framework applied across all active global procurement files."</w:t>
             </w:r>
           </w:p>
         </w:tc>
@@ -1541,7 +2216,7 @@
       <w:tr>
         <w:tc>
           <w:tcPr>
-            <w:tcW w:type="dxa" w:w="1440"/>
+            <w:tcW w:type="dxa" w:w="1234"/>
           </w:tcPr>
           <w:p>
             <w:r>
@@ -1551,7 +2226,7 @@
         </w:tc>
         <w:tc>
           <w:tcPr>
-            <w:tcW w:type="dxa" w:w="1440"/>
+            <w:tcW w:type="dxa" w:w="1234"/>
           </w:tcPr>
           <w:p>
             <w:r>
@@ -1561,17 +2236,17 @@
         </w:tc>
         <w:tc>
           <w:tcPr>
-            <w:tcW w:type="dxa" w:w="1440"/>
-          </w:tcPr>
-          <w:p>
-            <w:r>
-              <w:t>This Purchase Order and all non-contractual obligations arising out of or in connection with it shall be governed by the laws of India, excluding conflict-of-law principles. Disputes relating to price adjustment, delay LD, warranty, cancellation fee, limitation of liability, and consequential damages shall be finally resolved by arbitration seated in Singapore under the SIAC Rules. The language of arbitration shall be English</w:t>
-            </w:r>
-          </w:p>
-        </w:tc>
-        <w:tc>
-          <w:tcPr>
-            <w:tcW w:type="dxa" w:w="1440"/>
+            <w:tcW w:type="dxa" w:w="1234"/>
+          </w:tcPr>
+          <w:p>
+            <w:r>
+              <w:t>Provisions regarding 'Arbitration mechanism defined': Disputes limited to laboratory test methodology shall first be referred to a technical expert in Mumbai; if the expert's determination is rejected, only the remaining legal dispute proceeds to Singapore arbitration.</w:t>
+            </w:r>
+          </w:p>
+        </w:tc>
+        <w:tc>
+          <w:tcPr>
+            <w:tcW w:type="dxa" w:w="1234"/>
           </w:tcPr>
           <w:p>
             <w:r>
@@ -1581,7 +2256,7 @@
         </w:tc>
         <w:tc>
           <w:tcPr>
-            <w:tcW w:type="dxa" w:w="1440"/>
+            <w:tcW w:type="dxa" w:w="1234"/>
           </w:tcPr>
           <w:p>
             <w:r>
@@ -1595,7 +2270,7 @@
         </w:tc>
         <w:tc>
           <w:tcPr>
-            <w:tcW w:type="dxa" w:w="1440"/>
+            <w:tcW w:type="dxa" w:w="1234"/>
           </w:tcPr>
           <w:p>
             <w:r>
@@ -1607,11 +2282,30 @@
             </w:r>
           </w:p>
         </w:tc>
+        <w:tc>
+          <w:tcPr>
+            <w:tcW w:type="dxa" w:w="1234"/>
+          </w:tcPr>
+          <w:p>
+            <w:r>
+              <w:t>A multi-tier framework was introduced to address home-court bias, and new arbitration text was proposed to replace direct reliance on municipal courts.</w:t>
+              <w:br/>
+              <w:br/>
+              <w:t>Historical Reference</w:t>
+              <w:br/>
+              <w:t>Sources:</w:t>
+              <w:br/>
+              <w:t>• d1.docx – Dispute Resolution</w:t>
+              <w:br/>
+              <w:t>• d2.docx – Dispute Resolution</w:t>
+            </w:r>
+          </w:p>
+        </w:tc>
       </w:tr>
       <w:tr>
         <w:tc>
           <w:tcPr>
-            <w:tcW w:type="dxa" w:w="1440"/>
+            <w:tcW w:type="dxa" w:w="1234"/>
           </w:tcPr>
           <w:p>
             <w:r>
@@ -1621,7 +2315,7 @@
         </w:tc>
         <w:tc>
           <w:tcPr>
-            <w:tcW w:type="dxa" w:w="1440"/>
+            <w:tcW w:type="dxa" w:w="1234"/>
           </w:tcPr>
           <w:p>
             <w:r>
@@ -1631,17 +2325,17 @@
         </w:tc>
         <w:tc>
           <w:tcPr>
-            <w:tcW w:type="dxa" w:w="1440"/>
-          </w:tcPr>
-          <w:p>
-            <w:r>
-              <w:t>This Purchase Order and all non-contractual obligations arising out of or in connection with it shall be governed by the laws of India, excluding conflict-of-law principles. Disputes relating to price adjustment, delay LD, warranty, cancellation fee, limitation of liability, and consequential damages shall be finally resolved by arbitration seated in Singapore under the SIAC Rules. The language of arbitration shall be English</w:t>
-            </w:r>
-          </w:p>
-        </w:tc>
-        <w:tc>
-          <w:tcPr>
-            <w:tcW w:type="dxa" w:w="1440"/>
+            <w:tcW w:type="dxa" w:w="1234"/>
+          </w:tcPr>
+          <w:p>
+            <w:r>
+              <w:t>Provisions regarding 'Seat of arbitration specified': Disputes limited to laboratory test methodology shall first be referred to a technical expert in Mumbai; if the expert's determination is rejected, only the remaining legal dispute proceeds to Singapore arbitration.</w:t>
+            </w:r>
+          </w:p>
+        </w:tc>
+        <w:tc>
+          <w:tcPr>
+            <w:tcW w:type="dxa" w:w="1234"/>
           </w:tcPr>
           <w:p>
             <w:r>
@@ -1651,7 +2345,7 @@
         </w:tc>
         <w:tc>
           <w:tcPr>
-            <w:tcW w:type="dxa" w:w="1440"/>
+            <w:tcW w:type="dxa" w:w="1234"/>
           </w:tcPr>
           <w:p>
             <w:r>
@@ -1665,7 +2359,7 @@
         </w:tc>
         <w:tc>
           <w:tcPr>
-            <w:tcW w:type="dxa" w:w="1440"/>
+            <w:tcW w:type="dxa" w:w="1234"/>
           </w:tcPr>
           <w:p>
             <w:r>
@@ -1677,11 +2371,37 @@
             </w:r>
           </w:p>
         </w:tc>
+        <w:tc>
+          <w:tcPr>
+            <w:tcW w:type="dxa" w:w="1234"/>
+          </w:tcPr>
+          <w:p>
+            <w:r>
+              <w:t>The legal committee has been evaluating alternative neutral international locations to resolve the absence of a defined legal seat for arbitration.</w:t>
+              <w:br/>
+              <w:br/>
+              <w:t>Historical Reference</w:t>
+              <w:br/>
+              <w:t>Source:</w:t>
+              <w:br/>
+              <w:t>d1.docx</w:t>
+              <w:br/>
+              <w:t>Clause: Dispute Resolution</w:t>
+              <w:br/>
+              <w:t>Requirement: Seat of arbitration specified</w:t>
+              <w:br/>
+              <w:br/>
+              <w:t>Quote:</w:t>
+              <w:br/>
+              <w:t>"Resolution stalled in legal committee; alternative international neutral locations are currently under active evaluation."</w:t>
+            </w:r>
+          </w:p>
+        </w:tc>
       </w:tr>
       <w:tr>
         <w:tc>
           <w:tcPr>
-            <w:tcW w:type="dxa" w:w="1440"/>
+            <w:tcW w:type="dxa" w:w="1234"/>
           </w:tcPr>
           <w:p>
             <w:r>
@@ -1691,7 +2411,7 @@
         </w:tc>
         <w:tc>
           <w:tcPr>
-            <w:tcW w:type="dxa" w:w="1440"/>
+            <w:tcW w:type="dxa" w:w="1234"/>
           </w:tcPr>
           <w:p>
             <w:r>
@@ -1701,17 +2421,17 @@
         </w:tc>
         <w:tc>
           <w:tcPr>
-            <w:tcW w:type="dxa" w:w="1440"/>
-          </w:tcPr>
-          <w:p>
-            <w:r>
-              <w:t>1 Readiness and free storage. Supplier shall issue a readiness notice after FAT clearance. If Buyer defers collection after readiness notice, Supplier shall store the affected equipment free of charge for the first three (3) working days only</w:t>
-            </w:r>
-          </w:p>
-        </w:tc>
-        <w:tc>
-          <w:tcPr>
-            <w:tcW w:type="dxa" w:w="1440"/>
+            <w:tcW w:type="dxa" w:w="1234"/>
+          </w:tcPr>
+          <w:p>
+            <w:r>
+              <w:t>Provisions regarding 'Insurance responsibilities defined': Article 00511. 4 - Delivery, Readiness, and Storage.</w:t>
+            </w:r>
+          </w:p>
+        </w:tc>
+        <w:tc>
+          <w:tcPr>
+            <w:tcW w:type="dxa" w:w="1234"/>
           </w:tcPr>
           <w:p>
             <w:r>
@@ -1721,7 +2441,7 @@
         </w:tc>
         <w:tc>
           <w:tcPr>
-            <w:tcW w:type="dxa" w:w="1440"/>
+            <w:tcW w:type="dxa" w:w="1234"/>
           </w:tcPr>
           <w:p>
             <w:r>
@@ -1731,11 +2451,30 @@
         </w:tc>
         <w:tc>
           <w:tcPr>
-            <w:tcW w:type="dxa" w:w="1440"/>
+            <w:tcW w:type="dxa" w:w="1234"/>
           </w:tcPr>
           <w:p>
             <w:r>
               <w:t>Article 00511.4 - Delivery, Readiness, and Storage</w:t>
+            </w:r>
+          </w:p>
+        </w:tc>
+        <w:tc>
+          <w:tcPr>
+            <w:tcW w:type="dxa" w:w="1234"/>
+          </w:tcPr>
+          <w:p>
+            <w:r>
+              <w:t>Historical actions involved validating standard risk engineering baselines and expanding coverage via supplementary agreements to include specialized marine cargo policies.</w:t>
+              <w:br/>
+              <w:br/>
+              <w:t>Historical Reference</w:t>
+              <w:br/>
+              <w:t>Sources:</w:t>
+              <w:br/>
+              <w:t>• d1.docx – Insurance</w:t>
+              <w:br/>
+              <w:t>• d2.docx – Insurance</w:t>
             </w:r>
           </w:p>
         </w:tc>
@@ -1743,7 +2482,7 @@
       <w:tr>
         <w:tc>
           <w:tcPr>
-            <w:tcW w:type="dxa" w:w="1440"/>
+            <w:tcW w:type="dxa" w:w="1234"/>
           </w:tcPr>
           <w:p>
             <w:r>
@@ -1753,7 +2492,7 @@
         </w:tc>
         <w:tc>
           <w:tcPr>
-            <w:tcW w:type="dxa" w:w="1440"/>
+            <w:tcW w:type="dxa" w:w="1234"/>
           </w:tcPr>
           <w:p>
             <w:r>
@@ -1763,17 +2502,17 @@
         </w:tc>
         <w:tc>
           <w:tcPr>
-            <w:tcW w:type="dxa" w:w="1440"/>
-          </w:tcPr>
-          <w:p>
-            <w:r>
-              <w:t>1 Readiness and free storage. Supplier shall issue a readiness notice after FAT clearance. If Buyer defers collection after readiness notice, Supplier shall store the affected equipment free of charge for the first three (3) working days only</w:t>
-            </w:r>
-          </w:p>
-        </w:tc>
-        <w:tc>
-          <w:tcPr>
-            <w:tcW w:type="dxa" w:w="1440"/>
+            <w:tcW w:type="dxa" w:w="1234"/>
+          </w:tcPr>
+          <w:p>
+            <w:r>
+              <w:t>Provisions regarding 'Equipment damage covered while at buyer premises': Storage charges are without prejudice to Supplier's right to claim insurance or preservation costs caused by abnormal storage conditions.</w:t>
+            </w:r>
+          </w:p>
+        </w:tc>
+        <w:tc>
+          <w:tcPr>
+            <w:tcW w:type="dxa" w:w="1234"/>
           </w:tcPr>
           <w:p>
             <w:r>
@@ -1783,7 +2522,7 @@
         </w:tc>
         <w:tc>
           <w:tcPr>
-            <w:tcW w:type="dxa" w:w="1440"/>
+            <w:tcW w:type="dxa" w:w="1234"/>
           </w:tcPr>
           <w:p>
             <w:r>
@@ -1795,7 +2534,7 @@
         </w:tc>
         <w:tc>
           <w:tcPr>
-            <w:tcW w:type="dxa" w:w="1440"/>
+            <w:tcW w:type="dxa" w:w="1234"/>
           </w:tcPr>
           <w:p>
             <w:r>
@@ -1805,11 +2544,37 @@
             </w:r>
           </w:p>
         </w:tc>
+        <w:tc>
+          <w:tcPr>
+            <w:tcW w:type="dxa" w:w="1234"/>
+          </w:tcPr>
+          <w:p>
+            <w:r>
+              <w:t>When vendors refused to accept storage risks, management accepted the field damage risk by securing a secondary corporate property rider policy.</w:t>
+              <w:br/>
+              <w:br/>
+              <w:t>Historical Reference</w:t>
+              <w:br/>
+              <w:t>Source:</w:t>
+              <w:br/>
+              <w:t>d1.docx</w:t>
+              <w:br/>
+              <w:t>Clause: Insurance</w:t>
+              <w:br/>
+              <w:t>Requirement: Equipment damage covered while at buyer premises</w:t>
+              <w:br/>
+              <w:br/>
+              <w:t>Quote:</w:t>
+              <w:br/>
+              <w:t>"Management accepted field damage risk after securing a secondary comprehensive corporate property rider policy."</w:t>
+            </w:r>
+          </w:p>
+        </w:tc>
       </w:tr>
       <w:tr>
         <w:tc>
           <w:tcPr>
-            <w:tcW w:type="dxa" w:w="1440"/>
+            <w:tcW w:type="dxa" w:w="1234"/>
           </w:tcPr>
           <w:p>
             <w:r>
@@ -1819,7 +2584,7 @@
         </w:tc>
         <w:tc>
           <w:tcPr>
-            <w:tcW w:type="dxa" w:w="1440"/>
+            <w:tcW w:type="dxa" w:w="1234"/>
           </w:tcPr>
           <w:p>
             <w:r>
@@ -1829,17 +2594,17 @@
         </w:tc>
         <w:tc>
           <w:tcPr>
-            <w:tcW w:type="dxa" w:w="1440"/>
-          </w:tcPr>
-          <w:p>
-            <w:r>
-              <w:t>1 Defect liability cap. Supplier shall correct defects arising during the guarantee period. Supplier's aggregate liability for repair or replacement of defective equipment under this Article shall not exceed ten percent (10%) of the total Purchase Order value</w:t>
-            </w:r>
-          </w:p>
-        </w:tc>
-        <w:tc>
-          <w:tcPr>
-            <w:tcW w:type="dxa" w:w="1440"/>
+            <w:tcW w:type="dxa" w:w="1234"/>
+          </w:tcPr>
+          <w:p>
+            <w:r>
+              <w:t>Provisions regarding 'Aggregate liability cap defined': Supplier's aggregate liability for repair or replacement of defective equipment under this Article shall not exceed ten percent (10%) of the total Purchase Order value.</w:t>
+            </w:r>
+          </w:p>
+        </w:tc>
+        <w:tc>
+          <w:tcPr>
+            <w:tcW w:type="dxa" w:w="1234"/>
           </w:tcPr>
           <w:p>
             <w:r>
@@ -1849,7 +2614,7 @@
         </w:tc>
         <w:tc>
           <w:tcPr>
-            <w:tcW w:type="dxa" w:w="1440"/>
+            <w:tcW w:type="dxa" w:w="1234"/>
           </w:tcPr>
           <w:p>
             <w:r>
@@ -1861,7 +2626,7 @@
         </w:tc>
         <w:tc>
           <w:tcPr>
-            <w:tcW w:type="dxa" w:w="1440"/>
+            <w:tcW w:type="dxa" w:w="1234"/>
           </w:tcPr>
           <w:p>
             <w:r>
@@ -1871,11 +2636,30 @@
             </w:r>
           </w:p>
         </w:tc>
+        <w:tc>
+          <w:tcPr>
+            <w:tcW w:type="dxa" w:w="1234"/>
+          </w:tcPr>
+          <w:p>
+            <w:r>
+              <w:t>Efforts focused on eliminating uncapped liability exposure through executive escalation and multi-round amendments to establish a defined financial ceiling.</w:t>
+              <w:br/>
+              <w:br/>
+              <w:t>Historical Reference</w:t>
+              <w:br/>
+              <w:t>Sources:</w:t>
+              <w:br/>
+              <w:t>• d1.docx – Liability</w:t>
+              <w:br/>
+              <w:t>• d2.docx – Liability</w:t>
+            </w:r>
+          </w:p>
+        </w:tc>
       </w:tr>
       <w:tr>
         <w:tc>
           <w:tcPr>
-            <w:tcW w:type="dxa" w:w="1440"/>
+            <w:tcW w:type="dxa" w:w="1234"/>
           </w:tcPr>
           <w:p>
             <w:r>
@@ -1885,7 +2669,7 @@
         </w:tc>
         <w:tc>
           <w:tcPr>
-            <w:tcW w:type="dxa" w:w="1440"/>
+            <w:tcW w:type="dxa" w:w="1234"/>
           </w:tcPr>
           <w:p>
             <w:r>
@@ -1895,17 +2679,17 @@
         </w:tc>
         <w:tc>
           <w:tcPr>
-            <w:tcW w:type="dxa" w:w="1440"/>
-          </w:tcPr>
-          <w:p>
-            <w:r>
-              <w:t>1 Defect liability cap. Supplier shall correct defects arising during the guarantee period. Supplier's aggregate liability for repair or replacement of defective equipment under this Article shall not exceed ten percent (10%) of the total Purchase Order value</w:t>
-            </w:r>
-          </w:p>
-        </w:tc>
-        <w:tc>
-          <w:tcPr>
-            <w:tcW w:type="dxa" w:w="1440"/>
+            <w:tcW w:type="dxa" w:w="1234"/>
+          </w:tcPr>
+          <w:p>
+            <w:r>
+              <w:t>Provisions regarding 'Liability carve-outs defined': The cap in Article 00511. 1 does not apply to direct costs of emergency removal, re-installation, or temporary site stabilization if the defect creates a safety shutdown.</w:t>
+            </w:r>
+          </w:p>
+        </w:tc>
+        <w:tc>
+          <w:tcPr>
+            <w:tcW w:type="dxa" w:w="1234"/>
           </w:tcPr>
           <w:p>
             <w:r>
@@ -1915,7 +2699,7 @@
         </w:tc>
         <w:tc>
           <w:tcPr>
-            <w:tcW w:type="dxa" w:w="1440"/>
+            <w:tcW w:type="dxa" w:w="1234"/>
           </w:tcPr>
           <w:p>
             <w:r>
@@ -1927,11 +2711,37 @@
         </w:tc>
         <w:tc>
           <w:tcPr>
-            <w:tcW w:type="dxa" w:w="1440"/>
+            <w:tcW w:type="dxa" w:w="1234"/>
           </w:tcPr>
           <w:p>
             <w:r>
               <w:t>Clause contains material limitations, exceptions, carve-outs, conditions, or restricted applicability</w:t>
+            </w:r>
+          </w:p>
+        </w:tc>
+        <w:tc>
+          <w:tcPr>
+            <w:tcW w:type="dxa" w:w="1234"/>
+          </w:tcPr>
+          <w:p>
+            <w:r>
+              <w:t>Negotiations focused on restricting carve-outs to intellectual property indemnities and removing open-ended safety shutdown exclusions.</w:t>
+              <w:br/>
+              <w:br/>
+              <w:t>Historical Reference</w:t>
+              <w:br/>
+              <w:t>Source:</w:t>
+              <w:br/>
+              <w:t>d1.docx</w:t>
+              <w:br/>
+              <w:t>Clause: Liability</w:t>
+              <w:br/>
+              <w:t>Requirement: Liability carve-outs defined</w:t>
+              <w:br/>
+              <w:br/>
+              <w:t>Quote:</w:t>
+              <w:br/>
+              <w:t>"Reduced exposure profiles achieved by removing open-ended safety shutdown exclusions from original drafts."</w:t>
             </w:r>
           </w:p>
         </w:tc>
@@ -1939,7 +2749,7 @@
       <w:tr>
         <w:tc>
           <w:tcPr>
-            <w:tcW w:type="dxa" w:w="1440"/>
+            <w:tcW w:type="dxa" w:w="1234"/>
           </w:tcPr>
           <w:p>
             <w:r>
@@ -1949,7 +2759,7 @@
         </w:tc>
         <w:tc>
           <w:tcPr>
-            <w:tcW w:type="dxa" w:w="1440"/>
+            <w:tcW w:type="dxa" w:w="1234"/>
           </w:tcPr>
           <w:p>
             <w:r>
@@ -1959,17 +2769,17 @@
         </w:tc>
         <w:tc>
           <w:tcPr>
-            <w:tcW w:type="dxa" w:w="1440"/>
-          </w:tcPr>
-          <w:p>
-            <w:r>
-              <w:t>1 Consequential damages waiver. Neither party shall be liable to the other for loss of revenue, loss of profit, loss of use, loss of production, downtime, loss of business opportunity, indirect damages, special damages, punitive damages, exemplary damages, or consequential damages. The exclusion in Article 00511</w:t>
-            </w:r>
-          </w:p>
-        </w:tc>
-        <w:tc>
-          <w:tcPr>
-            <w:tcW w:type="dxa" w:w="1440"/>
+            <w:tcW w:type="dxa" w:w="1234"/>
+          </w:tcPr>
+          <w:p>
+            <w:r>
+              <w:t>Provisions regarding 'Consequential damages excluded': Neither party shall be liable to the other for loss of revenue, loss of profit, loss of use, loss of production, downtime, loss of business opportunity, indirect damages, special damages, punitive damages, exemplary damages, or consequential damages.</w:t>
+            </w:r>
+          </w:p>
+        </w:tc>
+        <w:tc>
+          <w:tcPr>
+            <w:tcW w:type="dxa" w:w="1234"/>
           </w:tcPr>
           <w:p>
             <w:r>
@@ -1979,7 +2789,7 @@
         </w:tc>
         <w:tc>
           <w:tcPr>
-            <w:tcW w:type="dxa" w:w="1440"/>
+            <w:tcW w:type="dxa" w:w="1234"/>
           </w:tcPr>
           <w:p>
             <w:r>
@@ -1993,11 +2803,37 @@
         </w:tc>
         <w:tc>
           <w:tcPr>
-            <w:tcW w:type="dxa" w:w="1440"/>
+            <w:tcW w:type="dxa" w:w="1234"/>
           </w:tcPr>
           <w:p>
             <w:r>
               <w:t>Clause contains material limitations, exceptions, carve-outs, conditions, or restricted applicability</w:t>
+            </w:r>
+          </w:p>
+        </w:tc>
+        <w:tc>
+          <w:tcPr>
+            <w:tcW w:type="dxa" w:w="1234"/>
+          </w:tcPr>
+          <w:p>
+            <w:r>
+              <w:t>Legal reviews were used to clarify damage definitions and integrate absolute mutual waivers for indirect and consequential losses.</w:t>
+              <w:br/>
+              <w:br/>
+              <w:t>Historical Reference</w:t>
+              <w:br/>
+              <w:t>Source:</w:t>
+              <w:br/>
+              <w:t>d1.docx</w:t>
+              <w:br/>
+              <w:t>Clause: Consequential Damages</w:t>
+              <w:br/>
+              <w:t>Requirement: Consequential damages excluded</w:t>
+              <w:br/>
+              <w:br/>
+              <w:t>Quote:</w:t>
+              <w:br/>
+              <w:t>"Clarified damage definitions and integrated absolute mutual waivers during legal review rounds."</w:t>
             </w:r>
           </w:p>
         </w:tc>
@@ -2005,7 +2841,7 @@
       <w:tr>
         <w:tc>
           <w:tcPr>
-            <w:tcW w:type="dxa" w:w="1440"/>
+            <w:tcW w:type="dxa" w:w="1234"/>
           </w:tcPr>
           <w:p>
             <w:r>
@@ -2015,7 +2851,7 @@
         </w:tc>
         <w:tc>
           <w:tcPr>
-            <w:tcW w:type="dxa" w:w="1440"/>
+            <w:tcW w:type="dxa" w:w="1234"/>
           </w:tcPr>
           <w:p>
             <w:r>
@@ -2025,17 +2861,17 @@
         </w:tc>
         <w:tc>
           <w:tcPr>
-            <w:tcW w:type="dxa" w:w="1440"/>
-          </w:tcPr>
-          <w:p>
-            <w:r>
-              <w:t>1 Consequential damages waiver. Neither party shall be liable to the other for loss of revenue, loss of profit, loss of use, loss of production, downtime, loss of business opportunity, indirect damages, special damages, punitive damages, exemplary damages, or consequential damages. The exclusion in Article 00511</w:t>
-            </w:r>
-          </w:p>
-        </w:tc>
-        <w:tc>
-          <w:tcPr>
-            <w:tcW w:type="dxa" w:w="1440"/>
+            <w:tcW w:type="dxa" w:w="1234"/>
+          </w:tcPr>
+          <w:p>
+            <w:r>
+              <w:t>Provisions regarding 'Exceptions to exclusion defined': Neither party shall be liable to the other for loss of revenue, loss of profit, loss of use, loss of production, downtime, loss of business opportunity, indirect damages, special damages, punitive damages, exemplary damages, or consequential damages.</w:t>
+            </w:r>
+          </w:p>
+        </w:tc>
+        <w:tc>
+          <w:tcPr>
+            <w:tcW w:type="dxa" w:w="1234"/>
           </w:tcPr>
           <w:p>
             <w:r>
@@ -2045,7 +2881,7 @@
         </w:tc>
         <w:tc>
           <w:tcPr>
-            <w:tcW w:type="dxa" w:w="1440"/>
+            <w:tcW w:type="dxa" w:w="1234"/>
           </w:tcPr>
           <w:p>
             <w:r>
@@ -2059,11 +2895,30 @@
         </w:tc>
         <w:tc>
           <w:tcPr>
-            <w:tcW w:type="dxa" w:w="1440"/>
+            <w:tcW w:type="dxa" w:w="1234"/>
           </w:tcPr>
           <w:p>
             <w:r>
               <w:t>Clause contains material limitations, exceptions, carve-outs, conditions, or restricted applicability</w:t>
+            </w:r>
+          </w:p>
+        </w:tc>
+        <w:tc>
+          <w:tcPr>
+            <w:tcW w:type="dxa" w:w="1234"/>
+          </w:tcPr>
+          <w:p>
+            <w:r>
+              <w:t>Attempts were made to narrow exceptions to achieve an unconditional waiver, though some vendors re-inserted exclusions for environmental compliance incidents.</w:t>
+              <w:br/>
+              <w:br/>
+              <w:t>Historical Reference</w:t>
+              <w:br/>
+              <w:t>Sources:</w:t>
+              <w:br/>
+              <w:t>• d1.docx – Consequential Damages</w:t>
+              <w:br/>
+              <w:t>• d2.docx – Consequential Damages</w:t>
             </w:r>
           </w:p>
         </w:tc>
@@ -2071,7 +2926,7 @@
       <w:tr>
         <w:tc>
           <w:tcPr>
-            <w:tcW w:type="dxa" w:w="1440"/>
+            <w:tcW w:type="dxa" w:w="1234"/>
           </w:tcPr>
           <w:p>
             <w:r>
@@ -2081,7 +2936,7 @@
         </w:tc>
         <w:tc>
           <w:tcPr>
-            <w:tcW w:type="dxa" w:w="1440"/>
+            <w:tcW w:type="dxa" w:w="1234"/>
           </w:tcPr>
           <w:p>
             <w:r>
@@ -2091,17 +2946,17 @@
         </w:tc>
         <w:tc>
           <w:tcPr>
-            <w:tcW w:type="dxa" w:w="1440"/>
-          </w:tcPr>
-          <w:p>
-            <w:r>
-              <w:t>Force Majeure means an event beyond the reasonable control of the affected party, including Act of God, expropriation, nationalization, embargo, changes in law or regulation, war, sabotage, floods, severe weather, fires, strikes, lockouts, epidemics, pandemics, quarantine restrictions, and government action directly preventing performance. 2 Supply-chain events. Supplier may claim Force Majeure relief for events affecting only the Tier-1 critical sub-suppliers named in Annex D or the approved international logistics carrier</w:t>
-            </w:r>
-          </w:p>
-        </w:tc>
-        <w:tc>
-          <w:tcPr>
-            <w:tcW w:type="dxa" w:w="1440"/>
+            <w:tcW w:type="dxa" w:w="1234"/>
+          </w:tcPr>
+          <w:p>
+            <w:r>
+              <w:t>Provisions regarding 'Approved critical vendors identified': Annex D approved critical sub-suppliers: BrightForge Rings Pvt.</w:t>
+            </w:r>
+          </w:p>
+        </w:tc>
+        <w:tc>
+          <w:tcPr>
+            <w:tcW w:type="dxa" w:w="1234"/>
           </w:tcPr>
           <w:p>
             <w:r>
@@ -2111,7 +2966,7 @@
         </w:tc>
         <w:tc>
           <w:tcPr>
-            <w:tcW w:type="dxa" w:w="1440"/>
+            <w:tcW w:type="dxa" w:w="1234"/>
           </w:tcPr>
           <w:p>
             <w:r>
@@ -2121,11 +2976,30 @@
         </w:tc>
         <w:tc>
           <w:tcPr>
-            <w:tcW w:type="dxa" w:w="1440"/>
+            <w:tcW w:type="dxa" w:w="1234"/>
           </w:tcPr>
           <w:p>
             <w:r>
               <w:t>Annex D approved critical sub-suppliers: BrightForge Rings Pvt.</w:t>
+            </w:r>
+          </w:p>
+        </w:tc>
+        <w:tc>
+          <w:tcPr>
+            <w:tcW w:type="dxa" w:w="1234"/>
+          </w:tcPr>
+          <w:p>
+            <w:r>
+              <w:t>Actions included pre-clearing alternate vendor directories with quality assurance and defining substitution controls during engineering alignment sessions.</w:t>
+              <w:br/>
+              <w:br/>
+              <w:t>Historical Reference</w:t>
+              <w:br/>
+              <w:t>Sources:</w:t>
+              <w:br/>
+              <w:t>• d1.docx – Critical Sub-Suppliers</w:t>
+              <w:br/>
+              <w:t>• d2.docx – Critical Sub-Suppliers</w:t>
             </w:r>
           </w:p>
         </w:tc>
@@ -2133,7 +3007,7 @@
       <w:tr>
         <w:tc>
           <w:tcPr>
-            <w:tcW w:type="dxa" w:w="1440"/>
+            <w:tcW w:type="dxa" w:w="1234"/>
           </w:tcPr>
           <w:p>
             <w:r>
@@ -2143,7 +3017,7 @@
         </w:tc>
         <w:tc>
           <w:tcPr>
-            <w:tcW w:type="dxa" w:w="1440"/>
+            <w:tcW w:type="dxa" w:w="1234"/>
           </w:tcPr>
           <w:p>
             <w:r>
@@ -2153,17 +3027,17 @@
         </w:tc>
         <w:tc>
           <w:tcPr>
-            <w:tcW w:type="dxa" w:w="1440"/>
-          </w:tcPr>
-          <w:p>
-            <w:r>
-              <w:t>Force Majeure means an event beyond the reasonable control of the affected party, including Act of God, expropriation, nationalization, embargo, changes in law or regulation, war, sabotage, floods, severe weather, fires, strikes, lockouts, epidemics, pandemics, quarantine restrictions, and government action directly preventing performance. 2 Supply-chain events. Supplier may claim Force Majeure relief for events affecting only the Tier-1 critical sub-suppliers named in Annex D or the approved international logistics carrier</w:t>
-            </w:r>
-          </w:p>
-        </w:tc>
-        <w:tc>
-          <w:tcPr>
-            <w:tcW w:type="dxa" w:w="1440"/>
+            <w:tcW w:type="dxa" w:w="1234"/>
+          </w:tcPr>
+          <w:p>
+            <w:r>
+              <w:t>Provisions regarding 'Vendor substitution restrictions defined': Annex D approved critical sub-suppliers: BrightForge Rings Pvt.</w:t>
+            </w:r>
+          </w:p>
+        </w:tc>
+        <w:tc>
+          <w:tcPr>
+            <w:tcW w:type="dxa" w:w="1234"/>
           </w:tcPr>
           <w:p>
             <w:r>
@@ -2173,7 +3047,7 @@
         </w:tc>
         <w:tc>
           <w:tcPr>
-            <w:tcW w:type="dxa" w:w="1440"/>
+            <w:tcW w:type="dxa" w:w="1234"/>
           </w:tcPr>
           <w:p>
             <w:r>
@@ -2183,7 +3057,7 @@
         </w:tc>
         <w:tc>
           <w:tcPr>
-            <w:tcW w:type="dxa" w:w="1440"/>
+            <w:tcW w:type="dxa" w:w="1234"/>
           </w:tcPr>
           <w:p>
             <w:r>
@@ -2191,127 +3065,29 @@
             </w:r>
           </w:p>
         </w:tc>
-      </w:tr>
-      <w:tr>
-        <w:tc>
-          <w:tcPr>
-            <w:tcW w:type="dxa" w:w="1440"/>
-          </w:tcPr>
-          <w:p>
-            <w:r>
-              <w:t>Payment Terms</w:t>
-            </w:r>
-          </w:p>
-        </w:tc>
-        <w:tc>
-          <w:tcPr>
-            <w:tcW w:type="dxa" w:w="1440"/>
-          </w:tcPr>
-          <w:p>
-            <w:r>
-              <w:t>All payments Net 30 days from invoice</w:t>
-            </w:r>
-          </w:p>
-        </w:tc>
-        <w:tc>
-          <w:tcPr>
-            <w:tcW w:type="dxa" w:w="1440"/>
-          </w:tcPr>
-          <w:p>
-            <w:r>
-              <w:t>Subject to Supplier acknowledging the Purchase Order and furnishing the documents listed in Annex B, Buyer shall arrange an advance equal to forty-five percent (45%) of the Purchase Order value. Thirty percent (30%) is payable within five (5) business days after PO acknowledgement. The remaining fifteen percent (15%) is payable only after Buyer receives the performance bank guarantee, the project kick-off minutes signed by both parties, and the first document submission register</w:t>
-            </w:r>
-          </w:p>
-        </w:tc>
-        <w:tc>
-          <w:tcPr>
-            <w:tcW w:type="dxa" w:w="1440"/>
-          </w:tcPr>
-          <w:p>
-            <w:r>
-              <w:t>Partially Met</w:t>
-            </w:r>
-          </w:p>
-        </w:tc>
-        <w:tc>
-          <w:tcPr>
-            <w:tcW w:type="dxa" w:w="1440"/>
-          </w:tcPr>
-          <w:p>
-            <w:r>
-              <w:t>Buyer shall pay accepted invoices within thirty (30) days after receipt of a valid tax invoice. An invoice is valid only after the corresponding goods receipt note, inspection release, and packing-list reconciliation are completed in Buyer's system. If those acceptance records are completed after invoice receipt, the thirty-day clock starts from the later acceptance record, not the invoice date.</w:t>
-            </w:r>
-          </w:p>
-        </w:tc>
-        <w:tc>
-          <w:tcPr>
-            <w:tcW w:type="dxa" w:w="1440"/>
-          </w:tcPr>
-          <w:p>
-            <w:r>
-              <w:t>The requirement for Net 30 days is modified by conditions: the clock only starts upon a 'valid tax invoice', which is contingent on internal system records (GRN, inspection release, packing-list reconciliation). This creates a modified trigger for the 30-day period rather than a simple Net 30 from invoice date.</w:t>
-            </w:r>
-          </w:p>
-        </w:tc>
-      </w:tr>
-      <w:tr>
-        <w:tc>
-          <w:tcPr>
-            <w:tcW w:type="dxa" w:w="1440"/>
-          </w:tcPr>
-          <w:p>
-            <w:r>
-              <w:t>Payment Terms</w:t>
-            </w:r>
-          </w:p>
-        </w:tc>
-        <w:tc>
-          <w:tcPr>
-            <w:tcW w:type="dxa" w:w="1440"/>
-          </w:tcPr>
-          <w:p>
-            <w:r>
-              <w:t>Partial delivery and invoicing allowed</w:t>
-            </w:r>
-          </w:p>
-        </w:tc>
-        <w:tc>
-          <w:tcPr>
-            <w:tcW w:type="dxa" w:w="1440"/>
-          </w:tcPr>
-          <w:p>
-            <w:r>
-              <w:t>Subject to Supplier acknowledging the Purchase Order and furnishing the documents listed in Annex B, Buyer shall arrange an advance equal to forty-five percent (45%) of the Purchase Order value. Thirty percent (30%) is payable within five (5) business days after PO acknowledgement. The remaining fifteen percent (15%) is payable only after Buyer receives the performance bank guarantee, the project kick-off minutes signed by both parties, and the first document submission register</w:t>
-            </w:r>
-          </w:p>
-        </w:tc>
-        <w:tc>
-          <w:tcPr>
-            <w:tcW w:type="dxa" w:w="1440"/>
-          </w:tcPr>
-          <w:p>
-            <w:r>
-              <w:t>Met</w:t>
-            </w:r>
-          </w:p>
-        </w:tc>
-        <w:tc>
-          <w:tcPr>
-            <w:tcW w:type="dxa" w:w="1440"/>
-          </w:tcPr>
-          <w:p>
-            <w:r>
-              <w:t>Supplier may dispatch Lot A, Lot B, and Lot C separately and may raise a corresponding invoice for each completed lot.</w:t>
-            </w:r>
-          </w:p>
-        </w:tc>
-        <w:tc>
-          <w:tcPr>
-            <w:tcW w:type="dxa" w:w="1440"/>
-          </w:tcPr>
-          <w:p>
-            <w:r>
-              <w:t>The contract explicitly permits the dispatch of separate lots and corresponding invoicing for each, which satisfies the requirement for partial delivery and invoicing.</w:t>
+        <w:tc>
+          <w:tcPr>
+            <w:tcW w:type="dxa" w:w="1234"/>
+          </w:tcPr>
+          <w:p>
+            <w:r>
+              <w:t>Internal audits flagged risks associated with unauthorized vendor substitutions, leading to remediation strategies and operational pauses for engineering verification.</w:t>
+              <w:br/>
+              <w:br/>
+              <w:t>Historical Reference</w:t>
+              <w:br/>
+              <w:t>Source:</w:t>
+              <w:br/>
+              <w:t>d1.docx</w:t>
+              <w:br/>
+              <w:t>Clause: Critical Sub-Suppliers</w:t>
+              <w:br/>
+              <w:t>Requirement: Vendor substitution restrictions defined</w:t>
+              <w:br/>
+              <w:br/>
+              <w:t>Quote:</w:t>
+              <w:br/>
+              <w:t>"Unauthorized substitution risks flagged by internal audit; remediation strategy currently under review."</w:t>
             </w:r>
           </w:p>
         </w:tc>
@@ -2443,7 +3219,7 @@
           </w:tcPr>
           <w:p>
             <w:r>
-              <w:t>Cash-flow and payment timing risk</w:t>
+              <w:t>Cash-flow risk and delayed advance payment</w:t>
             </w:r>
           </w:p>
         </w:tc>
@@ -2453,7 +3229,7 @@
           </w:tcPr>
           <w:p>
             <w:r>
-              <w:t>The 45% advance is split into two tranches. 15% is conditional upon the delivery of a performance bank guarantee, signed kick-off minutes, and a document submission register. If these conditions are not met within 20 days, the Buyer has the discretionary right to defer payment without interest, delaying the Supplier's liquidity.</w:t>
+              <w:t>The 45 percent advance is split into two tranches. The final 15 percent is conditional upon delivery of a bank guarantee, signed kick-off minutes, and a document register. Buyer retains the discretionary right to defer this payment without interest if conditions are not met within 20 days, creating a payment dependency and potential funding gap for the supplier.</w:t>
             </w:r>
           </w:p>
         </w:tc>
@@ -2463,7 +3239,7 @@
           </w:tcPr>
           <w:p>
             <w:r>
-              <w:t>Ensure the full 45% advance is payable as a single lump sum upon PO acknowledgement and document submission without further conditional tranches.</w:t>
+              <w:t>Ensure 45 percent advance is payable as a single lump sum within five business days of PO acknowledgement without conditional tranches.</w:t>
             </w:r>
           </w:p>
         </w:tc>
@@ -2475,7 +3251,7 @@
           </w:tcPr>
           <w:p>
             <w:r>
-              <w:t>Bank Guarantees</w:t>
+              <w:t>Payment Terms</w:t>
             </w:r>
           </w:p>
         </w:tc>
@@ -2485,7 +3261,7 @@
           </w:tcPr>
           <w:p>
             <w:r>
-              <w:t>Performance Guarantee not exceeding 10%</w:t>
+              <w:t>All payments Net 30 days from invoice</w:t>
             </w:r>
           </w:p>
         </w:tc>
@@ -2495,7 +3271,7 @@
           </w:tcPr>
           <w:p>
             <w:r>
-              <w:t>Red</w:t>
+              <w:t>Amber</w:t>
             </w:r>
           </w:p>
         </w:tc>
@@ -2505,7 +3281,7 @@
           </w:tcPr>
           <w:p>
             <w:r>
-              <w:t>Financial exposure and guarantee risk</w:t>
+              <w:t>Cash-flow and payment delay risk</w:t>
             </w:r>
           </w:p>
         </w:tc>
@@ -2515,7 +3291,7 @@
           </w:tcPr>
           <w:p>
             <w:r>
-              <w:t>The contract mandates a 10% performance guarantee plus a 2% bridge guarantee, totaling 12% security. This exceeds the 10% requirement limit. This creates excessive capital tie-up and financial strain on the supplier, contradicting General Procurement Condition 14.2.</w:t>
+              <w:t>The contract conditions the start of the 30-day payment period on internal buyer administrative processes, including goods receipt and inspection. This creates a dependency where payment is decoupled from the invoice date, potentially extending the payment cycle indefinitely based on the buyers internal processing speed.</w:t>
             </w:r>
           </w:p>
         </w:tc>
@@ -2525,7 +3301,7 @@
           </w:tcPr>
           <w:p>
             <w:r>
-              <w:t>Limit total performance security obligations to a maximum of 10 percent of the Purchase Order value, inclusive of the bridge guarantee.</w:t>
+              <w:t>Set payment terms to Net 30 days from invoice receipt and remove dependencies on internal buyer acceptance records.</w:t>
             </w:r>
           </w:p>
         </w:tc>
@@ -2537,7 +3313,7 @@
           </w:tcPr>
           <w:p>
             <w:r>
-              <w:t>Liquidated Damages</w:t>
+              <w:t>Bank Guarantees</w:t>
             </w:r>
           </w:p>
         </w:tc>
@@ -2547,7 +3323,7 @@
           </w:tcPr>
           <w:p>
             <w:r>
-              <w:t>Documentation LD not applicable</w:t>
+              <w:t>Performance Guarantee not exceeding 10%</w:t>
             </w:r>
           </w:p>
         </w:tc>
@@ -2557,7 +3333,7 @@
           </w:tcPr>
           <w:p>
             <w:r>
-              <w:t>Amber</w:t>
+              <w:t>Red</w:t>
             </w:r>
           </w:p>
         </w:tc>
@@ -2567,7 +3343,7 @@
           </w:tcPr>
           <w:p>
             <w:r>
-              <w:t>Financial exposure due to limited liquidated damages recovery</w:t>
+              <w:t>Financial exposure and guarantee risk</w:t>
             </w:r>
           </w:p>
         </w:tc>
@@ -2577,7 +3353,7 @@
           </w:tcPr>
           <w:p>
             <w:r>
-              <w:t>The clause exempts routine manuals and non-critical engineering submittals from standalone liquidated damages. This creates a gap where documentation delays not categorized as Critical Dispatch Documents do not trigger financial penalties, reducing the buyer's ability to recover costs for project delays caused by poor documentation management.</w:t>
+              <w:t>The total security obligation is 12 percent of the Purchase Order value, which exceeds the 10 percent limit. The inclusion of a 2 percent bridge guarantee in addition to the 10 percent performance bank guarantee creates a breach of the procurement requirement and increases the financial burden on the supplier.</w:t>
             </w:r>
           </w:p>
         </w:tc>
@@ -2587,7 +3363,7 @@
           </w:tcPr>
           <w:p>
             <w:r>
-              <w:t>Apply liquidated damages to all documentation and engineering submittal delays regardless of criticality.</w:t>
+              <w:t>Reduce total performance security to a maximum of 10 percent including bridge guarantees.</w:t>
             </w:r>
           </w:p>
         </w:tc>
@@ -2609,7 +3385,7 @@
           </w:tcPr>
           <w:p>
             <w:r>
-              <w:t>Equipment Delivery LD 0.5% per week</w:t>
+              <w:t>Documentation LD not applicable</w:t>
             </w:r>
           </w:p>
         </w:tc>
@@ -2629,7 +3405,7 @@
           </w:tcPr>
           <w:p>
             <w:r>
-              <w:t>Financial exposure due to liquidated damages caps</w:t>
+              <w:t>Financial exposure due to limited liquidated damages recovery</w:t>
             </w:r>
           </w:p>
         </w:tc>
@@ -2639,7 +3415,7 @@
           </w:tcPr>
           <w:p>
             <w:r>
-              <w:t>The clause imposes a 5% cap on individual equipment delivery LDs and a 7.5% aggregate cap on total PO value. This limits the buyer's ability to recover full losses resulting from significant delivery delays, restricting the financial recourse available beyond these predefined ceilings.</w:t>
+              <w:t>The clause excludes standalone liquidated damages for routine manuals, vendor data books, and non-critical engineering submittals. This creates a gap where delays in documentation do not trigger financial penalties unless they specifically prevent FAT release. Consequently, the buyer suffers operational delays without the ability to recover monetary damages for non-critical documentation failures.</w:t>
             </w:r>
           </w:p>
         </w:tc>
@@ -2649,7 +3425,7 @@
           </w:tcPr>
           <w:p>
             <w:r>
-              <w:t>Remove the 5% individual equipment cap and increase the aggregate delay exposure cap to 10% of the total Purchase Order value.</w:t>
+              <w:t>Remove the exclusion for routine manuals and non-critical engineering submittals to ensure all documentation delays attract applicable liquidated damages.</w:t>
             </w:r>
           </w:p>
         </w:tc>
@@ -2671,7 +3447,7 @@
           </w:tcPr>
           <w:p>
             <w:r>
-              <w:t>Equipment Delivery LD capped at 5%</w:t>
+              <w:t>Equipment Delivery LD 0.5% per week</w:t>
             </w:r>
           </w:p>
         </w:tc>
@@ -2691,7 +3467,7 @@
           </w:tcPr>
           <w:p>
             <w:r>
-              <w:t>Financial exposure due to aggregate LD cap overrun</w:t>
+              <w:t>Financial exposure due to capped liquidated damages</w:t>
             </w:r>
           </w:p>
         </w:tc>
@@ -2701,7 +3477,7 @@
           </w:tcPr>
           <w:p>
             <w:r>
-              <w:t>While individual equipment delivery LD is capped at 5 percent, the aggregate cap for delivery LD, Critical Dispatch Documents, and service credits is increased to 7.5 percent of the total Purchase Order value. This exceeds the 5 percent requirement, increasing the total financial liability for the supplier.</w:t>
+              <w:t>Clause 00511.5.2 limits delivery LD to 5 percent of the undelivered part value and Clause 00511.5.4 caps aggregate exposure at 7.5 percent of PO value. These limitations restrict the total amount the Buyer can recover for delays, potentially leaving the Buyer under-compensated for extended schedule slippage.</w:t>
             </w:r>
           </w:p>
         </w:tc>
@@ -2711,7 +3487,7 @@
           </w:tcPr>
           <w:p>
             <w:r>
-              <w:t>Reduce aggregate delay exposure, including delivery LD and service credits, to a maximum of 5 percent of the total Purchase Order value.</w:t>
+              <w:t>Remove the 5 percent cap on individual undelivered parts and increase the aggregate delay exposure cap.</w:t>
             </w:r>
           </w:p>
         </w:tc>
@@ -2733,7 +3509,7 @@
           </w:tcPr>
           <w:p>
             <w:r>
-              <w:t>Aggregate LD capped at 5% PO value</w:t>
+              <w:t>Equipment Delivery LD capped at 5%</w:t>
             </w:r>
           </w:p>
         </w:tc>
@@ -2743,7 +3519,7 @@
           </w:tcPr>
           <w:p>
             <w:r>
-              <w:t>Red</w:t>
+              <w:t>Amber</w:t>
             </w:r>
           </w:p>
         </w:tc>
@@ -2753,7 +3529,7 @@
           </w:tcPr>
           <w:p>
             <w:r>
-              <w:t>Financial liability exposure</w:t>
+              <w:t>Financial exposure due to excessive aggregate liquidated damages cap</w:t>
             </w:r>
           </w:p>
         </w:tc>
@@ -2763,7 +3539,7 @@
           </w:tcPr>
           <w:p>
             <w:r>
-              <w:t>The aggregate cap for liquidated damages and service credits is set at 7.5 percent of the total Purchase Order value, exceeding the mandatory 5 percent requirement. This increases the maximum potential financial penalty the Supplier must pay for delivery and documentation delays.</w:t>
+              <w:t>While individual equipment delivery LD is capped at 5 percent, Clause 00511.5.4 establishes an aggregate cap of 7.5 percent of the total Purchase Order value. This exceeds the 5 percent requirement, increasing the total financial liability the supplier may incur for combined delivery delays, critical document failures, and service credits.</w:t>
             </w:r>
           </w:p>
         </w:tc>
@@ -2773,7 +3549,7 @@
           </w:tcPr>
           <w:p>
             <w:r>
-              <w:t>Reduce aggregate delay exposure and service credits to a maximum of 5 percent of total Purchase Order value.</w:t>
+              <w:t>Reduce aggregate delay exposure, including delivery LD and service credits, to a maximum of 5 percent of total Purchase Order value.</w:t>
             </w:r>
           </w:p>
         </w:tc>
@@ -2795,7 +3571,7 @@
           </w:tcPr>
           <w:p>
             <w:r>
-              <w:t>Remedial Work LD not applicable</w:t>
+              <w:t>Aggregate LD capped at 5% PO value</w:t>
             </w:r>
           </w:p>
         </w:tc>
@@ -2805,7 +3581,7 @@
           </w:tcPr>
           <w:p>
             <w:r>
-              <w:t>Amber</w:t>
+              <w:t>Red</w:t>
             </w:r>
           </w:p>
         </w:tc>
@@ -2815,7 +3591,7 @@
           </w:tcPr>
           <w:p>
             <w:r>
-              <w:t>Financial exposure due to lack of remedial work liquidated damages</w:t>
+              <w:t>Financial liability exposure</w:t>
             </w:r>
           </w:p>
         </w:tc>
@@ -2825,7 +3601,7 @@
           </w:tcPr>
           <w:p>
             <w:r>
-              <w:t>Clause 00511.5.3 explicitly exempts remedial work, warranty repairs, and replacements from liquidated damages. This creates a financial gap where the buyer cannot recover monetary damages for delays in corrective actions, relying solely on a corrective-action plan without financial leverage to ensure timely performance.</w:t>
+              <w:t>The aggregate cap for liquidated damages is set at 7.5 percent of the total Purchase Order value, which exceeds the mandatory 5 percent requirement. This increases the potential financial penalty for delivery delays and service credits beyond the approved risk threshold.</w:t>
             </w:r>
           </w:p>
         </w:tc>
@@ -2835,7 +3611,7 @@
           </w:tcPr>
           <w:p>
             <w:r>
-              <w:t>Remove the exemption for remedial work and apply liquidated damages to delays in warranty repairs and replacements.</w:t>
+              <w:t>Reduce aggregate LD and service-credit exposure to a maximum of 5 percent of total PO value.</w:t>
             </w:r>
           </w:p>
         </w:tc>
@@ -2847,7 +3623,7 @@
           </w:tcPr>
           <w:p>
             <w:r>
-              <w:t>Guarantee</w:t>
+              <w:t>Liquidated Damages</w:t>
             </w:r>
           </w:p>
         </w:tc>
@@ -2857,7 +3633,7 @@
           </w:tcPr>
           <w:p>
             <w:r>
-              <w:t>Warranty period defined</w:t>
+              <w:t>Remedial Work LD not applicable</w:t>
             </w:r>
           </w:p>
         </w:tc>
@@ -2877,7 +3653,7 @@
           </w:tcPr>
           <w:p>
             <w:r>
-              <w:t>Warranty risks and financial exposure</w:t>
+              <w:t>Financial exposure due to lack of remedial work liquidated damages</w:t>
             </w:r>
           </w:p>
         </w:tc>
@@ -2887,7 +3663,7 @@
           </w:tcPr>
           <w:p>
             <w:r>
-              <w:t>The warranty period is subject to deemed events and restrictive time-caps. The standard guarantee may expire prematurely if commissioning is delayed, and remedial guarantees are capped at 18 months from original dispatch regardless of the repair date, limiting protection for replaced components.</w:t>
+              <w:t>Clause 00511.5.3 explicitly exempts remedial work, warranty repairs, and replacements from monetary liquidated damages. This removes financial leverage to ensure timely corrective actions, shifting the operational burden and potential project delay costs to the buyer.</w:t>
             </w:r>
           </w:p>
         </w:tc>
@@ -2897,7 +3673,7 @@
           </w:tcPr>
           <w:p>
             <w:r>
-              <w:t>Establish a fixed warranty period from final acceptance and ensure remedial guarantees run for a full term from the date of repair without dispatch-based caps.</w:t>
+              <w:t>Apply liquidated damages to remedial work and warranty repairs to ensure timely performance of corrective actions.</w:t>
             </w:r>
           </w:p>
         </w:tc>
@@ -2919,7 +3695,7 @@
           </w:tcPr>
           <w:p>
             <w:r>
-              <w:t>2 months from commissioning or 18 months from dispatch</w:t>
+              <w:t>Warranty period defined</w:t>
             </w:r>
           </w:p>
         </w:tc>
@@ -2939,7 +3715,7 @@
           </w:tcPr>
           <w:p>
             <w:r>
-              <w:t>Warranty risk and reduced equipment protection</w:t>
+              <w:t>Warranty risk and limited remedial coverage</w:t>
             </w:r>
           </w:p>
         </w:tc>
@@ -2949,7 +3725,7 @@
           </w:tcPr>
           <w:p>
             <w:r>
-              <w:t>The remedial guarantee for repaired components is limited to the earlier of twelve months from repair or eighteen months from original dispatch. This creates a gap where components replaced late in the original warranty period receive significantly shorter protection than the standard guarantee, increasing financial exposure for premature equipment failure.</w:t>
+              <w:t>The warranty is limited to two months post-commissioning or eighteen months from dispatch. Remedial guarantees for replaced components are capped at eighteen months from original dispatch, potentially leaving equipment without coverage if repairs occur late in the original warranty period. This creates a gap in operational protection and financial exposure for premature equipment failure.</w:t>
             </w:r>
           </w:p>
         </w:tc>
@@ -2959,7 +3735,7 @@
           </w:tcPr>
           <w:p>
             <w:r>
-              <w:t>Ensure repaired or replaced components are guaranteed for twelve months from completion of repair regardless of the original dispatch date.</w:t>
+              <w:t>Extend standard guarantee to twelve months post-commissioning and ensure remedial guarantees run for a full twelve months regardless of the original dispatch date.</w:t>
             </w:r>
           </w:p>
         </w:tc>
@@ -2981,7 +3757,7 @@
           </w:tcPr>
           <w:p>
             <w:r>
-              <w:t>Repair/replacement warranty obligations defined</w:t>
+              <w:t>2 months from commissioning or 18 months from dispatch</w:t>
             </w:r>
           </w:p>
         </w:tc>
@@ -3001,7 +3777,7 @@
           </w:tcPr>
           <w:p>
             <w:r>
-              <w:t>Warranty risk and limited remedial coverage</w:t>
+              <w:t>Warranty risk and limited remedial protection</w:t>
             </w:r>
           </w:p>
         </w:tc>
@@ -3011,7 +3787,7 @@
           </w:tcPr>
           <w:p>
             <w:r>
-              <w:t>The remedial guarantee is capped at 18 months from original dispatch, regardless of when the repair occurs. This creates a gap where repaired components may have little to no remaining warranty. Additionally, coverage is restricted only to the specific replaced component unless the entire equipment train is affected.</w:t>
+              <w:t>The remedial guarantee is limited to the specific repaired component and expires at 18 months from original dispatch. This creates a gap where replaced parts may lose coverage shortly after repair if the original dispatch date was long ago, reducing overall equipment reliability and increasing maintenance costs.</w:t>
             </w:r>
           </w:p>
         </w:tc>
@@ -3021,7 +3797,7 @@
           </w:tcPr>
           <w:p>
             <w:r>
-              <w:t>Extend remedial guarantee to a full 12 months from completion of repair regardless of original dispatch date and expand scope to include all affected integrated components.</w:t>
+              <w:t>Ensure repaired or replaced components are guaranteed for 12 months from completion of repair regardless of the original dispatch date.</w:t>
             </w:r>
           </w:p>
         </w:tc>
@@ -3033,7 +3809,7 @@
           </w:tcPr>
           <w:p>
             <w:r>
-              <w:t>Force Majeure</w:t>
+              <w:t>Guarantee</w:t>
             </w:r>
           </w:p>
         </w:tc>
@@ -3043,7 +3819,7 @@
           </w:tcPr>
           <w:p>
             <w:r>
-              <w:t>Force majeure events defined</w:t>
+              <w:t>Repair/replacement warranty obligations defined</w:t>
             </w:r>
           </w:p>
         </w:tc>
@@ -3063,7 +3839,7 @@
           </w:tcPr>
           <w:p>
             <w:r>
-              <w:t>Force majeure limitations</w:t>
+              <w:t>Warranty risk and limited guarantee coverage</w:t>
             </w:r>
           </w:p>
         </w:tc>
@@ -3073,7 +3849,7 @@
           </w:tcPr>
           <w:p>
             <w:r>
-              <w:t>Article 00511.7.2 restricts supply-chain force majeure relief exclusively to named Tier-1 sub-suppliers in Annex D and the approved logistics carrier. This creates operational and legal exposure because failures at other critical sub-contractor levels or alternate vendors are excluded from relief, regardless of whether the event was beyond the supplier's reasonable control.</w:t>
+              <w:t>The remedial guarantee is limited to whichever occurs earlier between twelve months from repair or eighteen months from original dispatch. This creates a gap where repaired components may have negligible remaining coverage if the original equipment was dispatched long before the repair occurred.</w:t>
             </w:r>
           </w:p>
         </w:tc>
@@ -3083,7 +3859,7 @@
           </w:tcPr>
           <w:p>
             <w:r>
-              <w:t>Remove the restriction limiting supply-chain relief to named Tier-1 sub-suppliers and approved carriers to cover all critical sub-contractors.</w:t>
+              <w:t>Define repair and replacement warranties to run for a full twelve months from the date of completion regardless of the original dispatch date.</w:t>
             </w:r>
           </w:p>
         </w:tc>
@@ -3105,7 +3881,7 @@
           </w:tcPr>
           <w:p>
             <w:r>
-              <w:t>Applies to subcontractors</w:t>
+              <w:t>Force majeure events defined</w:t>
             </w:r>
           </w:p>
         </w:tc>
@@ -3135,7 +3911,7 @@
           </w:tcPr>
           <w:p>
             <w:r>
-              <w:t>Force majeure relief is restricted to specific Tier-1 suppliers in Annex D and approved carriers. This excludes unnamed subcontractors and alternate vendors, creating operational and legal exposure if a non-named supplier experiences a qualifying event, as the Supplier remains liable for performance failures.</w:t>
+              <w:t>Relief for supply-chain disruptions is restricted solely to named Tier-1 sub-suppliers in Annex D and the approved international logistics carrier. This excludes unnamed sub-contractors and alternate vendors, creating operational and financial exposure if failures occur outside this narrow list despite the event being beyond the suppliers control.</w:t>
             </w:r>
           </w:p>
         </w:tc>
@@ -3145,7 +3921,7 @@
           </w:tcPr>
           <w:p>
             <w:r>
-              <w:t>Extend force majeure relief to all subcontractors and vendors regardless of their status as named Tier-1 or approved suppliers.</w:t>
+              <w:t>Extend force majeure relief to all sub-contractors and vendors regardless of their naming in Annex D or Tier-1 status.</w:t>
             </w:r>
           </w:p>
         </w:tc>
@@ -3167,7 +3943,7 @@
           </w:tcPr>
           <w:p>
             <w:r>
-              <w:t>Notice obligations defined</w:t>
+              <w:t>Applies to subcontractors</w:t>
             </w:r>
           </w:p>
         </w:tc>
@@ -3197,7 +3973,7 @@
           </w:tcPr>
           <w:p>
             <w:r>
-              <w:t>The clause restricts Force Majeure relief for supply chain disruptions exclusively to named Tier-1 sub-suppliers in Annex D and approved carriers. This creates operational and legal exposure because the Supplier cannot claim relief for disruptions involving unnamed subcontractors or alternate vendors, potentially leading to breach of contract disputes during systemic supply chain failures.</w:t>
+              <w:t>Relief for supply-chain disruptions is restricted to named Tier-1 suppliers and a specific logistics carrier. This excludes unnamed subcontractors and alternate vendors, creating a performance gap where the supplier remains liable for delays caused by critical sub-tier failures not listed in Annex D.</w:t>
             </w:r>
           </w:p>
         </w:tc>
@@ -3207,7 +3983,7 @@
           </w:tcPr>
           <w:p>
             <w:r>
-              <w:t>Extend Force Majeure relief to cover all subcontractors and logistics providers regardless of their listing in Annex D.</w:t>
+              <w:t>Extend force majeure relief to all subcontractors regardless of tier or naming in Annex D.</w:t>
             </w:r>
           </w:p>
         </w:tc>
@@ -3219,7 +3995,7 @@
           </w:tcPr>
           <w:p>
             <w:r>
-              <w:t>Termination</w:t>
+              <w:t>Force Majeure</w:t>
             </w:r>
           </w:p>
         </w:tc>
@@ -3229,7 +4005,7 @@
           </w:tcPr>
           <w:p>
             <w:r>
-              <w:t>Termination rights defined</w:t>
+              <w:t>Notice obligations defined</w:t>
             </w:r>
           </w:p>
         </w:tc>
@@ -3239,7 +4015,7 @@
           </w:tcPr>
           <w:p>
             <w:r>
-              <w:t>Green</w:t>
+              <w:t>Amber</w:t>
             </w:r>
           </w:p>
         </w:tc>
@@ -3249,7 +4025,7 @@
           </w:tcPr>
           <w:p>
             <w:r>
-              <w:t>Financial exposure due to tiered termination fees</w:t>
+              <w:t>force majeure limitations</w:t>
             </w:r>
           </w:p>
         </w:tc>
@@ -3259,7 +4035,7 @@
           </w:tcPr>
           <w:p>
             <w:r>
-              <w:t>The Buyer is obligated to pay a sliding scale of fees up to 100 percent of the undelivered balance upon convenience cancellation. This creates significant cash-flow risk and financial liability based on the timing of the cancellation request.</w:t>
+              <w:t>Relief for supply chain disruptions is restricted exclusively to named Tier-1 sub-suppliers in Annex D and the approved logistics carrier. This creates operational and legal exposure as the Supplier cannot claim relief for disruptions caused by unnamed subcontractors or alternate vendors, potentially leading to breach of contract despite events beyond their reasonable control.</w:t>
             </w:r>
           </w:p>
         </w:tc>
@@ -3269,7 +4045,7 @@
           </w:tcPr>
           <w:p>
             <w:r>
-              <w:t>Reduce the percentage of cancellation fees across all time tiers and cap the total liability for convenience termination.</w:t>
+              <w:t>Expand force majeure relief to include all subcontractors and logistics providers regardless of whether they are named in Annex D.</w:t>
             </w:r>
           </w:p>
         </w:tc>
@@ -3291,7 +4067,7 @@
           </w:tcPr>
           <w:p>
             <w:r>
-              <w:t>Cancellation fee structure defined</w:t>
+              <w:t>Termination rights defined</w:t>
             </w:r>
           </w:p>
         </w:tc>
@@ -3311,7 +4087,7 @@
           </w:tcPr>
           <w:p>
             <w:r>
-              <w:t>Financial exposure through escalating termination for convenience fees</w:t>
+              <w:t>Financial exposure due to tiered termination for convenience fees</w:t>
             </w:r>
           </w:p>
         </w:tc>
@@ -3321,7 +4097,7 @@
           </w:tcPr>
           <w:p>
             <w:r>
-              <w:t>The tiered fee structure creates significant financial liability, reaching 100 percent of the undelivered balance after 181 days. This creates a high cost of exit for the Buyer regardless of Supplier actual costs, escalating rapidly from 7.5 percent to 100 percent based solely on time elapsed since acknowledgement.</w:t>
+              <w:t>While the requirement is met, the clause creates significant financial exposure through a sliding scale of cancellation fees. Costs escalate from 7.5 percent to 100 percent of the undelivered balance based on the timing of the cancellation, resulting in substantial cash-flow leakage if orders are terminated for convenience.</w:t>
             </w:r>
           </w:p>
         </w:tc>
@@ -3331,7 +4107,7 @@
           </w:tcPr>
           <w:p>
             <w:r>
-              <w:t>Replace the percentage-based schedule with a reimbursement model limited to actual, documented, and non-cancelable costs incurred by the Supplier.</w:t>
+              <w:t>Reduce cancellation fee percentages and implement a maximum aggregate cap on convenience termination payments.</w:t>
             </w:r>
           </w:p>
         </w:tc>
@@ -3353,7 +4129,7 @@
           </w:tcPr>
           <w:p>
             <w:r>
-              <w:t>61-90 day cancellation fee 40%</w:t>
+              <w:t>Cancellation fee structure defined</w:t>
             </w:r>
           </w:p>
         </w:tc>
@@ -3363,7 +4139,7 @@
           </w:tcPr>
           <w:p>
             <w:r>
-              <w:t>Red</w:t>
+              <w:t>Green</w:t>
             </w:r>
           </w:p>
         </w:tc>
@@ -3373,7 +4149,7 @@
           </w:tcPr>
           <w:p>
             <w:r>
-              <w:t>Financial exposure due to non-compliant cancellation fee structure</w:t>
+              <w:t>Termination exposure and financial liability</w:t>
             </w:r>
           </w:p>
         </w:tc>
@@ -3383,7 +4159,7 @@
           </w:tcPr>
           <w:p>
             <w:r>
-              <w:t>The contract specifies a 38% fee for the 61-90 day window instead of the required 40%. This creates a discrepancy between the mandatory corporate requirement and the actual contractual obligation, resulting in an under-recovery of costs or failure to meet internal financial compliance standards during early termination for convenience.</w:t>
+              <w:t>The sliding scale creates escalating financial liability for convenience cancellations, reaching 100 percent of the undelivered balance after 181 days. This creates significant cash-flow risk and financial exposure depending on the timing of the cancellation.</w:t>
             </w:r>
           </w:p>
         </w:tc>
@@ -3393,7 +4169,7 @@
           </w:tcPr>
           <w:p>
             <w:r>
-              <w:t>Increase the cancellation fee for the 61-90 day window to 40 percent of the order value.</w:t>
+              <w:t>Reduce cancellation fee percentages and implement a maximum aggregate cap on total convenience termination fees.</w:t>
             </w:r>
           </w:p>
         </w:tc>
@@ -3405,7 +4181,7 @@
           </w:tcPr>
           <w:p>
             <w:r>
-              <w:t>Suspension</w:t>
+              <w:t>Termination</w:t>
             </w:r>
           </w:p>
         </w:tc>
@@ -3415,7 +4191,7 @@
           </w:tcPr>
           <w:p>
             <w:r>
-              <w:t>Maximum 2 suspensions and 30 days aggregate</w:t>
+              <w:t>61-90 day cancellation fee 40%</w:t>
             </w:r>
           </w:p>
         </w:tc>
@@ -3425,7 +4201,7 @@
           </w:tcPr>
           <w:p>
             <w:r>
-              <w:t>Amber</w:t>
+              <w:t>Red</w:t>
             </w:r>
           </w:p>
         </w:tc>
@@ -3435,7 +4211,7 @@
           </w:tcPr>
           <w:p>
             <w:r>
-              <w:t>Suspension risks and financial exposure</w:t>
+              <w:t>Termination exposure and financial exposure</w:t>
             </w:r>
           </w:p>
         </w:tc>
@@ -3445,7 +4221,7 @@
           </w:tcPr>
           <w:p>
             <w:r>
-              <w:t>The clause excludes regulatory, government, and safety stoppages from the suspension limits. This allows the Buyer to suspend work indefinitely for these reasons without triggering the compensable change order protections defined in 00511.10.2, leading to unrecovered costs for storage, demobilization, and remobilization.</w:t>
+              <w:t>The contract stipulates a 38% cancellation fee for the 61-90 day window, which is lower than the required 40%. This creates a discrepancy between the corporate compliance standard and the actual contractual obligation, resulting in a failure to secure the mandated fee percentage from the supplier.</w:t>
             </w:r>
           </w:p>
         </w:tc>
@@ -3455,7 +4231,7 @@
           </w:tcPr>
           <w:p>
             <w:r>
-              <w:t>Include regulatory, government, and safety stoppages within the maximum suspension limits and the definition of compensable excess periods.</w:t>
+              <w:t>Increase the convenience cancellation fee for the 61-90 day window to 40 percent of the order value.</w:t>
             </w:r>
           </w:p>
         </w:tc>
@@ -3477,7 +4253,7 @@
           </w:tcPr>
           <w:p>
             <w:r>
-              <w:t>Supplier obligations during suspension defined</w:t>
+              <w:t>Maximum 2 suspensions and 30 days aggregate</w:t>
             </w:r>
           </w:p>
         </w:tc>
@@ -3487,7 +4263,7 @@
           </w:tcPr>
           <w:p>
             <w:r>
-              <w:t>Green</w:t>
+              <w:t>Amber</w:t>
             </w:r>
           </w:p>
         </w:tc>
@@ -3497,7 +4273,7 @@
           </w:tcPr>
           <w:p>
             <w:r>
-              <w:t>Operational and financial suspension risks</w:t>
+              <w:t>Suspension risks and financial exposure</w:t>
             </w:r>
           </w:p>
         </w:tc>
@@ -3507,7 +4283,7 @@
           </w:tcPr>
           <w:p>
             <w:r>
-              <w:t>The clause allows Buyer to suspend work twice for 30 days. While excess periods are compensable, the initial 30-day window and the 5-day restart window subject to resource availability create operational uncertainty and potential uncompensated standby costs for the Supplier.</w:t>
+              <w:t>The exclusion of regulatory, government, legal, and safety stoppages from the suspension limits allows the Buyer to pause work indefinitely without triggering the compensable change order protections defined in clause 00511.10.2. This creates uncapped operational delays and unrecoverable costs for the Supplier.</w:t>
             </w:r>
           </w:p>
         </w:tc>
@@ -3517,7 +4293,7 @@
           </w:tcPr>
           <w:p>
             <w:r>
-              <w:t>Require payment for all suspension periods regardless of duration and remove the 30-day non-compensable threshold.</w:t>
+              <w:t>Remove exclusions for regulatory, government, legal, and safety stoppages to include all suspension types within the two-time and thirty-day aggregate limit.</w:t>
             </w:r>
           </w:p>
         </w:tc>
@@ -3529,7 +4305,7 @@
           </w:tcPr>
           <w:p>
             <w:r>
-              <w:t>Governing Law</w:t>
+              <w:t>Suspension</w:t>
             </w:r>
           </w:p>
         </w:tc>
@@ -3539,7 +4315,7 @@
           </w:tcPr>
           <w:p>
             <w:r>
-              <w:t>Applicable law specified</w:t>
+              <w:t>Supplier obligations during suspension defined</w:t>
             </w:r>
           </w:p>
         </w:tc>
@@ -3549,7 +4325,7 @@
           </w:tcPr>
           <w:p>
             <w:r>
-              <w:t>Amber</w:t>
+              <w:t>Green</w:t>
             </w:r>
           </w:p>
         </w:tc>
@@ -3559,7 +4335,7 @@
           </w:tcPr>
           <w:p>
             <w:r>
-              <w:t>Legal and arbitration exposure due to fragmented dispute resolution</w:t>
+              <w:t>Suspension and operational costs exposure</w:t>
             </w:r>
           </w:p>
         </w:tc>
@@ -3569,7 +4345,7 @@
           </w:tcPr>
           <w:p>
             <w:r>
-              <w:t>The clause creates a split jurisdictional framework where governing law is India, but specific disputes are arbitrated in Singapore, while others remain in Mumbai courts. This fragmentation increases legal complexity, potential for conflicting judgments, and higher costs associated with managing proceedings across two different legal jurisdictions and forums.</w:t>
+              <w:t>The clause allows Buyer to suspend work for commercial convenience. While limits exist, the Supplier only receives compensation for periods exceeding the limit. This creates a financial gap where the first two suspensions up to 30 days are non-compensable, potentially causing unrecovered operational and idling costs.</w:t>
             </w:r>
           </w:p>
         </w:tc>
@@ -3579,7 +4355,7 @@
           </w:tcPr>
           <w:p>
             <w:r>
-              <w:t>Align governing law and dispute resolution to a single jurisdiction and forum for all contractual and non-contractual obligations.</w:t>
+              <w:t>Ensure all commercial-convenience suspensions are compensable from day one regardless of frequency or aggregate duration.</w:t>
             </w:r>
           </w:p>
         </w:tc>
@@ -3591,7 +4367,7 @@
           </w:tcPr>
           <w:p>
             <w:r>
-              <w:t>Dispute Resolution</w:t>
+              <w:t>Governing Law</w:t>
             </w:r>
           </w:p>
         </w:tc>
@@ -3601,7 +4377,7 @@
           </w:tcPr>
           <w:p>
             <w:r>
-              <w:t>Arbitration mechanism defined</w:t>
+              <w:t>Applicable law specified</w:t>
             </w:r>
           </w:p>
         </w:tc>
@@ -3611,7 +4387,7 @@
           </w:tcPr>
           <w:p>
             <w:r>
-              <w:t>Green</w:t>
+              <w:t>Amber</w:t>
             </w:r>
           </w:p>
         </w:tc>
@@ -3621,7 +4397,7 @@
           </w:tcPr>
           <w:p>
             <w:r>
-              <w:t>Arbitration limitations</w:t>
+              <w:t>Legal exposure and arbitration complexity</w:t>
             </w:r>
           </w:p>
         </w:tc>
@@ -3631,7 +4407,7 @@
           </w:tcPr>
           <w:p>
             <w:r>
-              <w:t>The arbitration mechanism is conditional and restricted. Only legal disputes proceed to Singapore arbitration if a technical expert in Mumbai first determines laboratory test methodology disputes. This creates a dependency on a preliminary expert determination and limits the direct application of arbitration for technical disagreements.</w:t>
+              <w:t>The governing law is India, but dispute resolution is split between Singapore arbitration and Mumbai courts. This fragmented jurisdiction creates legal exposure and operational constraints through carve-outs for specific disputes and technical experts, increasing the risk of conflicting rulings and increased litigation costs.</w:t>
             </w:r>
           </w:p>
         </w:tc>
@@ -3641,7 +4417,7 @@
           </w:tcPr>
           <w:p>
             <w:r>
-              <w:t>Ensure all disputes regardless of technical nature are subject to direct Singapore arbitration without mandatory preliminary expert determination.</w:t>
+              <w:t>Align governing law and arbitration seat to a single jurisdiction and remove carve-outs for technical experts and specific court proceedings.</w:t>
             </w:r>
           </w:p>
         </w:tc>
@@ -3663,7 +4439,7 @@
           </w:tcPr>
           <w:p>
             <w:r>
-              <w:t>Seat of arbitration specified</w:t>
+              <w:t>Arbitration mechanism defined</w:t>
             </w:r>
           </w:p>
         </w:tc>
@@ -3683,7 +4459,7 @@
           </w:tcPr>
           <w:p>
             <w:r>
-              <w:t>Arbitration limitations and legal exposure</w:t>
+              <w:t>Arbitration limitations</w:t>
             </w:r>
           </w:p>
         </w:tc>
@@ -3693,7 +4469,7 @@
           </w:tcPr>
           <w:p>
             <w:r>
-              <w:t>The clause creates a multi-tiered dispute process with a carve-out for laboratory test methodology. By requiring a technical expert in Mumbai before proceeding to Singapore arbitration, the process introduces a procedural dependency and potential delays in achieving a final legal resolution.</w:t>
+              <w:t>The dispute resolution mechanism is conditional, requiring a preliminary technical expert referral in Mumbai for methodology disputes before proceeding to Singapore arbitration. This multi-tiered dependency creates a procedural hurdle and potential delay in accessing final legal remedy.</w:t>
             </w:r>
           </w:p>
         </w:tc>
@@ -3703,7 +4479,7 @@
           </w:tcPr>
           <w:p>
             <w:r>
-              <w:t>Remove the requirement for a technical expert referral and mandate all disputes proceed directly to Singapore arbitration.</w:t>
+              <w:t>Establish direct access to Singapore arbitration for all disputes regardless of technical nature.</w:t>
             </w:r>
           </w:p>
         </w:tc>
@@ -3715,7 +4491,7 @@
           </w:tcPr>
           <w:p>
             <w:r>
-              <w:t>Liability</w:t>
+              <w:t>Dispute Resolution</w:t>
             </w:r>
           </w:p>
         </w:tc>
@@ -3725,7 +4501,7 @@
           </w:tcPr>
           <w:p>
             <w:r>
-              <w:t>Liability carve-outs defined</w:t>
+              <w:t>Seat of arbitration specified</w:t>
             </w:r>
           </w:p>
         </w:tc>
@@ -3735,7 +4511,7 @@
           </w:tcPr>
           <w:p>
             <w:r>
-              <w:t>Amber</w:t>
+              <w:t>Green</w:t>
             </w:r>
           </w:p>
         </w:tc>
@@ -3745,7 +4521,7 @@
           </w:tcPr>
           <w:p>
             <w:r>
-              <w:t>Liability exposure</w:t>
+              <w:t>Arbitration limitations and operational constraints</w:t>
             </w:r>
           </w:p>
         </w:tc>
@@ -3755,7 +4531,7 @@
           </w:tcPr>
           <w:p>
             <w:r>
-              <w:t>The liability cap for defect repairs is limited to 10 percent of the PO value. While certain emergency costs are carved out, other significant defect-related damages remain capped, creating financial exposure if repair costs exceed the 10 percent threshold.</w:t>
+              <w:t>The clause mandates a tiered dispute process where laboratory test methodology disputes must first be referred to a technical expert in Mumbai. This creates a dependency and a procedural carve-out that delays access to Singapore arbitration, increasing legal exposure and prolonging the resolution of technical disputes.</w:t>
             </w:r>
           </w:p>
         </w:tc>
@@ -3765,7 +4541,7 @@
           </w:tcPr>
           <w:p>
             <w:r>
-              <w:t>Increase the aggregate liability cap for defect repairs and expand the list of excluded costs to include all emergency and critical failure remediations.</w:t>
+              <w:t>Remove the requirement for technical expert referral in Mumbai and specify Singapore as the sole seat of arbitration for all disputes.</w:t>
             </w:r>
           </w:p>
         </w:tc>
@@ -3777,7 +4553,7 @@
           </w:tcPr>
           <w:p>
             <w:r>
-              <w:t>Consequential Damages</w:t>
+              <w:t>Liability</w:t>
             </w:r>
           </w:p>
         </w:tc>
@@ -3787,7 +4563,7 @@
           </w:tcPr>
           <w:p>
             <w:r>
-              <w:t>Consequential damages excluded</w:t>
+              <w:t>Liability carve-outs defined</w:t>
             </w:r>
           </w:p>
         </w:tc>
@@ -3807,7 +4583,7 @@
           </w:tcPr>
           <w:p>
             <w:r>
-              <w:t>Uncapped liability exposure via consequential damage carve-outs</w:t>
+              <w:t>Liability exposure</w:t>
             </w:r>
           </w:p>
         </w:tc>
@@ -3817,7 +4593,7 @@
           </w:tcPr>
           <w:p>
             <w:r>
-              <w:t>Article 00511.15.2 creates multiple exceptions to the consequential damages waiver, including confidentiality, indemnity, IP infringement, and gross negligence. This allows the counterparty to seek recovery for indirect and consequential losses for these events, bypassing the general liability limitation and increasing financial and legal exposure.</w:t>
+              <w:t>The liability cap for defect repairs is limited to 10 percent of PO value. While carve-outs exist for safety shutdowns, other critical defect costs remain capped, creating financial exposure if repair costs exceed the limited aggregate cap.</w:t>
             </w:r>
           </w:p>
         </w:tc>
@@ -3827,7 +4603,7 @@
           </w:tcPr>
           <w:p>
             <w:r>
-              <w:t>Remove exceptions for confidentiality, indemnity, and IP infringement from the consequential damages waiver to ensure a comprehensive exclusion of indirect losses.</w:t>
+              <w:t>Increase the defect liability cap beyond 10 percent of PO value and expand carve-outs to include all critical repair and replacement costs.</w:t>
             </w:r>
           </w:p>
         </w:tc>
@@ -3849,7 +4625,7 @@
           </w:tcPr>
           <w:p>
             <w:r>
-              <w:t>Exceptions to exclusion defined</w:t>
+              <w:t>Consequential damages excluded</w:t>
             </w:r>
           </w:p>
         </w:tc>
@@ -3869,7 +4645,7 @@
           </w:tcPr>
           <w:p>
             <w:r>
-              <w:t>Increased liability exposure via extensive consequential damage carve-outs</w:t>
+              <w:t>Unlimited liability exposure for specific carve-out categories</w:t>
             </w:r>
           </w:p>
         </w:tc>
@@ -3879,7 +4655,7 @@
           </w:tcPr>
           <w:p>
             <w:r>
-              <w:t>The clause provides a broad waiver but allows for multiple exceptions including confidentiality, indemnity, IP infringement, fraud, and gross negligence. These carve-outs bypass the limitation of liability for consequential damages, exposing the company to uncapped financial claims for indirect losses in these specific scenarios.</w:t>
+              <w:t>Article 00511.15.2 creates broad exceptions to the consequential damages waiver, including confidentiality, indemnity, IP infringement, and gross negligence. This exposes the organization to unlimited claims for loss of profit and revenue despite the general waiver in Article 00511.15.1.</w:t>
             </w:r>
           </w:p>
         </w:tc>
@@ -3889,7 +4665,7 @@
           </w:tcPr>
           <w:p>
             <w:r>
-              <w:t>Narrow the list of exceptions to consequential damage waivers and subject all carve-outs to an overall aggregate liability cap.</w:t>
+              <w:t>Remove all carve-outs from the consequential damages waiver to ensure an absolute exclusion of indirect and consequential losses regardless of the cause of action.</w:t>
             </w:r>
           </w:p>
         </w:tc>
@@ -3901,7 +4677,7 @@
           </w:tcPr>
           <w:p>
             <w:r>
-              <w:t>Payment Terms</w:t>
+              <w:t>Consequential Damages</w:t>
             </w:r>
           </w:p>
         </w:tc>
@@ -3911,7 +4687,7 @@
           </w:tcPr>
           <w:p>
             <w:r>
-              <w:t>All payments Net 30 days from invoice</w:t>
+              <w:t>Exceptions to exclusion defined</w:t>
             </w:r>
           </w:p>
         </w:tc>
@@ -3931,7 +4707,7 @@
           </w:tcPr>
           <w:p>
             <w:r>
-              <w:t>Cash-flow risk and payment unpredictability</w:t>
+              <w:t>Liability exposure</w:t>
             </w:r>
           </w:p>
         </w:tc>
@@ -3941,7 +4717,7 @@
           </w:tcPr>
           <w:p>
             <w:r>
-              <w:t>Payment is contingent upon internal buyer processes including goods receipt, inspection, and packing-list reconciliation. Because the 30-day clock only starts after these internal records are completed, the buyer can unilaterally delay payment regardless of the invoice date, creating financial uncertainty and extending the actual payment cycle beyond the required Net 30 terms.</w:t>
+              <w:t>The exclusion of consequential damages is subject to multiple carve-outs including confidentiality, indemnity, IP infringement, and gross negligence. These exceptions expose the company to uncapped indirect and consequential financial losses if any of these trigger events occur, bypassing the standard liability protections.</w:t>
             </w:r>
           </w:p>
         </w:tc>
@@ -3951,7 +4727,7 @@
           </w:tcPr>
           <w:p>
             <w:r>
-              <w:t>Set payment as Net 30 days from invoice receipt and remove internal system record dependencies as triggers for the payment clock.</w:t>
+              <w:t>Remove broad carve-outs and subject all exceptions to a defined aggregate liability cap.</w:t>
             </w:r>
           </w:p>
         </w:tc>
@@ -4040,7 +4816,7 @@
           </w:tcPr>
           <w:p>
             <w:r>
-              <w:t>Ensure the full 45% advance is payable as a single lump sum upon PO acknowledgement and document submission without further conditional tranches.</w:t>
+              <w:t>Ensure 45 percent advance is payable as a single lump sum within five business days of PO acknowledgement without conditional tranches.</w:t>
             </w:r>
           </w:p>
         </w:tc>
@@ -4052,7 +4828,7 @@
           </w:tcPr>
           <w:p>
             <w:r>
-              <w:t>Bank Guarantees</w:t>
+              <w:t>Payment Terms</w:t>
             </w:r>
           </w:p>
         </w:tc>
@@ -4062,7 +4838,7 @@
           </w:tcPr>
           <w:p>
             <w:r>
-              <w:t>Performance Guarantee not exceeding 10%</w:t>
+              <w:t>All payments Net 30 days from invoice</w:t>
             </w:r>
           </w:p>
         </w:tc>
@@ -4072,7 +4848,7 @@
           </w:tcPr>
           <w:p>
             <w:r>
-              <w:t>Limit total performance security obligations to a maximum of 10 percent of the Purchase Order value, inclusive of the bridge guarantee.</w:t>
+              <w:t>Set payment terms to Net 30 days from invoice receipt and remove dependencies on internal buyer acceptance records.</w:t>
             </w:r>
           </w:p>
         </w:tc>
@@ -4084,7 +4860,7 @@
           </w:tcPr>
           <w:p>
             <w:r>
-              <w:t>Liquidated Damages</w:t>
+              <w:t>Bank Guarantees</w:t>
             </w:r>
           </w:p>
         </w:tc>
@@ -4094,7 +4870,7 @@
           </w:tcPr>
           <w:p>
             <w:r>
-              <w:t>Documentation LD not applicable</w:t>
+              <w:t>Performance Guarantee not exceeding 10%</w:t>
             </w:r>
           </w:p>
         </w:tc>
@@ -4104,7 +4880,7 @@
           </w:tcPr>
           <w:p>
             <w:r>
-              <w:t>Apply liquidated damages to all documentation and engineering submittal delays regardless of criticality.</w:t>
+              <w:t>Reduce total performance security to a maximum of 10 percent including bridge guarantees.</w:t>
             </w:r>
           </w:p>
         </w:tc>
@@ -4126,7 +4902,7 @@
           </w:tcPr>
           <w:p>
             <w:r>
-              <w:t>Equipment Delivery LD 0.5% per week</w:t>
+              <w:t>Documentation LD not applicable</w:t>
             </w:r>
           </w:p>
         </w:tc>
@@ -4136,7 +4912,7 @@
           </w:tcPr>
           <w:p>
             <w:r>
-              <w:t>Remove the 5% individual equipment cap and increase the aggregate delay exposure cap to 10% of the total Purchase Order value.</w:t>
+              <w:t>Remove the exclusion for routine manuals and non-critical engineering submittals to ensure all documentation delays attract applicable liquidated damages.</w:t>
             </w:r>
           </w:p>
         </w:tc>
@@ -4158,7 +4934,7 @@
           </w:tcPr>
           <w:p>
             <w:r>
-              <w:t>Equipment Delivery LD capped at 5%</w:t>
+              <w:t>Equipment Delivery LD 0.5% per week</w:t>
             </w:r>
           </w:p>
         </w:tc>
@@ -4168,7 +4944,7 @@
           </w:tcPr>
           <w:p>
             <w:r>
-              <w:t>Reduce aggregate delay exposure, including delivery LD and service credits, to a maximum of 5 percent of the total Purchase Order value.</w:t>
+              <w:t>Remove the 5 percent cap on individual undelivered parts and increase the aggregate delay exposure cap.</w:t>
             </w:r>
           </w:p>
         </w:tc>
@@ -4190,7 +4966,7 @@
           </w:tcPr>
           <w:p>
             <w:r>
-              <w:t>Aggregate LD capped at 5% PO value</w:t>
+              <w:t>Equipment Delivery LD capped at 5%</w:t>
             </w:r>
           </w:p>
         </w:tc>
@@ -4200,7 +4976,7 @@
           </w:tcPr>
           <w:p>
             <w:r>
-              <w:t>Reduce aggregate delay exposure and service credits to a maximum of 5 percent of total Purchase Order value.</w:t>
+              <w:t>Reduce aggregate delay exposure, including delivery LD and service credits, to a maximum of 5 percent of total Purchase Order value.</w:t>
             </w:r>
           </w:p>
         </w:tc>
@@ -4222,7 +4998,7 @@
           </w:tcPr>
           <w:p>
             <w:r>
-              <w:t>Remedial Work LD not applicable</w:t>
+              <w:t>Aggregate LD capped at 5% PO value</w:t>
             </w:r>
           </w:p>
         </w:tc>
@@ -4232,7 +5008,7 @@
           </w:tcPr>
           <w:p>
             <w:r>
-              <w:t>Remove the exemption for remedial work and apply liquidated damages to delays in warranty repairs and replacements.</w:t>
+              <w:t>Reduce aggregate LD and service-credit exposure to a maximum of 5 percent of total PO value.</w:t>
             </w:r>
           </w:p>
         </w:tc>
@@ -4244,7 +5020,7 @@
           </w:tcPr>
           <w:p>
             <w:r>
-              <w:t>Guarantee</w:t>
+              <w:t>Liquidated Damages</w:t>
             </w:r>
           </w:p>
         </w:tc>
@@ -4254,7 +5030,7 @@
           </w:tcPr>
           <w:p>
             <w:r>
-              <w:t>Warranty period defined</w:t>
+              <w:t>Remedial Work LD not applicable</w:t>
             </w:r>
           </w:p>
         </w:tc>
@@ -4264,7 +5040,7 @@
           </w:tcPr>
           <w:p>
             <w:r>
-              <w:t>Establish a fixed warranty period from final acceptance and ensure remedial guarantees run for a full term from the date of repair without dispatch-based caps.</w:t>
+              <w:t>Apply liquidated damages to remedial work and warranty repairs to ensure timely performance of corrective actions.</w:t>
             </w:r>
           </w:p>
         </w:tc>
@@ -4286,7 +5062,7 @@
           </w:tcPr>
           <w:p>
             <w:r>
-              <w:t>2 months from commissioning or 18 months from dispatch</w:t>
+              <w:t>Warranty period defined</w:t>
             </w:r>
           </w:p>
         </w:tc>
@@ -4296,7 +5072,7 @@
           </w:tcPr>
           <w:p>
             <w:r>
-              <w:t>Ensure repaired or replaced components are guaranteed for twelve months from completion of repair regardless of the original dispatch date.</w:t>
+              <w:t>Extend standard guarantee to twelve months post-commissioning and ensure remedial guarantees run for a full twelve months regardless of the original dispatch date.</w:t>
             </w:r>
           </w:p>
         </w:tc>
@@ -4318,7 +5094,7 @@
           </w:tcPr>
           <w:p>
             <w:r>
-              <w:t>Repair/replacement warranty obligations defined</w:t>
+              <w:t>2 months from commissioning or 18 months from dispatch</w:t>
             </w:r>
           </w:p>
         </w:tc>
@@ -4328,7 +5104,7 @@
           </w:tcPr>
           <w:p>
             <w:r>
-              <w:t>Extend remedial guarantee to a full 12 months from completion of repair regardless of original dispatch date and expand scope to include all affected integrated components.</w:t>
+              <w:t>Ensure repaired or replaced components are guaranteed for 12 months from completion of repair regardless of the original dispatch date.</w:t>
             </w:r>
           </w:p>
         </w:tc>
@@ -4340,7 +5116,7 @@
           </w:tcPr>
           <w:p>
             <w:r>
-              <w:t>Force Majeure</w:t>
+              <w:t>Guarantee</w:t>
             </w:r>
           </w:p>
         </w:tc>
@@ -4350,7 +5126,7 @@
           </w:tcPr>
           <w:p>
             <w:r>
-              <w:t>Force majeure events defined</w:t>
+              <w:t>Repair/replacement warranty obligations defined</w:t>
             </w:r>
           </w:p>
         </w:tc>
@@ -4360,7 +5136,7 @@
           </w:tcPr>
           <w:p>
             <w:r>
-              <w:t>Remove the restriction limiting supply-chain relief to named Tier-1 sub-suppliers and approved carriers to cover all critical sub-contractors.</w:t>
+              <w:t>Define repair and replacement warranties to run for a full twelve months from the date of completion regardless of the original dispatch date.</w:t>
             </w:r>
           </w:p>
         </w:tc>
@@ -4382,7 +5158,7 @@
           </w:tcPr>
           <w:p>
             <w:r>
-              <w:t>Applies to subcontractors</w:t>
+              <w:t>Force majeure events defined</w:t>
             </w:r>
           </w:p>
         </w:tc>
@@ -4392,7 +5168,7 @@
           </w:tcPr>
           <w:p>
             <w:r>
-              <w:t>Extend force majeure relief to all subcontractors and vendors regardless of their status as named Tier-1 or approved suppliers.</w:t>
+              <w:t>Extend force majeure relief to all sub-contractors and vendors regardless of their naming in Annex D or Tier-1 status.</w:t>
             </w:r>
           </w:p>
         </w:tc>
@@ -4414,7 +5190,7 @@
           </w:tcPr>
           <w:p>
             <w:r>
-              <w:t>Notice obligations defined</w:t>
+              <w:t>Applies to subcontractors</w:t>
             </w:r>
           </w:p>
         </w:tc>
@@ -4424,7 +5200,7 @@
           </w:tcPr>
           <w:p>
             <w:r>
-              <w:t>Extend Force Majeure relief to cover all subcontractors and logistics providers regardless of their listing in Annex D.</w:t>
+              <w:t>Extend force majeure relief to all subcontractors regardless of tier or naming in Annex D.</w:t>
             </w:r>
           </w:p>
         </w:tc>
@@ -4436,7 +5212,7 @@
           </w:tcPr>
           <w:p>
             <w:r>
-              <w:t>Termination</w:t>
+              <w:t>Force Majeure</w:t>
             </w:r>
           </w:p>
         </w:tc>
@@ -4446,7 +5222,7 @@
           </w:tcPr>
           <w:p>
             <w:r>
-              <w:t>Termination rights defined</w:t>
+              <w:t>Notice obligations defined</w:t>
             </w:r>
           </w:p>
         </w:tc>
@@ -4456,7 +5232,7 @@
           </w:tcPr>
           <w:p>
             <w:r>
-              <w:t>Reduce the percentage of cancellation fees across all time tiers and cap the total liability for convenience termination.</w:t>
+              <w:t>Expand force majeure relief to include all subcontractors and logistics providers regardless of whether they are named in Annex D.</w:t>
             </w:r>
           </w:p>
         </w:tc>
@@ -4478,7 +5254,7 @@
           </w:tcPr>
           <w:p>
             <w:r>
-              <w:t>Cancellation fee structure defined</w:t>
+              <w:t>Termination rights defined</w:t>
             </w:r>
           </w:p>
         </w:tc>
@@ -4488,7 +5264,7 @@
           </w:tcPr>
           <w:p>
             <w:r>
-              <w:t>Replace the percentage-based schedule with a reimbursement model limited to actual, documented, and non-cancelable costs incurred by the Supplier.</w:t>
+              <w:t>Reduce cancellation fee percentages and implement a maximum aggregate cap on convenience termination payments.</w:t>
             </w:r>
           </w:p>
         </w:tc>
@@ -4510,7 +5286,7 @@
           </w:tcPr>
           <w:p>
             <w:r>
-              <w:t>61-90 day cancellation fee 40%</w:t>
+              <w:t>Cancellation fee structure defined</w:t>
             </w:r>
           </w:p>
         </w:tc>
@@ -4520,7 +5296,7 @@
           </w:tcPr>
           <w:p>
             <w:r>
-              <w:t>Increase the cancellation fee for the 61-90 day window to 40 percent of the order value.</w:t>
+              <w:t>Reduce cancellation fee percentages and implement a maximum aggregate cap on total convenience termination fees.</w:t>
             </w:r>
           </w:p>
         </w:tc>
@@ -4532,7 +5308,7 @@
           </w:tcPr>
           <w:p>
             <w:r>
-              <w:t>Suspension</w:t>
+              <w:t>Termination</w:t>
             </w:r>
           </w:p>
         </w:tc>
@@ -4542,7 +5318,7 @@
           </w:tcPr>
           <w:p>
             <w:r>
-              <w:t>Maximum 2 suspensions and 30 days aggregate</w:t>
+              <w:t>61-90 day cancellation fee 40%</w:t>
             </w:r>
           </w:p>
         </w:tc>
@@ -4552,7 +5328,7 @@
           </w:tcPr>
           <w:p>
             <w:r>
-              <w:t>Include regulatory, government, and safety stoppages within the maximum suspension limits and the definition of compensable excess periods.</w:t>
+              <w:t>Increase the convenience cancellation fee for the 61-90 day window to 40 percent of the order value.</w:t>
             </w:r>
           </w:p>
         </w:tc>
@@ -4574,7 +5350,7 @@
           </w:tcPr>
           <w:p>
             <w:r>
-              <w:t>Supplier obligations during suspension defined</w:t>
+              <w:t>Maximum 2 suspensions and 30 days aggregate</w:t>
             </w:r>
           </w:p>
         </w:tc>
@@ -4584,7 +5360,7 @@
           </w:tcPr>
           <w:p>
             <w:r>
-              <w:t>Require payment for all suspension periods regardless of duration and remove the 30-day non-compensable threshold.</w:t>
+              <w:t>Remove exclusions for regulatory, government, legal, and safety stoppages to include all suspension types within the two-time and thirty-day aggregate limit.</w:t>
             </w:r>
           </w:p>
         </w:tc>
@@ -4596,7 +5372,7 @@
           </w:tcPr>
           <w:p>
             <w:r>
-              <w:t>Governing Law</w:t>
+              <w:t>Suspension</w:t>
             </w:r>
           </w:p>
         </w:tc>
@@ -4606,7 +5382,7 @@
           </w:tcPr>
           <w:p>
             <w:r>
-              <w:t>Applicable law specified</w:t>
+              <w:t>Supplier obligations during suspension defined</w:t>
             </w:r>
           </w:p>
         </w:tc>
@@ -4616,7 +5392,7 @@
           </w:tcPr>
           <w:p>
             <w:r>
-              <w:t>Align governing law and dispute resolution to a single jurisdiction and forum for all contractual and non-contractual obligations.</w:t>
+              <w:t>Ensure all commercial-convenience suspensions are compensable from day one regardless of frequency or aggregate duration.</w:t>
             </w:r>
           </w:p>
         </w:tc>
@@ -4628,7 +5404,7 @@
           </w:tcPr>
           <w:p>
             <w:r>
-              <w:t>Dispute Resolution</w:t>
+              <w:t>Governing Law</w:t>
             </w:r>
           </w:p>
         </w:tc>
@@ -4638,7 +5414,7 @@
           </w:tcPr>
           <w:p>
             <w:r>
-              <w:t>Arbitration mechanism defined</w:t>
+              <w:t>Applicable law specified</w:t>
             </w:r>
           </w:p>
         </w:tc>
@@ -4648,7 +5424,7 @@
           </w:tcPr>
           <w:p>
             <w:r>
-              <w:t>Ensure all disputes regardless of technical nature are subject to direct Singapore arbitration without mandatory preliminary expert determination.</w:t>
+              <w:t>Align governing law and arbitration seat to a single jurisdiction and remove carve-outs for technical experts and specific court proceedings.</w:t>
             </w:r>
           </w:p>
         </w:tc>
@@ -4670,7 +5446,7 @@
           </w:tcPr>
           <w:p>
             <w:r>
-              <w:t>Seat of arbitration specified</w:t>
+              <w:t>Arbitration mechanism defined</w:t>
             </w:r>
           </w:p>
         </w:tc>
@@ -4680,7 +5456,7 @@
           </w:tcPr>
           <w:p>
             <w:r>
-              <w:t>Remove the requirement for a technical expert referral and mandate all disputes proceed directly to Singapore arbitration.</w:t>
+              <w:t>Establish direct access to Singapore arbitration for all disputes regardless of technical nature.</w:t>
             </w:r>
           </w:p>
         </w:tc>
@@ -4692,7 +5468,7 @@
           </w:tcPr>
           <w:p>
             <w:r>
-              <w:t>Liability</w:t>
+              <w:t>Dispute Resolution</w:t>
             </w:r>
           </w:p>
         </w:tc>
@@ -4702,7 +5478,7 @@
           </w:tcPr>
           <w:p>
             <w:r>
-              <w:t>Liability carve-outs defined</w:t>
+              <w:t>Seat of arbitration specified</w:t>
             </w:r>
           </w:p>
         </w:tc>
@@ -4712,7 +5488,7 @@
           </w:tcPr>
           <w:p>
             <w:r>
-              <w:t>Increase the aggregate liability cap for defect repairs and expand the list of excluded costs to include all emergency and critical failure remediations.</w:t>
+              <w:t>Remove the requirement for technical expert referral in Mumbai and specify Singapore as the sole seat of arbitration for all disputes.</w:t>
             </w:r>
           </w:p>
         </w:tc>
@@ -4724,7 +5500,7 @@
           </w:tcPr>
           <w:p>
             <w:r>
-              <w:t>Consequential Damages</w:t>
+              <w:t>Liability</w:t>
             </w:r>
           </w:p>
         </w:tc>
@@ -4734,7 +5510,7 @@
           </w:tcPr>
           <w:p>
             <w:r>
-              <w:t>Consequential damages excluded</w:t>
+              <w:t>Liability carve-outs defined</w:t>
             </w:r>
           </w:p>
         </w:tc>
@@ -4744,7 +5520,7 @@
           </w:tcPr>
           <w:p>
             <w:r>
-              <w:t>Remove exceptions for confidentiality, indemnity, and IP infringement from the consequential damages waiver to ensure a comprehensive exclusion of indirect losses.</w:t>
+              <w:t>Increase the defect liability cap beyond 10 percent of PO value and expand carve-outs to include all critical repair and replacement costs.</w:t>
             </w:r>
           </w:p>
         </w:tc>
@@ -4766,7 +5542,7 @@
           </w:tcPr>
           <w:p>
             <w:r>
-              <w:t>Exceptions to exclusion defined</w:t>
+              <w:t>Consequential damages excluded</w:t>
             </w:r>
           </w:p>
         </w:tc>
@@ -4776,7 +5552,7 @@
           </w:tcPr>
           <w:p>
             <w:r>
-              <w:t>Narrow the list of exceptions to consequential damage waivers and subject all carve-outs to an overall aggregate liability cap.</w:t>
+              <w:t>Remove all carve-outs from the consequential damages waiver to ensure an absolute exclusion of indirect and consequential losses regardless of the cause of action.</w:t>
             </w:r>
           </w:p>
         </w:tc>
@@ -4788,7 +5564,7 @@
           </w:tcPr>
           <w:p>
             <w:r>
-              <w:t>Payment Terms</w:t>
+              <w:t>Consequential Damages</w:t>
             </w:r>
           </w:p>
         </w:tc>
@@ -4798,7 +5574,7 @@
           </w:tcPr>
           <w:p>
             <w:r>
-              <w:t>All payments Net 30 days from invoice</w:t>
+              <w:t>Exceptions to exclusion defined</w:t>
             </w:r>
           </w:p>
         </w:tc>
@@ -4808,7 +5584,7 @@
           </w:tcPr>
           <w:p>
             <w:r>
-              <w:t>Set payment as Net 30 days from invoice receipt and remove internal system record dependencies as triggers for the payment clock.</w:t>
+              <w:t>Remove broad carve-outs and subject all exceptions to a defined aggregate liability cap.</w:t>
             </w:r>
           </w:p>
         </w:tc>

</xml_diff>

<commit_message>
Optimized historical action retrival
</commit_message>
<xml_diff>
--- a/contract_analysis_report.docx
+++ b/contract_analysis_report.docx
@@ -25,18 +25,17 @@
         <w:tblLook w:firstColumn="1" w:firstRow="1" w:lastColumn="0" w:lastRow="0" w:noHBand="0" w:noVBand="1" w:val="04A0"/>
       </w:tblPr>
       <w:tblGrid>
-        <w:gridCol w:w="1234"/>
-        <w:gridCol w:w="1234"/>
-        <w:gridCol w:w="1234"/>
-        <w:gridCol w:w="1234"/>
-        <w:gridCol w:w="1234"/>
-        <w:gridCol w:w="1234"/>
-        <w:gridCol w:w="1234"/>
+        <w:gridCol w:w="1440"/>
+        <w:gridCol w:w="1440"/>
+        <w:gridCol w:w="1440"/>
+        <w:gridCol w:w="1440"/>
+        <w:gridCol w:w="1440"/>
+        <w:gridCol w:w="1440"/>
       </w:tblGrid>
       <w:tr>
         <w:tc>
           <w:tcPr>
-            <w:tcW w:type="dxa" w:w="1234"/>
+            <w:tcW w:type="dxa" w:w="1440"/>
           </w:tcPr>
           <w:p>
             <w:r>
@@ -46,7 +45,7 @@
         </w:tc>
         <w:tc>
           <w:tcPr>
-            <w:tcW w:type="dxa" w:w="1234"/>
+            <w:tcW w:type="dxa" w:w="1440"/>
           </w:tcPr>
           <w:p>
             <w:r>
@@ -56,7 +55,7 @@
         </w:tc>
         <w:tc>
           <w:tcPr>
-            <w:tcW w:type="dxa" w:w="1234"/>
+            <w:tcW w:type="dxa" w:w="1440"/>
           </w:tcPr>
           <w:p>
             <w:r>
@@ -66,17 +65,7 @@
         </w:tc>
         <w:tc>
           <w:tcPr>
-            <w:tcW w:type="dxa" w:w="1234"/>
-          </w:tcPr>
-          <w:p>
-            <w:r>
-              <w:t>Status</w:t>
-            </w:r>
-          </w:p>
-        </w:tc>
-        <w:tc>
-          <w:tcPr>
-            <w:tcW w:type="dxa" w:w="1234"/>
+            <w:tcW w:type="dxa" w:w="1440"/>
           </w:tcPr>
           <w:p>
             <w:r>
@@ -86,7 +75,7 @@
         </w:tc>
         <w:tc>
           <w:tcPr>
-            <w:tcW w:type="dxa" w:w="1234"/>
+            <w:tcW w:type="dxa" w:w="1440"/>
           </w:tcPr>
           <w:p>
             <w:r>
@@ -96,7 +85,7 @@
         </w:tc>
         <w:tc>
           <w:tcPr>
-            <w:tcW w:type="dxa" w:w="1234"/>
+            <w:tcW w:type="dxa" w:w="1440"/>
           </w:tcPr>
           <w:p>
             <w:r>
@@ -108,7 +97,7 @@
       <w:tr>
         <w:tc>
           <w:tcPr>
-            <w:tcW w:type="dxa" w:w="1234"/>
+            <w:tcW w:type="dxa" w:w="1440"/>
           </w:tcPr>
           <w:p>
             <w:r>
@@ -118,7 +107,7 @@
         </w:tc>
         <w:tc>
           <w:tcPr>
-            <w:tcW w:type="dxa" w:w="1234"/>
+            <w:tcW w:type="dxa" w:w="1440"/>
           </w:tcPr>
           <w:p>
             <w:r>
@@ -128,7 +117,7 @@
         </w:tc>
         <w:tc>
           <w:tcPr>
-            <w:tcW w:type="dxa" w:w="1234"/>
+            <w:tcW w:type="dxa" w:w="1440"/>
           </w:tcPr>
           <w:p>
             <w:r>
@@ -138,17 +127,7 @@
         </w:tc>
         <w:tc>
           <w:tcPr>
-            <w:tcW w:type="dxa" w:w="1234"/>
-          </w:tcPr>
-          <w:p>
-            <w:r>
-              <w:t>Partially Met</w:t>
-            </w:r>
-          </w:p>
-        </w:tc>
-        <w:tc>
-          <w:tcPr>
-            <w:tcW w:type="dxa" w:w="1234"/>
+            <w:tcW w:type="dxa" w:w="1440"/>
           </w:tcPr>
           <w:p>
             <w:r>
@@ -160,7 +139,7 @@
         </w:tc>
         <w:tc>
           <w:tcPr>
-            <w:tcW w:type="dxa" w:w="1234"/>
+            <w:tcW w:type="dxa" w:w="1440"/>
           </w:tcPr>
           <w:p>
             <w:r>
@@ -170,11 +149,11 @@
         </w:tc>
         <w:tc>
           <w:tcPr>
-            <w:tcW w:type="dxa" w:w="1234"/>
-          </w:tcPr>
-          <w:p>
-            <w:r>
-              <w:t>Past actions involved escalating to the CFO for lump-sum approval to secure pricing or proposing rolling letters of credit when advance payments were insufficient.</w:t>
+            <w:tcW w:type="dxa" w:w="1440"/>
+          </w:tcPr>
+          <w:p>
+            <w:r>
+              <w:t>Historically, advance payment percentages were either approved as exceptional lump sums to secure pricing or escalated to the finance board via rolling letters of credit when minimums were not met.</w:t>
               <w:br/>
               <w:br/>
               <w:t>Historical Reference</w:t>
@@ -191,7 +170,7 @@
       <w:tr>
         <w:tc>
           <w:tcPr>
-            <w:tcW w:type="dxa" w:w="1234"/>
+            <w:tcW w:type="dxa" w:w="1440"/>
           </w:tcPr>
           <w:p>
             <w:r>
@@ -201,7 +180,7 @@
         </w:tc>
         <w:tc>
           <w:tcPr>
-            <w:tcW w:type="dxa" w:w="1234"/>
+            <w:tcW w:type="dxa" w:w="1440"/>
           </w:tcPr>
           <w:p>
             <w:r>
@@ -211,7 +190,7 @@
         </w:tc>
         <w:tc>
           <w:tcPr>
-            <w:tcW w:type="dxa" w:w="1234"/>
+            <w:tcW w:type="dxa" w:w="1440"/>
           </w:tcPr>
           <w:p>
             <w:r>
@@ -221,17 +200,7 @@
         </w:tc>
         <w:tc>
           <w:tcPr>
-            <w:tcW w:type="dxa" w:w="1234"/>
-          </w:tcPr>
-          <w:p>
-            <w:r>
-              <w:t>Partially Met</w:t>
-            </w:r>
-          </w:p>
-        </w:tc>
-        <w:tc>
-          <w:tcPr>
-            <w:tcW w:type="dxa" w:w="1234"/>
+            <w:tcW w:type="dxa" w:w="1440"/>
           </w:tcPr>
           <w:p>
             <w:r>
@@ -241,21 +210,21 @@
         </w:tc>
         <w:tc>
           <w:tcPr>
-            <w:tcW w:type="dxa" w:w="1234"/>
-          </w:tcPr>
-          <w:p>
-            <w:r>
-              <w:t>The requirement is partially met because the 30-day payment trigger is conditional upon the completion of specific acceptance records (goods receipt note, inspection release, and packing-list reconciliation). If these occur after the invoice date, the payment period is deferred, modifying the standard 'Net 30 from invoice' trigger.</w:t>
-            </w:r>
-          </w:p>
-        </w:tc>
-        <w:tc>
-          <w:tcPr>
-            <w:tcW w:type="dxa" w:w="1234"/>
-          </w:tcPr>
-          <w:p>
-            <w:r>
-              <w:t>Extended payment terms were previously accepted through executive waivers, often in exchange for price discounts or after confirmation of sufficient cash reserves.</w:t>
+            <w:tcW w:type="dxa" w:w="1440"/>
+          </w:tcPr>
+          <w:p>
+            <w:r>
+              <w:t>The requirement for Net 30 is present, but it is subject to several conditions: the invoice must be 'accepted' and 'valid', and the 30-day trigger is modified to start from the later of the invoice receipt or the completion of internal acceptance records (goods receipt, inspection release, etc.).</w:t>
+            </w:r>
+          </w:p>
+        </w:tc>
+        <w:tc>
+          <w:tcPr>
+            <w:tcW w:type="dxa" w:w="1440"/>
+          </w:tcPr>
+          <w:p>
+            <w:r>
+              <w:t>Deviations from the Net 30 standard have previously been resolved through executive waivers in exchange for price discounts.</w:t>
               <w:br/>
               <w:br/>
               <w:t>Historical Reference</w:t>
@@ -279,7 +248,7 @@
       <w:tr>
         <w:tc>
           <w:tcPr>
-            <w:tcW w:type="dxa" w:w="1234"/>
+            <w:tcW w:type="dxa" w:w="1440"/>
           </w:tcPr>
           <w:p>
             <w:r>
@@ -289,7 +258,7 @@
         </w:tc>
         <w:tc>
           <w:tcPr>
-            <w:tcW w:type="dxa" w:w="1234"/>
+            <w:tcW w:type="dxa" w:w="1440"/>
           </w:tcPr>
           <w:p>
             <w:r>
@@ -299,7 +268,7 @@
         </w:tc>
         <w:tc>
           <w:tcPr>
-            <w:tcW w:type="dxa" w:w="1234"/>
+            <w:tcW w:type="dxa" w:w="1440"/>
           </w:tcPr>
           <w:p>
             <w:r>
@@ -309,17 +278,7 @@
         </w:tc>
         <w:tc>
           <w:tcPr>
-            <w:tcW w:type="dxa" w:w="1234"/>
-          </w:tcPr>
-          <w:p>
-            <w:r>
-              <w:t>Met</w:t>
-            </w:r>
-          </w:p>
-        </w:tc>
-        <w:tc>
-          <w:tcPr>
-            <w:tcW w:type="dxa" w:w="1234"/>
+            <w:tcW w:type="dxa" w:w="1440"/>
           </w:tcPr>
           <w:p>
             <w:r>
@@ -329,21 +288,21 @@
         </w:tc>
         <w:tc>
           <w:tcPr>
-            <w:tcW w:type="dxa" w:w="1234"/>
-          </w:tcPr>
-          <w:p>
-            <w:r>
-              <w:t>The contract explicitly allows for separate dispatch and invoicing of lots, which satisfies the requirement for partial delivery and invoicing.</w:t>
-            </w:r>
-          </w:p>
-        </w:tc>
-        <w:tc>
-          <w:tcPr>
-            <w:tcW w:type="dxa" w:w="1234"/>
-          </w:tcPr>
-          <w:p>
-            <w:r>
-              <w:t>Restrictions on partial invoicing were historically managed through contract review board updates or by accepting the risk via executive waivers to secure sole-source exclusivity.</w:t>
+            <w:tcW w:type="dxa" w:w="1440"/>
+          </w:tcPr>
+          <w:p>
+            <w:r>
+              <w:t>The contract explicitly allows for separate dispatch (partial delivery) and corresponding invoicing for each completed lot.</w:t>
+            </w:r>
+          </w:p>
+        </w:tc>
+        <w:tc>
+          <w:tcPr>
+            <w:tcW w:type="dxa" w:w="1440"/>
+          </w:tcPr>
+          <w:p>
+            <w:r>
+              <w:t>Past discrepancies regarding partial invoicing were addressed through Contract Review Board updates or accepted as management risks to maintain sole-source exclusivity.</w:t>
               <w:br/>
               <w:br/>
               <w:t>Historical Reference</w:t>
@@ -360,7 +319,7 @@
       <w:tr>
         <w:tc>
           <w:tcPr>
-            <w:tcW w:type="dxa" w:w="1234"/>
+            <w:tcW w:type="dxa" w:w="1440"/>
           </w:tcPr>
           <w:p>
             <w:r>
@@ -370,7 +329,7 @@
         </w:tc>
         <w:tc>
           <w:tcPr>
-            <w:tcW w:type="dxa" w:w="1234"/>
+            <w:tcW w:type="dxa" w:w="1440"/>
           </w:tcPr>
           <w:p>
             <w:r>
@@ -380,7 +339,7 @@
         </w:tc>
         <w:tc>
           <w:tcPr>
-            <w:tcW w:type="dxa" w:w="1234"/>
+            <w:tcW w:type="dxa" w:w="1440"/>
           </w:tcPr>
           <w:p>
             <w:r>
@@ -390,17 +349,7 @@
         </w:tc>
         <w:tc>
           <w:tcPr>
-            <w:tcW w:type="dxa" w:w="1234"/>
-          </w:tcPr>
-          <w:p>
-            <w:r>
-              <w:t>Not Met</w:t>
-            </w:r>
-          </w:p>
-        </w:tc>
-        <w:tc>
-          <w:tcPr>
-            <w:tcW w:type="dxa" w:w="1234"/>
+            <w:tcW w:type="dxa" w:w="1440"/>
           </w:tcPr>
           <w:p>
             <w:r>
@@ -414,7 +363,7 @@
         </w:tc>
         <w:tc>
           <w:tcPr>
-            <w:tcW w:type="dxa" w:w="1234"/>
+            <w:tcW w:type="dxa" w:w="1440"/>
           </w:tcPr>
           <w:p>
             <w:r>
@@ -424,11 +373,11 @@
         </w:tc>
         <w:tc>
           <w:tcPr>
-            <w:tcW w:type="dxa" w:w="1234"/>
-          </w:tcPr>
-          <w:p>
-            <w:r>
-              <w:t>Performance security was reduced through legal overrides based on audited asset records and the removal of secondary maintenance bonds.</w:t>
+            <w:tcW w:type="dxa" w:w="1440"/>
+          </w:tcPr>
+          <w:p>
+            <w:r>
+              <w:t>Historically, performance security percentages were reduced via legal overrides following the submission and review of the vendor's audited global asset records.</w:t>
               <w:br/>
               <w:br/>
               <w:t>Historical Reference</w:t>
@@ -452,7 +401,7 @@
       <w:tr>
         <w:tc>
           <w:tcPr>
-            <w:tcW w:type="dxa" w:w="1234"/>
+            <w:tcW w:type="dxa" w:w="1440"/>
           </w:tcPr>
           <w:p>
             <w:r>
@@ -462,7 +411,7 @@
         </w:tc>
         <w:tc>
           <w:tcPr>
-            <w:tcW w:type="dxa" w:w="1234"/>
+            <w:tcW w:type="dxa" w:w="1440"/>
           </w:tcPr>
           <w:p>
             <w:r>
@@ -472,7 +421,7 @@
         </w:tc>
         <w:tc>
           <w:tcPr>
-            <w:tcW w:type="dxa" w:w="1234"/>
+            <w:tcW w:type="dxa" w:w="1440"/>
           </w:tcPr>
           <w:p>
             <w:r>
@@ -482,17 +431,7 @@
         </w:tc>
         <w:tc>
           <w:tcPr>
-            <w:tcW w:type="dxa" w:w="1234"/>
-          </w:tcPr>
-          <w:p>
-            <w:r>
-              <w:t>Met</w:t>
-            </w:r>
-          </w:p>
-        </w:tc>
-        <w:tc>
-          <w:tcPr>
-            <w:tcW w:type="dxa" w:w="1234"/>
+            <w:tcW w:type="dxa" w:w="1440"/>
           </w:tcPr>
           <w:p>
             <w:r>
@@ -504,7 +443,7 @@
         </w:tc>
         <w:tc>
           <w:tcPr>
-            <w:tcW w:type="dxa" w:w="1234"/>
+            <w:tcW w:type="dxa" w:w="1440"/>
           </w:tcPr>
           <w:p>
             <w:r>
@@ -516,11 +455,11 @@
         </w:tc>
         <w:tc>
           <w:tcPr>
-            <w:tcW w:type="dxa" w:w="1234"/>
-          </w:tcPr>
-          <w:p>
-            <w:r>
-              <w:t>Internal audits identified gaps in validity periods and missing expiry dates, leading to formal remediation demands and deferred amendments.</w:t>
+            <w:tcW w:type="dxa" w:w="1440"/>
+          </w:tcPr>
+          <w:p>
+            <w:r>
+              <w:t>Past discrepancies in validity periods were managed through internal audit identifications, leading to either deferred remediation in amendment cycles or formal demands for immediate correction of expiry and return protocols.</w:t>
               <w:br/>
               <w:br/>
               <w:t>Historical Reference</w:t>
@@ -537,7 +476,7 @@
       <w:tr>
         <w:tc>
           <w:tcPr>
-            <w:tcW w:type="dxa" w:w="1234"/>
+            <w:tcW w:type="dxa" w:w="1440"/>
           </w:tcPr>
           <w:p>
             <w:r>
@@ -547,7 +486,7 @@
         </w:tc>
         <w:tc>
           <w:tcPr>
-            <w:tcW w:type="dxa" w:w="1234"/>
+            <w:tcW w:type="dxa" w:w="1440"/>
           </w:tcPr>
           <w:p>
             <w:r>
@@ -557,7 +496,7 @@
         </w:tc>
         <w:tc>
           <w:tcPr>
-            <w:tcW w:type="dxa" w:w="1234"/>
+            <w:tcW w:type="dxa" w:w="1440"/>
           </w:tcPr>
           <w:p>
             <w:r>
@@ -567,17 +506,7 @@
         </w:tc>
         <w:tc>
           <w:tcPr>
-            <w:tcW w:type="dxa" w:w="1234"/>
-          </w:tcPr>
-          <w:p>
-            <w:r>
-              <w:t>Partially Met</w:t>
-            </w:r>
-          </w:p>
-        </w:tc>
-        <w:tc>
-          <w:tcPr>
-            <w:tcW w:type="dxa" w:w="1234"/>
+            <w:tcW w:type="dxa" w:w="1440"/>
           </w:tcPr>
           <w:p>
             <w:r>
@@ -589,7 +518,7 @@
         </w:tc>
         <w:tc>
           <w:tcPr>
-            <w:tcW w:type="dxa" w:w="1234"/>
+            <w:tcW w:type="dxa" w:w="1440"/>
           </w:tcPr>
           <w:p>
             <w:r>
@@ -599,101 +528,11 @@
         </w:tc>
         <w:tc>
           <w:tcPr>
-            <w:tcW w:type="dxa" w:w="1234"/>
-          </w:tcPr>
-          <w:p>
-            <w:r>
-              <w:t>Negotiations focused on removing financial penalties for documentation delays to align with corporate risk standards.</w:t>
-              <w:br/>
-              <w:br/>
-              <w:t>Historical Reference</w:t>
-              <w:br/>
-              <w:t>Source:</w:t>
-              <w:br/>
-              <w:t>d2.docx</w:t>
-              <w:br/>
-              <w:t>Clause: Liquidated Damages</w:t>
-              <w:br/>
-              <w:t>Requirement: Documentation LD not applicable</w:t>
-              <w:br/>
-              <w:br/>
-              <w:t>Quote:</w:t>
-              <w:br/>
-              <w:t>"Negotiated lower LD cap and explicitly removed all documentation-related financial penalty strings from the text."</w:t>
-            </w:r>
-          </w:p>
-        </w:tc>
-      </w:tr>
-      <w:tr>
-        <w:tc>
-          <w:tcPr>
-            <w:tcW w:type="dxa" w:w="1234"/>
-          </w:tcPr>
-          <w:p>
-            <w:r>
-              <w:t>Liquidated Damages</w:t>
-            </w:r>
-          </w:p>
-        </w:tc>
-        <w:tc>
-          <w:tcPr>
-            <w:tcW w:type="dxa" w:w="1234"/>
-          </w:tcPr>
-          <w:p>
-            <w:r>
-              <w:t>Equipment Delivery LD 0.5% per week</w:t>
-            </w:r>
-          </w:p>
-        </w:tc>
-        <w:tc>
-          <w:tcPr>
-            <w:tcW w:type="dxa" w:w="1234"/>
-          </w:tcPr>
-          <w:p>
-            <w:r>
-              <w:t>Provisions regarding 'Equipment Delivery LD 0.5% per week': For delay in delivery of equipment beyond the contractual delivery date, Supplier shall pay liquidated damages at zero point five percent (0. 5%) of the value of the undelivered part per completed week of delay.</w:t>
-            </w:r>
-          </w:p>
-        </w:tc>
-        <w:tc>
-          <w:tcPr>
-            <w:tcW w:type="dxa" w:w="1234"/>
-          </w:tcPr>
-          <w:p>
-            <w:r>
-              <w:t>Partially Met</w:t>
-            </w:r>
-          </w:p>
-        </w:tc>
-        <w:tc>
-          <w:tcPr>
-            <w:tcW w:type="dxa" w:w="1234"/>
-          </w:tcPr>
-          <w:p>
-            <w:r>
-              <w:t>For delay in delivery of equipment beyond the contractual delivery date, Supplier shall pay liquidated</w:t>
-              <w:br/>
-              <w:t>damages at zero point five percent (0.5%) of the value of the undelivered part per completed week of delay.</w:t>
-            </w:r>
-          </w:p>
-        </w:tc>
-        <w:tc>
-          <w:tcPr>
-            <w:tcW w:type="dxa" w:w="1234"/>
-          </w:tcPr>
-          <w:p>
-            <w:r>
-              <w:t>Clause contains material limitations, exceptions, carve-outs, conditions, or restricted applicability</w:t>
-            </w:r>
-          </w:p>
-        </w:tc>
-        <w:tc>
-          <w:tcPr>
-            <w:tcW w:type="dxa" w:w="1234"/>
-          </w:tcPr>
-          <w:p>
-            <w:r>
-              <w:t>While standard 0.5% rates were typically validated, some instances of higher rates led to deadlocked negotiations between vendor working groups.</w:t>
+            <w:tcW w:type="dxa" w:w="1440"/>
+          </w:tcPr>
+          <w:p>
+            <w:r>
+              <w:t>Historically, documentation-related penalties were either flagged for risk monitoring or explicitly removed from the text to isolate administrative delays from financial penalties.</w:t>
               <w:br/>
               <w:br/>
               <w:t>Historical Reference</w:t>
@@ -710,7 +549,7 @@
       <w:tr>
         <w:tc>
           <w:tcPr>
-            <w:tcW w:type="dxa" w:w="1234"/>
+            <w:tcW w:type="dxa" w:w="1440"/>
           </w:tcPr>
           <w:p>
             <w:r>
@@ -720,37 +559,27 @@
         </w:tc>
         <w:tc>
           <w:tcPr>
-            <w:tcW w:type="dxa" w:w="1234"/>
-          </w:tcPr>
-          <w:p>
-            <w:r>
-              <w:t>Equipment Delivery LD capped at 5%</w:t>
-            </w:r>
-          </w:p>
-        </w:tc>
-        <w:tc>
-          <w:tcPr>
-            <w:tcW w:type="dxa" w:w="1234"/>
-          </w:tcPr>
-          <w:p>
-            <w:r>
-              <w:t>Provisions regarding 'Equipment Delivery LD capped at 5%': For delay in delivery of equipment beyond the contractual delivery date, Supplier shall pay liquidated damages at zero point five percent (0. 5%) of the value of the undelivered part per completed week of delay.</w:t>
-            </w:r>
-          </w:p>
-        </w:tc>
-        <w:tc>
-          <w:tcPr>
-            <w:tcW w:type="dxa" w:w="1234"/>
-          </w:tcPr>
-          <w:p>
-            <w:r>
-              <w:t>Partially Met</w:t>
-            </w:r>
-          </w:p>
-        </w:tc>
-        <w:tc>
-          <w:tcPr>
-            <w:tcW w:type="dxa" w:w="1234"/>
+            <w:tcW w:type="dxa" w:w="1440"/>
+          </w:tcPr>
+          <w:p>
+            <w:r>
+              <w:t>Equipment Delivery LD 0.5% per week</w:t>
+            </w:r>
+          </w:p>
+        </w:tc>
+        <w:tc>
+          <w:tcPr>
+            <w:tcW w:type="dxa" w:w="1440"/>
+          </w:tcPr>
+          <w:p>
+            <w:r>
+              <w:t>Provisions regarding 'Equipment Delivery LD 0.5% per week': For delay in delivery of equipment beyond the contractual delivery date, Supplier shall pay liquidated damages at zero point five percent (0. 5%) of the value of the undelivered part per completed week of delay.</w:t>
+            </w:r>
+          </w:p>
+        </w:tc>
+        <w:tc>
+          <w:tcPr>
+            <w:tcW w:type="dxa" w:w="1440"/>
           </w:tcPr>
           <w:p>
             <w:r>
@@ -762,7 +591,7 @@
         </w:tc>
         <w:tc>
           <w:tcPr>
-            <w:tcW w:type="dxa" w:w="1234"/>
+            <w:tcW w:type="dxa" w:w="1440"/>
           </w:tcPr>
           <w:p>
             <w:r>
@@ -772,11 +601,11 @@
         </w:tc>
         <w:tc>
           <w:tcPr>
-            <w:tcW w:type="dxa" w:w="1234"/>
-          </w:tcPr>
-          <w:p>
-            <w:r>
-              <w:t>Efforts were made to establish clear component-level boundaries or shift from uncapped positions to aggregate frameworks during legal reviews.</w:t>
+            <w:tcW w:type="dxa" w:w="1440"/>
+          </w:tcPr>
+          <w:p>
+            <w:r>
+              <w:t>Standard 0.5% weekly rates have been validated by legal, while aggressive rates (e.g., 1.0%) were flagged for negotiation via vendor working groups.</w:t>
               <w:br/>
               <w:br/>
               <w:t>Historical Reference</w:t>
@@ -793,7 +622,7 @@
       <w:tr>
         <w:tc>
           <w:tcPr>
-            <w:tcW w:type="dxa" w:w="1234"/>
+            <w:tcW w:type="dxa" w:w="1440"/>
           </w:tcPr>
           <w:p>
             <w:r>
@@ -803,37 +632,27 @@
         </w:tc>
         <w:tc>
           <w:tcPr>
-            <w:tcW w:type="dxa" w:w="1234"/>
-          </w:tcPr>
-          <w:p>
-            <w:r>
-              <w:t>Aggregate LD capped at 5% PO value</w:t>
-            </w:r>
-          </w:p>
-        </w:tc>
-        <w:tc>
-          <w:tcPr>
-            <w:tcW w:type="dxa" w:w="1234"/>
-          </w:tcPr>
-          <w:p>
-            <w:r>
-              <w:t>Provisions regarding 'Aggregate LD capped at 5% PO value': For delay in delivery of equipment beyond the contractual delivery date, Supplier shall pay liquidated damages at zero point five percent (0. 5%) of the value of the undelivered part per completed week of delay.</w:t>
-            </w:r>
-          </w:p>
-        </w:tc>
-        <w:tc>
-          <w:tcPr>
-            <w:tcW w:type="dxa" w:w="1234"/>
-          </w:tcPr>
-          <w:p>
-            <w:r>
-              <w:t>Not Met</w:t>
-            </w:r>
-          </w:p>
-        </w:tc>
-        <w:tc>
-          <w:tcPr>
-            <w:tcW w:type="dxa" w:w="1234"/>
+            <w:tcW w:type="dxa" w:w="1440"/>
+          </w:tcPr>
+          <w:p>
+            <w:r>
+              <w:t>Equipment Delivery LD capped at 5%</w:t>
+            </w:r>
+          </w:p>
+        </w:tc>
+        <w:tc>
+          <w:tcPr>
+            <w:tcW w:type="dxa" w:w="1440"/>
+          </w:tcPr>
+          <w:p>
+            <w:r>
+              <w:t>Provisions regarding 'Equipment Delivery LD capped at 5%': For delay in delivery of equipment beyond the contractual delivery date, Supplier shall pay liquidated damages at zero point five percent (0. 5%) of the value of the undelivered part per completed week of delay.</w:t>
+            </w:r>
+          </w:p>
+        </w:tc>
+        <w:tc>
+          <w:tcPr>
+            <w:tcW w:type="dxa" w:w="1440"/>
           </w:tcPr>
           <w:p>
             <w:r>
@@ -845,7 +664,80 @@
         </w:tc>
         <w:tc>
           <w:tcPr>
-            <w:tcW w:type="dxa" w:w="1234"/>
+            <w:tcW w:type="dxa" w:w="1440"/>
+          </w:tcPr>
+          <w:p>
+            <w:r>
+              <w:t>Clause contains material limitations, exceptions, carve-outs, conditions, or restricted applicability</w:t>
+            </w:r>
+          </w:p>
+        </w:tc>
+        <w:tc>
+          <w:tcPr>
+            <w:tcW w:type="dxa" w:w="1440"/>
+          </w:tcPr>
+          <w:p>
+            <w:r>
+              <w:t>Efforts have focused on establishing clear component-level boundaries or renegotiating uncapped positions into aggregate frameworks during compromise rounds.</w:t>
+              <w:br/>
+              <w:br/>
+              <w:t>Historical Reference</w:t>
+              <w:br/>
+              <w:t>Sources:</w:t>
+              <w:br/>
+              <w:t>• d1.docx – Liquidated Damages</w:t>
+              <w:br/>
+              <w:t>• d2.docx – Liquidated Damages</w:t>
+            </w:r>
+          </w:p>
+        </w:tc>
+      </w:tr>
+      <w:tr>
+        <w:tc>
+          <w:tcPr>
+            <w:tcW w:type="dxa" w:w="1440"/>
+          </w:tcPr>
+          <w:p>
+            <w:r>
+              <w:t>Liquidated Damages</w:t>
+            </w:r>
+          </w:p>
+        </w:tc>
+        <w:tc>
+          <w:tcPr>
+            <w:tcW w:type="dxa" w:w="1440"/>
+          </w:tcPr>
+          <w:p>
+            <w:r>
+              <w:t>Aggregate LD capped at 5% PO value</w:t>
+            </w:r>
+          </w:p>
+        </w:tc>
+        <w:tc>
+          <w:tcPr>
+            <w:tcW w:type="dxa" w:w="1440"/>
+          </w:tcPr>
+          <w:p>
+            <w:r>
+              <w:t>Provisions regarding 'Aggregate LD capped at 5% PO value': For delay in delivery of equipment beyond the contractual delivery date, Supplier shall pay liquidated damages at zero point five percent (0. 5%) of the value of the undelivered part per completed week of delay.</w:t>
+            </w:r>
+          </w:p>
+        </w:tc>
+        <w:tc>
+          <w:tcPr>
+            <w:tcW w:type="dxa" w:w="1440"/>
+          </w:tcPr>
+          <w:p>
+            <w:r>
+              <w:t>For delay in delivery of equipment beyond the contractual delivery date, Supplier shall pay liquidated</w:t>
+              <w:br/>
+              <w:t>damages at zero point five percent (0.5%) of the value of the undelivered part per completed week of delay.</w:t>
+            </w:r>
+          </w:p>
+        </w:tc>
+        <w:tc>
+          <w:tcPr>
+            <w:tcW w:type="dxa" w:w="1440"/>
           </w:tcPr>
           <w:p>
             <w:r>
@@ -855,11 +747,11 @@
         </w:tc>
         <w:tc>
           <w:tcPr>
-            <w:tcW w:type="dxa" w:w="1234"/>
-          </w:tcPr>
-          <w:p>
-            <w:r>
-              <w:t>Corporate counsel and commercial settlements were used to replace higher penalty thresholds with a strict 5% absolute ceiling.</w:t>
+            <w:tcW w:type="dxa" w:w="1440"/>
+          </w:tcPr>
+          <w:p>
+            <w:r>
+              <w:t>Absolute 5% ceilings for total cumulative liability were established during global commercial settlement phases.</w:t>
               <w:br/>
               <w:br/>
               <w:t>Historical Reference</w:t>
@@ -883,7 +775,7 @@
       <w:tr>
         <w:tc>
           <w:tcPr>
-            <w:tcW w:type="dxa" w:w="1234"/>
+            <w:tcW w:type="dxa" w:w="1440"/>
           </w:tcPr>
           <w:p>
             <w:r>
@@ -893,7 +785,7 @@
         </w:tc>
         <w:tc>
           <w:tcPr>
-            <w:tcW w:type="dxa" w:w="1234"/>
+            <w:tcW w:type="dxa" w:w="1440"/>
           </w:tcPr>
           <w:p>
             <w:r>
@@ -903,7 +795,7 @@
         </w:tc>
         <w:tc>
           <w:tcPr>
-            <w:tcW w:type="dxa" w:w="1234"/>
+            <w:tcW w:type="dxa" w:w="1440"/>
           </w:tcPr>
           <w:p>
             <w:r>
@@ -913,17 +805,7 @@
         </w:tc>
         <w:tc>
           <w:tcPr>
-            <w:tcW w:type="dxa" w:w="1234"/>
-          </w:tcPr>
-          <w:p>
-            <w:r>
-              <w:t>Partially Met</w:t>
-            </w:r>
-          </w:p>
-        </w:tc>
-        <w:tc>
-          <w:tcPr>
-            <w:tcW w:type="dxa" w:w="1234"/>
+            <w:tcW w:type="dxa" w:w="1440"/>
           </w:tcPr>
           <w:p>
             <w:r>
@@ -935,7 +817,7 @@
         </w:tc>
         <w:tc>
           <w:tcPr>
-            <w:tcW w:type="dxa" w:w="1234"/>
+            <w:tcW w:type="dxa" w:w="1440"/>
           </w:tcPr>
           <w:p>
             <w:r>
@@ -945,11 +827,11 @@
         </w:tc>
         <w:tc>
           <w:tcPr>
-            <w:tcW w:type="dxa" w:w="1234"/>
-          </w:tcPr>
-          <w:p>
-            <w:r>
-              <w:t>Procurement teams worked to remove conditional dependencies to ensure penalties do not accrue during engineering remediation, though some risks remained under monitoring.</w:t>
+            <w:tcW w:type="dxa" w:w="1440"/>
+          </w:tcPr>
+          <w:p>
+            <w:r>
+              <w:t>Procurement teams have historically removed conditional dependencies from drafts to ensure penalties do not accrue during active engineering remediation.</w:t>
               <w:br/>
               <w:br/>
               <w:t>Historical Reference</w:t>
@@ -966,7 +848,7 @@
       <w:tr>
         <w:tc>
           <w:tcPr>
-            <w:tcW w:type="dxa" w:w="1234"/>
+            <w:tcW w:type="dxa" w:w="1440"/>
           </w:tcPr>
           <w:p>
             <w:r>
@@ -976,7 +858,7 @@
         </w:tc>
         <w:tc>
           <w:tcPr>
-            <w:tcW w:type="dxa" w:w="1234"/>
+            <w:tcW w:type="dxa" w:w="1440"/>
           </w:tcPr>
           <w:p>
             <w:r>
@@ -986,7 +868,7 @@
         </w:tc>
         <w:tc>
           <w:tcPr>
-            <w:tcW w:type="dxa" w:w="1234"/>
+            <w:tcW w:type="dxa" w:w="1440"/>
           </w:tcPr>
           <w:p>
             <w:r>
@@ -996,17 +878,7 @@
         </w:tc>
         <w:tc>
           <w:tcPr>
-            <w:tcW w:type="dxa" w:w="1234"/>
-          </w:tcPr>
-          <w:p>
-            <w:r>
-              <w:t>Partially Met</w:t>
-            </w:r>
-          </w:p>
-        </w:tc>
-        <w:tc>
-          <w:tcPr>
-            <w:tcW w:type="dxa" w:w="1234"/>
+            <w:tcW w:type="dxa" w:w="1440"/>
           </w:tcPr>
           <w:p>
             <w:r>
@@ -1018,7 +890,7 @@
         </w:tc>
         <w:tc>
           <w:tcPr>
-            <w:tcW w:type="dxa" w:w="1234"/>
+            <w:tcW w:type="dxa" w:w="1440"/>
           </w:tcPr>
           <w:p>
             <w:r>
@@ -1028,11 +900,11 @@
         </w:tc>
         <w:tc>
           <w:tcPr>
-            <w:tcW w:type="dxa" w:w="1234"/>
-          </w:tcPr>
-          <w:p>
-            <w:r>
-              <w:t>The commercial team successfully negotiated extended warranty periods by making reciprocal concessions on maritime shipping and intellectual property clauses.</w:t>
+            <w:tcW w:type="dxa" w:w="1440"/>
+          </w:tcPr>
+          <w:p>
+            <w:r>
+              <w:t>Commercial teams have historically secured extended warranty periods by negotiating reciprocal adjustments to maritime shipping or intellectual property clauses.</w:t>
               <w:br/>
               <w:br/>
               <w:t>Historical Reference</w:t>
@@ -1049,7 +921,7 @@
       <w:tr>
         <w:tc>
           <w:tcPr>
-            <w:tcW w:type="dxa" w:w="1234"/>
+            <w:tcW w:type="dxa" w:w="1440"/>
           </w:tcPr>
           <w:p>
             <w:r>
@@ -1059,7 +931,7 @@
         </w:tc>
         <w:tc>
           <w:tcPr>
-            <w:tcW w:type="dxa" w:w="1234"/>
+            <w:tcW w:type="dxa" w:w="1440"/>
           </w:tcPr>
           <w:p>
             <w:r>
@@ -1069,7 +941,7 @@
         </w:tc>
         <w:tc>
           <w:tcPr>
-            <w:tcW w:type="dxa" w:w="1234"/>
+            <w:tcW w:type="dxa" w:w="1440"/>
           </w:tcPr>
           <w:p>
             <w:r>
@@ -1079,17 +951,7 @@
         </w:tc>
         <w:tc>
           <w:tcPr>
-            <w:tcW w:type="dxa" w:w="1234"/>
-          </w:tcPr>
-          <w:p>
-            <w:r>
-              <w:t>Partially Met</w:t>
-            </w:r>
-          </w:p>
-        </w:tc>
-        <w:tc>
-          <w:tcPr>
-            <w:tcW w:type="dxa" w:w="1234"/>
+            <w:tcW w:type="dxa" w:w="1440"/>
           </w:tcPr>
           <w:p>
             <w:r>
@@ -1101,7 +963,7 @@
         </w:tc>
         <w:tc>
           <w:tcPr>
-            <w:tcW w:type="dxa" w:w="1234"/>
+            <w:tcW w:type="dxa" w:w="1440"/>
           </w:tcPr>
           <w:p>
             <w:r>
@@ -1111,11 +973,11 @@
         </w:tc>
         <w:tc>
           <w:tcPr>
-            <w:tcW w:type="dxa" w:w="1234"/>
-          </w:tcPr>
-          <w:p>
-            <w:r>
-              <w:t>Efforts to align warranty triggers involved renegotiating durations during legal reviews and escalating risks to the Project Director when multi-trigger requirements were not met.</w:t>
+            <w:tcW w:type="dxa" w:w="1440"/>
+          </w:tcPr>
+          <w:p>
+            <w:r>
+              <w:t>Failures to meet multi-trigger commissioning timelines were previously escalated to the Project Director and logged as formal corporate risks, or renegotiated during legal review to defer environmental exceptions.</w:t>
               <w:br/>
               <w:br/>
               <w:t>Historical Reference</w:t>
@@ -1132,7 +994,7 @@
       <w:tr>
         <w:tc>
           <w:tcPr>
-            <w:tcW w:type="dxa" w:w="1234"/>
+            <w:tcW w:type="dxa" w:w="1440"/>
           </w:tcPr>
           <w:p>
             <w:r>
@@ -1142,7 +1004,7 @@
         </w:tc>
         <w:tc>
           <w:tcPr>
-            <w:tcW w:type="dxa" w:w="1234"/>
+            <w:tcW w:type="dxa" w:w="1440"/>
           </w:tcPr>
           <w:p>
             <w:r>
@@ -1152,7 +1014,7 @@
         </w:tc>
         <w:tc>
           <w:tcPr>
-            <w:tcW w:type="dxa" w:w="1234"/>
+            <w:tcW w:type="dxa" w:w="1440"/>
           </w:tcPr>
           <w:p>
             <w:r>
@@ -1162,17 +1024,7 @@
         </w:tc>
         <w:tc>
           <w:tcPr>
-            <w:tcW w:type="dxa" w:w="1234"/>
-          </w:tcPr>
-          <w:p>
-            <w:r>
-              <w:t>Partially Met</w:t>
-            </w:r>
-          </w:p>
-        </w:tc>
-        <w:tc>
-          <w:tcPr>
-            <w:tcW w:type="dxa" w:w="1234"/>
+            <w:tcW w:type="dxa" w:w="1440"/>
           </w:tcPr>
           <w:p>
             <w:r>
@@ -1184,7 +1036,7 @@
         </w:tc>
         <w:tc>
           <w:tcPr>
-            <w:tcW w:type="dxa" w:w="1234"/>
+            <w:tcW w:type="dxa" w:w="1440"/>
           </w:tcPr>
           <w:p>
             <w:r>
@@ -1194,11 +1046,11 @@
         </w:tc>
         <w:tc>
           <w:tcPr>
-            <w:tcW w:type="dxa" w:w="1234"/>
-          </w:tcPr>
-          <w:p>
-            <w:r>
-              <w:t>Warranty obligations for repairs and replacements were finalized by adopting vendor-proposed wording and revising coverage limits during engineering alignment meetings.</w:t>
+            <w:tcW w:type="dxa" w:w="1440"/>
+          </w:tcPr>
+          <w:p>
+            <w:r>
+              <w:t>Warranty coverage limits for repaired or replaced components were previously refined during final engineering alignment meetings and finalized by legal counsel.</w:t>
               <w:br/>
               <w:br/>
               <w:t>Historical Reference</w:t>
@@ -1222,7 +1074,7 @@
       <w:tr>
         <w:tc>
           <w:tcPr>
-            <w:tcW w:type="dxa" w:w="1234"/>
+            <w:tcW w:type="dxa" w:w="1440"/>
           </w:tcPr>
           <w:p>
             <w:r>
@@ -1232,7 +1084,7 @@
         </w:tc>
         <w:tc>
           <w:tcPr>
-            <w:tcW w:type="dxa" w:w="1234"/>
+            <w:tcW w:type="dxa" w:w="1440"/>
           </w:tcPr>
           <w:p>
             <w:r>
@@ -1242,7 +1094,7 @@
         </w:tc>
         <w:tc>
           <w:tcPr>
-            <w:tcW w:type="dxa" w:w="1234"/>
+            <w:tcW w:type="dxa" w:w="1440"/>
           </w:tcPr>
           <w:p>
             <w:r>
@@ -1252,17 +1104,7 @@
         </w:tc>
         <w:tc>
           <w:tcPr>
-            <w:tcW w:type="dxa" w:w="1234"/>
-          </w:tcPr>
-          <w:p>
-            <w:r>
-              <w:t>Partially Met</w:t>
-            </w:r>
-          </w:p>
-        </w:tc>
-        <w:tc>
-          <w:tcPr>
-            <w:tcW w:type="dxa" w:w="1234"/>
+            <w:tcW w:type="dxa" w:w="1440"/>
           </w:tcPr>
           <w:p>
             <w:r>
@@ -1274,7 +1116,7 @@
         </w:tc>
         <w:tc>
           <w:tcPr>
-            <w:tcW w:type="dxa" w:w="1234"/>
+            <w:tcW w:type="dxa" w:w="1440"/>
           </w:tcPr>
           <w:p>
             <w:r>
@@ -1284,11 +1126,11 @@
         </w:tc>
         <w:tc>
           <w:tcPr>
-            <w:tcW w:type="dxa" w:w="1234"/>
-          </w:tcPr>
-          <w:p>
-            <w:r>
-              <w:t>Force majeure definitions were standardized across drafts and expanded to include specific risks like regional power grid failures following legal audits.</w:t>
+            <w:tcW w:type="dxa" w:w="1440"/>
+          </w:tcPr>
+          <w:p>
+            <w:r>
+              <w:t>Historically, definitions were expanded to include regional infrastructure failures and standardized across all baseline drafts to ensure neutral, unambiguous boundaries.</w:t>
               <w:br/>
               <w:br/>
               <w:t>Historical Reference</w:t>
@@ -1305,7 +1147,7 @@
       <w:tr>
         <w:tc>
           <w:tcPr>
-            <w:tcW w:type="dxa" w:w="1234"/>
+            <w:tcW w:type="dxa" w:w="1440"/>
           </w:tcPr>
           <w:p>
             <w:r>
@@ -1315,7 +1157,7 @@
         </w:tc>
         <w:tc>
           <w:tcPr>
-            <w:tcW w:type="dxa" w:w="1234"/>
+            <w:tcW w:type="dxa" w:w="1440"/>
           </w:tcPr>
           <w:p>
             <w:r>
@@ -1325,7 +1167,7 @@
         </w:tc>
         <w:tc>
           <w:tcPr>
-            <w:tcW w:type="dxa" w:w="1234"/>
+            <w:tcW w:type="dxa" w:w="1440"/>
           </w:tcPr>
           <w:p>
             <w:r>
@@ -1335,17 +1177,7 @@
         </w:tc>
         <w:tc>
           <w:tcPr>
-            <w:tcW w:type="dxa" w:w="1234"/>
-          </w:tcPr>
-          <w:p>
-            <w:r>
-              <w:t>Partially Met</w:t>
-            </w:r>
-          </w:p>
-        </w:tc>
-        <w:tc>
-          <w:tcPr>
-            <w:tcW w:type="dxa" w:w="1234"/>
+            <w:tcW w:type="dxa" w:w="1440"/>
           </w:tcPr>
           <w:p>
             <w:r>
@@ -1355,7 +1187,7 @@
         </w:tc>
         <w:tc>
           <w:tcPr>
-            <w:tcW w:type="dxa" w:w="1234"/>
+            <w:tcW w:type="dxa" w:w="1440"/>
           </w:tcPr>
           <w:p>
             <w:r>
@@ -1365,11 +1197,11 @@
         </w:tc>
         <w:tc>
           <w:tcPr>
-            <w:tcW w:type="dxa" w:w="1234"/>
-          </w:tcPr>
-          <w:p>
-            <w:r>
-              <w:t>Wording was adjusted through a subcontractor compliance review and formal amendments to ensure force majeure relief extends to the entire supply chain.</w:t>
+            <w:tcW w:type="dxa" w:w="1440"/>
+          </w:tcPr>
+          <w:p>
+            <w:r>
+              <w:t>Previous actions involved adjusting wording to ensure relief explicitly extends to all approved subcontractors and component suppliers throughout the execution chain.</w:t>
               <w:br/>
               <w:br/>
               <w:t>Historical Reference</w:t>
@@ -1393,7 +1225,7 @@
       <w:tr>
         <w:tc>
           <w:tcPr>
-            <w:tcW w:type="dxa" w:w="1234"/>
+            <w:tcW w:type="dxa" w:w="1440"/>
           </w:tcPr>
           <w:p>
             <w:r>
@@ -1403,7 +1235,7 @@
         </w:tc>
         <w:tc>
           <w:tcPr>
-            <w:tcW w:type="dxa" w:w="1234"/>
+            <w:tcW w:type="dxa" w:w="1440"/>
           </w:tcPr>
           <w:p>
             <w:r>
@@ -1413,7 +1245,7 @@
         </w:tc>
         <w:tc>
           <w:tcPr>
-            <w:tcW w:type="dxa" w:w="1234"/>
+            <w:tcW w:type="dxa" w:w="1440"/>
           </w:tcPr>
           <w:p>
             <w:r>
@@ -1423,17 +1255,7 @@
         </w:tc>
         <w:tc>
           <w:tcPr>
-            <w:tcW w:type="dxa" w:w="1234"/>
-          </w:tcPr>
-          <w:p>
-            <w:r>
-              <w:t>Partially Met</w:t>
-            </w:r>
-          </w:p>
-        </w:tc>
-        <w:tc>
-          <w:tcPr>
-            <w:tcW w:type="dxa" w:w="1234"/>
+            <w:tcW w:type="dxa" w:w="1440"/>
           </w:tcPr>
           <w:p>
             <w:r>
@@ -1445,7 +1267,7 @@
         </w:tc>
         <w:tc>
           <w:tcPr>
-            <w:tcW w:type="dxa" w:w="1234"/>
+            <w:tcW w:type="dxa" w:w="1440"/>
           </w:tcPr>
           <w:p>
             <w:r>
@@ -1455,11 +1277,11 @@
         </w:tc>
         <w:tc>
           <w:tcPr>
-            <w:tcW w:type="dxa" w:w="1234"/>
-          </w:tcPr>
-          <w:p>
-            <w:r>
-              <w:t>Notice periods were simplified and extended from an unrealistic 24-hour window to more achievable timelines, such as 72 hours or five business days.</w:t>
+            <w:tcW w:type="dxa" w:w="1440"/>
+          </w:tcPr>
+          <w:p>
+            <w:r>
+              <w:t>Negotiations focused on replacing unrealistic 24-hour notification windows with more achievable timelines, such as 72 hours or five business days.</w:t>
               <w:br/>
               <w:br/>
               <w:t>Historical Reference</w:t>
@@ -1476,7 +1298,7 @@
       <w:tr>
         <w:tc>
           <w:tcPr>
-            <w:tcW w:type="dxa" w:w="1234"/>
+            <w:tcW w:type="dxa" w:w="1440"/>
           </w:tcPr>
           <w:p>
             <w:r>
@@ -1486,7 +1308,7 @@
         </w:tc>
         <w:tc>
           <w:tcPr>
-            <w:tcW w:type="dxa" w:w="1234"/>
+            <w:tcW w:type="dxa" w:w="1440"/>
           </w:tcPr>
           <w:p>
             <w:r>
@@ -1496,7 +1318,7 @@
         </w:tc>
         <w:tc>
           <w:tcPr>
-            <w:tcW w:type="dxa" w:w="1234"/>
+            <w:tcW w:type="dxa" w:w="1440"/>
           </w:tcPr>
           <w:p>
             <w:r>
@@ -1506,17 +1328,7 @@
         </w:tc>
         <w:tc>
           <w:tcPr>
-            <w:tcW w:type="dxa" w:w="1234"/>
-          </w:tcPr>
-          <w:p>
-            <w:r>
-              <w:t>Met</w:t>
-            </w:r>
-          </w:p>
-        </w:tc>
-        <w:tc>
-          <w:tcPr>
-            <w:tcW w:type="dxa" w:w="1234"/>
+            <w:tcW w:type="dxa" w:w="1440"/>
           </w:tcPr>
           <w:p>
             <w:r>
@@ -1532,7 +1344,7 @@
         </w:tc>
         <w:tc>
           <w:tcPr>
-            <w:tcW w:type="dxa" w:w="1234"/>
+            <w:tcW w:type="dxa" w:w="1440"/>
           </w:tcPr>
           <w:p>
             <w:r>
@@ -1548,11 +1360,11 @@
         </w:tc>
         <w:tc>
           <w:tcPr>
-            <w:tcW w:type="dxa" w:w="1234"/>
-          </w:tcPr>
-          <w:p>
-            <w:r>
-              <w:t>Termination rights were standardized by the legal team, though some efforts focused on balancing the contract to allow supplier-initiated termination for non-payment.</w:t>
+            <w:tcW w:type="dxa" w:w="1440"/>
+          </w:tcPr>
+          <w:p>
+            <w:r>
+              <w:t>Efforts were made to balance termination rights by addressing reciprocal pathways for supplier-initiated termination and standardizing rules via legal review.</w:t>
               <w:br/>
               <w:br/>
               <w:t>Historical Reference</w:t>
@@ -1569,7 +1381,7 @@
       <w:tr>
         <w:tc>
           <w:tcPr>
-            <w:tcW w:type="dxa" w:w="1234"/>
+            <w:tcW w:type="dxa" w:w="1440"/>
           </w:tcPr>
           <w:p>
             <w:r>
@@ -1579,7 +1391,7 @@
         </w:tc>
         <w:tc>
           <w:tcPr>
-            <w:tcW w:type="dxa" w:w="1234"/>
+            <w:tcW w:type="dxa" w:w="1440"/>
           </w:tcPr>
           <w:p>
             <w:r>
@@ -1589,7 +1401,7 @@
         </w:tc>
         <w:tc>
           <w:tcPr>
-            <w:tcW w:type="dxa" w:w="1234"/>
+            <w:tcW w:type="dxa" w:w="1440"/>
           </w:tcPr>
           <w:p>
             <w:r>
@@ -1599,17 +1411,7 @@
         </w:tc>
         <w:tc>
           <w:tcPr>
-            <w:tcW w:type="dxa" w:w="1234"/>
-          </w:tcPr>
-          <w:p>
-            <w:r>
-              <w:t>Met</w:t>
-            </w:r>
-          </w:p>
-        </w:tc>
-        <w:tc>
-          <w:tcPr>
-            <w:tcW w:type="dxa" w:w="1234"/>
+            <w:tcW w:type="dxa" w:w="1440"/>
           </w:tcPr>
           <w:p>
             <w:r>
@@ -1625,7 +1427,7 @@
         </w:tc>
         <w:tc>
           <w:tcPr>
-            <w:tcW w:type="dxa" w:w="1234"/>
+            <w:tcW w:type="dxa" w:w="1440"/>
           </w:tcPr>
           <w:p>
             <w:r>
@@ -1641,11 +1443,11 @@
         </w:tc>
         <w:tc>
           <w:tcPr>
-            <w:tcW w:type="dxa" w:w="1234"/>
-          </w:tcPr>
-          <w:p>
-            <w:r>
-              <w:t>The commercial team attempted to replace rigid flat-rate lump sums with dynamic milestone-based fee structures to better protect work-in-progress investments.</w:t>
+            <w:tcW w:type="dxa" w:w="1440"/>
+          </w:tcPr>
+          <w:p>
+            <w:r>
+              <w:t>Negotiations focused on transitioning from flat-rate lump sums to dynamic milestone tracking to better protect work-in-progress and material investments.</w:t>
               <w:br/>
               <w:br/>
               <w:t>Historical Reference</w:t>
@@ -1662,7 +1464,7 @@
       <w:tr>
         <w:tc>
           <w:tcPr>
-            <w:tcW w:type="dxa" w:w="1234"/>
+            <w:tcW w:type="dxa" w:w="1440"/>
           </w:tcPr>
           <w:p>
             <w:r>
@@ -1672,7 +1474,7 @@
         </w:tc>
         <w:tc>
           <w:tcPr>
-            <w:tcW w:type="dxa" w:w="1234"/>
+            <w:tcW w:type="dxa" w:w="1440"/>
           </w:tcPr>
           <w:p>
             <w:r>
@@ -1682,7 +1484,7 @@
         </w:tc>
         <w:tc>
           <w:tcPr>
-            <w:tcW w:type="dxa" w:w="1234"/>
+            <w:tcW w:type="dxa" w:w="1440"/>
           </w:tcPr>
           <w:p>
             <w:r>
@@ -1692,17 +1494,7 @@
         </w:tc>
         <w:tc>
           <w:tcPr>
-            <w:tcW w:type="dxa" w:w="1234"/>
-          </w:tcPr>
-          <w:p>
-            <w:r>
-              <w:t>Not Met</w:t>
-            </w:r>
-          </w:p>
-        </w:tc>
-        <w:tc>
-          <w:tcPr>
-            <w:tcW w:type="dxa" w:w="1234"/>
+            <w:tcW w:type="dxa" w:w="1440"/>
           </w:tcPr>
           <w:p>
             <w:r>
@@ -1712,7 +1504,7 @@
         </w:tc>
         <w:tc>
           <w:tcPr>
-            <w:tcW w:type="dxa" w:w="1234"/>
+            <w:tcW w:type="dxa" w:w="1440"/>
           </w:tcPr>
           <w:p>
             <w:r>
@@ -1722,11 +1514,11 @@
         </w:tc>
         <w:tc>
           <w:tcPr>
-            <w:tcW w:type="dxa" w:w="1234"/>
-          </w:tcPr>
-          <w:p>
-            <w:r>
-              <w:t>Baseline percentages were corrected during formatting reviews and finalized following a legal review to address asset tracking shortfalls.</w:t>
+            <w:tcW w:type="dxa" w:w="1440"/>
+          </w:tcPr>
+          <w:p>
+            <w:r>
+              <w:t>Baseline percentages were re-aligned and corrected during pre-signature reviews to ensure strict adherence to corporate material recovery guidelines.</w:t>
               <w:br/>
               <w:br/>
               <w:t>Historical Reference</w:t>
@@ -1750,7 +1542,7 @@
       <w:tr>
         <w:tc>
           <w:tcPr>
-            <w:tcW w:type="dxa" w:w="1234"/>
+            <w:tcW w:type="dxa" w:w="1440"/>
           </w:tcPr>
           <w:p>
             <w:r>
@@ -1760,7 +1552,7 @@
         </w:tc>
         <w:tc>
           <w:tcPr>
-            <w:tcW w:type="dxa" w:w="1234"/>
+            <w:tcW w:type="dxa" w:w="1440"/>
           </w:tcPr>
           <w:p>
             <w:r>
@@ -1770,7 +1562,7 @@
         </w:tc>
         <w:tc>
           <w:tcPr>
-            <w:tcW w:type="dxa" w:w="1234"/>
+            <w:tcW w:type="dxa" w:w="1440"/>
           </w:tcPr>
           <w:p>
             <w:r>
@@ -1780,17 +1572,7 @@
         </w:tc>
         <w:tc>
           <w:tcPr>
-            <w:tcW w:type="dxa" w:w="1234"/>
-          </w:tcPr>
-          <w:p>
-            <w:r>
-              <w:t>Partially Met</w:t>
-            </w:r>
-          </w:p>
-        </w:tc>
-        <w:tc>
-          <w:tcPr>
-            <w:tcW w:type="dxa" w:w="1234"/>
+            <w:tcW w:type="dxa" w:w="1440"/>
           </w:tcPr>
           <w:p>
             <w:r>
@@ -1800,7 +1582,7 @@
         </w:tc>
         <w:tc>
           <w:tcPr>
-            <w:tcW w:type="dxa" w:w="1234"/>
+            <w:tcW w:type="dxa" w:w="1440"/>
           </w:tcPr>
           <w:p>
             <w:r>
@@ -1810,11 +1592,11 @@
         </w:tc>
         <w:tc>
           <w:tcPr>
-            <w:tcW w:type="dxa" w:w="1234"/>
-          </w:tcPr>
-          <w:p>
-            <w:r>
-              <w:t>Hard duration limits and an approval workflow were implemented following a review of previous contract disputes.</w:t>
+            <w:tcW w:type="dxa" w:w="1440"/>
+          </w:tcPr>
+          <w:p>
+            <w:r>
+              <w:t>Implemented a formal suspension approval workflow and established hard duration limits to prevent indefinite project pauses following previous contract disputes.</w:t>
               <w:br/>
               <w:br/>
               <w:t>Historical Reference</w:t>
@@ -1838,7 +1620,7 @@
       <w:tr>
         <w:tc>
           <w:tcPr>
-            <w:tcW w:type="dxa" w:w="1234"/>
+            <w:tcW w:type="dxa" w:w="1440"/>
           </w:tcPr>
           <w:p>
             <w:r>
@@ -1848,7 +1630,7 @@
         </w:tc>
         <w:tc>
           <w:tcPr>
-            <w:tcW w:type="dxa" w:w="1234"/>
+            <w:tcW w:type="dxa" w:w="1440"/>
           </w:tcPr>
           <w:p>
             <w:r>
@@ -1858,7 +1640,7 @@
         </w:tc>
         <w:tc>
           <w:tcPr>
-            <w:tcW w:type="dxa" w:w="1234"/>
+            <w:tcW w:type="dxa" w:w="1440"/>
           </w:tcPr>
           <w:p>
             <w:r>
@@ -1868,17 +1650,7 @@
         </w:tc>
         <w:tc>
           <w:tcPr>
-            <w:tcW w:type="dxa" w:w="1234"/>
-          </w:tcPr>
-          <w:p>
-            <w:r>
-              <w:t>Met</w:t>
-            </w:r>
-          </w:p>
-        </w:tc>
-        <w:tc>
-          <w:tcPr>
-            <w:tcW w:type="dxa" w:w="1234"/>
+            <w:tcW w:type="dxa" w:w="1440"/>
           </w:tcPr>
           <w:p>
             <w:r>
@@ -1892,7 +1664,7 @@
         </w:tc>
         <w:tc>
           <w:tcPr>
-            <w:tcW w:type="dxa" w:w="1234"/>
+            <w:tcW w:type="dxa" w:w="1440"/>
           </w:tcPr>
           <w:p>
             <w:r>
@@ -1906,11 +1678,11 @@
         </w:tc>
         <w:tc>
           <w:tcPr>
-            <w:tcW w:type="dxa" w:w="1234"/>
-          </w:tcPr>
-          <w:p>
-            <w:r>
-              <w:t>Engineering teams embedded explicit preservation protocols into the contract, while maintenance cost allocations were escalated to the procurement board.</w:t>
+            <w:tcW w:type="dxa" w:w="1440"/>
+          </w:tcPr>
+          <w:p>
+            <w:r>
+              <w:t>Standardized preservation protocol requirements within the contract text and escalated unresolved maintenance cost allocations to the procurement board for final ruling.</w:t>
               <w:br/>
               <w:br/>
               <w:t>Historical Reference</w:t>
@@ -1927,7 +1699,7 @@
       <w:tr>
         <w:tc>
           <w:tcPr>
-            <w:tcW w:type="dxa" w:w="1234"/>
+            <w:tcW w:type="dxa" w:w="1440"/>
           </w:tcPr>
           <w:p>
             <w:r>
@@ -1937,7 +1709,7 @@
         </w:tc>
         <w:tc>
           <w:tcPr>
-            <w:tcW w:type="dxa" w:w="1234"/>
+            <w:tcW w:type="dxa" w:w="1440"/>
           </w:tcPr>
           <w:p>
             <w:r>
@@ -1947,7 +1719,7 @@
         </w:tc>
         <w:tc>
           <w:tcPr>
-            <w:tcW w:type="dxa" w:w="1234"/>
+            <w:tcW w:type="dxa" w:w="1440"/>
           </w:tcPr>
           <w:p>
             <w:r>
@@ -1957,17 +1729,7 @@
         </w:tc>
         <w:tc>
           <w:tcPr>
-            <w:tcW w:type="dxa" w:w="1234"/>
-          </w:tcPr>
-          <w:p>
-            <w:r>
-              <w:t>Met</w:t>
-            </w:r>
-          </w:p>
-        </w:tc>
-        <w:tc>
-          <w:tcPr>
-            <w:tcW w:type="dxa" w:w="1234"/>
+            <w:tcW w:type="dxa" w:w="1440"/>
           </w:tcPr>
           <w:p>
             <w:r>
@@ -1981,7 +1743,7 @@
         </w:tc>
         <w:tc>
           <w:tcPr>
-            <w:tcW w:type="dxa" w:w="1234"/>
+            <w:tcW w:type="dxa" w:w="1440"/>
           </w:tcPr>
           <w:p>
             <w:r>
@@ -1995,27 +1757,20 @@
         </w:tc>
         <w:tc>
           <w:tcPr>
-            <w:tcW w:type="dxa" w:w="1234"/>
-          </w:tcPr>
-          <w:p>
-            <w:r>
-              <w:t>A formal change request protocol and a strict document precedence matrix were integrated to eliminate risks associated with informal amendments.</w:t>
+            <w:tcW w:type="dxa" w:w="1440"/>
+          </w:tcPr>
+          <w:p>
+            <w:r>
+              <w:t>Established a formal change request protocol and integrated a strict document precedence matrix to resolve conflicting instructions between technical communications and the main contract.</w:t>
               <w:br/>
               <w:br/>
               <w:t>Historical Reference</w:t>
               <w:br/>
-              <w:t>Source:</w:t>
+              <w:t>Sources:</w:t>
               <w:br/>
-              <w:t>d2.docx</w:t>
+              <w:t>• d1.docx – Change Orders</w:t>
               <w:br/>
-              <w:t>Clause: Change Orders</w:t>
-              <w:br/>
-              <w:t>Requirement: Formal amendment process defined</w:t>
-              <w:br/>
-              <w:br/>
-              <w:t>Quote:</w:t>
-              <w:br/>
-              <w:t>"Implemented formal change request protocol and strict document precedence matrix; closed after amendment integration."</w:t>
+              <w:t>• d2.docx – Change Orders</w:t>
             </w:r>
           </w:p>
         </w:tc>
@@ -2023,7 +1778,7 @@
       <w:tr>
         <w:tc>
           <w:tcPr>
-            <w:tcW w:type="dxa" w:w="1234"/>
+            <w:tcW w:type="dxa" w:w="1440"/>
           </w:tcPr>
           <w:p>
             <w:r>
@@ -2033,7 +1788,7 @@
         </w:tc>
         <w:tc>
           <w:tcPr>
-            <w:tcW w:type="dxa" w:w="1234"/>
+            <w:tcW w:type="dxa" w:w="1440"/>
           </w:tcPr>
           <w:p>
             <w:r>
@@ -2043,7 +1798,7 @@
         </w:tc>
         <w:tc>
           <w:tcPr>
-            <w:tcW w:type="dxa" w:w="1234"/>
+            <w:tcW w:type="dxa" w:w="1440"/>
           </w:tcPr>
           <w:p>
             <w:r>
@@ -2053,17 +1808,7 @@
         </w:tc>
         <w:tc>
           <w:tcPr>
-            <w:tcW w:type="dxa" w:w="1234"/>
-          </w:tcPr>
-          <w:p>
-            <w:r>
-              <w:t>Met</w:t>
-            </w:r>
-          </w:p>
-        </w:tc>
-        <w:tc>
-          <w:tcPr>
-            <w:tcW w:type="dxa" w:w="1234"/>
+            <w:tcW w:type="dxa" w:w="1440"/>
           </w:tcPr>
           <w:p>
             <w:r>
@@ -2077,7 +1822,7 @@
         </w:tc>
         <w:tc>
           <w:tcPr>
-            <w:tcW w:type="dxa" w:w="1234"/>
+            <w:tcW w:type="dxa" w:w="1440"/>
           </w:tcPr>
           <w:p>
             <w:r>
@@ -2091,27 +1836,20 @@
         </w:tc>
         <w:tc>
           <w:tcPr>
-            <w:tcW w:type="dxa" w:w="1234"/>
-          </w:tcPr>
-          <w:p>
-            <w:r>
-              <w:t>Efforts were made to replace vague timeframes with a formal approval process and to eliminate unilateral directives that bypassed cost tracking.</w:t>
+            <w:tcW w:type="dxa" w:w="1440"/>
+          </w:tcPr>
+          <w:p>
+            <w:r>
+              <w:t>Addressed approval timeline gaps by assigning a vendor working group to replace vague 'reasonable commercial' language with firm deadlines and flagging unilateral directives for removal.</w:t>
               <w:br/>
               <w:br/>
               <w:t>Historical Reference</w:t>
               <w:br/>
-              <w:t>Source:</w:t>
+              <w:t>Sources:</w:t>
               <w:br/>
-              <w:t>d2.docx</w:t>
+              <w:t>• d1.docx – Change Orders</w:t>
               <w:br/>
-              <w:t>Clause: Change Orders</w:t>
-              <w:br/>
-              <w:t>Requirement: Timeline for approval defined</w:t>
-              <w:br/>
-              <w:br/>
-              <w:t>Quote:</w:t>
-              <w:br/>
-              <w:t>"Implemented formal change request and approval process; unilateral directives flagged for secondary elimination."</w:t>
+              <w:t>• d2.docx – Change Orders</w:t>
             </w:r>
           </w:p>
         </w:tc>
@@ -2119,7 +1857,7 @@
       <w:tr>
         <w:tc>
           <w:tcPr>
-            <w:tcW w:type="dxa" w:w="1234"/>
+            <w:tcW w:type="dxa" w:w="1440"/>
           </w:tcPr>
           <w:p>
             <w:r>
@@ -2129,7 +1867,7 @@
         </w:tc>
         <w:tc>
           <w:tcPr>
-            <w:tcW w:type="dxa" w:w="1234"/>
+            <w:tcW w:type="dxa" w:w="1440"/>
           </w:tcPr>
           <w:p>
             <w:r>
@@ -2139,7 +1877,7 @@
         </w:tc>
         <w:tc>
           <w:tcPr>
-            <w:tcW w:type="dxa" w:w="1234"/>
+            <w:tcW w:type="dxa" w:w="1440"/>
           </w:tcPr>
           <w:p>
             <w:r>
@@ -2149,17 +1887,7 @@
         </w:tc>
         <w:tc>
           <w:tcPr>
-            <w:tcW w:type="dxa" w:w="1234"/>
-          </w:tcPr>
-          <w:p>
-            <w:r>
-              <w:t>Partially Met</w:t>
-            </w:r>
-          </w:p>
-        </w:tc>
-        <w:tc>
-          <w:tcPr>
-            <w:tcW w:type="dxa" w:w="1234"/>
+            <w:tcW w:type="dxa" w:w="1440"/>
           </w:tcPr>
           <w:p>
             <w:r>
@@ -2171,7 +1899,7 @@
         </w:tc>
         <w:tc>
           <w:tcPr>
-            <w:tcW w:type="dxa" w:w="1234"/>
+            <w:tcW w:type="dxa" w:w="1440"/>
           </w:tcPr>
           <w:p>
             <w:r>
@@ -2181,11 +1909,11 @@
         </w:tc>
         <w:tc>
           <w:tcPr>
-            <w:tcW w:type="dxa" w:w="1234"/>
-          </w:tcPr>
-          <w:p>
-            <w:r>
-              <w:t>A standardized governing law framework was applied across all global procurement files to simplify legal enforcement.</w:t>
+            <w:tcW w:type="dxa" w:w="1440"/>
+          </w:tcPr>
+          <w:p>
+            <w:r>
+              <w:t>Historically, governing law requirements were addressed by implementing a standardized legal framework across all global procurement files to ensure consistency.</w:t>
               <w:br/>
               <w:br/>
               <w:t>Historical Reference</w:t>
@@ -2209,7 +1937,7 @@
       <w:tr>
         <w:tc>
           <w:tcPr>
-            <w:tcW w:type="dxa" w:w="1234"/>
+            <w:tcW w:type="dxa" w:w="1440"/>
           </w:tcPr>
           <w:p>
             <w:r>
@@ -2219,7 +1947,7 @@
         </w:tc>
         <w:tc>
           <w:tcPr>
-            <w:tcW w:type="dxa" w:w="1234"/>
+            <w:tcW w:type="dxa" w:w="1440"/>
           </w:tcPr>
           <w:p>
             <w:r>
@@ -2229,7 +1957,7 @@
         </w:tc>
         <w:tc>
           <w:tcPr>
-            <w:tcW w:type="dxa" w:w="1234"/>
+            <w:tcW w:type="dxa" w:w="1440"/>
           </w:tcPr>
           <w:p>
             <w:r>
@@ -2239,17 +1967,7 @@
         </w:tc>
         <w:tc>
           <w:tcPr>
-            <w:tcW w:type="dxa" w:w="1234"/>
-          </w:tcPr>
-          <w:p>
-            <w:r>
-              <w:t>Met</w:t>
-            </w:r>
-          </w:p>
-        </w:tc>
-        <w:tc>
-          <w:tcPr>
-            <w:tcW w:type="dxa" w:w="1234"/>
+            <w:tcW w:type="dxa" w:w="1440"/>
           </w:tcPr>
           <w:p>
             <w:r>
@@ -2263,7 +1981,7 @@
         </w:tc>
         <w:tc>
           <w:tcPr>
-            <w:tcW w:type="dxa" w:w="1234"/>
+            <w:tcW w:type="dxa" w:w="1440"/>
           </w:tcPr>
           <w:p>
             <w:r>
@@ -2277,11 +1995,11 @@
         </w:tc>
         <w:tc>
           <w:tcPr>
-            <w:tcW w:type="dxa" w:w="1234"/>
-          </w:tcPr>
-          <w:p>
-            <w:r>
-              <w:t>A multi-tier framework was introduced to address home-court bias, and new arbitration text was proposed to replace direct court litigation.</w:t>
+            <w:tcW w:type="dxa" w:w="1440"/>
+          </w:tcPr>
+          <w:p>
+            <w:r>
+              <w:t>Previous efforts focused on introducing multi-tier frameworks and proposing updated arbitration mechanisms to replace direct municipal court litigation.</w:t>
               <w:br/>
               <w:br/>
               <w:t>Historical Reference</w:t>
@@ -2298,7 +2016,7 @@
       <w:tr>
         <w:tc>
           <w:tcPr>
-            <w:tcW w:type="dxa" w:w="1234"/>
+            <w:tcW w:type="dxa" w:w="1440"/>
           </w:tcPr>
           <w:p>
             <w:r>
@@ -2308,7 +2026,7 @@
         </w:tc>
         <w:tc>
           <w:tcPr>
-            <w:tcW w:type="dxa" w:w="1234"/>
+            <w:tcW w:type="dxa" w:w="1440"/>
           </w:tcPr>
           <w:p>
             <w:r>
@@ -2318,7 +2036,7 @@
         </w:tc>
         <w:tc>
           <w:tcPr>
-            <w:tcW w:type="dxa" w:w="1234"/>
+            <w:tcW w:type="dxa" w:w="1440"/>
           </w:tcPr>
           <w:p>
             <w:r>
@@ -2328,17 +2046,7 @@
         </w:tc>
         <w:tc>
           <w:tcPr>
-            <w:tcW w:type="dxa" w:w="1234"/>
-          </w:tcPr>
-          <w:p>
-            <w:r>
-              <w:t>Met</w:t>
-            </w:r>
-          </w:p>
-        </w:tc>
-        <w:tc>
-          <w:tcPr>
-            <w:tcW w:type="dxa" w:w="1234"/>
+            <w:tcW w:type="dxa" w:w="1440"/>
           </w:tcPr>
           <w:p>
             <w:r>
@@ -2352,7 +2060,7 @@
         </w:tc>
         <w:tc>
           <w:tcPr>
-            <w:tcW w:type="dxa" w:w="1234"/>
+            <w:tcW w:type="dxa" w:w="1440"/>
           </w:tcPr>
           <w:p>
             <w:r>
@@ -2366,27 +2074,20 @@
         </w:tc>
         <w:tc>
           <w:tcPr>
-            <w:tcW w:type="dxa" w:w="1234"/>
-          </w:tcPr>
-          <w:p>
-            <w:r>
-              <w:t>The legal committee evaluated alternative international neutral locations to resolve the lack of a designated arbitration seat.</w:t>
+            <w:tcW w:type="dxa" w:w="1440"/>
+          </w:tcPr>
+          <w:p>
+            <w:r>
+              <w:t>Historical gaps in designating a legal seat were addressed by evaluating alternative international neutral locations through the legal committee.</w:t>
               <w:br/>
               <w:br/>
               <w:t>Historical Reference</w:t>
               <w:br/>
-              <w:t>Source:</w:t>
+              <w:t>Sources:</w:t>
               <w:br/>
-              <w:t>d1.docx</w:t>
+              <w:t>• d1.docx – Dispute Resolution</w:t>
               <w:br/>
-              <w:t>Clause: Dispute Resolution</w:t>
-              <w:br/>
-              <w:t>Requirement: Seat of arbitration specified</w:t>
-              <w:br/>
-              <w:br/>
-              <w:t>Quote:</w:t>
-              <w:br/>
-              <w:t>"Resolution stalled in legal committee; alternative international neutral locations are currently under active evaluation."</w:t>
+              <w:t>• d2.docx – Dispute Resolution</w:t>
             </w:r>
           </w:p>
         </w:tc>
@@ -2394,7 +2095,7 @@
       <w:tr>
         <w:tc>
           <w:tcPr>
-            <w:tcW w:type="dxa" w:w="1234"/>
+            <w:tcW w:type="dxa" w:w="1440"/>
           </w:tcPr>
           <w:p>
             <w:r>
@@ -2404,7 +2105,7 @@
         </w:tc>
         <w:tc>
           <w:tcPr>
-            <w:tcW w:type="dxa" w:w="1234"/>
+            <w:tcW w:type="dxa" w:w="1440"/>
           </w:tcPr>
           <w:p>
             <w:r>
@@ -2414,7 +2115,7 @@
         </w:tc>
         <w:tc>
           <w:tcPr>
-            <w:tcW w:type="dxa" w:w="1234"/>
+            <w:tcW w:type="dxa" w:w="1440"/>
           </w:tcPr>
           <w:p>
             <w:r>
@@ -2424,17 +2125,7 @@
         </w:tc>
         <w:tc>
           <w:tcPr>
-            <w:tcW w:type="dxa" w:w="1234"/>
-          </w:tcPr>
-          <w:p>
-            <w:r>
-              <w:t>Met</w:t>
-            </w:r>
-          </w:p>
-        </w:tc>
-        <w:tc>
-          <w:tcPr>
-            <w:tcW w:type="dxa" w:w="1234"/>
+            <w:tcW w:type="dxa" w:w="1440"/>
           </w:tcPr>
           <w:p>
             <w:r>
@@ -2444,7 +2135,7 @@
         </w:tc>
         <w:tc>
           <w:tcPr>
-            <w:tcW w:type="dxa" w:w="1234"/>
+            <w:tcW w:type="dxa" w:w="1440"/>
           </w:tcPr>
           <w:p>
             <w:r>
@@ -2454,11 +2145,11 @@
         </w:tc>
         <w:tc>
           <w:tcPr>
-            <w:tcW w:type="dxa" w:w="1234"/>
-          </w:tcPr>
-          <w:p>
-            <w:r>
-              <w:t>Standard insurance language was validated against corporate baselines, while gaps in international transit coverage were addressed through supplementary carrier agreements.</w:t>
+            <w:tcW w:type="dxa" w:w="1440"/>
+          </w:tcPr>
+          <w:p>
+            <w:r>
+              <w:t>Historically, insurance responsibilities were validated against corporate risk baselines and expanded via supplementary agreements to cover specialized international transit risks.</w:t>
               <w:br/>
               <w:br/>
               <w:t>Historical Reference</w:t>
@@ -2475,7 +2166,7 @@
       <w:tr>
         <w:tc>
           <w:tcPr>
-            <w:tcW w:type="dxa" w:w="1234"/>
+            <w:tcW w:type="dxa" w:w="1440"/>
           </w:tcPr>
           <w:p>
             <w:r>
@@ -2485,7 +2176,7 @@
         </w:tc>
         <w:tc>
           <w:tcPr>
-            <w:tcW w:type="dxa" w:w="1234"/>
+            <w:tcW w:type="dxa" w:w="1440"/>
           </w:tcPr>
           <w:p>
             <w:r>
@@ -2495,7 +2186,7 @@
         </w:tc>
         <w:tc>
           <w:tcPr>
-            <w:tcW w:type="dxa" w:w="1234"/>
+            <w:tcW w:type="dxa" w:w="1440"/>
           </w:tcPr>
           <w:p>
             <w:r>
@@ -2505,17 +2196,7 @@
         </w:tc>
         <w:tc>
           <w:tcPr>
-            <w:tcW w:type="dxa" w:w="1234"/>
-          </w:tcPr>
-          <w:p>
-            <w:r>
-              <w:t>Met</w:t>
-            </w:r>
-          </w:p>
-        </w:tc>
-        <w:tc>
-          <w:tcPr>
-            <w:tcW w:type="dxa" w:w="1234"/>
+            <w:tcW w:type="dxa" w:w="1440"/>
           </w:tcPr>
           <w:p>
             <w:r>
@@ -2527,7 +2208,7 @@
         </w:tc>
         <w:tc>
           <w:tcPr>
-            <w:tcW w:type="dxa" w:w="1234"/>
+            <w:tcW w:type="dxa" w:w="1440"/>
           </w:tcPr>
           <w:p>
             <w:r>
@@ -2539,11 +2220,11 @@
         </w:tc>
         <w:tc>
           <w:tcPr>
-            <w:tcW w:type="dxa" w:w="1234"/>
-          </w:tcPr>
-          <w:p>
-            <w:r>
-              <w:t>When vendors refused to accept storage risks at buyer premises, management mitigated the exposure by securing a secondary corporate property rider policy.</w:t>
+            <w:tcW w:type="dxa" w:w="1440"/>
+          </w:tcPr>
+          <w:p>
+            <w:r>
+              <w:t>Past non-compliance regarding equipment damage at buyer premises was mitigated by securing a secondary comprehensive corporate property rider policy to accept field damage risks.</w:t>
               <w:br/>
               <w:br/>
               <w:t>Historical Reference</w:t>
@@ -2567,7 +2248,7 @@
       <w:tr>
         <w:tc>
           <w:tcPr>
-            <w:tcW w:type="dxa" w:w="1234"/>
+            <w:tcW w:type="dxa" w:w="1440"/>
           </w:tcPr>
           <w:p>
             <w:r>
@@ -2577,7 +2258,7 @@
         </w:tc>
         <w:tc>
           <w:tcPr>
-            <w:tcW w:type="dxa" w:w="1234"/>
+            <w:tcW w:type="dxa" w:w="1440"/>
           </w:tcPr>
           <w:p>
             <w:r>
@@ -2587,7 +2268,7 @@
         </w:tc>
         <w:tc>
           <w:tcPr>
-            <w:tcW w:type="dxa" w:w="1234"/>
+            <w:tcW w:type="dxa" w:w="1440"/>
           </w:tcPr>
           <w:p>
             <w:r>
@@ -2597,17 +2278,7 @@
         </w:tc>
         <w:tc>
           <w:tcPr>
-            <w:tcW w:type="dxa" w:w="1234"/>
-          </w:tcPr>
-          <w:p>
-            <w:r>
-              <w:t>Met</w:t>
-            </w:r>
-          </w:p>
-        </w:tc>
-        <w:tc>
-          <w:tcPr>
-            <w:tcW w:type="dxa" w:w="1234"/>
+            <w:tcW w:type="dxa" w:w="1440"/>
           </w:tcPr>
           <w:p>
             <w:r>
@@ -2619,7 +2290,7 @@
         </w:tc>
         <w:tc>
           <w:tcPr>
-            <w:tcW w:type="dxa" w:w="1234"/>
+            <w:tcW w:type="dxa" w:w="1440"/>
           </w:tcPr>
           <w:p>
             <w:r>
@@ -2631,11 +2302,11 @@
         </w:tc>
         <w:tc>
           <w:tcPr>
-            <w:tcW w:type="dxa" w:w="1234"/>
-          </w:tcPr>
-          <w:p>
-            <w:r>
-              <w:t>Efforts were made to move from uncapped liability to defined limits, though some agreements resulted in caps that exceeded the preferred 10% manufacturing standard.</w:t>
+            <w:tcW w:type="dxa" w:w="1440"/>
+          </w:tcPr>
+          <w:p>
+            <w:r>
+              <w:t>Historically, efforts focused on transitioning from uncapped liability to defined caps, negotiating limits down from 100% of PO value toward standard corporate risk margins.</w:t>
               <w:br/>
               <w:br/>
               <w:t>Historical Reference</w:t>
@@ -2652,7 +2323,7 @@
       <w:tr>
         <w:tc>
           <w:tcPr>
-            <w:tcW w:type="dxa" w:w="1234"/>
+            <w:tcW w:type="dxa" w:w="1440"/>
           </w:tcPr>
           <w:p>
             <w:r>
@@ -2662,7 +2333,7 @@
         </w:tc>
         <w:tc>
           <w:tcPr>
-            <w:tcW w:type="dxa" w:w="1234"/>
+            <w:tcW w:type="dxa" w:w="1440"/>
           </w:tcPr>
           <w:p>
             <w:r>
@@ -2672,7 +2343,7 @@
         </w:tc>
         <w:tc>
           <w:tcPr>
-            <w:tcW w:type="dxa" w:w="1234"/>
+            <w:tcW w:type="dxa" w:w="1440"/>
           </w:tcPr>
           <w:p>
             <w:r>
@@ -2682,17 +2353,7 @@
         </w:tc>
         <w:tc>
           <w:tcPr>
-            <w:tcW w:type="dxa" w:w="1234"/>
-          </w:tcPr>
-          <w:p>
-            <w:r>
-              <w:t>Partially Met</w:t>
-            </w:r>
-          </w:p>
-        </w:tc>
-        <w:tc>
-          <w:tcPr>
-            <w:tcW w:type="dxa" w:w="1234"/>
+            <w:tcW w:type="dxa" w:w="1440"/>
           </w:tcPr>
           <w:p>
             <w:r>
@@ -2704,7 +2365,7 @@
         </w:tc>
         <w:tc>
           <w:tcPr>
-            <w:tcW w:type="dxa" w:w="1234"/>
+            <w:tcW w:type="dxa" w:w="1440"/>
           </w:tcPr>
           <w:p>
             <w:r>
@@ -2714,11 +2375,11 @@
         </w:tc>
         <w:tc>
           <w:tcPr>
-            <w:tcW w:type="dxa" w:w="1234"/>
-          </w:tcPr>
-          <w:p>
-            <w:r>
-              <w:t>Negotiations focused on limiting carve-outs to intellectual property indemnities and removing open-ended exclusions for safety shutdowns.</w:t>
+            <w:tcW w:type="dxa" w:w="1440"/>
+          </w:tcPr>
+          <w:p>
+            <w:r>
+              <w:t>Past actions involved tightening carve-out scopes by removing open-ended safety shutdown exclusions to ensure operational errors remained within the liability cap.</w:t>
               <w:br/>
               <w:br/>
               <w:t>Historical Reference</w:t>
@@ -2742,7 +2403,7 @@
       <w:tr>
         <w:tc>
           <w:tcPr>
-            <w:tcW w:type="dxa" w:w="1234"/>
+            <w:tcW w:type="dxa" w:w="1440"/>
           </w:tcPr>
           <w:p>
             <w:r>
@@ -2752,7 +2413,7 @@
         </w:tc>
         <w:tc>
           <w:tcPr>
-            <w:tcW w:type="dxa" w:w="1234"/>
+            <w:tcW w:type="dxa" w:w="1440"/>
           </w:tcPr>
           <w:p>
             <w:r>
@@ -2762,7 +2423,7 @@
         </w:tc>
         <w:tc>
           <w:tcPr>
-            <w:tcW w:type="dxa" w:w="1234"/>
+            <w:tcW w:type="dxa" w:w="1440"/>
           </w:tcPr>
           <w:p>
             <w:r>
@@ -2772,17 +2433,7 @@
         </w:tc>
         <w:tc>
           <w:tcPr>
-            <w:tcW w:type="dxa" w:w="1234"/>
-          </w:tcPr>
-          <w:p>
-            <w:r>
-              <w:t>Partially Met</w:t>
-            </w:r>
-          </w:p>
-        </w:tc>
-        <w:tc>
-          <w:tcPr>
-            <w:tcW w:type="dxa" w:w="1234"/>
+            <w:tcW w:type="dxa" w:w="1440"/>
           </w:tcPr>
           <w:p>
             <w:r>
@@ -2796,7 +2447,7 @@
         </w:tc>
         <w:tc>
           <w:tcPr>
-            <w:tcW w:type="dxa" w:w="1234"/>
+            <w:tcW w:type="dxa" w:w="1440"/>
           </w:tcPr>
           <w:p>
             <w:r>
@@ -2806,11 +2457,11 @@
         </w:tc>
         <w:tc>
           <w:tcPr>
-            <w:tcW w:type="dxa" w:w="1234"/>
-          </w:tcPr>
-          <w:p>
-            <w:r>
-              <w:t>Legal reviews were used to integrate absolute mutual waivers and clarify definitions to ensure both parties were protected from indirect and speculative financial losses.</w:t>
+            <w:tcW w:type="dxa" w:w="1440"/>
+          </w:tcPr>
+          <w:p>
+            <w:r>
+              <w:t>Historically, legal teams focused on clarifying damage definitions and integrating absolute mutual waivers to isolate both entities from speculative financial claims.</w:t>
               <w:br/>
               <w:br/>
               <w:t>Historical Reference</w:t>
@@ -2827,7 +2478,7 @@
       <w:tr>
         <w:tc>
           <w:tcPr>
-            <w:tcW w:type="dxa" w:w="1234"/>
+            <w:tcW w:type="dxa" w:w="1440"/>
           </w:tcPr>
           <w:p>
             <w:r>
@@ -2837,7 +2488,7 @@
         </w:tc>
         <w:tc>
           <w:tcPr>
-            <w:tcW w:type="dxa" w:w="1234"/>
+            <w:tcW w:type="dxa" w:w="1440"/>
           </w:tcPr>
           <w:p>
             <w:r>
@@ -2847,7 +2498,7 @@
         </w:tc>
         <w:tc>
           <w:tcPr>
-            <w:tcW w:type="dxa" w:w="1234"/>
+            <w:tcW w:type="dxa" w:w="1440"/>
           </w:tcPr>
           <w:p>
             <w:r>
@@ -2857,17 +2508,7 @@
         </w:tc>
         <w:tc>
           <w:tcPr>
-            <w:tcW w:type="dxa" w:w="1234"/>
-          </w:tcPr>
-          <w:p>
-            <w:r>
-              <w:t>Partially Met</w:t>
-            </w:r>
-          </w:p>
-        </w:tc>
-        <w:tc>
-          <w:tcPr>
-            <w:tcW w:type="dxa" w:w="1234"/>
+            <w:tcW w:type="dxa" w:w="1440"/>
           </w:tcPr>
           <w:p>
             <w:r>
@@ -2881,7 +2522,7 @@
         </w:tc>
         <w:tc>
           <w:tcPr>
-            <w:tcW w:type="dxa" w:w="1234"/>
+            <w:tcW w:type="dxa" w:w="1440"/>
           </w:tcPr>
           <w:p>
             <w:r>
@@ -2891,11 +2532,11 @@
         </w:tc>
         <w:tc>
           <w:tcPr>
-            <w:tcW w:type="dxa" w:w="1234"/>
-          </w:tcPr>
-          <w:p>
-            <w:r>
-              <w:t>Attempts were made to establish unconditional waivers by narrowing exceptions, although some vendors successfully re-inserted exclusions for environmental compliance incidents.</w:t>
+            <w:tcW w:type="dxa" w:w="1440"/>
+          </w:tcPr>
+          <w:p>
+            <w:r>
+              <w:t>Past efforts involved narrowing or completely removing exceptions to achieve an unconditional waiver structure, though some vendors successfully re-inserted specific carve-outs for environmental incidents.</w:t>
               <w:br/>
               <w:br/>
               <w:t>Historical Reference</w:t>
@@ -2912,7 +2553,7 @@
       <w:tr>
         <w:tc>
           <w:tcPr>
-            <w:tcW w:type="dxa" w:w="1234"/>
+            <w:tcW w:type="dxa" w:w="1440"/>
           </w:tcPr>
           <w:p>
             <w:r>
@@ -2922,7 +2563,7 @@
         </w:tc>
         <w:tc>
           <w:tcPr>
-            <w:tcW w:type="dxa" w:w="1234"/>
+            <w:tcW w:type="dxa" w:w="1440"/>
           </w:tcPr>
           <w:p>
             <w:r>
@@ -2932,7 +2573,7 @@
         </w:tc>
         <w:tc>
           <w:tcPr>
-            <w:tcW w:type="dxa" w:w="1234"/>
+            <w:tcW w:type="dxa" w:w="1440"/>
           </w:tcPr>
           <w:p>
             <w:r>
@@ -2942,17 +2583,7 @@
         </w:tc>
         <w:tc>
           <w:tcPr>
-            <w:tcW w:type="dxa" w:w="1234"/>
-          </w:tcPr>
-          <w:p>
-            <w:r>
-              <w:t>Met</w:t>
-            </w:r>
-          </w:p>
-        </w:tc>
-        <w:tc>
-          <w:tcPr>
-            <w:tcW w:type="dxa" w:w="1234"/>
+            <w:tcW w:type="dxa" w:w="1440"/>
           </w:tcPr>
           <w:p>
             <w:r>
@@ -2962,7 +2593,7 @@
         </w:tc>
         <w:tc>
           <w:tcPr>
-            <w:tcW w:type="dxa" w:w="1234"/>
+            <w:tcW w:type="dxa" w:w="1440"/>
           </w:tcPr>
           <w:p>
             <w:r>
@@ -2972,11 +2603,11 @@
         </w:tc>
         <w:tc>
           <w:tcPr>
-            <w:tcW w:type="dxa" w:w="1234"/>
-          </w:tcPr>
-          <w:p>
-            <w:r>
-              <w:t>Compliance was improved by developing exhaustive registries of approved metallurgical suppliers and pre-clearing alternate vendor directories through quality assurance.</w:t>
+            <w:tcW w:type="dxa" w:w="1440"/>
+          </w:tcPr>
+          <w:p>
+            <w:r>
+              <w:t>Historically, efforts focused on expanding the approved vendor registry to include both forging houses and metallurgical refineries to eliminate supply chain vulnerabilities.</w:t>
               <w:br/>
               <w:br/>
               <w:t>Historical Reference</w:t>
@@ -2993,7 +2624,7 @@
       <w:tr>
         <w:tc>
           <w:tcPr>
-            <w:tcW w:type="dxa" w:w="1234"/>
+            <w:tcW w:type="dxa" w:w="1440"/>
           </w:tcPr>
           <w:p>
             <w:r>
@@ -3003,7 +2634,7 @@
         </w:tc>
         <w:tc>
           <w:tcPr>
-            <w:tcW w:type="dxa" w:w="1234"/>
+            <w:tcW w:type="dxa" w:w="1440"/>
           </w:tcPr>
           <w:p>
             <w:r>
@@ -3013,7 +2644,7 @@
         </w:tc>
         <w:tc>
           <w:tcPr>
-            <w:tcW w:type="dxa" w:w="1234"/>
+            <w:tcW w:type="dxa" w:w="1440"/>
           </w:tcPr>
           <w:p>
             <w:r>
@@ -3023,17 +2654,7 @@
         </w:tc>
         <w:tc>
           <w:tcPr>
-            <w:tcW w:type="dxa" w:w="1234"/>
-          </w:tcPr>
-          <w:p>
-            <w:r>
-              <w:t>Met</w:t>
-            </w:r>
-          </w:p>
-        </w:tc>
-        <w:tc>
-          <w:tcPr>
-            <w:tcW w:type="dxa" w:w="1234"/>
+            <w:tcW w:type="dxa" w:w="1440"/>
           </w:tcPr>
           <w:p>
             <w:r>
@@ -3043,7 +2664,7 @@
         </w:tc>
         <w:tc>
           <w:tcPr>
-            <w:tcW w:type="dxa" w:w="1234"/>
+            <w:tcW w:type="dxa" w:w="1440"/>
           </w:tcPr>
           <w:p>
             <w:r>
@@ -3053,11 +2674,11 @@
         </w:tc>
         <w:tc>
           <w:tcPr>
-            <w:tcW w:type="dxa" w:w="1234"/>
-          </w:tcPr>
-          <w:p>
-            <w:r>
-              <w:t>Issues regarding unauthorized vendor substitutions were flagged by internal audit, leading to remediation strategies and the pausing of operations for engineering verification.</w:t>
+            <w:tcW w:type="dxa" w:w="1440"/>
+          </w:tcPr>
+          <w:p>
+            <w:r>
+              <w:t>Past actions involved flagging unauthorized substitution risks through internal audits to remediate clauses that allowed vendors to switch suppliers without prior buyer approval.</w:t>
               <w:br/>
               <w:br/>
               <w:t>Historical Reference</w:t>
@@ -3215,17 +2836,17 @@
           </w:tcPr>
           <w:p>
             <w:r>
-              <w:t>The 45% advance is split into two tranches. The second 15% tranche is conditional upon the delivery of a performance bank guarantee, signed kick-off minutes, and a document submission register. The Buyer possesses a discretionary right to defer this payment without interest if conditions are not met within 20 days, creating a dependency that delays full liquidity for the Supplier.</w:t>
-            </w:r>
-          </w:p>
-        </w:tc>
-        <w:tc>
-          <w:tcPr>
-            <w:tcW w:type="dxa" w:w="1440"/>
-          </w:tcPr>
-          <w:p>
-            <w:r>
-              <w:t>Ensure the full 45% advance is payable in a single installment upon PO acknowledgement and furnishing of Annex B documents.</w:t>
+              <w:t>The 45% advance is split into two tranches. The final 15% is conditional upon the performance bank guarantee, signed kick-off minutes, and document submission register. Failure to satisfy these within 20 days allows the Buyer to defer payment without interest, creating a dependency that delays the full realization of the required advance payment.</w:t>
+            </w:r>
+          </w:p>
+        </w:tc>
+        <w:tc>
+          <w:tcPr>
+            <w:tcW w:type="dxa" w:w="1440"/>
+          </w:tcPr>
+          <w:p>
+            <w:r>
+              <w:t>Remove conditional dependencies for the second advance tranche and ensure the full 45% is payable upon PO acknowledgement and furnishing of Annex B documents.</w:t>
             </w:r>
           </w:p>
         </w:tc>
@@ -3267,27 +2888,27 @@
           </w:tcPr>
           <w:p>
             <w:r>
-              <w:t>Cash-flow risk and payment deferral exposure</w:t>
-            </w:r>
-          </w:p>
-        </w:tc>
-        <w:tc>
-          <w:tcPr>
-            <w:tcW w:type="dxa" w:w="1440"/>
-          </w:tcPr>
-          <w:p>
-            <w:r>
-              <w:t>Payment is conditional upon internal Buyer system records rather than invoice receipt. This creates a dependency on Buyer administrative processes, allowing the 30-day payment clock to be deferred indefinitely until goods receipt, inspection, and reconciliation are completed, delaying cash inflows.</w:t>
-            </w:r>
-          </w:p>
-        </w:tc>
-        <w:tc>
-          <w:tcPr>
-            <w:tcW w:type="dxa" w:w="1440"/>
-          </w:tcPr>
-          <w:p>
-            <w:r>
-              <w:t>Set payment terms to Net 30 days from invoice receipt and remove conditional dependencies on internal Buyer system records.</w:t>
+              <w:t>Cash-flow risk and payment delay exposure</w:t>
+            </w:r>
+          </w:p>
+        </w:tc>
+        <w:tc>
+          <w:tcPr>
+            <w:tcW w:type="dxa" w:w="1440"/>
+          </w:tcPr>
+          <w:p>
+            <w:r>
+              <w:t>Payment triggers are dependent on internal buyer processes including goods receipt and inspection. This allows the 30-day clock to be deferred indefinitely based on internal administrative completion, bypassing the standard Net 30 invoice date requirement.</w:t>
+            </w:r>
+          </w:p>
+        </w:tc>
+        <w:tc>
+          <w:tcPr>
+            <w:tcW w:type="dxa" w:w="1440"/>
+          </w:tcPr>
+          <w:p>
+            <w:r>
+              <w:t>Set payment terms as Net 30 days from invoice receipt regardless of internal acceptance records.</w:t>
             </w:r>
           </w:p>
         </w:tc>
@@ -3329,27 +2950,27 @@
           </w:tcPr>
           <w:p>
             <w:r>
-              <w:t>Financial exposure and guarantee risk</w:t>
-            </w:r>
-          </w:p>
-        </w:tc>
-        <w:tc>
-          <w:tcPr>
-            <w:tcW w:type="dxa" w:w="1440"/>
-          </w:tcPr>
-          <w:p>
-            <w:r>
-              <w:t>The total security obligations are 12 percent, exceeding the 10 percent maximum requirement. This is caused by the cumulative effect of the 10 percent performance guarantee and the 2 percent bridge guarantee. This creates excessive financial burden and liquidity constraints for the supplier.</w:t>
-            </w:r>
-          </w:p>
-        </w:tc>
-        <w:tc>
-          <w:tcPr>
-            <w:tcW w:type="dxa" w:w="1440"/>
-          </w:tcPr>
-          <w:p>
-            <w:r>
-              <w:t>Reduce total performance security to a maximum of 10 percent including bridge guarantees.</w:t>
+              <w:t>Financial exposure through excessive guarantee obligations</w:t>
+            </w:r>
+          </w:p>
+        </w:tc>
+        <w:tc>
+          <w:tcPr>
+            <w:tcW w:type="dxa" w:w="1440"/>
+          </w:tcPr>
+          <w:p>
+            <w:r>
+              <w:t>The combined performance and bridge guarantees total 12 percent of the Purchase Order value, exceeding the 10 percent maximum requirement. This creates higher collateral costs and cash-flow constraints for the Supplier.</w:t>
+            </w:r>
+          </w:p>
+        </w:tc>
+        <w:tc>
+          <w:tcPr>
+            <w:tcW w:type="dxa" w:w="1440"/>
+          </w:tcPr>
+          <w:p>
+            <w:r>
+              <w:t>Limit total performance security to a maximum of 10 percent including bridge guarantees.</w:t>
             </w:r>
           </w:p>
         </w:tc>
@@ -3391,27 +3012,27 @@
           </w:tcPr>
           <w:p>
             <w:r>
-              <w:t>Financial exposure due to limited liquidated damages recovery</w:t>
-            </w:r>
-          </w:p>
-        </w:tc>
-        <w:tc>
-          <w:tcPr>
-            <w:tcW w:type="dxa" w:w="1440"/>
-          </w:tcPr>
-          <w:p>
-            <w:r>
-              <w:t>The clause excludes standalone LDs for documentation and engineering submittals unless they are Critical Dispatch Documents. Additionally, a 5 percent cap on equipment delivery LDs and a 7.5 percent aggregate cap limit the total recoverable damages, reducing the financial incentive for the supplier to maintain the schedule.</w:t>
-            </w:r>
-          </w:p>
-        </w:tc>
-        <w:tc>
-          <w:tcPr>
-            <w:tcW w:type="dxa" w:w="1440"/>
-          </w:tcPr>
-          <w:p>
-            <w:r>
-              <w:t>Remove standalone exclusions for documentation delays and increase the aggregate LD cap to align with total project risk exposure.</w:t>
+              <w:t>Financial exposure due to documentation LD exceptions</w:t>
+            </w:r>
+          </w:p>
+        </w:tc>
+        <w:tc>
+          <w:tcPr>
+            <w:tcW w:type="dxa" w:w="1440"/>
+          </w:tcPr>
+          <w:p>
+            <w:r>
+              <w:t>The clause excludes standalone liquidated damages for routine manuals and non-critical engineering submittals. This creates a gap where delays in non-critical documentation are not monetarily penalized, potentially leading to operational delays in project handover or system integration without financial recourse against the supplier.</w:t>
+            </w:r>
+          </w:p>
+        </w:tc>
+        <w:tc>
+          <w:tcPr>
+            <w:tcW w:type="dxa" w:w="1440"/>
+          </w:tcPr>
+          <w:p>
+            <w:r>
+              <w:t>Remove the exception for routine manuals and non-critical engineering submittals to ensure all documentation delays attract liquidated damages.</w:t>
             </w:r>
           </w:p>
         </w:tc>
@@ -3463,17 +3084,17 @@
           </w:tcPr>
           <w:p>
             <w:r>
-              <w:t>The clause imposes a 5 percent cap on individual equipment delivery LDs and an aggregate cap of 7.5 percent of the total PO value. These limits restrict the buyer's ability to recover full losses resulting from extended delivery delays beyond these thresholds.</w:t>
-            </w:r>
-          </w:p>
-        </w:tc>
-        <w:tc>
-          <w:tcPr>
-            <w:tcW w:type="dxa" w:w="1440"/>
-          </w:tcPr>
-          <w:p>
-            <w:r>
-              <w:t>Remove the 5 percent per part cap and increase the aggregate delay exposure cap to align with total potential project loss.</w:t>
+              <w:t>The clause limits delivery LD to 5% of the undelivered part value and an aggregate cap of 7.5% of total PO value. These limitations restrict the buyer's ability to recover full losses resulting from significant delivery delays.</w:t>
+            </w:r>
+          </w:p>
+        </w:tc>
+        <w:tc>
+          <w:tcPr>
+            <w:tcW w:type="dxa" w:w="1440"/>
+          </w:tcPr>
+          <w:p>
+            <w:r>
+              <w:t>Remove the 5% cap on individual undelivered parts and increase the aggregate delay exposure cap.</w:t>
             </w:r>
           </w:p>
         </w:tc>
@@ -3515,17 +3136,17 @@
           </w:tcPr>
           <w:p>
             <w:r>
-              <w:t>Financial exposure due to increased aggregate liquidated damages cap</w:t>
-            </w:r>
-          </w:p>
-        </w:tc>
-        <w:tc>
-          <w:tcPr>
-            <w:tcW w:type="dxa" w:w="1440"/>
-          </w:tcPr>
-          <w:p>
-            <w:r>
-              <w:t>While individual equipment delivery LD is capped at 5 percent, clause 00511.5.4 establishes an aggregate cap of 7.5 percent of the total Purchase Order value. This exceeds the required 5 percent limit, increasing the total financial penalty exposure for the supplier.</w:t>
+              <w:t>Financial exposure from elevated aggregate liquidated damages cap</w:t>
+            </w:r>
+          </w:p>
+        </w:tc>
+        <w:tc>
+          <w:tcPr>
+            <w:tcW w:type="dxa" w:w="1440"/>
+          </w:tcPr>
+          <w:p>
+            <w:r>
+              <w:t>While individual equipment delivery LD is capped at 5 percent, the aggregate cap for delivery LD and service credits is increased to 7.5 percent of total PO value. This exceeds the requirement of a 5 percent cap, increasing the total financial liability for the supplier.</w:t>
             </w:r>
           </w:p>
         </w:tc>
@@ -3577,27 +3198,27 @@
           </w:tcPr>
           <w:p>
             <w:r>
-              <w:t>Financial exposure from excessive liquidated damages</w:t>
-            </w:r>
-          </w:p>
-        </w:tc>
-        <w:tc>
-          <w:tcPr>
-            <w:tcW w:type="dxa" w:w="1440"/>
-          </w:tcPr>
-          <w:p>
-            <w:r>
-              <w:t>The aggregate LD cap is set at 7.5 percent of the total PO value, which exceeds the 5 percent requirement. This increases the maximum financial penalty the supplier may incur for delivery delays and service credit failures, creating a 2.5 percent over-exposure relative to the enterprise compliance standard.</w:t>
-            </w:r>
-          </w:p>
-        </w:tc>
-        <w:tc>
-          <w:tcPr>
-            <w:tcW w:type="dxa" w:w="1440"/>
-          </w:tcPr>
-          <w:p>
-            <w:r>
-              <w:t>Reduce aggregate LD and service-credit exposure to a maximum of 5 percent of the total Purchase Order value.</w:t>
+              <w:t>Financial exposure from excessive liquidated damages liability</w:t>
+            </w:r>
+          </w:p>
+        </w:tc>
+        <w:tc>
+          <w:tcPr>
+            <w:tcW w:type="dxa" w:w="1440"/>
+          </w:tcPr>
+          <w:p>
+            <w:r>
+              <w:t>The aggregate LD cap is 7.5 percent of the total PO value, which exceeds the 5 percent requirement. This increases the total monetary penalty exposure the Supplier faces for combined delivery delays, critical document failures, and service credits.</w:t>
+            </w:r>
+          </w:p>
+        </w:tc>
+        <w:tc>
+          <w:tcPr>
+            <w:tcW w:type="dxa" w:w="1440"/>
+          </w:tcPr>
+          <w:p>
+            <w:r>
+              <w:t>Reduce aggregate LD and service-credit exposure to a maximum of 5 percent of total PO value.</w:t>
             </w:r>
           </w:p>
         </w:tc>
@@ -3639,27 +3260,27 @@
           </w:tcPr>
           <w:p>
             <w:r>
-              <w:t>Financial exposure due to excluded remedial work liquidated damages</w:t>
-            </w:r>
-          </w:p>
-        </w:tc>
-        <w:tc>
-          <w:tcPr>
-            <w:tcW w:type="dxa" w:w="1440"/>
-          </w:tcPr>
-          <w:p>
-            <w:r>
-              <w:t>Clause 00511.5.3 explicitly exempts remedial work, warranty repairs, and replacements from liquidated damages. This creates a financial gap where the buyer cannot recover monetary damages for delays in correcting defective equipment, limiting the supplier's incentive to prioritize timely remedial actions.</w:t>
-            </w:r>
-          </w:p>
-        </w:tc>
-        <w:tc>
-          <w:tcPr>
-            <w:tcW w:type="dxa" w:w="1440"/>
-          </w:tcPr>
-          <w:p>
-            <w:r>
-              <w:t>Apply liquidated damages to remedial work and warranty repairs to ensure timely correction of defects.</w:t>
+              <w:t>Financial exposure due to lack of remedial work liquidated damages</w:t>
+            </w:r>
+          </w:p>
+        </w:tc>
+        <w:tc>
+          <w:tcPr>
+            <w:tcW w:type="dxa" w:w="1440"/>
+          </w:tcPr>
+          <w:p>
+            <w:r>
+              <w:t>Clause 00511.5.3 explicitly excludes liquidated damages for remedial work, warranty repairs, and replacements. This creates a financial gap where the buyer cannot recover predetermined monetary damages for delays in corrective actions, relying instead on a non-monetary corrective-action plan. This shifts the operational and financial burden of remedial delays from the supplier to the buyer.</w:t>
+            </w:r>
+          </w:p>
+        </w:tc>
+        <w:tc>
+          <w:tcPr>
+            <w:tcW w:type="dxa" w:w="1440"/>
+          </w:tcPr>
+          <w:p>
+            <w:r>
+              <w:t>Remove the exclusion of liquidated damages for remedial work and apply monetary penalties for delays in warranty repairs and replacements.</w:t>
             </w:r>
           </w:p>
         </w:tc>
@@ -3701,27 +3322,27 @@
           </w:tcPr>
           <w:p>
             <w:r>
-              <w:t>Warranty risk and limited guarantee coverage</w:t>
-            </w:r>
-          </w:p>
-        </w:tc>
-        <w:tc>
-          <w:tcPr>
-            <w:tcW w:type="dxa" w:w="1440"/>
-          </w:tcPr>
-          <w:p>
-            <w:r>
-              <w:t>The standard guarantee is limited to only two months post-commissioning. Furthermore, the remedial guarantee is capped by the original dispatch date, potentially expiring before the twelve month repair warranty is fulfilled. These restrictions reduce the period of supplier accountability for equipment performance and reliability.</w:t>
-            </w:r>
-          </w:p>
-        </w:tc>
-        <w:tc>
-          <w:tcPr>
-            <w:tcW w:type="dxa" w:w="1440"/>
-          </w:tcPr>
-          <w:p>
-            <w:r>
-              <w:t>Extend standard guarantee to twelve months post-commissioning and ensure remedial guarantees provide full twelve months coverage regardless of the original dispatch date.</w:t>
+              <w:t>Warranty risk and reduced equipment protection</w:t>
+            </w:r>
+          </w:p>
+        </w:tc>
+        <w:tc>
+          <w:tcPr>
+            <w:tcW w:type="dxa" w:w="1440"/>
+          </w:tcPr>
+          <w:p>
+            <w:r>
+              <w:t>The standard guarantee is limited to only two months post-commissioning and the remedial guarantee is capped by the original dispatch date. This creates a gap where equipment may lose warranty coverage prematurely regardless of actual performance or repair quality, shifting financial burden for failures to the buyer.</w:t>
+            </w:r>
+          </w:p>
+        </w:tc>
+        <w:tc>
+          <w:tcPr>
+            <w:tcW w:type="dxa" w:w="1440"/>
+          </w:tcPr>
+          <w:p>
+            <w:r>
+              <w:t>Extend standard guarantee to twelve months post-commissioning and ensure remedial guarantees run for twelve months from repair without being capped by original dispatch dates.</w:t>
             </w:r>
           </w:p>
         </w:tc>
@@ -3763,27 +3384,27 @@
           </w:tcPr>
           <w:p>
             <w:r>
-              <w:t>Warranty risk and reduced equipment protection</w:t>
-            </w:r>
-          </w:p>
-        </w:tc>
-        <w:tc>
-          <w:tcPr>
-            <w:tcW w:type="dxa" w:w="1440"/>
-          </w:tcPr>
-          <w:p>
-            <w:r>
-              <w:t>The remedial guarantee for replaced components is capped by the original dispatch date. This prevents a full twelve month protection period for repairs made late in the standard warranty, creating a gap in coverage for newly installed parts.</w:t>
-            </w:r>
-          </w:p>
-        </w:tc>
-        <w:tc>
-          <w:tcPr>
-            <w:tcW w:type="dxa" w:w="1440"/>
-          </w:tcPr>
-          <w:p>
-            <w:r>
-              <w:t>Ensure repaired or replaced components are guaranteed for twelve months from completion of repair or replacement regardless of the original dispatch date.</w:t>
+              <w:t>Warranty risk and limited remedial guarantee coverage</w:t>
+            </w:r>
+          </w:p>
+        </w:tc>
+        <w:tc>
+          <w:tcPr>
+            <w:tcW w:type="dxa" w:w="1440"/>
+          </w:tcPr>
+          <w:p>
+            <w:r>
+              <w:t>The remedial guarantee for replaced components is capped at 18 months from original dispatch. If a repair occurs late in the initial warranty period, the component may have little to no remaining protection regardless of the 12-month repair window, creating a gap in equipment reliability and financial exposure for premature failures.</w:t>
+            </w:r>
+          </w:p>
+        </w:tc>
+        <w:tc>
+          <w:tcPr>
+            <w:tcW w:type="dxa" w:w="1440"/>
+          </w:tcPr>
+          <w:p>
+            <w:r>
+              <w:t>Ensure remedial guarantees for repaired or replaced components extend for a full 12 months from the date of repair regardless of the original dispatch date.</w:t>
             </w:r>
           </w:p>
         </w:tc>
@@ -3835,17 +3456,17 @@
           </w:tcPr>
           <w:p>
             <w:r>
-              <w:t>The remedial guarantee is limited by a hard stop at 18 months from original dispatch. This creates a gap where a component replaced late in the primary warranty may only have negligible remaining coverage, forcing the buyer to fund repairs for components that failed shortly after replacement.</w:t>
-            </w:r>
-          </w:p>
-        </w:tc>
-        <w:tc>
-          <w:tcPr>
-            <w:tcW w:type="dxa" w:w="1440"/>
-          </w:tcPr>
-          <w:p>
-            <w:r>
-              <w:t>Ensure repaired or replaced components are guaranteed for twelve months from completion of repair or replacement regardless of the original dispatch date.</w:t>
+              <w:t>The remedial guarantee contains a sunset clause that expires 18 months from original dispatch regardless of when the repair occurred. This creates a gap where repaired components may have negligible or no remaining warranty coverage if the original dispatch date is approached, forcing the buyer to absorb repair costs prematurely.</w:t>
+            </w:r>
+          </w:p>
+        </w:tc>
+        <w:tc>
+          <w:tcPr>
+            <w:tcW w:type="dxa" w:w="1440"/>
+          </w:tcPr>
+          <w:p>
+            <w:r>
+              <w:t>Ensure repaired or replaced components are guaranteed for a full twelve months from the date of repair without limitation based on the original dispatch date.</w:t>
             </w:r>
           </w:p>
         </w:tc>
@@ -3887,27 +3508,27 @@
           </w:tcPr>
           <w:p>
             <w:r>
-              <w:t>Force majeure limitations</w:t>
-            </w:r>
-          </w:p>
-        </w:tc>
-        <w:tc>
-          <w:tcPr>
-            <w:tcW w:type="dxa" w:w="1440"/>
-          </w:tcPr>
-          <w:p>
-            <w:r>
-              <w:t>Relief for supply chain disruptions is restricted exclusively to named Tier-1 sub-suppliers in Annex D and approved logistics carriers. This creates operational and legal exposure as the Supplier cannot claim Force Majeure for disruptions involving unnamed sub-contractors or alternate vendors, regardless of whether the event was beyond their reasonable control.</w:t>
-            </w:r>
-          </w:p>
-        </w:tc>
-        <w:tc>
-          <w:tcPr>
-            <w:tcW w:type="dxa" w:w="1440"/>
-          </w:tcPr>
-          <w:p>
-            <w:r>
-              <w:t>Extend Force Majeure relief to all sub-contractors and vendors regardless of their naming in Annex D provided the event satisfies the general Force Majeure definition.</w:t>
+              <w:t>force majeure limitations</w:t>
+            </w:r>
+          </w:p>
+        </w:tc>
+        <w:tc>
+          <w:tcPr>
+            <w:tcW w:type="dxa" w:w="1440"/>
+          </w:tcPr>
+          <w:p>
+            <w:r>
+              <w:t>The clause restricts force majeure relief for supply chain disruptions to only named Tier-1 sub-suppliers in Annex D and the approved carrier. This creates operational risk by excluding unnamed subcontractors and alternate vendors, potentially leaving the supplier unable to claim relief for legitimate disruptions within the broader supply chain unless the event independently satisfies general force majeure criteria.</w:t>
+            </w:r>
+          </w:p>
+        </w:tc>
+        <w:tc>
+          <w:tcPr>
+            <w:tcW w:type="dxa" w:w="1440"/>
+          </w:tcPr>
+          <w:p>
+            <w:r>
+              <w:t>Extend force majeure relief to include all approved sub-suppliers and logistics providers regardless of their Tier-1 status or inclusion in Annex D.</w:t>
             </w:r>
           </w:p>
         </w:tc>
@@ -3949,27 +3570,27 @@
           </w:tcPr>
           <w:p>
             <w:r>
-              <w:t>force majeure limitations</w:t>
-            </w:r>
-          </w:p>
-        </w:tc>
-        <w:tc>
-          <w:tcPr>
-            <w:tcW w:type="dxa" w:w="1440"/>
-          </w:tcPr>
-          <w:p>
-            <w:r>
-              <w:t>Force majeure relief is restricted to named Tier-1 critical sub-suppliers and approved logistics carriers. This excludes unnamed subcontractors and alternate vendors, creating a gap where the supplier remains liable for performance failures caused by events beyond their control if those events occur within their broader supply chain.</w:t>
-            </w:r>
-          </w:p>
-        </w:tc>
-        <w:tc>
-          <w:tcPr>
-            <w:tcW w:type="dxa" w:w="1440"/>
-          </w:tcPr>
-          <w:p>
-            <w:r>
-              <w:t>Extend force majeure relief to all subcontractors and vendors regardless of their tier or naming in Annex D.</w:t>
+              <w:t>Force majeure limitations</w:t>
+            </w:r>
+          </w:p>
+        </w:tc>
+        <w:tc>
+          <w:tcPr>
+            <w:tcW w:type="dxa" w:w="1440"/>
+          </w:tcPr>
+          <w:p>
+            <w:r>
+              <w:t>Relief is restricted to named Tier-1 sub-suppliers and approved carriers. Failure of unnamed subcontractors does not qualify as Force Majeure, creating operational and legal exposure if the Supplier cannot perform due to an unforeseen event affecting an excluded vendor.</w:t>
+            </w:r>
+          </w:p>
+        </w:tc>
+        <w:tc>
+          <w:tcPr>
+            <w:tcW w:type="dxa" w:w="1440"/>
+          </w:tcPr>
+          <w:p>
+            <w:r>
+              <w:t>Extend Force Majeure relief to all subcontractors regardless of Tier or naming status in Annex D.</w:t>
             </w:r>
           </w:p>
         </w:tc>
@@ -4021,17 +3642,17 @@
           </w:tcPr>
           <w:p>
             <w:r>
-              <w:t>Relief for supply chain disruptions is restricted exclusively to Tier-1 critical sub-suppliers in Annex D and the approved logistics carrier. This creates operational and legal exposure because the supplier cannot claim force majeure for disruptions involving unnamed sub-contractors or alternate vendors, potentially leading to breach of contract disputes during systemic supply chain failures.</w:t>
-            </w:r>
-          </w:p>
-        </w:tc>
-        <w:tc>
-          <w:tcPr>
-            <w:tcW w:type="dxa" w:w="1440"/>
-          </w:tcPr>
-          <w:p>
-            <w:r>
-              <w:t>Expand force majeure relief to include all sub-contractors and logistics providers regardless of their designation in Annex D.</w:t>
+              <w:t>Relief for supply chain events is restricted to specific Tier-1 sub-suppliers in Annex D and approved logistics carriers. This creates operational and legal exposure because the Supplier cannot claim Force Majeure for events affecting unnamed sub-contractors or alternate vendors, potentially leading to breach of contract disputes despite legitimate external disruptions.</w:t>
+            </w:r>
+          </w:p>
+        </w:tc>
+        <w:tc>
+          <w:tcPr>
+            <w:tcW w:type="dxa" w:w="1440"/>
+          </w:tcPr>
+          <w:p>
+            <w:r>
+              <w:t>Expand Force Majeure relief to include all critical sub-suppliers and logistics providers regardless of their listing in Annex D.</w:t>
             </w:r>
           </w:p>
         </w:tc>
@@ -4073,27 +3694,27 @@
           </w:tcPr>
           <w:p>
             <w:r>
-              <w:t>Financial exposure via sliding scale termination fees</w:t>
-            </w:r>
-          </w:p>
-        </w:tc>
-        <w:tc>
-          <w:tcPr>
-            <w:tcW w:type="dxa" w:w="1440"/>
-          </w:tcPr>
-          <w:p>
-            <w:r>
-              <w:t>The termination for convenience clause imposes a tiered payment obligation that reaches 100 percent of the undelivered balance after 181 days. This creates a significant financial liability regardless of the Suppliers actual costs incurred, effectively transforming a convenience cancellation into a full purchase obligation.</w:t>
-            </w:r>
-          </w:p>
-        </w:tc>
-        <w:tc>
-          <w:tcPr>
-            <w:tcW w:type="dxa" w:w="1440"/>
-          </w:tcPr>
-          <w:p>
-            <w:r>
-              <w:t>Limit termination for convenience payments to documented actual costs incurred and proven non-cancelable commitments rather than a fixed percentage of order value.</w:t>
+              <w:t>Financial exposure from tiered convenience termination fees</w:t>
+            </w:r>
+          </w:p>
+        </w:tc>
+        <w:tc>
+          <w:tcPr>
+            <w:tcW w:type="dxa" w:w="1440"/>
+          </w:tcPr>
+          <w:p>
+            <w:r>
+              <w:t>The clause imposes a sliding scale of cancellation fees reaching up to 100 percent of the undelivered balance. This creates significant financial liability for the Buyer upon exercising convenience termination rights, as costs escalate based on the duration since acknowledgement.</w:t>
+            </w:r>
+          </w:p>
+        </w:tc>
+        <w:tc>
+          <w:tcPr>
+            <w:tcW w:type="dxa" w:w="1440"/>
+          </w:tcPr>
+          <w:p>
+            <w:r>
+              <w:t>Replace tiered percentage fees with a flat fee or limit total convenience termination liability to actual documented costs incurred by the Supplier.</w:t>
             </w:r>
           </w:p>
         </w:tc>
@@ -4145,17 +3766,17 @@
           </w:tcPr>
           <w:p>
             <w:r>
-              <w:t>The sliding scale imposes steep cancellation fees reaching 100 percent of the undelivered balance after 181 days. This creates significant financial liability for convenience terminations regardless of the supplier actual costs incurred.</w:t>
-            </w:r>
-          </w:p>
-        </w:tc>
-        <w:tc>
-          <w:tcPr>
-            <w:tcW w:type="dxa" w:w="1440"/>
-          </w:tcPr>
-          <w:p>
-            <w:r>
-              <w:t>Replace the percentage-based fee schedule with a reimbursement model limited to documented, non-cancelable costs and reasonable wind-down expenses.</w:t>
+              <w:t>The escalating fee structure creates significant financial liability for convenience cancellations, reaching 100 percent of the undelivered balance after 181 days. This represents a substantial cash-flow risk and financial exposure if project requirements change or the order is no longer needed.</w:t>
+            </w:r>
+          </w:p>
+        </w:tc>
+        <w:tc>
+          <w:tcPr>
+            <w:tcW w:type="dxa" w:w="1440"/>
+          </w:tcPr>
+          <w:p>
+            <w:r>
+              <w:t>Reduce percentage fees across the schedule and cap total convenience cancellation liability at a maximum percentage of the total order value.</w:t>
             </w:r>
           </w:p>
         </w:tc>
@@ -4197,27 +3818,27 @@
           </w:tcPr>
           <w:p>
             <w:r>
-              <w:t>Financial exposure due to termination fee shortfall</w:t>
-            </w:r>
-          </w:p>
-        </w:tc>
-        <w:tc>
-          <w:tcPr>
-            <w:tcW w:type="dxa" w:w="1440"/>
-          </w:tcPr>
-          <w:p>
-            <w:r>
-              <w:t>The contract provides a 38% cancellation fee for the 61-90 day window, which is lower than the required 40%. This creates a 2% deficit in expected cost recovery for convenience cancellations within this timeframe, leading to direct financial loss on the order value.</w:t>
-            </w:r>
-          </w:p>
-        </w:tc>
-        <w:tc>
-          <w:tcPr>
-            <w:tcW w:type="dxa" w:w="1440"/>
-          </w:tcPr>
-          <w:p>
-            <w:r>
-              <w:t>Increase the convenience cancellation fee for the 61-90 days bracket to 40 percent of the order value.</w:t>
+              <w:t>Financial exposure due to insufficient cancellation fee</w:t>
+            </w:r>
+          </w:p>
+        </w:tc>
+        <w:tc>
+          <w:tcPr>
+            <w:tcW w:type="dxa" w:w="1440"/>
+          </w:tcPr>
+          <w:p>
+            <w:r>
+              <w:t>The contract provides a 38 percent fee for cancellations between 61-90 days, failing to meet the required 40 percent. This creates a financial shortfall in recovering costs associated with early termination during this specific window.</w:t>
+            </w:r>
+          </w:p>
+        </w:tc>
+        <w:tc>
+          <w:tcPr>
+            <w:tcW w:type="dxa" w:w="1440"/>
+          </w:tcPr>
+          <w:p>
+            <w:r>
+              <w:t>Increase the convenience cancellation fee for the 61-90 days window to 40 percent of the order value.</w:t>
             </w:r>
           </w:p>
         </w:tc>
@@ -4259,27 +3880,27 @@
           </w:tcPr>
           <w:p>
             <w:r>
-              <w:t>Suspension risks and financial exposure</w:t>
-            </w:r>
-          </w:p>
-        </w:tc>
-        <w:tc>
-          <w:tcPr>
-            <w:tcW w:type="dxa" w:w="1440"/>
-          </w:tcPr>
-          <w:p>
-            <w:r>
-              <w:t>The exclusion of regulatory, government, legal, and safety stoppages from the suspension limit allows the Buyer to impose indefinite delays without triggering compensable change order protections. This creates operational constraints and unrecoverable costs for the Supplier since these specific stoppage categories do not count toward the 30-day aggregate limit.</w:t>
-            </w:r>
-          </w:p>
-        </w:tc>
-        <w:tc>
-          <w:tcPr>
-            <w:tcW w:type="dxa" w:w="1440"/>
-          </w:tcPr>
-          <w:p>
-            <w:r>
-              <w:t>Include regulatory, government, legal, and safety stoppages within the aggregate suspension limit and the criteria for compensable change orders.</w:t>
+              <w:t>Financial and operational suspension exposure</w:t>
+            </w:r>
+          </w:p>
+        </w:tc>
+        <w:tc>
+          <w:tcPr>
+            <w:tcW w:type="dxa" w:w="1440"/>
+          </w:tcPr>
+          <w:p>
+            <w:r>
+              <w:t>The clause excludes regulatory, government, legal, and safety stoppages from the suspension limits. This allows the Buyer to suspend work indefinitely for these reasons without triggering compensable change orders or the cost recoveries defined in Article 00511.10.2, leading to unrecovered mobilization and storage costs.</w:t>
+            </w:r>
+          </w:p>
+        </w:tc>
+        <w:tc>
+          <w:tcPr>
+            <w:tcW w:type="dxa" w:w="1440"/>
+          </w:tcPr>
+          <w:p>
+            <w:r>
+              <w:t>Remove exclusions for regulatory, government, legal, and safety stoppages so all suspension types count toward the two suspension and 30 day aggregate limit.</w:t>
             </w:r>
           </w:p>
         </w:tc>
@@ -4321,27 +3942,27 @@
           </w:tcPr>
           <w:p>
             <w:r>
-              <w:t>Financial and operational suspension risk</w:t>
-            </w:r>
-          </w:p>
-        </w:tc>
-        <w:tc>
-          <w:tcPr>
-            <w:tcW w:type="dxa" w:w="1440"/>
-          </w:tcPr>
-          <w:p>
-            <w:r>
-              <w:t>The clause allows Buyer to suspend work for commercial convenience. While limits exist, excess suspensions trigger compensable change orders for storage and remobilization. Furthermore, the five business day restart requirement is conditional upon material and resource availability, creating operational uncertainty and potential schedule delays during restart.</w:t>
-            </w:r>
-          </w:p>
-        </w:tc>
-        <w:tc>
-          <w:tcPr>
-            <w:tcW w:type="dxa" w:w="1440"/>
-          </w:tcPr>
-          <w:p>
-            <w:r>
-              <w:t>Define specific compensation rates for excess suspensions and remove the material and resource availability condition from the restart notice obligation.</w:t>
+              <w:t>Financial and operational suspension risks</w:t>
+            </w:r>
+          </w:p>
+        </w:tc>
+        <w:tc>
+          <w:tcPr>
+            <w:tcW w:type="dxa" w:w="1440"/>
+          </w:tcPr>
+          <w:p>
+            <w:r>
+              <w:t>The clause allows Buyer to suspend work for convenience, creating operational instability. While limits exist, exclusions for regulatory, government, and safety stoppages allow for potentially unlimited suspensions without triggering compensable change orders, leading to unrecovered costs and schedule delays.</w:t>
+            </w:r>
+          </w:p>
+        </w:tc>
+        <w:tc>
+          <w:tcPr>
+            <w:tcW w:type="dxa" w:w="1440"/>
+          </w:tcPr>
+          <w:p>
+            <w:r>
+              <w:t>Include regulatory, government, and safety stoppages within the aggregate suspension duration limit to ensure all prolonged delays are compensable.</w:t>
             </w:r>
           </w:p>
         </w:tc>
@@ -4383,27 +4004,27 @@
           </w:tcPr>
           <w:p>
             <w:r>
-              <w:t>Legal exposure due to fragmented dispute resolution forums</w:t>
-            </w:r>
-          </w:p>
-        </w:tc>
-        <w:tc>
-          <w:tcPr>
-            <w:tcW w:type="dxa" w:w="1440"/>
-          </w:tcPr>
-          <w:p>
-            <w:r>
-              <w:t>The clause splits jurisdiction between Indian law, Singapore arbitration for specific commercial disputes, and Mumbai courts for interim or specific proceedings. This fragmentation creates conflicting legal standards and increases the risk of parallel proceedings across different jurisdictions, leading to higher legal costs and inconsistent judgments.</w:t>
-            </w:r>
-          </w:p>
-        </w:tc>
-        <w:tc>
-          <w:tcPr>
-            <w:tcW w:type="dxa" w:w="1440"/>
-          </w:tcPr>
-          <w:p>
-            <w:r>
-              <w:t>Consolidate governing law and all dispute resolution proceedings into a single jurisdiction and forum to eliminate forum shopping and conflicting rulings.</w:t>
+              <w:t>Legal exposure due to fragmented dispute resolution venues</w:t>
+            </w:r>
+          </w:p>
+        </w:tc>
+        <w:tc>
+          <w:tcPr>
+            <w:tcW w:type="dxa" w:w="1440"/>
+          </w:tcPr>
+          <w:p>
+            <w:r>
+              <w:t>The clause splits jurisdiction between Indian law, Singapore arbitration for specific disputes, and Mumbai courts for interim proceedings. This fragmentation creates legal exposure and potential conflicting rulings across multiple forums, increasing the cost and complexity of enforcing contractual rights.</w:t>
+            </w:r>
+          </w:p>
+        </w:tc>
+        <w:tc>
+          <w:tcPr>
+            <w:tcW w:type="dxa" w:w="1440"/>
+          </w:tcPr>
+          <w:p>
+            <w:r>
+              <w:t>Consolidate governing law, jurisdiction, and arbitration in a single venue to eliminate carve-outs and forum fragmentation.</w:t>
             </w:r>
           </w:p>
         </w:tc>
@@ -4445,27 +4066,27 @@
           </w:tcPr>
           <w:p>
             <w:r>
-              <w:t>Arbitration limitations and multi-tiered dispute dependencies</w:t>
-            </w:r>
-          </w:p>
-        </w:tc>
-        <w:tc>
-          <w:tcPr>
-            <w:tcW w:type="dxa" w:w="1440"/>
-          </w:tcPr>
-          <w:p>
-            <w:r>
-              <w:t>The clause imposes a mandatory preliminary technical expert review in Mumbai for laboratory methodology disputes before Singapore arbitration can be accessed. This creates a procedural dependency and potential delay in resolving technical disputes, restricting immediate access to the primary arbitration venue.</w:t>
-            </w:r>
-          </w:p>
-        </w:tc>
-        <w:tc>
-          <w:tcPr>
-            <w:tcW w:type="dxa" w:w="1440"/>
-          </w:tcPr>
-          <w:p>
-            <w:r>
-              <w:t>Remove the mandatory technical expert prerequisite and provide direct access to Singapore arbitration for all disputes including those regarding laboratory test methodology.</w:t>
+              <w:t>Arbitration limitations and legal exposure</w:t>
+            </w:r>
+          </w:p>
+        </w:tc>
+        <w:tc>
+          <w:tcPr>
+            <w:tcW w:type="dxa" w:w="1440"/>
+          </w:tcPr>
+          <w:p>
+            <w:r>
+              <w:t>The clause imposes a mandatory tiered dispute process for laboratory test methodology. This creates a dependency on a technical expert in Mumbai before Singapore arbitration can be initiated, delaying final legal resolution and introducing a procedural hurdle for technical disputes.</w:t>
+            </w:r>
+          </w:p>
+        </w:tc>
+        <w:tc>
+          <w:tcPr>
+            <w:tcW w:type="dxa" w:w="1440"/>
+          </w:tcPr>
+          <w:p>
+            <w:r>
+              <w:t>Remove the mandatory technical expert referral and allow all disputes to proceed directly to Singapore arbitration.</w:t>
             </w:r>
           </w:p>
         </w:tc>
@@ -4507,27 +4128,27 @@
           </w:tcPr>
           <w:p>
             <w:r>
-              <w:t>Arbitration limitations</w:t>
-            </w:r>
-          </w:p>
-        </w:tc>
-        <w:tc>
-          <w:tcPr>
-            <w:tcW w:type="dxa" w:w="1440"/>
-          </w:tcPr>
-          <w:p>
-            <w:r>
-              <w:t>The clause creates a conditional dependency where legal disputes regarding laboratory test methodology must first undergo technical expert determination in Mumbai. This multi-tiered process delays access to Singapore arbitration, creating operational constraints and legal exposure through a mandatory preliminary step before formal arbitration can be initiated.</w:t>
-            </w:r>
-          </w:p>
-        </w:tc>
-        <w:tc>
-          <w:tcPr>
-            <w:tcW w:type="dxa" w:w="1440"/>
-          </w:tcPr>
-          <w:p>
-            <w:r>
-              <w:t>Remove the mandatory technical expert referral and provide direct access to Singapore arbitration for all disputes.</w:t>
+              <w:t>arbitration limitations</w:t>
+            </w:r>
+          </w:p>
+        </w:tc>
+        <w:tc>
+          <w:tcPr>
+            <w:tcW w:type="dxa" w:w="1440"/>
+          </w:tcPr>
+          <w:p>
+            <w:r>
+              <w:t>The clause imposes a conditional multi-tier dispute process where technical disputes must first be referred to an expert in Mumbai. This creates a dependency and a procedural carve-out, delaying access to Singapore arbitration and potentially splitting the forum for different aspects of the same dispute.</w:t>
+            </w:r>
+          </w:p>
+        </w:tc>
+        <w:tc>
+          <w:tcPr>
+            <w:tcW w:type="dxa" w:w="1440"/>
+          </w:tcPr>
+          <w:p>
+            <w:r>
+              <w:t>Remove the requirement for preliminary technical expert determination in Mumbai and grant direct access to Singapore arbitration for all disputes.</w:t>
             </w:r>
           </w:p>
         </w:tc>
@@ -4569,27 +4190,27 @@
           </w:tcPr>
           <w:p>
             <w:r>
-              <w:t>Liability exposure and financial exposure</w:t>
-            </w:r>
-          </w:p>
-        </w:tc>
-        <w:tc>
-          <w:tcPr>
-            <w:tcW w:type="dxa" w:w="1440"/>
-          </w:tcPr>
-          <w:p>
-            <w:r>
-              <w:t>The defect liability cap is limited to 10 percent of the PO value. While carve-outs exist for safety shutdowns, other significant defect costs remain capped, limiting recovery for non-emergency repairs or stabilization, which creates financial exposure for the buyer.</w:t>
-            </w:r>
-          </w:p>
-        </w:tc>
-        <w:tc>
-          <w:tcPr>
-            <w:tcW w:type="dxa" w:w="1440"/>
-          </w:tcPr>
-          <w:p>
-            <w:r>
-              <w:t>Increase the aggregate defect liability cap and expand carve-outs to include all direct costs associated with correcting defects regardless of safety shutdown status.</w:t>
+              <w:t>Liability exposure</w:t>
+            </w:r>
+          </w:p>
+        </w:tc>
+        <w:tc>
+          <w:tcPr>
+            <w:tcW w:type="dxa" w:w="1440"/>
+          </w:tcPr>
+          <w:p>
+            <w:r>
+              <w:t>The defect liability cap is limited to 10% of PO value, but carve-outs for emergency removal and site stabilization during safety shutdowns create uncapped financial exposure for specific direct costs. This results in unpredictable cost recovery beyond the primary liability limit.</w:t>
+            </w:r>
+          </w:p>
+        </w:tc>
+        <w:tc>
+          <w:tcPr>
+            <w:tcW w:type="dxa" w:w="1440"/>
+          </w:tcPr>
+          <w:p>
+            <w:r>
+              <w:t>Eliminate carve-outs for emergency costs and apply a consistent aggregate liability cap to all defect-related damages.</w:t>
             </w:r>
           </w:p>
         </w:tc>
@@ -4631,27 +4252,27 @@
           </w:tcPr>
           <w:p>
             <w:r>
-              <w:t>Unlimited liability exposure for specific carve-outs</w:t>
-            </w:r>
-          </w:p>
-        </w:tc>
-        <w:tc>
-          <w:tcPr>
-            <w:tcW w:type="dxa" w:w="1440"/>
-          </w:tcPr>
-          <w:p>
-            <w:r>
-              <w:t>The exclusion of consequential damages is invalidated for confidentiality breaches, indemnity, IP infringement, fraud, gross negligence, willful misconduct, bank guarantees, liquidated damages, and safety shutdown costs. This creates significant financial and legal exposure as these specific events allow for the recovery of indirect and consequential losses.</w:t>
-            </w:r>
-          </w:p>
-        </w:tc>
-        <w:tc>
-          <w:tcPr>
-            <w:tcW w:type="dxa" w:w="1440"/>
-          </w:tcPr>
-          <w:p>
-            <w:r>
-              <w:t>Remove exceptions to the consequential damages waiver or subject all carve-outs to an overall aggregate liability cap.</w:t>
+              <w:t>Uncapped liability exposure for specific carve-outs</w:t>
+            </w:r>
+          </w:p>
+        </w:tc>
+        <w:tc>
+          <w:tcPr>
+            <w:tcW w:type="dxa" w:w="1440"/>
+          </w:tcPr>
+          <w:p>
+            <w:r>
+              <w:t>Article 00511.15.2 creates multiple exceptions to the consequential damages waiver, including confidentiality breaches, indemnity, IP infringement, fraud, and gross negligence. This exposes the organization to indirect and consequential financial losses for these events, contradicting the requirement for a full exclusion of such damages.</w:t>
+            </w:r>
+          </w:p>
+        </w:tc>
+        <w:tc>
+          <w:tcPr>
+            <w:tcW w:type="dxa" w:w="1440"/>
+          </w:tcPr>
+          <w:p>
+            <w:r>
+              <w:t>Remove all exceptions to the consequential damages waiver in Article 00511.15.2 to ensure a comprehensive exclusion for all parties.</w:t>
             </w:r>
           </w:p>
         </w:tc>
@@ -4693,27 +4314,27 @@
           </w:tcPr>
           <w:p>
             <w:r>
-              <w:t>Uncapped liability exposure for multiple carve-out categories</w:t>
-            </w:r>
-          </w:p>
-        </w:tc>
-        <w:tc>
-          <w:tcPr>
-            <w:tcW w:type="dxa" w:w="1440"/>
-          </w:tcPr>
-          <w:p>
-            <w:r>
-              <w:t>The exclusion of consequential damages does not apply to confidentiality breaches, indemnity, IP infringement, fraud, gross negligence, willful misconduct, bank guarantees, liquidated damages, and safety shutdown costs. This creates significant financial and legal exposure as these specific losses are not capped by the waiver in Article 00511.15.1.</w:t>
-            </w:r>
-          </w:p>
-        </w:tc>
-        <w:tc>
-          <w:tcPr>
-            <w:tcW w:type="dxa" w:w="1440"/>
-          </w:tcPr>
-          <w:p>
-            <w:r>
-              <w:t>Limit the scope of exceptions to the consequential damages waiver and subject all carved-out liabilities to a defined aggregate liability cap.</w:t>
+              <w:t>Increased liability exposure</w:t>
+            </w:r>
+          </w:p>
+        </w:tc>
+        <w:tc>
+          <w:tcPr>
+            <w:tcW w:type="dxa" w:w="1440"/>
+          </w:tcPr>
+          <w:p>
+            <w:r>
+              <w:t>The waiver of consequential damages contains broad exceptions for confidentiality, indemnity, intellectual property, fraud, gross negligence, willful misconduct, and specific liquidated damages. This creates financial and legal exposure by allowing the recovery of indirect and consequential losses for these specified events, bypassing the general liability exclusion.</w:t>
+            </w:r>
+          </w:p>
+        </w:tc>
+        <w:tc>
+          <w:tcPr>
+            <w:tcW w:type="dxa" w:w="1440"/>
+          </w:tcPr>
+          <w:p>
+            <w:r>
+              <w:t>Narrow the exceptions to the consequential damages waiver to limit exposure to only willful misconduct and fraud.</w:t>
             </w:r>
           </w:p>
         </w:tc>
@@ -4802,7 +4423,7 @@
           </w:tcPr>
           <w:p>
             <w:r>
-              <w:t>Ensure the full 45% advance is payable in a single installment upon PO acknowledgement and furnishing of Annex B documents.</w:t>
+              <w:t>Remove conditional dependencies for the second advance tranche and ensure the full 45% is payable upon PO acknowledgement and furnishing of Annex B documents.</w:t>
             </w:r>
           </w:p>
         </w:tc>
@@ -4834,7 +4455,7 @@
           </w:tcPr>
           <w:p>
             <w:r>
-              <w:t>Set payment terms to Net 30 days from invoice receipt and remove conditional dependencies on internal Buyer system records.</w:t>
+              <w:t>Set payment terms as Net 30 days from invoice receipt regardless of internal acceptance records.</w:t>
             </w:r>
           </w:p>
         </w:tc>
@@ -4866,7 +4487,7 @@
           </w:tcPr>
           <w:p>
             <w:r>
-              <w:t>Reduce total performance security to a maximum of 10 percent including bridge guarantees.</w:t>
+              <w:t>Limit total performance security to a maximum of 10 percent including bridge guarantees.</w:t>
             </w:r>
           </w:p>
         </w:tc>
@@ -4898,7 +4519,7 @@
           </w:tcPr>
           <w:p>
             <w:r>
-              <w:t>Remove standalone exclusions for documentation delays and increase the aggregate LD cap to align with total project risk exposure.</w:t>
+              <w:t>Remove the exception for routine manuals and non-critical engineering submittals to ensure all documentation delays attract liquidated damages.</w:t>
             </w:r>
           </w:p>
         </w:tc>
@@ -4930,7 +4551,7 @@
           </w:tcPr>
           <w:p>
             <w:r>
-              <w:t>Remove the 5 percent per part cap and increase the aggregate delay exposure cap to align with total potential project loss.</w:t>
+              <w:t>Remove the 5% cap on individual undelivered parts and increase the aggregate delay exposure cap.</w:t>
             </w:r>
           </w:p>
         </w:tc>
@@ -4994,7 +4615,7 @@
           </w:tcPr>
           <w:p>
             <w:r>
-              <w:t>Reduce aggregate LD and service-credit exposure to a maximum of 5 percent of the total Purchase Order value.</w:t>
+              <w:t>Reduce aggregate LD and service-credit exposure to a maximum of 5 percent of total PO value.</w:t>
             </w:r>
           </w:p>
         </w:tc>
@@ -5026,7 +4647,7 @@
           </w:tcPr>
           <w:p>
             <w:r>
-              <w:t>Apply liquidated damages to remedial work and warranty repairs to ensure timely correction of defects.</w:t>
+              <w:t>Remove the exclusion of liquidated damages for remedial work and apply monetary penalties for delays in warranty repairs and replacements.</w:t>
             </w:r>
           </w:p>
         </w:tc>
@@ -5058,7 +4679,7 @@
           </w:tcPr>
           <w:p>
             <w:r>
-              <w:t>Extend standard guarantee to twelve months post-commissioning and ensure remedial guarantees provide full twelve months coverage regardless of the original dispatch date.</w:t>
+              <w:t>Extend standard guarantee to twelve months post-commissioning and ensure remedial guarantees run for twelve months from repair without being capped by original dispatch dates.</w:t>
             </w:r>
           </w:p>
         </w:tc>
@@ -5090,7 +4711,7 @@
           </w:tcPr>
           <w:p>
             <w:r>
-              <w:t>Ensure repaired or replaced components are guaranteed for twelve months from completion of repair or replacement regardless of the original dispatch date.</w:t>
+              <w:t>Ensure remedial guarantees for repaired or replaced components extend for a full 12 months from the date of repair regardless of the original dispatch date.</w:t>
             </w:r>
           </w:p>
         </w:tc>
@@ -5122,7 +4743,7 @@
           </w:tcPr>
           <w:p>
             <w:r>
-              <w:t>Ensure repaired or replaced components are guaranteed for twelve months from completion of repair or replacement regardless of the original dispatch date.</w:t>
+              <w:t>Ensure repaired or replaced components are guaranteed for a full twelve months from the date of repair without limitation based on the original dispatch date.</w:t>
             </w:r>
           </w:p>
         </w:tc>
@@ -5154,7 +4775,7 @@
           </w:tcPr>
           <w:p>
             <w:r>
-              <w:t>Extend Force Majeure relief to all sub-contractors and vendors regardless of their naming in Annex D provided the event satisfies the general Force Majeure definition.</w:t>
+              <w:t>Extend force majeure relief to include all approved sub-suppliers and logistics providers regardless of their Tier-1 status or inclusion in Annex D.</w:t>
             </w:r>
           </w:p>
         </w:tc>
@@ -5186,7 +4807,7 @@
           </w:tcPr>
           <w:p>
             <w:r>
-              <w:t>Extend force majeure relief to all subcontractors and vendors regardless of their tier or naming in Annex D.</w:t>
+              <w:t>Extend Force Majeure relief to all subcontractors regardless of Tier or naming status in Annex D.</w:t>
             </w:r>
           </w:p>
         </w:tc>
@@ -5218,7 +4839,7 @@
           </w:tcPr>
           <w:p>
             <w:r>
-              <w:t>Expand force majeure relief to include all sub-contractors and logistics providers regardless of their designation in Annex D.</w:t>
+              <w:t>Expand Force Majeure relief to include all critical sub-suppliers and logistics providers regardless of their listing in Annex D.</w:t>
             </w:r>
           </w:p>
         </w:tc>
@@ -5250,7 +4871,7 @@
           </w:tcPr>
           <w:p>
             <w:r>
-              <w:t>Limit termination for convenience payments to documented actual costs incurred and proven non-cancelable commitments rather than a fixed percentage of order value.</w:t>
+              <w:t>Replace tiered percentage fees with a flat fee or limit total convenience termination liability to actual documented costs incurred by the Supplier.</w:t>
             </w:r>
           </w:p>
         </w:tc>
@@ -5282,7 +4903,7 @@
           </w:tcPr>
           <w:p>
             <w:r>
-              <w:t>Replace the percentage-based fee schedule with a reimbursement model limited to documented, non-cancelable costs and reasonable wind-down expenses.</w:t>
+              <w:t>Reduce percentage fees across the schedule and cap total convenience cancellation liability at a maximum percentage of the total order value.</w:t>
             </w:r>
           </w:p>
         </w:tc>
@@ -5314,7 +4935,7 @@
           </w:tcPr>
           <w:p>
             <w:r>
-              <w:t>Increase the convenience cancellation fee for the 61-90 days bracket to 40 percent of the order value.</w:t>
+              <w:t>Increase the convenience cancellation fee for the 61-90 days window to 40 percent of the order value.</w:t>
             </w:r>
           </w:p>
         </w:tc>
@@ -5346,7 +4967,7 @@
           </w:tcPr>
           <w:p>
             <w:r>
-              <w:t>Include regulatory, government, legal, and safety stoppages within the aggregate suspension limit and the criteria for compensable change orders.</w:t>
+              <w:t>Remove exclusions for regulatory, government, legal, and safety stoppages so all suspension types count toward the two suspension and 30 day aggregate limit.</w:t>
             </w:r>
           </w:p>
         </w:tc>
@@ -5378,7 +4999,7 @@
           </w:tcPr>
           <w:p>
             <w:r>
-              <w:t>Define specific compensation rates for excess suspensions and remove the material and resource availability condition from the restart notice obligation.</w:t>
+              <w:t>Include regulatory, government, and safety stoppages within the aggregate suspension duration limit to ensure all prolonged delays are compensable.</w:t>
             </w:r>
           </w:p>
         </w:tc>
@@ -5410,7 +5031,7 @@
           </w:tcPr>
           <w:p>
             <w:r>
-              <w:t>Consolidate governing law and all dispute resolution proceedings into a single jurisdiction and forum to eliminate forum shopping and conflicting rulings.</w:t>
+              <w:t>Consolidate governing law, jurisdiction, and arbitration in a single venue to eliminate carve-outs and forum fragmentation.</w:t>
             </w:r>
           </w:p>
         </w:tc>
@@ -5442,7 +5063,7 @@
           </w:tcPr>
           <w:p>
             <w:r>
-              <w:t>Remove the mandatory technical expert prerequisite and provide direct access to Singapore arbitration for all disputes including those regarding laboratory test methodology.</w:t>
+              <w:t>Remove the mandatory technical expert referral and allow all disputes to proceed directly to Singapore arbitration.</w:t>
             </w:r>
           </w:p>
         </w:tc>
@@ -5474,7 +5095,7 @@
           </w:tcPr>
           <w:p>
             <w:r>
-              <w:t>Remove the mandatory technical expert referral and provide direct access to Singapore arbitration for all disputes.</w:t>
+              <w:t>Remove the requirement for preliminary technical expert determination in Mumbai and grant direct access to Singapore arbitration for all disputes.</w:t>
             </w:r>
           </w:p>
         </w:tc>
@@ -5506,7 +5127,7 @@
           </w:tcPr>
           <w:p>
             <w:r>
-              <w:t>Increase the aggregate defect liability cap and expand carve-outs to include all direct costs associated with correcting defects regardless of safety shutdown status.</w:t>
+              <w:t>Eliminate carve-outs for emergency costs and apply a consistent aggregate liability cap to all defect-related damages.</w:t>
             </w:r>
           </w:p>
         </w:tc>
@@ -5538,7 +5159,7 @@
           </w:tcPr>
           <w:p>
             <w:r>
-              <w:t>Remove exceptions to the consequential damages waiver or subject all carve-outs to an overall aggregate liability cap.</w:t>
+              <w:t>Remove all exceptions to the consequential damages waiver in Article 00511.15.2 to ensure a comprehensive exclusion for all parties.</w:t>
             </w:r>
           </w:p>
         </w:tc>
@@ -5570,7 +5191,7 @@
           </w:tcPr>
           <w:p>
             <w:r>
-              <w:t>Limit the scope of exceptions to the consequential damages waiver and subject all carved-out liabilities to a defined aggregate liability cap.</w:t>
+              <w:t>Narrow the exceptions to the consequential damages waiver to limit exposure to only willful misconduct and fraud.</w:t>
             </w:r>
           </w:p>
         </w:tc>

</xml_diff>